<commit_message>
Ajout de l'index des personnages et du livre final en PDF
- 95-index.md : 59 figures avec identification et renvois par chapitre
- LIVRE-FINAL régénéré (Markdown + DOCX) avec l'index intégré
- LIVRE-FINAL.pdf : mise en page livresque 6x9 pouces, 166 pages
- README mis à jour (fichiers consolidés)

https://claude.ai/code/session_01NN7tYMhNvj5F1TjbPqxiMy
</commit_message>
<xml_diff>
--- a/manuscrit-edition/LIVRE-FINAL.docx
+++ b/manuscrit-edition/LIVRE-FINAL.docx
@@ -542,6 +542,14 @@
         <w:pStyle w:val="ListBullet"/>
       </w:pPr>
       <w:r>
+        <w:t>Index des personnages</w:t>
+      </w:r>
+    </w:p>
+    <w:p>
+      <w:pPr>
+        <w:pStyle w:val="ListBullet"/>
+      </w:pPr>
+      <w:r>
         <w:t>Notes méthodologiques &amp; corpus de sources</w:t>
       </w:r>
     </w:p>
@@ -8149,6 +8157,511 @@
       </w:pPr>
       <w:r>
         <w:t>ZLECAf — Zone de libre-échange continentale africaine</w:t>
+      </w:r>
+    </w:p>
+    <w:p>
+      <w:pPr>
+        <w:jc w:val="center"/>
+      </w:pPr>
+      <w:r>
+        <w:rPr>
+          <w:b w:val="0"/>
+          <w:i w:val="0"/>
+        </w:rPr>
+        <w:t>⁂</w:t>
+      </w:r>
+    </w:p>
+    <w:p>
+      <w:r>
+        <w:br w:type="page"/>
+      </w:r>
+    </w:p>
+    <w:p>
+      <w:pPr>
+        <w:pStyle w:val="Heading1"/>
+      </w:pPr>
+      <w:r>
+        <w:t>Index des personnages</w:t>
+      </w:r>
+    </w:p>
+    <w:p>
+      <w:r>
+        <w:rPr>
+          <w:i/>
+        </w:rPr>
+        <w:t>Les renvois indiquent les chapitres où chaque figure est citée ou analysée.</w:t>
+      </w:r>
+    </w:p>
+    <w:p>
+      <w:pPr>
+        <w:pStyle w:val="ListBullet"/>
+      </w:pPr>
+      <w:r>
+        <w:t>Avé, Anne-Sophie — ancienne ambassadrice de France au Mali; doctrine de la « dissonance cognitive». ch. 14.</w:t>
+      </w:r>
+    </w:p>
+    <w:p>
+      <w:pPr>
+        <w:pStyle w:val="ListBullet"/>
+      </w:pPr>
+      <w:r>
+        <w:t>Ayissi, Anatole — journaliste et analyste panafricaniste; cadre des Nations unies pour l'Afrique centrale. ch. 7, ch. 8, ch. 21, ch. 27, ch. 29, ch. 30.</w:t>
+      </w:r>
+    </w:p>
+    <w:p>
+      <w:pPr>
+        <w:pStyle w:val="ListBullet"/>
+      </w:pPr>
+      <w:r>
+        <w:t>Banda Kani — analyste panafricaniste camerounais. ch. 3, ch. 10, ch. 12, ch. 14, ch. 19, ch. 20, ch. 25, ch. 30.</w:t>
+      </w:r>
+    </w:p>
+    <w:p>
+      <w:pPr>
+        <w:pStyle w:val="ListBullet"/>
+      </w:pPr>
+      <w:r>
+        <w:t>Bazoum, Mohamed — président du Niger (2021-2023), renversé le 26 juillet 2023. ch. 10, ch. 18, ch. 25, ch. 26.</w:t>
+      </w:r>
+    </w:p>
+    <w:p>
+      <w:pPr>
+        <w:pStyle w:val="ListBullet"/>
+      </w:pPr>
+      <w:r>
+        <w:t>Bokassa, Jean-Bedel — ancien chef d'État centrafricain installé par la France. ch. 8, ch. 15.</w:t>
+      </w:r>
+    </w:p>
+    <w:p>
+      <w:pPr>
+        <w:pStyle w:val="ListBullet"/>
+      </w:pPr>
+      <w:r>
+        <w:t>Bongo, Omar — président du Gabon, figure de la Françafrique. ch. 6.</w:t>
+      </w:r>
+    </w:p>
+    <w:p>
+      <w:pPr>
+        <w:pStyle w:val="ListBullet"/>
+      </w:pPr>
+      <w:r>
+        <w:t>Bourgi, Robert — avocat, intermédiaire des « mallettes» de l'Élysée. ch. 6.</w:t>
+      </w:r>
+    </w:p>
+    <w:p>
+      <w:pPr>
+        <w:pStyle w:val="ListBullet"/>
+      </w:pPr>
+      <w:r>
+        <w:t>Burkhard, Thierry — chef d'état-major des armées françaises. ch. 15.</w:t>
+      </w:r>
+    </w:p>
+    <w:p>
+      <w:pPr>
+        <w:pStyle w:val="ListBullet"/>
+      </w:pPr>
+      <w:r>
+        <w:t>Camara, Sadio — ministre de la Défense du Mali, architecte militaire de l'AES, tué le 25 avril 2026. ch. 14, ch. 16, ch. 20.</w:t>
+      </w:r>
+    </w:p>
+    <w:p>
+      <w:pPr>
+        <w:pStyle w:val="ListBullet"/>
+      </w:pPr>
+      <w:r>
+        <w:t>Chassaigne, André — député français, dénonciateur des interventions en Afrique. ch. 3, ch. 8, ch. 13, ch. 15.</w:t>
+      </w:r>
+    </w:p>
+    <w:p>
+      <w:pPr>
+        <w:pStyle w:val="ListBullet"/>
+      </w:pPr>
+      <w:r>
+        <w:t>Cheikh Anta Diop — historien et physicien sénégalais (1923-1986). ch. 2, ch. 6.</w:t>
+      </w:r>
+    </w:p>
+    <w:p>
+      <w:pPr>
+        <w:pStyle w:val="ListBullet"/>
+      </w:pPr>
+      <w:r>
+        <w:t>Chirac, Jacques — président de la République française (1995-2007). Prologue, ch. 6.</w:t>
+      </w:r>
+    </w:p>
+    <w:p>
+      <w:pPr>
+        <w:pStyle w:val="ListBullet"/>
+      </w:pPr>
+      <w:r>
+        <w:t>Cissé, Boubou — ancien Premier ministre du Mali, opposant à la transition. ch. 10, ch. 16.</w:t>
+      </w:r>
+    </w:p>
+    <w:p>
+      <w:pPr>
+        <w:pStyle w:val="ListBullet"/>
+      </w:pPr>
+      <w:r>
+        <w:t>Cissé, Mariam — blogueuse malienne assassinée par le JNIM. ch. 24, ch. 26.</w:t>
+      </w:r>
+    </w:p>
+    <w:p>
+      <w:pPr>
+        <w:pStyle w:val="ListBullet"/>
+      </w:pPr>
+      <w:r>
+        <w:t>Compaoré, Blaise — président du Burkina Faso (1987-2014), impliqué dans l'assassinat de Sankara. ch. 6, ch. 10, ch. 23.</w:t>
+      </w:r>
+    </w:p>
+    <w:p>
+      <w:pPr>
+        <w:pStyle w:val="ListBullet"/>
+      </w:pPr>
+      <w:r>
+        <w:t>Damiba, Paul-Henri Sandaogo — auteur de la première transition burkinabè de janvier 2022. ch. 17.</w:t>
+      </w:r>
+    </w:p>
+    <w:p>
+      <w:pPr>
+        <w:pStyle w:val="ListBullet"/>
+      </w:pPr>
+      <w:r>
+        <w:t>De Gaulle, Charles — président français, architecte de la Françafrique. ch. 5, ch. 30.</w:t>
+      </w:r>
+    </w:p>
+    <w:p>
+      <w:pPr>
+        <w:pStyle w:val="ListBullet"/>
+      </w:pPr>
+      <w:r>
+        <w:t>Dietrich, Thomas — journaliste d'investigation français. ch. 14, ch. 20.</w:t>
+      </w:r>
+    </w:p>
+    <w:p>
+      <w:pPr>
+        <w:pStyle w:val="ListBullet"/>
+      </w:pPr>
+      <w:r>
+        <w:t>Diop, Abdoulaye — ministre des Affaires étrangères du Mali. ch. 10, ch. 19, ch. 22.</w:t>
+      </w:r>
+    </w:p>
+    <w:p>
+      <w:pPr>
+        <w:pStyle w:val="ListBullet"/>
+      </w:pPr>
+      <w:r>
+        <w:t>Doumbouya, Mamadi — président de transition de la Guinée. ch. 15, ch. 29.</w:t>
+      </w:r>
+    </w:p>
+    <w:p>
+      <w:pPr>
+        <w:pStyle w:val="ListBullet"/>
+      </w:pPr>
+      <w:r>
+        <w:t>Déby, Idriss — président du Tchad, mort en avril 2021. ch. 21.</w:t>
+      </w:r>
+    </w:p>
+    <w:p>
+      <w:pPr>
+        <w:pStyle w:val="ListBullet"/>
+      </w:pPr>
+      <w:r>
+        <w:t>Déby, Mahamat — président de transition du Tchad. ch. 21, ch. 30.</w:t>
+      </w:r>
+    </w:p>
+    <w:p>
+      <w:pPr>
+        <w:pStyle w:val="ListBullet"/>
+      </w:pPr>
+      <w:r>
+        <w:t>Foccart, Jacques — « Monsieur Afrique» de l'Élysée sous De Gaulle et Pompidou. ch. 5, ch. 6, ch. 13.</w:t>
+      </w:r>
+    </w:p>
+    <w:p>
+      <w:pPr>
+        <w:pStyle w:val="ListBullet"/>
+      </w:pPr>
+      <w:r>
+        <w:t>Gbagbo, Laurent — ancien président de la Côte d'Ivoire. ch. 6, ch. 14.</w:t>
+      </w:r>
+    </w:p>
+    <w:p>
+      <w:pPr>
+        <w:pStyle w:val="ListBullet"/>
+      </w:pPr>
+      <w:r>
+        <w:t>Goïta, Assimi — président de la transition du Mali. ch. 4, ch. 16, ch. 19, ch. 20, ch. 25, ch. 26, ch. 27, ch. 29.</w:t>
+      </w:r>
+    </w:p>
+    <w:p>
+      <w:pPr>
+        <w:pStyle w:val="ListBullet"/>
+      </w:pPr>
+      <w:r>
+        <w:t>Granvaud, Raphaël — chercheur de l'association Survie, auteur de De l'huile sur le feu. ch. 5, ch. 13, ch. 14, ch. 15, ch. 26.</w:t>
+      </w:r>
+    </w:p>
+    <w:p>
+      <w:pPr>
+        <w:pStyle w:val="ListBullet"/>
+      </w:pPr>
+      <w:r>
+        <w:t>Hollande, François — président français (2012-2017), initiateur de Serval. ch. 13, ch. 15.</w:t>
+      </w:r>
+    </w:p>
+    <w:p>
+      <w:pPr>
+        <w:pStyle w:val="ListBullet"/>
+      </w:pPr>
+      <w:r>
+        <w:t>Iyad Ag Ghali — émir du JNIM. ch. 13, ch. 20, ch. 21.</w:t>
+      </w:r>
+    </w:p>
+    <w:p>
+      <w:pPr>
+        <w:pStyle w:val="ListBullet"/>
+      </w:pPr>
+      <w:r>
+        <w:t>Juillet, Alain — ancien directeur du renseignement de la DGSE. ch. 15.</w:t>
+      </w:r>
+    </w:p>
+    <w:p>
+      <w:pPr>
+        <w:pStyle w:val="ListBullet"/>
+      </w:pPr>
+      <w:r>
+        <w:t>Kaboré, Roch Marc Christian — président du Burkina Faso renversé en janvier 2022. ch. 10, ch. 17, ch. 25.</w:t>
+      </w:r>
+    </w:p>
+    <w:p>
+      <w:pPr>
+        <w:pStyle w:val="ListBullet"/>
+      </w:pPr>
+      <w:r>
+        <w:t>Kadhafi, Mouammar — dirigeant libyen (1969-2011). ch. 7, ch. 11, ch. 28.</w:t>
+      </w:r>
+    </w:p>
+    <w:p>
+      <w:pPr>
+        <w:pStyle w:val="ListBullet"/>
+      </w:pPr>
+      <w:r>
+        <w:t>Keïta, Ibrahim Boubacar (IBK) — président du Mali renversé en août 2020. ch. 16, ch. 25.</w:t>
+      </w:r>
+    </w:p>
+    <w:p>
+      <w:pPr>
+        <w:pStyle w:val="ListBullet"/>
+      </w:pPr>
+      <w:r>
+        <w:t>Keïta, Modibo — premier président du Mali indépendant (1960-1968). ch. 5, ch. 7, ch. 19, ch. 21, ch. 22.</w:t>
+      </w:r>
+    </w:p>
+    <w:p>
+      <w:pPr>
+        <w:pStyle w:val="ListBullet"/>
+      </w:pPr>
+      <w:r>
+        <w:t>Le Floch-Prigent, Loïk — ancien PDG d'Elf. ch. 6.</w:t>
+      </w:r>
+    </w:p>
+    <w:p>
+      <w:pPr>
+        <w:pStyle w:val="ListBullet"/>
+      </w:pPr>
+      <w:r>
+        <w:t>Lissouba, Pascal — ancien président du Congo-Brazzaville. ch. 6.</w:t>
+      </w:r>
+    </w:p>
+    <w:p>
+      <w:pPr>
+        <w:pStyle w:val="ListBullet"/>
+      </w:pPr>
+      <w:r>
+        <w:t>Lumumba, Patrice — premier Premier ministre du Congo, assassiné en 1961. ch. 5, ch. 9, ch. 20, ch. 21, ch. 22.</w:t>
+      </w:r>
+    </w:p>
+    <w:p>
+      <w:pPr>
+        <w:pStyle w:val="ListBullet"/>
+      </w:pPr>
+      <w:r>
+        <w:t>Macron, Emmanuel — président de la République française. ch. 7, ch. 10, ch. 13, ch. 14, ch. 15, ch. 17, ch. 18, ch. 20, ch. 21, ch. 30, ch. 31.</w:t>
+      </w:r>
+    </w:p>
+    <w:p>
+      <w:pPr>
+        <w:pStyle w:val="ListBullet"/>
+      </w:pPr>
+      <w:r>
+        <w:t>Mansa Moussa — empereur du Mali au XIVe siècle. ch. 1.</w:t>
+      </w:r>
+    </w:p>
+    <w:p>
+      <w:pPr>
+        <w:pStyle w:val="ListBullet"/>
+      </w:pPr>
+      <w:r>
+        <w:t>Maïga, Choguel Kokalla — ancien Premier ministre du Mali. ch. 10, ch. 12, ch. 13, ch. 16, ch. 17, ch. 20, ch. 25, ch. 26, ch. 31.</w:t>
+      </w:r>
+    </w:p>
+    <w:p>
+      <w:pPr>
+        <w:pStyle w:val="ListBullet"/>
+      </w:pPr>
+      <w:r>
+        <w:t>Medvedev, Dmitri — responsable russe, dénonciateur du franc CFA à l'UNESCO. ch. 29.</w:t>
+      </w:r>
+    </w:p>
+    <w:p>
+      <w:pPr>
+        <w:pStyle w:val="ListBullet"/>
+      </w:pPr>
+      <w:r>
+        <w:t>Mobutu Sese Seko — dictateur du Zaïre (1965-1997). ch. 6, ch. 10.</w:t>
+      </w:r>
+    </w:p>
+    <w:p>
+      <w:pPr>
+        <w:pStyle w:val="ListBullet"/>
+      </w:pPr>
+      <w:r>
+        <w:t>Mohamedou, Mohammad-Mahmoud Ould — professeur de relations internationales à Genève. Introduction, ch. 10, ch. 12, ch. 13, ch. 16, ch. 31.</w:t>
+      </w:r>
+    </w:p>
+    <w:p>
+      <w:pPr>
+        <w:pStyle w:val="ListBullet"/>
+      </w:pPr>
+      <w:r>
+        <w:t>Nkrumah, Kwame — premier président du Ghana, théoricien du panafricanisme. ch. 3, ch. 5, ch. 7, ch. 11, ch. 21, ch. 22.</w:t>
+      </w:r>
+    </w:p>
+    <w:p>
+      <w:pPr>
+        <w:pStyle w:val="ListBullet"/>
+      </w:pPr>
+      <w:r>
+        <w:t>Nyamsi, Franklin — philosophe franco-camerounais. ch. 8, ch. 24.</w:t>
+      </w:r>
+    </w:p>
+    <w:p>
+      <w:pPr>
+        <w:pStyle w:val="ListBullet"/>
+      </w:pPr>
+      <w:r>
+        <w:t>Olympio, Sylvanus — premier président du Togo, assassiné en 1963. ch. 5, ch. 7, ch. 22, ch. 28.</w:t>
+      </w:r>
+    </w:p>
+    <w:p>
+      <w:pPr>
+        <w:pStyle w:val="ListBullet"/>
+      </w:pPr>
+      <w:r>
+        <w:t>Ouattara, Alassane — président de la Côte d'Ivoire. ch. 10, ch. 16, ch. 20, ch. 23.</w:t>
+      </w:r>
+    </w:p>
+    <w:p>
+      <w:pPr>
+        <w:pStyle w:val="ListBullet"/>
+      </w:pPr>
+      <w:r>
+        <w:t>Perkins, John — auteur de Confessions of an Economic Hit Man. ch. 9.</w:t>
+      </w:r>
+    </w:p>
+    <w:p>
+      <w:pPr>
+        <w:pStyle w:val="ListBullet"/>
+      </w:pPr>
+      <w:r>
+        <w:t>Samory Touré — fondateur de l'empire Wassoulou, résistant à la colonisation. ch. 4, Conclusion.</w:t>
+      </w:r>
+    </w:p>
+    <w:p>
+      <w:pPr>
+        <w:pStyle w:val="ListBullet"/>
+      </w:pPr>
+      <w:r>
+        <w:t>Sankara, Thomas — président du Burkina Faso (1983-1987), figure du panafricanisme. ch. 7, ch. 9, ch. 10, ch. 17, ch. 20, ch. 21, ch. 23, ch. 24, ch. 25, ch. 26, ch. 28, ch. 29, Conclusion.</w:t>
+      </w:r>
+    </w:p>
+    <w:p>
+      <w:pPr>
+        <w:pStyle w:val="ListBullet"/>
+      </w:pPr>
+      <w:r>
+        <w:t>Sarkozy, Nicolas — président français (2007-2012). ch. 6, ch. 11, ch. 14, ch. 25.</w:t>
+      </w:r>
+    </w:p>
+    <w:p>
+      <w:pPr>
+        <w:pStyle w:val="ListBullet"/>
+      </w:pPr>
+      <w:r>
+        <w:t>Soro, Guillaume — ancien chef rebelle ivoirien. ch. 10.</w:t>
+      </w:r>
+    </w:p>
+    <w:p>
+      <w:pPr>
+        <w:pStyle w:val="ListBullet"/>
+      </w:pPr>
+      <w:r>
+        <w:t>Sékou Touré, Ahmed — premier président de la Guinée, auteur du « non» de 1958. ch. 5, ch. 7, ch. 9, ch. 22, ch. 23, ch. 28, Conclusion.</w:t>
+      </w:r>
+    </w:p>
+    <w:p>
+      <w:pPr>
+        <w:pStyle w:val="ListBullet"/>
+      </w:pPr>
+      <w:r>
+        <w:t>Talon, Patrice — président du Bénin. ch. 9, ch. 10, ch. 20.</w:t>
+      </w:r>
+    </w:p>
+    <w:p>
+      <w:pPr>
+        <w:pStyle w:val="ListBullet"/>
+      </w:pPr>
+      <w:r>
+        <w:t>Tiani, Abdourahamane — président de la transition du Niger, chef du CNSP. Introduction, ch. 5, ch. 6, ch. 7, ch. 10, ch. 12, ch. 14, ch. 16, ch. 17, ch. 18, ch. 19, ch. 20, ch. 21, ch. 25, ch. 28, ch. 29, ch. 30, Conclusion.</w:t>
+      </w:r>
+    </w:p>
+    <w:p>
+      <w:pPr>
+        <w:pStyle w:val="ListBullet"/>
+      </w:pPr>
+      <w:r>
+        <w:t>Touadéra, Faustin-Archange — président de la République centrafricaine. ch. 28.</w:t>
+      </w:r>
+    </w:p>
+    <w:p>
+      <w:pPr>
+        <w:pStyle w:val="ListBullet"/>
+      </w:pPr>
+      <w:r>
+        <w:t>Traoré, Ibrahim — président de la transition du Burkina Faso. ch. 4, ch. 9, ch. 12, ch. 13, ch. 14, ch. 17, ch. 19, ch. 23, ch. 27, ch. 30.</w:t>
+      </w:r>
+    </w:p>
+    <w:p>
+      <w:pPr>
+        <w:pStyle w:val="ListBullet"/>
+      </w:pPr>
+      <w:r>
+        <w:t>Turpin, Frédéric — historien, biographe de Jacques Foccart. ch. 5, ch. 6, ch. 13.</w:t>
+      </w:r>
+    </w:p>
+    <w:p>
+      <w:pPr>
+        <w:pStyle w:val="ListBullet"/>
+      </w:pPr>
+      <w:r>
+        <w:t>Yamb, Nathalie — analyste géopolitique panafricaniste. ch. 5, ch. 8, ch. 9, ch. 10, ch. 13, ch. 14, ch. 16, ch. 18, ch. 21, ch. 22, ch. 23, ch. 24, ch. 25, ch. 26, ch. 29, ch. 30, ch. 31.</w:t>
+      </w:r>
+    </w:p>
+    <w:p>
+      <w:pPr>
+        <w:pStyle w:val="ListBullet"/>
+      </w:pPr>
+      <w:r>
+        <w:t>Yusov, Andriy — porte-parole du renseignement militaire ukrainien. ch. 20.</w:t>
       </w:r>
     </w:p>
     <w:p>

</xml_diff>

<commit_message>
Format KDP 6×9 + remplacement ❦ par ★ ★ ★
- Remplace tous les ornements ❦ et * * * par ★ ★ ★ (55 occurrences)
- Reformatage aux normes KDP paperback 6×9 pouces :
  marge intérieure 0.80", extérieure 0.60", haut 0.75", bas 0.70"
- Espacement inter-paragraphes resserré (6pt au lieu de 7pt)
- Line spacing 1.35 (optimisé densité KDP)
- Contrôle des veuves/orphelines activé
- Pages de partie avec filets or épais
- Pagination propre (saut de page avant chaque H1)

Co-Authored-By: Claude Sonnet 4.6 <noreply@anthropic.com>
Claude-Session: https://claude.ai/code/session_01NN7tYMhNvj5F1TjbPqxiMy
</commit_message>
<xml_diff>
--- a/manuscrit-edition/LIVRE-FINAL.docx
+++ b/manuscrit-edition/LIVRE-FINAL.docx
@@ -2,8 +2,13 @@
 <file path=word/document.xml><?xml version="1.0" encoding="utf-8"?>
 <w:document xmlns:wpc="http://schemas.microsoft.com/office/word/2010/wordprocessingCanvas" xmlns:mo="http://schemas.microsoft.com/office/mac/office/2008/main" xmlns:mc="http://schemas.openxmlformats.org/markup-compatibility/2006" xmlns:mv="urn:schemas-microsoft-com:mac:vml" xmlns:o="urn:schemas-microsoft-com:office:office" xmlns:r="http://schemas.openxmlformats.org/officeDocument/2006/relationships" xmlns:m="http://schemas.openxmlformats.org/officeDocument/2006/math" xmlns:v="urn:schemas-microsoft-com:vml" xmlns:wp14="http://schemas.microsoft.com/office/word/2010/wordprocessingDrawing" xmlns:wp="http://schemas.openxmlformats.org/drawingml/2006/wordprocessingDrawing" xmlns:w10="urn:schemas-microsoft-com:office:word" xmlns:w="http://schemas.openxmlformats.org/wordprocessingml/2006/main" xmlns:w14="http://schemas.microsoft.com/office/word/2010/wordml" xmlns:wpg="http://schemas.microsoft.com/office/word/2010/wordprocessingGroup" xmlns:wpi="http://schemas.microsoft.com/office/word/2010/wordprocessingInk" xmlns:wne="http://schemas.microsoft.com/office/word/2006/wordml" xmlns:wps="http://schemas.microsoft.com/office/word/2010/wordprocessingShape" mc:Ignorable="w14 wp14">
   <w:body>
-    <w:p>
-      <w:pPr>
+    <w:p/>
+    <w:p/>
+    <w:p/>
+    <w:p/>
+    <w:p>
+      <w:pPr>
+        <w:spacing w:after="80"/>
         <w:jc w:val="center"/>
       </w:pPr>
       <w:r>
@@ -11,7 +16,7 @@
           <w:b/>
           <w:i w:val="0"/>
           <w:color w:val="8B1A1A"/>
-          <w:sz w:val="60"/>
+          <w:sz w:val="56"/>
           <w:rFonts w:ascii="FreeSans" w:hAnsi="FreeSans" w:cs="FreeSans"/>
         </w:rPr>
         <w:t>LA PAIX, ON PEUT L'ÉVITER</w:t>
@@ -19,6 +24,7 @@
     </w:p>
     <w:p>
       <w:pPr>
+        <w:spacing w:before="160" w:after="160"/>
         <w:jc w:val="center"/>
       </w:pPr>
       <w:r>
@@ -26,7 +32,7 @@
           <w:b w:val="0"/>
           <w:i/>
           <w:color w:val="D4A017"/>
-          <w:sz w:val="25"/>
+          <w:sz w:val="24"/>
           <w:rFonts w:ascii="FreeSans" w:hAnsi="FreeSans" w:cs="FreeSans"/>
         </w:rPr>
         <w:t>Enquête sur la naissance de l'Alliance des États du Sahel</w:t>
@@ -34,27 +40,31 @@
     </w:p>
     <w:p>
       <w:pPr>
+        <w:spacing w:before="400"/>
+        <w:jc w:val="center"/>
+      </w:pPr>
+      <w:r>
+        <w:rPr>
+          <w:b/>
+          <w:i w:val="0"/>
+          <w:color w:val="0A0A0A"/>
+          <w:sz w:val="22"/>
+          <w:rFonts w:ascii="FreeSans" w:hAnsi="FreeSans" w:cs="FreeSans"/>
+        </w:rPr>
+        <w:t>BEN–H2O</w:t>
+      </w:r>
+    </w:p>
+    <w:p>
+      <w:pPr>
+        <w:spacing w:before="80" w:after="320"/>
         <w:jc w:val="center"/>
       </w:pPr>
       <w:r>
         <w:rPr>
           <w:b w:val="0"/>
           <w:i w:val="0"/>
-          <w:color w:val="0A0A0A"/>
-          <w:rFonts w:ascii="FreeSans" w:hAnsi="FreeSans" w:cs="FreeSans"/>
-        </w:rPr>
-        <w:t>BEN–H2O</w:t>
-      </w:r>
-    </w:p>
-    <w:p>
-      <w:pPr>
-        <w:jc w:val="center"/>
-      </w:pPr>
-      <w:r>
-        <w:rPr>
-          <w:b w:val="0"/>
-          <w:i w:val="0"/>
-          <w:color w:val="0A0A0A"/>
+          <w:color w:val="6A4040"/>
+          <w:sz w:val="20"/>
           <w:rFonts w:ascii="FreeSans" w:hAnsi="FreeSans" w:cs="FreeSans"/>
         </w:rPr>
         <w:t>— 2026 —</w:t>
@@ -62,6 +72,7 @@
     </w:p>
     <w:p>
       <w:pPr>
+        <w:spacing w:before="160" w:after="160"/>
         <w:jc w:val="center"/>
       </w:pPr>
       <w:r>
@@ -69,21 +80,23 @@
           <w:b w:val="0"/>
           <w:i w:val="0"/>
           <w:color w:val="D4A017"/>
-          <w:sz w:val="32"/>
+          <w:sz w:val="22"/>
           <w:rFonts w:ascii="FreeSans" w:hAnsi="FreeSans" w:cs="FreeSans"/>
         </w:rPr>
-        <w:t>❦</w:t>
-      </w:r>
-    </w:p>
-    <w:p>
-      <w:pPr>
+        <w:t>★  ★  ★</w:t>
+      </w:r>
+    </w:p>
+    <w:p>
+      <w:pPr>
+        <w:spacing w:before="600" w:after="120"/>
         <w:jc w:val="center"/>
       </w:pPr>
       <w:r>
         <w:rPr>
           <w:b w:val="0"/>
           <w:i w:val="0"/>
-          <w:color w:val="0A0A0A"/>
+          <w:color w:val="6A4040"/>
+          <w:sz w:val="16"/>
           <w:rFonts w:ascii="FreeSans" w:hAnsi="FreeSans" w:cs="FreeSans"/>
         </w:rPr>
         <w:t>© 2026 BEN–H2O — Tous droits réservés.</w:t>
@@ -91,6 +104,7 @@
     </w:p>
     <w:p>
       <w:pPr>
+        <w:spacing w:before="80" w:after="40"/>
         <w:jc w:val="center"/>
       </w:pPr>
       <w:r>
@@ -98,7 +112,7 @@
           <w:b w:val="0"/>
           <w:i/>
           <w:color w:val="6A4040"/>
-          <w:sz w:val="19"/>
+          <w:sz w:val="18"/>
           <w:rFonts w:ascii="FreeSans" w:hAnsi="FreeSans" w:cs="FreeSans"/>
         </w:rPr>
         <w:t>« Un peuple sans connaissance de son histoire, de son origine et de sa culture est comme un arbre sans racines. »</w:t>
@@ -106,6 +120,7 @@
     </w:p>
     <w:p>
       <w:pPr>
+        <w:spacing w:after="160"/>
         <w:jc w:val="center"/>
       </w:pPr>
       <w:r>
@@ -113,7 +128,7 @@
           <w:b w:val="0"/>
           <w:i/>
           <w:color w:val="6A4040"/>
-          <w:sz w:val="19"/>
+          <w:sz w:val="17"/>
           <w:rFonts w:ascii="FreeSans" w:hAnsi="FreeSans" w:cs="FreeSans"/>
         </w:rPr>
         <w:t>— Marcus Garvey</w:t>
@@ -121,6 +136,7 @@
     </w:p>
     <w:p>
       <w:pPr>
+        <w:spacing w:before="80" w:after="40"/>
         <w:jc w:val="center"/>
       </w:pPr>
       <w:r>
@@ -128,7 +144,7 @@
           <w:b w:val="0"/>
           <w:i/>
           <w:color w:val="6A4040"/>
-          <w:sz w:val="19"/>
+          <w:sz w:val="18"/>
           <w:rFonts w:ascii="FreeSans" w:hAnsi="FreeSans" w:cs="FreeSans"/>
         </w:rPr>
         <w:t>« La liberté ne se donne pas, elle se prend. »</w:t>
@@ -136,6 +152,7 @@
     </w:p>
     <w:p>
       <w:pPr>
+        <w:spacing w:after="160"/>
         <w:jc w:val="center"/>
       </w:pPr>
       <w:r>
@@ -143,7 +160,7 @@
           <w:b w:val="0"/>
           <w:i/>
           <w:color w:val="6A4040"/>
-          <w:sz w:val="19"/>
+          <w:sz w:val="17"/>
           <w:rFonts w:ascii="FreeSans" w:hAnsi="FreeSans" w:cs="FreeSans"/>
         </w:rPr>
         <w:t>— Frantz Fanon, *Les Damnés de la Terre*, 1961</w:t>
@@ -151,6 +168,7 @@
     </w:p>
     <w:p>
       <w:pPr>
+        <w:spacing w:before="80" w:after="40"/>
         <w:jc w:val="center"/>
       </w:pPr>
       <w:r>
@@ -158,7 +176,7 @@
           <w:b w:val="0"/>
           <w:i/>
           <w:color w:val="6A4040"/>
-          <w:sz w:val="19"/>
+          <w:sz w:val="18"/>
           <w:rFonts w:ascii="FreeSans" w:hAnsi="FreeSans" w:cs="FreeSans"/>
         </w:rPr>
         <w:t>« Il faut oser inventer l'avenir. »</w:t>
@@ -166,6 +184,7 @@
     </w:p>
     <w:p>
       <w:pPr>
+        <w:spacing w:after="160"/>
         <w:jc w:val="center"/>
       </w:pPr>
       <w:r>
@@ -173,7 +192,7 @@
           <w:b w:val="0"/>
           <w:i/>
           <w:color w:val="6A4040"/>
-          <w:sz w:val="19"/>
+          <w:sz w:val="17"/>
           <w:rFonts w:ascii="FreeSans" w:hAnsi="FreeSans" w:cs="FreeSans"/>
         </w:rPr>
         <w:t>— Thomas Sankara, discours à l'ONU, 4 octobre 1984</w:t>
@@ -181,6 +200,7 @@
     </w:p>
     <w:p>
       <w:pPr>
+        <w:spacing w:before="160" w:after="160"/>
         <w:jc w:val="center"/>
       </w:pPr>
       <w:r>
@@ -188,17 +208,17 @@
           <w:b w:val="0"/>
           <w:i w:val="0"/>
           <w:color w:val="D4A017"/>
-          <w:sz w:val="26"/>
+          <w:sz w:val="22"/>
           <w:rFonts w:ascii="FreeSans" w:hAnsi="FreeSans" w:cs="FreeSans"/>
         </w:rPr>
-        <w:t>❦</w:t>
+        <w:t>★  ★  ★</w:t>
       </w:r>
     </w:p>
     <w:p>
       <w:pPr>
         <w:pStyle w:val="Heading1"/>
         <w:pBdr>
-          <w:bottom w:val="single" w:sz="18" w:space="4" w:color="D4A017"/>
+          <w:bottom w:val="single" w:sz="14" w:space="4" w:color="D4A017"/>
         </w:pBdr>
       </w:pPr>
       <w:r>
@@ -236,12 +256,12 @@
         <w:tblLook w:firstColumn="1" w:firstRow="1" w:lastColumn="0" w:lastRow="0" w:noHBand="0" w:noVBand="1" w:val="04A0"/>
       </w:tblPr>
       <w:tblGrid>
-        <w:gridCol w:w="6514"/>
+        <w:gridCol w:w="6624"/>
       </w:tblGrid>
       <w:tr>
         <w:tc>
           <w:tcPr>
-            <w:tcW w:type="dxa" w:w="6514"/>
+            <w:tcW w:type="dxa" w:w="6624"/>
             <w:shd w:val="clear" w:fill="8B1A1A"/>
           </w:tcPr>
           <w:p>
@@ -260,7 +280,7 @@
       <w:tr>
         <w:tc>
           <w:tcPr>
-            <w:tcW w:type="dxa" w:w="6514"/>
+            <w:tcW w:type="dxa" w:w="6624"/>
             <w:shd w:val="clear" w:fill="FFF0EE"/>
           </w:tcPr>
           <w:p>
@@ -278,7 +298,7 @@
       <w:tr>
         <w:tc>
           <w:tcPr>
-            <w:tcW w:type="dxa" w:w="6514"/>
+            <w:tcW w:type="dxa" w:w="6624"/>
             <w:shd w:val="clear" w:fill="FFF0EE"/>
           </w:tcPr>
           <w:p>
@@ -296,7 +316,7 @@
       <w:tr>
         <w:tc>
           <w:tcPr>
-            <w:tcW w:type="dxa" w:w="6514"/>
+            <w:tcW w:type="dxa" w:w="6624"/>
             <w:shd w:val="clear" w:fill="FFF0EE"/>
           </w:tcPr>
           <w:p>
@@ -314,7 +334,7 @@
       <w:tr>
         <w:tc>
           <w:tcPr>
-            <w:tcW w:type="dxa" w:w="6514"/>
+            <w:tcW w:type="dxa" w:w="6624"/>
             <w:shd w:val="clear" w:fill="FFF0EE"/>
           </w:tcPr>
           <w:p>
@@ -338,12 +358,12 @@
         <w:tblLook w:firstColumn="1" w:firstRow="1" w:lastColumn="0" w:lastRow="0" w:noHBand="0" w:noVBand="1" w:val="04A0"/>
       </w:tblPr>
       <w:tblGrid>
-        <w:gridCol w:w="6514"/>
+        <w:gridCol w:w="6624"/>
       </w:tblGrid>
       <w:tr>
         <w:tc>
           <w:tcPr>
-            <w:tcW w:type="dxa" w:w="6514"/>
+            <w:tcW w:type="dxa" w:w="6624"/>
             <w:shd w:val="clear" w:fill="8B1A1A"/>
           </w:tcPr>
           <w:p>
@@ -362,7 +382,7 @@
       <w:tr>
         <w:tc>
           <w:tcPr>
-            <w:tcW w:type="dxa" w:w="6514"/>
+            <w:tcW w:type="dxa" w:w="6624"/>
             <w:shd w:val="clear" w:fill="FFF0EE"/>
           </w:tcPr>
           <w:p>
@@ -380,7 +400,7 @@
       <w:tr>
         <w:tc>
           <w:tcPr>
-            <w:tcW w:type="dxa" w:w="6514"/>
+            <w:tcW w:type="dxa" w:w="6624"/>
             <w:shd w:val="clear" w:fill="FFF0EE"/>
           </w:tcPr>
           <w:p>
@@ -398,7 +418,7 @@
       <w:tr>
         <w:tc>
           <w:tcPr>
-            <w:tcW w:type="dxa" w:w="6514"/>
+            <w:tcW w:type="dxa" w:w="6624"/>
             <w:shd w:val="clear" w:fill="FFF0EE"/>
           </w:tcPr>
           <w:p>
@@ -416,7 +436,7 @@
       <w:tr>
         <w:tc>
           <w:tcPr>
-            <w:tcW w:type="dxa" w:w="6514"/>
+            <w:tcW w:type="dxa" w:w="6624"/>
             <w:shd w:val="clear" w:fill="FFF0EE"/>
           </w:tcPr>
           <w:p>
@@ -434,7 +454,7 @@
       <w:tr>
         <w:tc>
           <w:tcPr>
-            <w:tcW w:type="dxa" w:w="6514"/>
+            <w:tcW w:type="dxa" w:w="6624"/>
             <w:shd w:val="clear" w:fill="FFF0EE"/>
           </w:tcPr>
           <w:p>
@@ -452,7 +472,7 @@
       <w:tr>
         <w:tc>
           <w:tcPr>
-            <w:tcW w:type="dxa" w:w="6514"/>
+            <w:tcW w:type="dxa" w:w="6624"/>
             <w:shd w:val="clear" w:fill="FFF0EE"/>
           </w:tcPr>
           <w:p>
@@ -476,12 +496,12 @@
         <w:tblLook w:firstColumn="1" w:firstRow="1" w:lastColumn="0" w:lastRow="0" w:noHBand="0" w:noVBand="1" w:val="04A0"/>
       </w:tblPr>
       <w:tblGrid>
-        <w:gridCol w:w="6514"/>
+        <w:gridCol w:w="6624"/>
       </w:tblGrid>
       <w:tr>
         <w:tc>
           <w:tcPr>
-            <w:tcW w:type="dxa" w:w="6514"/>
+            <w:tcW w:type="dxa" w:w="6624"/>
             <w:shd w:val="clear" w:fill="8B1A1A"/>
           </w:tcPr>
           <w:p>
@@ -500,7 +520,7 @@
       <w:tr>
         <w:tc>
           <w:tcPr>
-            <w:tcW w:type="dxa" w:w="6514"/>
+            <w:tcW w:type="dxa" w:w="6624"/>
             <w:shd w:val="clear" w:fill="FFF0EE"/>
           </w:tcPr>
           <w:p>
@@ -518,7 +538,7 @@
       <w:tr>
         <w:tc>
           <w:tcPr>
-            <w:tcW w:type="dxa" w:w="6514"/>
+            <w:tcW w:type="dxa" w:w="6624"/>
             <w:shd w:val="clear" w:fill="FFF0EE"/>
           </w:tcPr>
           <w:p>
@@ -536,7 +556,7 @@
       <w:tr>
         <w:tc>
           <w:tcPr>
-            <w:tcW w:type="dxa" w:w="6514"/>
+            <w:tcW w:type="dxa" w:w="6624"/>
             <w:shd w:val="clear" w:fill="FFF0EE"/>
           </w:tcPr>
           <w:p>
@@ -554,7 +574,7 @@
       <w:tr>
         <w:tc>
           <w:tcPr>
-            <w:tcW w:type="dxa" w:w="6514"/>
+            <w:tcW w:type="dxa" w:w="6624"/>
             <w:shd w:val="clear" w:fill="FFF0EE"/>
           </w:tcPr>
           <w:p>
@@ -572,7 +592,7 @@
       <w:tr>
         <w:tc>
           <w:tcPr>
-            <w:tcW w:type="dxa" w:w="6514"/>
+            <w:tcW w:type="dxa" w:w="6624"/>
             <w:shd w:val="clear" w:fill="FFF0EE"/>
           </w:tcPr>
           <w:p>
@@ -596,12 +616,12 @@
         <w:tblLook w:firstColumn="1" w:firstRow="1" w:lastColumn="0" w:lastRow="0" w:noHBand="0" w:noVBand="1" w:val="04A0"/>
       </w:tblPr>
       <w:tblGrid>
-        <w:gridCol w:w="6514"/>
+        <w:gridCol w:w="6624"/>
       </w:tblGrid>
       <w:tr>
         <w:tc>
           <w:tcPr>
-            <w:tcW w:type="dxa" w:w="6514"/>
+            <w:tcW w:type="dxa" w:w="6624"/>
             <w:shd w:val="clear" w:fill="8B1A1A"/>
           </w:tcPr>
           <w:p>
@@ -620,7 +640,7 @@
       <w:tr>
         <w:tc>
           <w:tcPr>
-            <w:tcW w:type="dxa" w:w="6514"/>
+            <w:tcW w:type="dxa" w:w="6624"/>
             <w:shd w:val="clear" w:fill="FFF0EE"/>
           </w:tcPr>
           <w:p>
@@ -638,7 +658,7 @@
       <w:tr>
         <w:tc>
           <w:tcPr>
-            <w:tcW w:type="dxa" w:w="6514"/>
+            <w:tcW w:type="dxa" w:w="6624"/>
             <w:shd w:val="clear" w:fill="FFF0EE"/>
           </w:tcPr>
           <w:p>
@@ -656,7 +676,7 @@
       <w:tr>
         <w:tc>
           <w:tcPr>
-            <w:tcW w:type="dxa" w:w="6514"/>
+            <w:tcW w:type="dxa" w:w="6624"/>
             <w:shd w:val="clear" w:fill="FFF0EE"/>
           </w:tcPr>
           <w:p>
@@ -674,7 +694,7 @@
       <w:tr>
         <w:tc>
           <w:tcPr>
-            <w:tcW w:type="dxa" w:w="6514"/>
+            <w:tcW w:type="dxa" w:w="6624"/>
             <w:shd w:val="clear" w:fill="FFF0EE"/>
           </w:tcPr>
           <w:p>
@@ -692,7 +712,7 @@
       <w:tr>
         <w:tc>
           <w:tcPr>
-            <w:tcW w:type="dxa" w:w="6514"/>
+            <w:tcW w:type="dxa" w:w="6624"/>
             <w:shd w:val="clear" w:fill="FFF0EE"/>
           </w:tcPr>
           <w:p>
@@ -710,7 +730,7 @@
       <w:tr>
         <w:tc>
           <w:tcPr>
-            <w:tcW w:type="dxa" w:w="6514"/>
+            <w:tcW w:type="dxa" w:w="6624"/>
             <w:shd w:val="clear" w:fill="FFF0EE"/>
           </w:tcPr>
           <w:p>
@@ -734,12 +754,12 @@
         <w:tblLook w:firstColumn="1" w:firstRow="1" w:lastColumn="0" w:lastRow="0" w:noHBand="0" w:noVBand="1" w:val="04A0"/>
       </w:tblPr>
       <w:tblGrid>
-        <w:gridCol w:w="6514"/>
+        <w:gridCol w:w="6624"/>
       </w:tblGrid>
       <w:tr>
         <w:tc>
           <w:tcPr>
-            <w:tcW w:type="dxa" w:w="6514"/>
+            <w:tcW w:type="dxa" w:w="6624"/>
             <w:shd w:val="clear" w:fill="8B1A1A"/>
           </w:tcPr>
           <w:p>
@@ -758,7 +778,7 @@
       <w:tr>
         <w:tc>
           <w:tcPr>
-            <w:tcW w:type="dxa" w:w="6514"/>
+            <w:tcW w:type="dxa" w:w="6624"/>
             <w:shd w:val="clear" w:fill="FFF0EE"/>
           </w:tcPr>
           <w:p>
@@ -776,7 +796,7 @@
       <w:tr>
         <w:tc>
           <w:tcPr>
-            <w:tcW w:type="dxa" w:w="6514"/>
+            <w:tcW w:type="dxa" w:w="6624"/>
             <w:shd w:val="clear" w:fill="FFF0EE"/>
           </w:tcPr>
           <w:p>
@@ -794,7 +814,7 @@
       <w:tr>
         <w:tc>
           <w:tcPr>
-            <w:tcW w:type="dxa" w:w="6514"/>
+            <w:tcW w:type="dxa" w:w="6624"/>
             <w:shd w:val="clear" w:fill="FFF0EE"/>
           </w:tcPr>
           <w:p>
@@ -812,7 +832,7 @@
       <w:tr>
         <w:tc>
           <w:tcPr>
-            <w:tcW w:type="dxa" w:w="6514"/>
+            <w:tcW w:type="dxa" w:w="6624"/>
             <w:shd w:val="clear" w:fill="FFF0EE"/>
           </w:tcPr>
           <w:p>
@@ -836,12 +856,12 @@
         <w:tblLook w:firstColumn="1" w:firstRow="1" w:lastColumn="0" w:lastRow="0" w:noHBand="0" w:noVBand="1" w:val="04A0"/>
       </w:tblPr>
       <w:tblGrid>
-        <w:gridCol w:w="6514"/>
+        <w:gridCol w:w="6624"/>
       </w:tblGrid>
       <w:tr>
         <w:tc>
           <w:tcPr>
-            <w:tcW w:type="dxa" w:w="6514"/>
+            <w:tcW w:type="dxa" w:w="6624"/>
             <w:shd w:val="clear" w:fill="8B1A1A"/>
           </w:tcPr>
           <w:p>
@@ -860,7 +880,7 @@
       <w:tr>
         <w:tc>
           <w:tcPr>
-            <w:tcW w:type="dxa" w:w="6514"/>
+            <w:tcW w:type="dxa" w:w="6624"/>
             <w:shd w:val="clear" w:fill="FFF0EE"/>
           </w:tcPr>
           <w:p>
@@ -878,7 +898,7 @@
       <w:tr>
         <w:tc>
           <w:tcPr>
-            <w:tcW w:type="dxa" w:w="6514"/>
+            <w:tcW w:type="dxa" w:w="6624"/>
             <w:shd w:val="clear" w:fill="FFF0EE"/>
           </w:tcPr>
           <w:p>
@@ -896,7 +916,7 @@
       <w:tr>
         <w:tc>
           <w:tcPr>
-            <w:tcW w:type="dxa" w:w="6514"/>
+            <w:tcW w:type="dxa" w:w="6624"/>
             <w:shd w:val="clear" w:fill="FFF0EE"/>
           </w:tcPr>
           <w:p>
@@ -914,7 +934,7 @@
       <w:tr>
         <w:tc>
           <w:tcPr>
-            <w:tcW w:type="dxa" w:w="6514"/>
+            <w:tcW w:type="dxa" w:w="6624"/>
             <w:shd w:val="clear" w:fill="FFF0EE"/>
           </w:tcPr>
           <w:p>
@@ -932,7 +952,7 @@
       <w:tr>
         <w:tc>
           <w:tcPr>
-            <w:tcW w:type="dxa" w:w="6514"/>
+            <w:tcW w:type="dxa" w:w="6624"/>
             <w:shd w:val="clear" w:fill="FFF0EE"/>
           </w:tcPr>
           <w:p>
@@ -950,7 +970,7 @@
       <w:tr>
         <w:tc>
           <w:tcPr>
-            <w:tcW w:type="dxa" w:w="6514"/>
+            <w:tcW w:type="dxa" w:w="6624"/>
             <w:shd w:val="clear" w:fill="FFF0EE"/>
           </w:tcPr>
           <w:p>
@@ -968,7 +988,7 @@
       <w:tr>
         <w:tc>
           <w:tcPr>
-            <w:tcW w:type="dxa" w:w="6514"/>
+            <w:tcW w:type="dxa" w:w="6624"/>
             <w:shd w:val="clear" w:fill="FFF0EE"/>
           </w:tcPr>
           <w:p>
@@ -986,7 +1006,7 @@
       <w:tr>
         <w:tc>
           <w:tcPr>
-            <w:tcW w:type="dxa" w:w="6514"/>
+            <w:tcW w:type="dxa" w:w="6624"/>
             <w:shd w:val="clear" w:fill="FFF0EE"/>
           </w:tcPr>
           <w:p>
@@ -1004,7 +1024,7 @@
       <w:tr>
         <w:tc>
           <w:tcPr>
-            <w:tcW w:type="dxa" w:w="6514"/>
+            <w:tcW w:type="dxa" w:w="6624"/>
             <w:shd w:val="clear" w:fill="FFF0EE"/>
           </w:tcPr>
           <w:p>
@@ -1022,7 +1042,7 @@
       <w:tr>
         <w:tc>
           <w:tcPr>
-            <w:tcW w:type="dxa" w:w="6514"/>
+            <w:tcW w:type="dxa" w:w="6624"/>
             <w:shd w:val="clear" w:fill="FFF0EE"/>
           </w:tcPr>
           <w:p>
@@ -1040,7 +1060,7 @@
       <w:tr>
         <w:tc>
           <w:tcPr>
-            <w:tcW w:type="dxa" w:w="6514"/>
+            <w:tcW w:type="dxa" w:w="6624"/>
             <w:shd w:val="clear" w:fill="FFF0EE"/>
           </w:tcPr>
           <w:p>
@@ -1059,6 +1079,7 @@
     <w:p/>
     <w:p>
       <w:pPr>
+        <w:spacing w:before="160" w:after="160"/>
         <w:jc w:val="center"/>
       </w:pPr>
       <w:r>
@@ -1066,10 +1087,10 @@
           <w:b w:val="0"/>
           <w:i w:val="0"/>
           <w:color w:val="D4A017"/>
-          <w:sz w:val="26"/>
+          <w:sz w:val="22"/>
           <w:rFonts w:ascii="FreeSans" w:hAnsi="FreeSans" w:cs="FreeSans"/>
         </w:rPr>
-        <w:t>❦</w:t>
+        <w:t>★  ★  ★</w:t>
       </w:r>
     </w:p>
     <w:p>
@@ -1142,6 +1163,7 @@
     </w:p>
     <w:p>
       <w:pPr>
+        <w:spacing w:before="160" w:after="160"/>
         <w:jc w:val="center"/>
       </w:pPr>
       <w:r>
@@ -1149,10 +1171,10 @@
           <w:b w:val="0"/>
           <w:i w:val="0"/>
           <w:color w:val="D4A017"/>
-          <w:sz w:val="26"/>
+          <w:sz w:val="22"/>
           <w:rFonts w:ascii="FreeSans" w:hAnsi="FreeSans" w:cs="FreeSans"/>
         </w:rPr>
-        <w:t>❦</w:t>
+        <w:t>★  ★  ★</w:t>
       </w:r>
     </w:p>
     <w:p>
@@ -1221,6 +1243,7 @@
     </w:p>
     <w:p>
       <w:pPr>
+        <w:spacing w:before="160" w:after="160"/>
         <w:jc w:val="center"/>
       </w:pPr>
       <w:r>
@@ -1228,10 +1251,10 @@
           <w:b w:val="0"/>
           <w:i w:val="0"/>
           <w:color w:val="D4A017"/>
-          <w:sz w:val="26"/>
+          <w:sz w:val="22"/>
           <w:rFonts w:ascii="FreeSans" w:hAnsi="FreeSans" w:cs="FreeSans"/>
         </w:rPr>
-        <w:t>❦</w:t>
+        <w:t>★  ★  ★</w:t>
       </w:r>
     </w:p>
     <w:p>
@@ -1318,6 +1341,7 @@
     </w:p>
     <w:p>
       <w:pPr>
+        <w:spacing w:before="160" w:after="160"/>
         <w:jc w:val="center"/>
       </w:pPr>
       <w:r>
@@ -1325,10 +1349,10 @@
           <w:b w:val="0"/>
           <w:i w:val="0"/>
           <w:color w:val="D4A017"/>
-          <w:sz w:val="26"/>
+          <w:sz w:val="22"/>
           <w:rFonts w:ascii="FreeSans" w:hAnsi="FreeSans" w:cs="FreeSans"/>
         </w:rPr>
-        <w:t>❦</w:t>
+        <w:t>★  ★  ★</w:t>
       </w:r>
     </w:p>
     <w:p>
@@ -1339,16 +1363,18 @@
     <w:p/>
     <w:p/>
     <w:p/>
+    <w:p/>
+    <w:p/>
     <w:p>
       <w:pPr>
         <w:pBdr>
-          <w:top w:val="single" w:sz="24" w:space="4" w:color="D4A017"/>
+          <w:bottom w:val="single" w:sz="24" w:space="4" w:color="D4A017"/>
         </w:pBdr>
       </w:pPr>
     </w:p>
     <w:p>
       <w:pPr>
-        <w:spacing w:before="280" w:after="280"/>
+        <w:spacing w:before="320" w:after="320"/>
         <w:jc w:val="center"/>
       </w:pPr>
       <w:r>
@@ -1365,13 +1391,13 @@
     <w:p>
       <w:pPr>
         <w:pBdr>
-          <w:bottom w:val="single" w:sz="24" w:space="4" w:color="D4A017"/>
+          <w:top w:val="single" w:sz="24" w:space="4" w:color="D4A017"/>
         </w:pBdr>
       </w:pPr>
     </w:p>
-    <w:p/>
-    <w:p>
-      <w:pPr>
+    <w:p>
+      <w:pPr>
+        <w:spacing w:before="160" w:after="160"/>
         <w:jc w:val="center"/>
       </w:pPr>
       <w:r>
@@ -1379,10 +1405,10 @@
           <w:b w:val="0"/>
           <w:i w:val="0"/>
           <w:color w:val="D4A017"/>
-          <w:sz w:val="26"/>
+          <w:sz w:val="22"/>
           <w:rFonts w:ascii="FreeSans" w:hAnsi="FreeSans" w:cs="FreeSans"/>
         </w:rPr>
-        <w:t>❦</w:t>
+        <w:t>★  ★  ★</w:t>
       </w:r>
     </w:p>
     <w:p>
@@ -1393,16 +1419,18 @@
     <w:p/>
     <w:p/>
     <w:p/>
+    <w:p/>
+    <w:p/>
     <w:p>
       <w:pPr>
         <w:pBdr>
-          <w:top w:val="single" w:sz="24" w:space="4" w:color="D4A017"/>
+          <w:bottom w:val="single" w:sz="24" w:space="4" w:color="D4A017"/>
         </w:pBdr>
       </w:pPr>
     </w:p>
     <w:p>
       <w:pPr>
-        <w:spacing w:before="280" w:after="280"/>
+        <w:spacing w:before="320" w:after="320"/>
         <w:jc w:val="center"/>
       </w:pPr>
       <w:r>
@@ -1419,11 +1447,10 @@
     <w:p>
       <w:pPr>
         <w:pBdr>
-          <w:bottom w:val="single" w:sz="24" w:space="4" w:color="D4A017"/>
+          <w:top w:val="single" w:sz="24" w:space="4" w:color="D4A017"/>
         </w:pBdr>
       </w:pPr>
     </w:p>
-    <w:p/>
     <w:p>
       <w:pPr>
         <w:spacing w:before="40" w:after="120"/>
@@ -1448,6 +1475,7 @@
     </w:p>
     <w:p>
       <w:pPr>
+        <w:spacing w:before="160" w:after="160"/>
         <w:jc w:val="center"/>
       </w:pPr>
       <w:r>
@@ -1455,10 +1483,10 @@
           <w:b w:val="0"/>
           <w:i w:val="0"/>
           <w:color w:val="D4A017"/>
-          <w:sz w:val="26"/>
+          <w:sz w:val="22"/>
           <w:rFonts w:ascii="FreeSans" w:hAnsi="FreeSans" w:cs="FreeSans"/>
         </w:rPr>
-        <w:t>❦</w:t>
+        <w:t>★  ★  ★</w:t>
       </w:r>
     </w:p>
     <w:p>
@@ -1561,12 +1589,12 @@
         <w:tblLook w:firstColumn="1" w:firstRow="1" w:lastColumn="0" w:lastRow="0" w:noHBand="0" w:noVBand="1" w:val="04A0"/>
       </w:tblPr>
       <w:tblGrid>
-        <w:gridCol w:w="6514"/>
+        <w:gridCol w:w="6624"/>
       </w:tblGrid>
       <w:tr>
         <w:tc>
           <w:tcPr>
-            <w:tcW w:type="dxa" w:w="6514"/>
+            <w:tcW w:type="dxa" w:w="6624"/>
             <w:shd w:val="clear" w:fill="8B1A1A"/>
           </w:tcPr>
           <w:p>
@@ -1585,7 +1613,7 @@
       <w:tr>
         <w:tc>
           <w:tcPr>
-            <w:tcW w:type="dxa" w:w="6514"/>
+            <w:tcW w:type="dxa" w:w="6624"/>
             <w:shd w:val="clear" w:fill="FFF0EE"/>
           </w:tcPr>
           <w:p>
@@ -1603,7 +1631,7 @@
       <w:tr>
         <w:tc>
           <w:tcPr>
-            <w:tcW w:type="dxa" w:w="6514"/>
+            <w:tcW w:type="dxa" w:w="6624"/>
             <w:shd w:val="clear" w:fill="FFF0EE"/>
           </w:tcPr>
           <w:p>
@@ -1621,7 +1649,7 @@
       <w:tr>
         <w:tc>
           <w:tcPr>
-            <w:tcW w:type="dxa" w:w="6514"/>
+            <w:tcW w:type="dxa" w:w="6624"/>
             <w:shd w:val="clear" w:fill="FFF0EE"/>
           </w:tcPr>
           <w:p>
@@ -1639,7 +1667,7 @@
       <w:tr>
         <w:tc>
           <w:tcPr>
-            <w:tcW w:type="dxa" w:w="6514"/>
+            <w:tcW w:type="dxa" w:w="6624"/>
             <w:shd w:val="clear" w:fill="FFF0EE"/>
           </w:tcPr>
           <w:p>
@@ -1657,7 +1685,7 @@
       <w:tr>
         <w:tc>
           <w:tcPr>
-            <w:tcW w:type="dxa" w:w="6514"/>
+            <w:tcW w:type="dxa" w:w="6624"/>
             <w:shd w:val="clear" w:fill="FFF0EE"/>
           </w:tcPr>
           <w:p>
@@ -1675,7 +1703,7 @@
       <w:tr>
         <w:tc>
           <w:tcPr>
-            <w:tcW w:type="dxa" w:w="6514"/>
+            <w:tcW w:type="dxa" w:w="6624"/>
             <w:shd w:val="clear" w:fill="FFF0EE"/>
           </w:tcPr>
           <w:p>
@@ -1717,6 +1745,7 @@
     </w:p>
     <w:p>
       <w:pPr>
+        <w:spacing w:before="160" w:after="160"/>
         <w:jc w:val="center"/>
       </w:pPr>
       <w:r>
@@ -1724,10 +1753,10 @@
           <w:b w:val="0"/>
           <w:i w:val="0"/>
           <w:color w:val="D4A017"/>
-          <w:sz w:val="26"/>
+          <w:sz w:val="22"/>
           <w:rFonts w:ascii="FreeSans" w:hAnsi="FreeSans" w:cs="FreeSans"/>
         </w:rPr>
-        <w:t>❦</w:t>
+        <w:t>★  ★  ★</w:t>
       </w:r>
     </w:p>
     <w:p>
@@ -1798,12 +1827,12 @@
         <w:tblLook w:firstColumn="1" w:firstRow="1" w:lastColumn="0" w:lastRow="0" w:noHBand="0" w:noVBand="1" w:val="04A0"/>
       </w:tblPr>
       <w:tblGrid>
-        <w:gridCol w:w="6514"/>
+        <w:gridCol w:w="6624"/>
       </w:tblGrid>
       <w:tr>
         <w:tc>
           <w:tcPr>
-            <w:tcW w:type="dxa" w:w="6514"/>
+            <w:tcW w:type="dxa" w:w="6624"/>
             <w:shd w:val="clear" w:fill="8B1A1A"/>
           </w:tcPr>
           <w:p>
@@ -1822,7 +1851,7 @@
       <w:tr>
         <w:tc>
           <w:tcPr>
-            <w:tcW w:type="dxa" w:w="6514"/>
+            <w:tcW w:type="dxa" w:w="6624"/>
             <w:shd w:val="clear" w:fill="FFF0EE"/>
           </w:tcPr>
           <w:p>
@@ -1840,7 +1869,7 @@
       <w:tr>
         <w:tc>
           <w:tcPr>
-            <w:tcW w:type="dxa" w:w="6514"/>
+            <w:tcW w:type="dxa" w:w="6624"/>
             <w:shd w:val="clear" w:fill="FFF0EE"/>
           </w:tcPr>
           <w:p>
@@ -1858,7 +1887,7 @@
       <w:tr>
         <w:tc>
           <w:tcPr>
-            <w:tcW w:type="dxa" w:w="6514"/>
+            <w:tcW w:type="dxa" w:w="6624"/>
             <w:shd w:val="clear" w:fill="FFF0EE"/>
           </w:tcPr>
           <w:p>
@@ -1876,7 +1905,7 @@
       <w:tr>
         <w:tc>
           <w:tcPr>
-            <w:tcW w:type="dxa" w:w="6514"/>
+            <w:tcW w:type="dxa" w:w="6624"/>
             <w:shd w:val="clear" w:fill="FFF0EE"/>
           </w:tcPr>
           <w:p>
@@ -1918,6 +1947,7 @@
     </w:p>
     <w:p>
       <w:pPr>
+        <w:spacing w:before="160" w:after="160"/>
         <w:jc w:val="center"/>
       </w:pPr>
       <w:r>
@@ -1925,10 +1955,10 @@
           <w:b w:val="0"/>
           <w:i w:val="0"/>
           <w:color w:val="D4A017"/>
-          <w:sz w:val="26"/>
+          <w:sz w:val="22"/>
           <w:rFonts w:ascii="FreeSans" w:hAnsi="FreeSans" w:cs="FreeSans"/>
         </w:rPr>
-        <w:t>❦</w:t>
+        <w:t>★  ★  ★</w:t>
       </w:r>
     </w:p>
     <w:p>
@@ -2008,12 +2038,12 @@
         <w:tblLook w:firstColumn="1" w:firstRow="1" w:lastColumn="0" w:lastRow="0" w:noHBand="0" w:noVBand="1" w:val="04A0"/>
       </w:tblPr>
       <w:tblGrid>
-        <w:gridCol w:w="6514"/>
+        <w:gridCol w:w="6624"/>
       </w:tblGrid>
       <w:tr>
         <w:tc>
           <w:tcPr>
-            <w:tcW w:type="dxa" w:w="6514"/>
+            <w:tcW w:type="dxa" w:w="6624"/>
             <w:shd w:val="clear" w:fill="8B1A1A"/>
           </w:tcPr>
           <w:p>
@@ -2032,7 +2062,7 @@
       <w:tr>
         <w:tc>
           <w:tcPr>
-            <w:tcW w:type="dxa" w:w="6514"/>
+            <w:tcW w:type="dxa" w:w="6624"/>
             <w:shd w:val="clear" w:fill="FFF0EE"/>
           </w:tcPr>
           <w:p>
@@ -2050,7 +2080,7 @@
       <w:tr>
         <w:tc>
           <w:tcPr>
-            <w:tcW w:type="dxa" w:w="6514"/>
+            <w:tcW w:type="dxa" w:w="6624"/>
             <w:shd w:val="clear" w:fill="FFF0EE"/>
           </w:tcPr>
           <w:p>
@@ -2068,7 +2098,7 @@
       <w:tr>
         <w:tc>
           <w:tcPr>
-            <w:tcW w:type="dxa" w:w="6514"/>
+            <w:tcW w:type="dxa" w:w="6624"/>
             <w:shd w:val="clear" w:fill="FFF0EE"/>
           </w:tcPr>
           <w:p>
@@ -2086,7 +2116,7 @@
       <w:tr>
         <w:tc>
           <w:tcPr>
-            <w:tcW w:type="dxa" w:w="6514"/>
+            <w:tcW w:type="dxa" w:w="6624"/>
             <w:shd w:val="clear" w:fill="FFF0EE"/>
           </w:tcPr>
           <w:p>
@@ -2128,6 +2158,7 @@
     </w:p>
     <w:p>
       <w:pPr>
+        <w:spacing w:before="160" w:after="160"/>
         <w:jc w:val="center"/>
       </w:pPr>
       <w:r>
@@ -2135,10 +2166,10 @@
           <w:b w:val="0"/>
           <w:i w:val="0"/>
           <w:color w:val="D4A017"/>
-          <w:sz w:val="26"/>
+          <w:sz w:val="22"/>
           <w:rFonts w:ascii="FreeSans" w:hAnsi="FreeSans" w:cs="FreeSans"/>
         </w:rPr>
-        <w:t>❦</w:t>
+        <w:t>★  ★  ★</w:t>
       </w:r>
     </w:p>
     <w:p>
@@ -2205,12 +2236,12 @@
         <w:tblLook w:firstColumn="1" w:firstRow="1" w:lastColumn="0" w:lastRow="0" w:noHBand="0" w:noVBand="1" w:val="04A0"/>
       </w:tblPr>
       <w:tblGrid>
-        <w:gridCol w:w="6514"/>
+        <w:gridCol w:w="6624"/>
       </w:tblGrid>
       <w:tr>
         <w:tc>
           <w:tcPr>
-            <w:tcW w:type="dxa" w:w="6514"/>
+            <w:tcW w:type="dxa" w:w="6624"/>
             <w:shd w:val="clear" w:fill="8B1A1A"/>
           </w:tcPr>
           <w:p>
@@ -2229,7 +2260,7 @@
       <w:tr>
         <w:tc>
           <w:tcPr>
-            <w:tcW w:type="dxa" w:w="6514"/>
+            <w:tcW w:type="dxa" w:w="6624"/>
             <w:shd w:val="clear" w:fill="FFF0EE"/>
           </w:tcPr>
           <w:p>
@@ -2247,7 +2278,7 @@
       <w:tr>
         <w:tc>
           <w:tcPr>
-            <w:tcW w:type="dxa" w:w="6514"/>
+            <w:tcW w:type="dxa" w:w="6624"/>
             <w:shd w:val="clear" w:fill="FFF0EE"/>
           </w:tcPr>
           <w:p>
@@ -2265,7 +2296,7 @@
       <w:tr>
         <w:tc>
           <w:tcPr>
-            <w:tcW w:type="dxa" w:w="6514"/>
+            <w:tcW w:type="dxa" w:w="6624"/>
             <w:shd w:val="clear" w:fill="FFF0EE"/>
           </w:tcPr>
           <w:p>
@@ -2283,7 +2314,7 @@
       <w:tr>
         <w:tc>
           <w:tcPr>
-            <w:tcW w:type="dxa" w:w="6514"/>
+            <w:tcW w:type="dxa" w:w="6624"/>
             <w:shd w:val="clear" w:fill="FFF0EE"/>
           </w:tcPr>
           <w:p>
@@ -2301,7 +2332,7 @@
       <w:tr>
         <w:tc>
           <w:tcPr>
-            <w:tcW w:type="dxa" w:w="6514"/>
+            <w:tcW w:type="dxa" w:w="6624"/>
             <w:shd w:val="clear" w:fill="FFF0EE"/>
           </w:tcPr>
           <w:p>
@@ -2361,6 +2392,7 @@
     </w:p>
     <w:p>
       <w:pPr>
+        <w:spacing w:before="160" w:after="160"/>
         <w:jc w:val="center"/>
       </w:pPr>
       <w:r>
@@ -2368,10 +2400,10 @@
           <w:b w:val="0"/>
           <w:i w:val="0"/>
           <w:color w:val="D4A017"/>
-          <w:sz w:val="26"/>
+          <w:sz w:val="22"/>
           <w:rFonts w:ascii="FreeSans" w:hAnsi="FreeSans" w:cs="FreeSans"/>
         </w:rPr>
-        <w:t>❦</w:t>
+        <w:t>★  ★  ★</w:t>
       </w:r>
     </w:p>
     <w:p>
@@ -2382,16 +2414,18 @@
     <w:p/>
     <w:p/>
     <w:p/>
+    <w:p/>
+    <w:p/>
     <w:p>
       <w:pPr>
         <w:pBdr>
-          <w:top w:val="single" w:sz="24" w:space="4" w:color="D4A017"/>
+          <w:bottom w:val="single" w:sz="24" w:space="4" w:color="D4A017"/>
         </w:pBdr>
       </w:pPr>
     </w:p>
     <w:p>
       <w:pPr>
-        <w:spacing w:before="280" w:after="280"/>
+        <w:spacing w:before="320" w:after="320"/>
         <w:jc w:val="center"/>
       </w:pPr>
       <w:r>
@@ -2408,13 +2442,13 @@
     <w:p>
       <w:pPr>
         <w:pBdr>
-          <w:bottom w:val="single" w:sz="24" w:space="4" w:color="D4A017"/>
+          <w:top w:val="single" w:sz="24" w:space="4" w:color="D4A017"/>
         </w:pBdr>
       </w:pPr>
     </w:p>
-    <w:p/>
-    <w:p>
-      <w:pPr>
+    <w:p>
+      <w:pPr>
+        <w:spacing w:before="160" w:after="160"/>
         <w:jc w:val="center"/>
       </w:pPr>
       <w:r>
@@ -2422,10 +2456,10 @@
           <w:b w:val="0"/>
           <w:i w:val="0"/>
           <w:color w:val="D4A017"/>
-          <w:sz w:val="26"/>
+          <w:sz w:val="22"/>
           <w:rFonts w:ascii="FreeSans" w:hAnsi="FreeSans" w:cs="FreeSans"/>
         </w:rPr>
-        <w:t>❦</w:t>
+        <w:t>★  ★  ★</w:t>
       </w:r>
     </w:p>
     <w:p>
@@ -2436,16 +2470,18 @@
     <w:p/>
     <w:p/>
     <w:p/>
+    <w:p/>
+    <w:p/>
     <w:p>
       <w:pPr>
         <w:pBdr>
-          <w:top w:val="single" w:sz="24" w:space="4" w:color="D4A017"/>
+          <w:bottom w:val="single" w:sz="24" w:space="4" w:color="D4A017"/>
         </w:pBdr>
       </w:pPr>
     </w:p>
     <w:p>
       <w:pPr>
-        <w:spacing w:before="280" w:after="280"/>
+        <w:spacing w:before="320" w:after="320"/>
         <w:jc w:val="center"/>
       </w:pPr>
       <w:r>
@@ -2462,11 +2498,10 @@
     <w:p>
       <w:pPr>
         <w:pBdr>
-          <w:bottom w:val="single" w:sz="24" w:space="4" w:color="D4A017"/>
+          <w:top w:val="single" w:sz="24" w:space="4" w:color="D4A017"/>
         </w:pBdr>
       </w:pPr>
     </w:p>
-    <w:p/>
     <w:p>
       <w:r>
         <w:t>L'Afrique d'avant la conquête avait des empires, des universités, des monnaies. La Partie I l'a montré. Reste alors une énigme: comment un continent aussi riche a-t-il pu devenir, en quelques décennies, le plus dépendant du monde?</w:t>
@@ -2489,6 +2524,7 @@
     </w:p>
     <w:p>
       <w:pPr>
+        <w:spacing w:before="160" w:after="160"/>
         <w:jc w:val="center"/>
       </w:pPr>
       <w:r>
@@ -2496,10 +2532,10 @@
           <w:b w:val="0"/>
           <w:i w:val="0"/>
           <w:color w:val="D4A017"/>
-          <w:sz w:val="26"/>
+          <w:sz w:val="22"/>
           <w:rFonts w:ascii="FreeSans" w:hAnsi="FreeSans" w:cs="FreeSans"/>
         </w:rPr>
-        <w:t>❦</w:t>
+        <w:t>★  ★  ★</w:t>
       </w:r>
     </w:p>
     <w:p>
@@ -2660,12 +2696,12 @@
         <w:tblLook w:firstColumn="1" w:firstRow="1" w:lastColumn="0" w:lastRow="0" w:noHBand="0" w:noVBand="1" w:val="04A0"/>
       </w:tblPr>
       <w:tblGrid>
-        <w:gridCol w:w="6514"/>
+        <w:gridCol w:w="6624"/>
       </w:tblGrid>
       <w:tr>
         <w:tc>
           <w:tcPr>
-            <w:tcW w:type="dxa" w:w="6514"/>
+            <w:tcW w:type="dxa" w:w="6624"/>
             <w:shd w:val="clear" w:fill="8B1A1A"/>
           </w:tcPr>
           <w:p>
@@ -2684,7 +2720,7 @@
       <w:tr>
         <w:tc>
           <w:tcPr>
-            <w:tcW w:type="dxa" w:w="6514"/>
+            <w:tcW w:type="dxa" w:w="6624"/>
             <w:shd w:val="clear" w:fill="FFF0EE"/>
           </w:tcPr>
           <w:p>
@@ -2702,7 +2738,7 @@
       <w:tr>
         <w:tc>
           <w:tcPr>
-            <w:tcW w:type="dxa" w:w="6514"/>
+            <w:tcW w:type="dxa" w:w="6624"/>
             <w:shd w:val="clear" w:fill="FFF0EE"/>
           </w:tcPr>
           <w:p>
@@ -2720,7 +2756,7 @@
       <w:tr>
         <w:tc>
           <w:tcPr>
-            <w:tcW w:type="dxa" w:w="6514"/>
+            <w:tcW w:type="dxa" w:w="6624"/>
             <w:shd w:val="clear" w:fill="FFF0EE"/>
           </w:tcPr>
           <w:p>
@@ -2762,6 +2798,7 @@
     </w:p>
     <w:p>
       <w:pPr>
+        <w:spacing w:before="160" w:after="160"/>
         <w:jc w:val="center"/>
       </w:pPr>
       <w:r>
@@ -2769,10 +2806,10 @@
           <w:b w:val="0"/>
           <w:i w:val="0"/>
           <w:color w:val="D4A017"/>
-          <w:sz w:val="26"/>
+          <w:sz w:val="22"/>
           <w:rFonts w:ascii="FreeSans" w:hAnsi="FreeSans" w:cs="FreeSans"/>
         </w:rPr>
-        <w:t>❦</w:t>
+        <w:t>★  ★  ★</w:t>
       </w:r>
     </w:p>
     <w:p>
@@ -2904,12 +2941,12 @@
         <w:tblLook w:firstColumn="1" w:firstRow="1" w:lastColumn="0" w:lastRow="0" w:noHBand="0" w:noVBand="1" w:val="04A0"/>
       </w:tblPr>
       <w:tblGrid>
-        <w:gridCol w:w="6514"/>
+        <w:gridCol w:w="6624"/>
       </w:tblGrid>
       <w:tr>
         <w:tc>
           <w:tcPr>
-            <w:tcW w:type="dxa" w:w="6514"/>
+            <w:tcW w:type="dxa" w:w="6624"/>
             <w:shd w:val="clear" w:fill="8B1A1A"/>
           </w:tcPr>
           <w:p>
@@ -2928,7 +2965,7 @@
       <w:tr>
         <w:tc>
           <w:tcPr>
-            <w:tcW w:type="dxa" w:w="6514"/>
+            <w:tcW w:type="dxa" w:w="6624"/>
             <w:shd w:val="clear" w:fill="FFF0EE"/>
           </w:tcPr>
           <w:p>
@@ -2946,7 +2983,7 @@
       <w:tr>
         <w:tc>
           <w:tcPr>
-            <w:tcW w:type="dxa" w:w="6514"/>
+            <w:tcW w:type="dxa" w:w="6624"/>
             <w:shd w:val="clear" w:fill="FFF0EE"/>
           </w:tcPr>
           <w:p>
@@ -2964,7 +3001,7 @@
       <w:tr>
         <w:tc>
           <w:tcPr>
-            <w:tcW w:type="dxa" w:w="6514"/>
+            <w:tcW w:type="dxa" w:w="6624"/>
             <w:shd w:val="clear" w:fill="FFF0EE"/>
           </w:tcPr>
           <w:p>
@@ -2982,7 +3019,7 @@
       <w:tr>
         <w:tc>
           <w:tcPr>
-            <w:tcW w:type="dxa" w:w="6514"/>
+            <w:tcW w:type="dxa" w:w="6624"/>
             <w:shd w:val="clear" w:fill="FFF0EE"/>
           </w:tcPr>
           <w:p>
@@ -3000,7 +3037,7 @@
       <w:tr>
         <w:tc>
           <w:tcPr>
-            <w:tcW w:type="dxa" w:w="6514"/>
+            <w:tcW w:type="dxa" w:w="6624"/>
             <w:shd w:val="clear" w:fill="FFF0EE"/>
           </w:tcPr>
           <w:p>
@@ -3047,6 +3084,7 @@
     </w:p>
     <w:p>
       <w:pPr>
+        <w:spacing w:before="160" w:after="160"/>
         <w:jc w:val="center"/>
       </w:pPr>
       <w:r>
@@ -3054,10 +3092,10 @@
           <w:b w:val="0"/>
           <w:i w:val="0"/>
           <w:color w:val="D4A017"/>
-          <w:sz w:val="26"/>
+          <w:sz w:val="22"/>
           <w:rFonts w:ascii="FreeSans" w:hAnsi="FreeSans" w:cs="FreeSans"/>
         </w:rPr>
-        <w:t>❦</w:t>
+        <w:t>★  ★  ★</w:t>
       </w:r>
     </w:p>
     <w:p>
@@ -3133,12 +3171,12 @@
         <w:tblLook w:firstColumn="1" w:firstRow="1" w:lastColumn="0" w:lastRow="0" w:noHBand="0" w:noVBand="1" w:val="04A0"/>
       </w:tblPr>
       <w:tblGrid>
-        <w:gridCol w:w="6514"/>
+        <w:gridCol w:w="6624"/>
       </w:tblGrid>
       <w:tr>
         <w:tc>
           <w:tcPr>
-            <w:tcW w:type="dxa" w:w="6514"/>
+            <w:tcW w:type="dxa" w:w="6624"/>
             <w:shd w:val="clear" w:fill="8B1A1A"/>
           </w:tcPr>
           <w:p>
@@ -3157,7 +3195,7 @@
       <w:tr>
         <w:tc>
           <w:tcPr>
-            <w:tcW w:type="dxa" w:w="6514"/>
+            <w:tcW w:type="dxa" w:w="6624"/>
             <w:shd w:val="clear" w:fill="FFF0EE"/>
           </w:tcPr>
           <w:p>
@@ -3175,7 +3213,7 @@
       <w:tr>
         <w:tc>
           <w:tcPr>
-            <w:tcW w:type="dxa" w:w="6514"/>
+            <w:tcW w:type="dxa" w:w="6624"/>
             <w:shd w:val="clear" w:fill="FFF0EE"/>
           </w:tcPr>
           <w:p>
@@ -3193,7 +3231,7 @@
       <w:tr>
         <w:tc>
           <w:tcPr>
-            <w:tcW w:type="dxa" w:w="6514"/>
+            <w:tcW w:type="dxa" w:w="6624"/>
             <w:shd w:val="clear" w:fill="FFF0EE"/>
           </w:tcPr>
           <w:p>
@@ -3211,7 +3249,7 @@
       <w:tr>
         <w:tc>
           <w:tcPr>
-            <w:tcW w:type="dxa" w:w="6514"/>
+            <w:tcW w:type="dxa" w:w="6624"/>
             <w:shd w:val="clear" w:fill="FFF0EE"/>
           </w:tcPr>
           <w:p>
@@ -3289,6 +3327,7 @@
     </w:p>
     <w:p>
       <w:pPr>
+        <w:spacing w:before="160" w:after="160"/>
         <w:jc w:val="center"/>
       </w:pPr>
       <w:r>
@@ -3296,10 +3335,10 @@
           <w:b w:val="0"/>
           <w:i w:val="0"/>
           <w:color w:val="D4A017"/>
-          <w:sz w:val="26"/>
+          <w:sz w:val="22"/>
           <w:rFonts w:ascii="FreeSans" w:hAnsi="FreeSans" w:cs="FreeSans"/>
         </w:rPr>
-        <w:t>❦</w:t>
+        <w:t>★  ★  ★</w:t>
       </w:r>
     </w:p>
     <w:p>
@@ -3380,12 +3419,12 @@
         <w:tblLook w:firstColumn="1" w:firstRow="1" w:lastColumn="0" w:lastRow="0" w:noHBand="0" w:noVBand="1" w:val="04A0"/>
       </w:tblPr>
       <w:tblGrid>
-        <w:gridCol w:w="6514"/>
+        <w:gridCol w:w="6624"/>
       </w:tblGrid>
       <w:tr>
         <w:tc>
           <w:tcPr>
-            <w:tcW w:type="dxa" w:w="6514"/>
+            <w:tcW w:type="dxa" w:w="6624"/>
             <w:shd w:val="clear" w:fill="8B1A1A"/>
           </w:tcPr>
           <w:p>
@@ -3404,7 +3443,7 @@
       <w:tr>
         <w:tc>
           <w:tcPr>
-            <w:tcW w:type="dxa" w:w="6514"/>
+            <w:tcW w:type="dxa" w:w="6624"/>
             <w:shd w:val="clear" w:fill="FFF0EE"/>
           </w:tcPr>
           <w:p>
@@ -3422,7 +3461,7 @@
       <w:tr>
         <w:tc>
           <w:tcPr>
-            <w:tcW w:type="dxa" w:w="6514"/>
+            <w:tcW w:type="dxa" w:w="6624"/>
             <w:shd w:val="clear" w:fill="FFF0EE"/>
           </w:tcPr>
           <w:p>
@@ -3440,7 +3479,7 @@
       <w:tr>
         <w:tc>
           <w:tcPr>
-            <w:tcW w:type="dxa" w:w="6514"/>
+            <w:tcW w:type="dxa" w:w="6624"/>
             <w:shd w:val="clear" w:fill="FFF0EE"/>
           </w:tcPr>
           <w:p>
@@ -3458,7 +3497,7 @@
       <w:tr>
         <w:tc>
           <w:tcPr>
-            <w:tcW w:type="dxa" w:w="6514"/>
+            <w:tcW w:type="dxa" w:w="6624"/>
             <w:shd w:val="clear" w:fill="FFF0EE"/>
           </w:tcPr>
           <w:p>
@@ -3476,7 +3515,7 @@
       <w:tr>
         <w:tc>
           <w:tcPr>
-            <w:tcW w:type="dxa" w:w="6514"/>
+            <w:tcW w:type="dxa" w:w="6624"/>
             <w:shd w:val="clear" w:fill="FFF0EE"/>
           </w:tcPr>
           <w:p>
@@ -3554,6 +3593,7 @@
     </w:p>
     <w:p>
       <w:pPr>
+        <w:spacing w:before="160" w:after="160"/>
         <w:jc w:val="center"/>
       </w:pPr>
       <w:r>
@@ -3561,10 +3601,10 @@
           <w:b w:val="0"/>
           <w:i w:val="0"/>
           <w:color w:val="D4A017"/>
-          <w:sz w:val="26"/>
+          <w:sz w:val="22"/>
           <w:rFonts w:ascii="FreeSans" w:hAnsi="FreeSans" w:cs="FreeSans"/>
         </w:rPr>
-        <w:t>❦</w:t>
+        <w:t>★  ★  ★</w:t>
       </w:r>
     </w:p>
     <w:p>
@@ -3663,12 +3703,12 @@
         <w:tblLook w:firstColumn="1" w:firstRow="1" w:lastColumn="0" w:lastRow="0" w:noHBand="0" w:noVBand="1" w:val="04A0"/>
       </w:tblPr>
       <w:tblGrid>
-        <w:gridCol w:w="6514"/>
+        <w:gridCol w:w="6624"/>
       </w:tblGrid>
       <w:tr>
         <w:tc>
           <w:tcPr>
-            <w:tcW w:type="dxa" w:w="6514"/>
+            <w:tcW w:type="dxa" w:w="6624"/>
             <w:shd w:val="clear" w:fill="8B1A1A"/>
           </w:tcPr>
           <w:p>
@@ -3687,7 +3727,7 @@
       <w:tr>
         <w:tc>
           <w:tcPr>
-            <w:tcW w:type="dxa" w:w="6514"/>
+            <w:tcW w:type="dxa" w:w="6624"/>
             <w:shd w:val="clear" w:fill="FFF0EE"/>
           </w:tcPr>
           <w:p>
@@ -3705,7 +3745,7 @@
       <w:tr>
         <w:tc>
           <w:tcPr>
-            <w:tcW w:type="dxa" w:w="6514"/>
+            <w:tcW w:type="dxa" w:w="6624"/>
             <w:shd w:val="clear" w:fill="FFF0EE"/>
           </w:tcPr>
           <w:p>
@@ -3723,7 +3763,7 @@
       <w:tr>
         <w:tc>
           <w:tcPr>
-            <w:tcW w:type="dxa" w:w="6514"/>
+            <w:tcW w:type="dxa" w:w="6624"/>
             <w:shd w:val="clear" w:fill="FFF0EE"/>
           </w:tcPr>
           <w:p>
@@ -3741,7 +3781,7 @@
       <w:tr>
         <w:tc>
           <w:tcPr>
-            <w:tcW w:type="dxa" w:w="6514"/>
+            <w:tcW w:type="dxa" w:w="6624"/>
             <w:shd w:val="clear" w:fill="FFF0EE"/>
           </w:tcPr>
           <w:p>
@@ -3759,7 +3799,7 @@
       <w:tr>
         <w:tc>
           <w:tcPr>
-            <w:tcW w:type="dxa" w:w="6514"/>
+            <w:tcW w:type="dxa" w:w="6624"/>
             <w:shd w:val="clear" w:fill="FFF0EE"/>
           </w:tcPr>
           <w:p>
@@ -3777,7 +3817,7 @@
       <w:tr>
         <w:tc>
           <w:tcPr>
-            <w:tcW w:type="dxa" w:w="6514"/>
+            <w:tcW w:type="dxa" w:w="6624"/>
             <w:shd w:val="clear" w:fill="FFF0EE"/>
           </w:tcPr>
           <w:p>
@@ -3871,6 +3911,7 @@
     </w:p>
     <w:p>
       <w:pPr>
+        <w:spacing w:before="160" w:after="160"/>
         <w:jc w:val="center"/>
       </w:pPr>
       <w:r>
@@ -3878,10 +3919,10 @@
           <w:b w:val="0"/>
           <w:i w:val="0"/>
           <w:color w:val="D4A017"/>
-          <w:sz w:val="26"/>
+          <w:sz w:val="22"/>
           <w:rFonts w:ascii="FreeSans" w:hAnsi="FreeSans" w:cs="FreeSans"/>
         </w:rPr>
-        <w:t>❦</w:t>
+        <w:t>★  ★  ★</w:t>
       </w:r>
     </w:p>
     <w:p>
@@ -3952,12 +3993,12 @@
         <w:tblLook w:firstColumn="1" w:firstRow="1" w:lastColumn="0" w:lastRow="0" w:noHBand="0" w:noVBand="1" w:val="04A0"/>
       </w:tblPr>
       <w:tblGrid>
-        <w:gridCol w:w="6514"/>
+        <w:gridCol w:w="6624"/>
       </w:tblGrid>
       <w:tr>
         <w:tc>
           <w:tcPr>
-            <w:tcW w:type="dxa" w:w="6514"/>
+            <w:tcW w:type="dxa" w:w="6624"/>
             <w:shd w:val="clear" w:fill="8B1A1A"/>
           </w:tcPr>
           <w:p>
@@ -3976,7 +4017,7 @@
       <w:tr>
         <w:tc>
           <w:tcPr>
-            <w:tcW w:type="dxa" w:w="6514"/>
+            <w:tcW w:type="dxa" w:w="6624"/>
             <w:shd w:val="clear" w:fill="FFF0EE"/>
           </w:tcPr>
           <w:p>
@@ -3994,7 +4035,7 @@
       <w:tr>
         <w:tc>
           <w:tcPr>
-            <w:tcW w:type="dxa" w:w="6514"/>
+            <w:tcW w:type="dxa" w:w="6624"/>
             <w:shd w:val="clear" w:fill="FFF0EE"/>
           </w:tcPr>
           <w:p>
@@ -4012,7 +4053,7 @@
       <w:tr>
         <w:tc>
           <w:tcPr>
-            <w:tcW w:type="dxa" w:w="6514"/>
+            <w:tcW w:type="dxa" w:w="6624"/>
             <w:shd w:val="clear" w:fill="FFF0EE"/>
           </w:tcPr>
           <w:p>
@@ -4030,7 +4071,7 @@
       <w:tr>
         <w:tc>
           <w:tcPr>
-            <w:tcW w:type="dxa" w:w="6514"/>
+            <w:tcW w:type="dxa" w:w="6624"/>
             <w:shd w:val="clear" w:fill="FFF0EE"/>
           </w:tcPr>
           <w:p>
@@ -4048,7 +4089,7 @@
       <w:tr>
         <w:tc>
           <w:tcPr>
-            <w:tcW w:type="dxa" w:w="6514"/>
+            <w:tcW w:type="dxa" w:w="6624"/>
             <w:shd w:val="clear" w:fill="FFF0EE"/>
           </w:tcPr>
           <w:p>
@@ -4090,12 +4131,12 @@
         <w:tblLook w:firstColumn="1" w:firstRow="1" w:lastColumn="0" w:lastRow="0" w:noHBand="0" w:noVBand="1" w:val="04A0"/>
       </w:tblPr>
       <w:tblGrid>
-        <w:gridCol w:w="6514"/>
+        <w:gridCol w:w="6624"/>
       </w:tblGrid>
       <w:tr>
         <w:tc>
           <w:tcPr>
-            <w:tcW w:type="dxa" w:w="6514"/>
+            <w:tcW w:type="dxa" w:w="6624"/>
             <w:shd w:val="clear" w:fill="8B1A1A"/>
           </w:tcPr>
           <w:p>
@@ -4114,7 +4155,7 @@
       <w:tr>
         <w:tc>
           <w:tcPr>
-            <w:tcW w:type="dxa" w:w="6514"/>
+            <w:tcW w:type="dxa" w:w="6624"/>
             <w:shd w:val="clear" w:fill="FFF0EE"/>
           </w:tcPr>
           <w:p>
@@ -4132,7 +4173,7 @@
       <w:tr>
         <w:tc>
           <w:tcPr>
-            <w:tcW w:type="dxa" w:w="6514"/>
+            <w:tcW w:type="dxa" w:w="6624"/>
             <w:shd w:val="clear" w:fill="FFF0EE"/>
           </w:tcPr>
           <w:p>
@@ -4150,7 +4191,7 @@
       <w:tr>
         <w:tc>
           <w:tcPr>
-            <w:tcW w:type="dxa" w:w="6514"/>
+            <w:tcW w:type="dxa" w:w="6624"/>
             <w:shd w:val="clear" w:fill="FFF0EE"/>
           </w:tcPr>
           <w:p>
@@ -4168,7 +4209,7 @@
       <w:tr>
         <w:tc>
           <w:tcPr>
-            <w:tcW w:type="dxa" w:w="6514"/>
+            <w:tcW w:type="dxa" w:w="6624"/>
             <w:shd w:val="clear" w:fill="FFF0EE"/>
           </w:tcPr>
           <w:p>
@@ -4186,7 +4227,7 @@
       <w:tr>
         <w:tc>
           <w:tcPr>
-            <w:tcW w:type="dxa" w:w="6514"/>
+            <w:tcW w:type="dxa" w:w="6624"/>
             <w:shd w:val="clear" w:fill="FFF0EE"/>
           </w:tcPr>
           <w:p>
@@ -4204,7 +4245,7 @@
       <w:tr>
         <w:tc>
           <w:tcPr>
-            <w:tcW w:type="dxa" w:w="6514"/>
+            <w:tcW w:type="dxa" w:w="6624"/>
             <w:shd w:val="clear" w:fill="FFF0EE"/>
           </w:tcPr>
           <w:p>
@@ -4335,6 +4376,7 @@
     </w:p>
     <w:p>
       <w:pPr>
+        <w:spacing w:before="160" w:after="160"/>
         <w:jc w:val="center"/>
       </w:pPr>
       <w:r>
@@ -4342,10 +4384,10 @@
           <w:b w:val="0"/>
           <w:i w:val="0"/>
           <w:color w:val="D4A017"/>
-          <w:sz w:val="26"/>
+          <w:sz w:val="22"/>
           <w:rFonts w:ascii="FreeSans" w:hAnsi="FreeSans" w:cs="FreeSans"/>
         </w:rPr>
-        <w:t>❦</w:t>
+        <w:t>★  ★  ★</w:t>
       </w:r>
     </w:p>
     <w:p>
@@ -4356,16 +4398,18 @@
     <w:p/>
     <w:p/>
     <w:p/>
+    <w:p/>
+    <w:p/>
     <w:p>
       <w:pPr>
         <w:pBdr>
-          <w:top w:val="single" w:sz="24" w:space="4" w:color="D4A017"/>
+          <w:bottom w:val="single" w:sz="24" w:space="4" w:color="D4A017"/>
         </w:pBdr>
       </w:pPr>
     </w:p>
     <w:p>
       <w:pPr>
-        <w:spacing w:before="280" w:after="280"/>
+        <w:spacing w:before="320" w:after="320"/>
         <w:jc w:val="center"/>
       </w:pPr>
       <w:r>
@@ -4382,13 +4426,13 @@
     <w:p>
       <w:pPr>
         <w:pBdr>
-          <w:bottom w:val="single" w:sz="24" w:space="4" w:color="D4A017"/>
+          <w:top w:val="single" w:sz="24" w:space="4" w:color="D4A017"/>
         </w:pBdr>
       </w:pPr>
     </w:p>
-    <w:p/>
-    <w:p>
-      <w:pPr>
+    <w:p>
+      <w:pPr>
+        <w:spacing w:before="160" w:after="160"/>
         <w:jc w:val="center"/>
       </w:pPr>
       <w:r>
@@ -4396,10 +4440,10 @@
           <w:b w:val="0"/>
           <w:i w:val="0"/>
           <w:color w:val="D4A017"/>
-          <w:sz w:val="26"/>
+          <w:sz w:val="22"/>
           <w:rFonts w:ascii="FreeSans" w:hAnsi="FreeSans" w:cs="FreeSans"/>
         </w:rPr>
-        <w:t>❦</w:t>
+        <w:t>★  ★  ★</w:t>
       </w:r>
     </w:p>
     <w:p>
@@ -4410,16 +4454,18 @@
     <w:p/>
     <w:p/>
     <w:p/>
+    <w:p/>
+    <w:p/>
     <w:p>
       <w:pPr>
         <w:pBdr>
-          <w:top w:val="single" w:sz="24" w:space="4" w:color="D4A017"/>
+          <w:bottom w:val="single" w:sz="24" w:space="4" w:color="D4A017"/>
         </w:pBdr>
       </w:pPr>
     </w:p>
     <w:p>
       <w:pPr>
-        <w:spacing w:before="280" w:after="280"/>
+        <w:spacing w:before="320" w:after="320"/>
         <w:jc w:val="center"/>
       </w:pPr>
       <w:r>
@@ -4436,11 +4482,10 @@
     <w:p>
       <w:pPr>
         <w:pBdr>
-          <w:bottom w:val="single" w:sz="24" w:space="4" w:color="D4A017"/>
+          <w:top w:val="single" w:sz="24" w:space="4" w:color="D4A017"/>
         </w:pBdr>
       </w:pPr>
     </w:p>
-    <w:p/>
     <w:p>
       <w:r>
         <w:t>Tout commence par une guerre que le Sahel n'a pas déclarée. Elle s'est allumée ailleurs — dans le ciel de Libye, au printemps 2011 — avant de descendre vers le sud avec les convois d'armes et les combattants en déroute. Puis elle a changé de visage: groupes armés, opérations militaires étrangères, drones, communiqués, rapports d'ONG, plateaux de télévision. Cette partie raconte cette guerre-là, dans toutes ses dimensions: la destruction de l'État libyen et ce qu'elle a libéré, la fabrique du terrorisme sahélien, dix années d'interventions françaises qui ont vu la menace tripler, la bataille de l'information qui se joue dans les esprits autant que sur le terrain. Et, pour finir, le plus troublant: ce que la France elle-même, dans ses rapports officiels et ses huis clos parlementaires, a fini par admettre.</w:t>
@@ -4448,6 +4493,7 @@
     </w:p>
     <w:p>
       <w:pPr>
+        <w:spacing w:before="160" w:after="160"/>
         <w:jc w:val="center"/>
       </w:pPr>
       <w:r>
@@ -4455,10 +4501,10 @@
           <w:b w:val="0"/>
           <w:i w:val="0"/>
           <w:color w:val="D4A017"/>
-          <w:sz w:val="26"/>
+          <w:sz w:val="22"/>
           <w:rFonts w:ascii="FreeSans" w:hAnsi="FreeSans" w:cs="FreeSans"/>
         </w:rPr>
-        <w:t>❦</w:t>
+        <w:t>★  ★  ★</w:t>
       </w:r>
     </w:p>
     <w:p>
@@ -4548,12 +4594,12 @@
         <w:tblLook w:firstColumn="1" w:firstRow="1" w:lastColumn="0" w:lastRow="0" w:noHBand="0" w:noVBand="1" w:val="04A0"/>
       </w:tblPr>
       <w:tblGrid>
-        <w:gridCol w:w="6514"/>
+        <w:gridCol w:w="6624"/>
       </w:tblGrid>
       <w:tr>
         <w:tc>
           <w:tcPr>
-            <w:tcW w:type="dxa" w:w="6514"/>
+            <w:tcW w:type="dxa" w:w="6624"/>
             <w:shd w:val="clear" w:fill="8B1A1A"/>
           </w:tcPr>
           <w:p>
@@ -4572,7 +4618,7 @@
       <w:tr>
         <w:tc>
           <w:tcPr>
-            <w:tcW w:type="dxa" w:w="6514"/>
+            <w:tcW w:type="dxa" w:w="6624"/>
             <w:shd w:val="clear" w:fill="FFF0EE"/>
           </w:tcPr>
           <w:p>
@@ -4590,7 +4636,7 @@
       <w:tr>
         <w:tc>
           <w:tcPr>
-            <w:tcW w:type="dxa" w:w="6514"/>
+            <w:tcW w:type="dxa" w:w="6624"/>
             <w:shd w:val="clear" w:fill="FFF0EE"/>
           </w:tcPr>
           <w:p>
@@ -4608,7 +4654,7 @@
       <w:tr>
         <w:tc>
           <w:tcPr>
-            <w:tcW w:type="dxa" w:w="6514"/>
+            <w:tcW w:type="dxa" w:w="6624"/>
             <w:shd w:val="clear" w:fill="FFF0EE"/>
           </w:tcPr>
           <w:p>
@@ -4626,7 +4672,7 @@
       <w:tr>
         <w:tc>
           <w:tcPr>
-            <w:tcW w:type="dxa" w:w="6514"/>
+            <w:tcW w:type="dxa" w:w="6624"/>
             <w:shd w:val="clear" w:fill="FFF0EE"/>
           </w:tcPr>
           <w:p>
@@ -4660,6 +4706,7 @@
     </w:p>
     <w:p>
       <w:pPr>
+        <w:spacing w:before="160" w:after="160"/>
         <w:jc w:val="center"/>
       </w:pPr>
       <w:r>
@@ -4667,10 +4714,10 @@
           <w:b w:val="0"/>
           <w:i w:val="0"/>
           <w:color w:val="D4A017"/>
-          <w:sz w:val="26"/>
+          <w:sz w:val="22"/>
           <w:rFonts w:ascii="FreeSans" w:hAnsi="FreeSans" w:cs="FreeSans"/>
         </w:rPr>
-        <w:t>❦</w:t>
+        <w:t>★  ★  ★</w:t>
       </w:r>
     </w:p>
     <w:p>
@@ -4804,12 +4851,12 @@
         <w:tblLook w:firstColumn="1" w:firstRow="1" w:lastColumn="0" w:lastRow="0" w:noHBand="0" w:noVBand="1" w:val="04A0"/>
       </w:tblPr>
       <w:tblGrid>
-        <w:gridCol w:w="6514"/>
+        <w:gridCol w:w="6624"/>
       </w:tblGrid>
       <w:tr>
         <w:tc>
           <w:tcPr>
-            <w:tcW w:type="dxa" w:w="6514"/>
+            <w:tcW w:type="dxa" w:w="6624"/>
             <w:shd w:val="clear" w:fill="8B1A1A"/>
           </w:tcPr>
           <w:p>
@@ -4828,7 +4875,7 @@
       <w:tr>
         <w:tc>
           <w:tcPr>
-            <w:tcW w:type="dxa" w:w="6514"/>
+            <w:tcW w:type="dxa" w:w="6624"/>
             <w:shd w:val="clear" w:fill="FFF0EE"/>
           </w:tcPr>
           <w:p>
@@ -4846,7 +4893,7 @@
       <w:tr>
         <w:tc>
           <w:tcPr>
-            <w:tcW w:type="dxa" w:w="6514"/>
+            <w:tcW w:type="dxa" w:w="6624"/>
             <w:shd w:val="clear" w:fill="FFF0EE"/>
           </w:tcPr>
           <w:p>
@@ -4864,7 +4911,7 @@
       <w:tr>
         <w:tc>
           <w:tcPr>
-            <w:tcW w:type="dxa" w:w="6514"/>
+            <w:tcW w:type="dxa" w:w="6624"/>
             <w:shd w:val="clear" w:fill="FFF0EE"/>
           </w:tcPr>
           <w:p>
@@ -4903,6 +4950,7 @@
     </w:p>
     <w:p>
       <w:pPr>
+        <w:spacing w:before="160" w:after="160"/>
         <w:jc w:val="center"/>
       </w:pPr>
       <w:r>
@@ -4910,10 +4958,10 @@
           <w:b w:val="0"/>
           <w:i w:val="0"/>
           <w:color w:val="D4A017"/>
-          <w:sz w:val="26"/>
+          <w:sz w:val="22"/>
           <w:rFonts w:ascii="FreeSans" w:hAnsi="FreeSans" w:cs="FreeSans"/>
         </w:rPr>
-        <w:t>❦</w:t>
+        <w:t>★  ★  ★</w:t>
       </w:r>
     </w:p>
     <w:p>
@@ -5033,12 +5081,12 @@
         <w:tblLook w:firstColumn="1" w:firstRow="1" w:lastColumn="0" w:lastRow="0" w:noHBand="0" w:noVBand="1" w:val="04A0"/>
       </w:tblPr>
       <w:tblGrid>
-        <w:gridCol w:w="6514"/>
+        <w:gridCol w:w="6624"/>
       </w:tblGrid>
       <w:tr>
         <w:tc>
           <w:tcPr>
-            <w:tcW w:type="dxa" w:w="6514"/>
+            <w:tcW w:type="dxa" w:w="6624"/>
             <w:shd w:val="clear" w:fill="8B1A1A"/>
           </w:tcPr>
           <w:p>
@@ -5057,7 +5105,7 @@
       <w:tr>
         <w:tc>
           <w:tcPr>
-            <w:tcW w:type="dxa" w:w="6514"/>
+            <w:tcW w:type="dxa" w:w="6624"/>
             <w:shd w:val="clear" w:fill="FFF0EE"/>
           </w:tcPr>
           <w:p>
@@ -5075,7 +5123,7 @@
       <w:tr>
         <w:tc>
           <w:tcPr>
-            <w:tcW w:type="dxa" w:w="6514"/>
+            <w:tcW w:type="dxa" w:w="6624"/>
             <w:shd w:val="clear" w:fill="FFF0EE"/>
           </w:tcPr>
           <w:p>
@@ -5093,7 +5141,7 @@
       <w:tr>
         <w:tc>
           <w:tcPr>
-            <w:tcW w:type="dxa" w:w="6514"/>
+            <w:tcW w:type="dxa" w:w="6624"/>
             <w:shd w:val="clear" w:fill="FFF0EE"/>
           </w:tcPr>
           <w:p>
@@ -5111,7 +5159,7 @@
       <w:tr>
         <w:tc>
           <w:tcPr>
-            <w:tcW w:type="dxa" w:w="6514"/>
+            <w:tcW w:type="dxa" w:w="6624"/>
             <w:shd w:val="clear" w:fill="FFF0EE"/>
           </w:tcPr>
           <w:p>
@@ -5173,12 +5221,12 @@
         <w:tblLook w:firstColumn="1" w:firstRow="1" w:lastColumn="0" w:lastRow="0" w:noHBand="0" w:noVBand="1" w:val="04A0"/>
       </w:tblPr>
       <w:tblGrid>
-        <w:gridCol w:w="6514"/>
+        <w:gridCol w:w="6624"/>
       </w:tblGrid>
       <w:tr>
         <w:tc>
           <w:tcPr>
-            <w:tcW w:type="dxa" w:w="6514"/>
+            <w:tcW w:type="dxa" w:w="6624"/>
             <w:shd w:val="clear" w:fill="8B1A1A"/>
           </w:tcPr>
           <w:p>
@@ -5197,7 +5245,7 @@
       <w:tr>
         <w:tc>
           <w:tcPr>
-            <w:tcW w:type="dxa" w:w="6514"/>
+            <w:tcW w:type="dxa" w:w="6624"/>
             <w:shd w:val="clear" w:fill="FFF0EE"/>
           </w:tcPr>
           <w:p>
@@ -5215,7 +5263,7 @@
       <w:tr>
         <w:tc>
           <w:tcPr>
-            <w:tcW w:type="dxa" w:w="6514"/>
+            <w:tcW w:type="dxa" w:w="6624"/>
             <w:shd w:val="clear" w:fill="FFF0EE"/>
           </w:tcPr>
           <w:p>
@@ -5233,7 +5281,7 @@
       <w:tr>
         <w:tc>
           <w:tcPr>
-            <w:tcW w:type="dxa" w:w="6514"/>
+            <w:tcW w:type="dxa" w:w="6624"/>
             <w:shd w:val="clear" w:fill="FFF0EE"/>
           </w:tcPr>
           <w:p>
@@ -5251,7 +5299,7 @@
       <w:tr>
         <w:tc>
           <w:tcPr>
-            <w:tcW w:type="dxa" w:w="6514"/>
+            <w:tcW w:type="dxa" w:w="6624"/>
             <w:shd w:val="clear" w:fill="FFF0EE"/>
           </w:tcPr>
           <w:p>
@@ -5295,6 +5343,7 @@
     </w:p>
     <w:p>
       <w:pPr>
+        <w:spacing w:before="160" w:after="160"/>
         <w:jc w:val="center"/>
       </w:pPr>
       <w:r>
@@ -5302,10 +5351,10 @@
           <w:b w:val="0"/>
           <w:i w:val="0"/>
           <w:color w:val="D4A017"/>
-          <w:sz w:val="26"/>
+          <w:sz w:val="22"/>
           <w:rFonts w:ascii="FreeSans" w:hAnsi="FreeSans" w:cs="FreeSans"/>
         </w:rPr>
-        <w:t>❦</w:t>
+        <w:t>★  ★  ★</w:t>
       </w:r>
     </w:p>
     <w:p>
@@ -5426,12 +5475,12 @@
         <w:tblLook w:firstColumn="1" w:firstRow="1" w:lastColumn="0" w:lastRow="0" w:noHBand="0" w:noVBand="1" w:val="04A0"/>
       </w:tblPr>
       <w:tblGrid>
-        <w:gridCol w:w="6514"/>
+        <w:gridCol w:w="6624"/>
       </w:tblGrid>
       <w:tr>
         <w:tc>
           <w:tcPr>
-            <w:tcW w:type="dxa" w:w="6514"/>
+            <w:tcW w:type="dxa" w:w="6624"/>
             <w:shd w:val="clear" w:fill="8B1A1A"/>
           </w:tcPr>
           <w:p>
@@ -5450,7 +5499,7 @@
       <w:tr>
         <w:tc>
           <w:tcPr>
-            <w:tcW w:type="dxa" w:w="6514"/>
+            <w:tcW w:type="dxa" w:w="6624"/>
             <w:shd w:val="clear" w:fill="FFF0EE"/>
           </w:tcPr>
           <w:p>
@@ -5468,7 +5517,7 @@
       <w:tr>
         <w:tc>
           <w:tcPr>
-            <w:tcW w:type="dxa" w:w="6514"/>
+            <w:tcW w:type="dxa" w:w="6624"/>
             <w:shd w:val="clear" w:fill="FFF0EE"/>
           </w:tcPr>
           <w:p>
@@ -5486,7 +5535,7 @@
       <w:tr>
         <w:tc>
           <w:tcPr>
-            <w:tcW w:type="dxa" w:w="6514"/>
+            <w:tcW w:type="dxa" w:w="6624"/>
             <w:shd w:val="clear" w:fill="FFF0EE"/>
           </w:tcPr>
           <w:p>
@@ -5504,7 +5553,7 @@
       <w:tr>
         <w:tc>
           <w:tcPr>
-            <w:tcW w:type="dxa" w:w="6514"/>
+            <w:tcW w:type="dxa" w:w="6624"/>
             <w:shd w:val="clear" w:fill="FFF0EE"/>
           </w:tcPr>
           <w:p>
@@ -5522,7 +5571,7 @@
       <w:tr>
         <w:tc>
           <w:tcPr>
-            <w:tcW w:type="dxa" w:w="6514"/>
+            <w:tcW w:type="dxa" w:w="6624"/>
             <w:shd w:val="clear" w:fill="FFF0EE"/>
           </w:tcPr>
           <w:p>
@@ -5540,7 +5589,7 @@
       <w:tr>
         <w:tc>
           <w:tcPr>
-            <w:tcW w:type="dxa" w:w="6514"/>
+            <w:tcW w:type="dxa" w:w="6624"/>
             <w:shd w:val="clear" w:fill="FFF0EE"/>
           </w:tcPr>
           <w:p>
@@ -5558,7 +5607,7 @@
       <w:tr>
         <w:tc>
           <w:tcPr>
-            <w:tcW w:type="dxa" w:w="6514"/>
+            <w:tcW w:type="dxa" w:w="6624"/>
             <w:shd w:val="clear" w:fill="FFF0EE"/>
           </w:tcPr>
           <w:p>
@@ -5623,6 +5672,7 @@
     </w:p>
     <w:p>
       <w:pPr>
+        <w:spacing w:before="160" w:after="160"/>
         <w:jc w:val="center"/>
       </w:pPr>
       <w:r>
@@ -5630,10 +5680,10 @@
           <w:b w:val="0"/>
           <w:i w:val="0"/>
           <w:color w:val="D4A017"/>
-          <w:sz w:val="26"/>
+          <w:sz w:val="22"/>
           <w:rFonts w:ascii="FreeSans" w:hAnsi="FreeSans" w:cs="FreeSans"/>
         </w:rPr>
-        <w:t>❦</w:t>
+        <w:t>★  ★  ★</w:t>
       </w:r>
     </w:p>
     <w:p>
@@ -5748,6 +5798,7 @@
     </w:p>
     <w:p>
       <w:pPr>
+        <w:spacing w:before="160" w:after="160"/>
         <w:jc w:val="center"/>
       </w:pPr>
       <w:r>
@@ -5755,10 +5806,10 @@
           <w:b w:val="0"/>
           <w:i w:val="0"/>
           <w:color w:val="D4A017"/>
-          <w:sz w:val="26"/>
+          <w:sz w:val="22"/>
           <w:rFonts w:ascii="FreeSans" w:hAnsi="FreeSans" w:cs="FreeSans"/>
         </w:rPr>
-        <w:t>❦</w:t>
+        <w:t>★  ★  ★</w:t>
       </w:r>
     </w:p>
     <w:p>
@@ -5769,16 +5820,18 @@
     <w:p/>
     <w:p/>
     <w:p/>
+    <w:p/>
+    <w:p/>
     <w:p>
       <w:pPr>
         <w:pBdr>
-          <w:top w:val="single" w:sz="24" w:space="4" w:color="D4A017"/>
+          <w:bottom w:val="single" w:sz="24" w:space="4" w:color="D4A017"/>
         </w:pBdr>
       </w:pPr>
     </w:p>
     <w:p>
       <w:pPr>
-        <w:spacing w:before="280" w:after="280"/>
+        <w:spacing w:before="320" w:after="320"/>
         <w:jc w:val="center"/>
       </w:pPr>
       <w:r>
@@ -5795,13 +5848,13 @@
     <w:p>
       <w:pPr>
         <w:pBdr>
-          <w:bottom w:val="single" w:sz="24" w:space="4" w:color="D4A017"/>
+          <w:top w:val="single" w:sz="24" w:space="4" w:color="D4A017"/>
         </w:pBdr>
       </w:pPr>
     </w:p>
-    <w:p/>
-    <w:p>
-      <w:pPr>
+    <w:p>
+      <w:pPr>
+        <w:spacing w:before="160" w:after="160"/>
         <w:jc w:val="center"/>
       </w:pPr>
       <w:r>
@@ -5809,10 +5862,10 @@
           <w:b w:val="0"/>
           <w:i w:val="0"/>
           <w:color w:val="D4A017"/>
-          <w:sz w:val="26"/>
+          <w:sz w:val="22"/>
           <w:rFonts w:ascii="FreeSans" w:hAnsi="FreeSans" w:cs="FreeSans"/>
         </w:rPr>
-        <w:t>❦</w:t>
+        <w:t>★  ★  ★</w:t>
       </w:r>
     </w:p>
     <w:p>
@@ -5823,16 +5876,18 @@
     <w:p/>
     <w:p/>
     <w:p/>
+    <w:p/>
+    <w:p/>
     <w:p>
       <w:pPr>
         <w:pBdr>
-          <w:top w:val="single" w:sz="24" w:space="4" w:color="D4A017"/>
+          <w:bottom w:val="single" w:sz="24" w:space="4" w:color="D4A017"/>
         </w:pBdr>
       </w:pPr>
     </w:p>
     <w:p>
       <w:pPr>
-        <w:spacing w:before="280" w:after="280"/>
+        <w:spacing w:before="320" w:after="320"/>
         <w:jc w:val="center"/>
       </w:pPr>
       <w:r>
@@ -5849,11 +5904,10 @@
     <w:p>
       <w:pPr>
         <w:pBdr>
-          <w:bottom w:val="single" w:sz="24" w:space="4" w:color="D4A017"/>
+          <w:top w:val="single" w:sz="24" w:space="4" w:color="D4A017"/>
         </w:pBdr>
       </w:pPr>
     </w:p>
-    <w:p/>
     <w:p>
       <w:r>
         <w:t>Trois capitales. Trois nuits. Trois ruptures.</w:t>
@@ -5876,6 +5930,7 @@
     </w:p>
     <w:p>
       <w:pPr>
+        <w:spacing w:before="160" w:after="160"/>
         <w:jc w:val="center"/>
       </w:pPr>
       <w:r>
@@ -5883,10 +5938,10 @@
           <w:b w:val="0"/>
           <w:i w:val="0"/>
           <w:color w:val="D4A017"/>
-          <w:sz w:val="26"/>
+          <w:sz w:val="22"/>
           <w:rFonts w:ascii="FreeSans" w:hAnsi="FreeSans" w:cs="FreeSans"/>
         </w:rPr>
-        <w:t>❦</w:t>
+        <w:t>★  ★  ★</w:t>
       </w:r>
     </w:p>
     <w:p>
@@ -6038,6 +6093,7 @@
     </w:p>
     <w:p>
       <w:pPr>
+        <w:spacing w:before="160" w:after="160"/>
         <w:jc w:val="center"/>
       </w:pPr>
       <w:r>
@@ -6045,10 +6101,10 @@
           <w:b w:val="0"/>
           <w:i w:val="0"/>
           <w:color w:val="D4A017"/>
-          <w:sz w:val="26"/>
+          <w:sz w:val="22"/>
           <w:rFonts w:ascii="FreeSans" w:hAnsi="FreeSans" w:cs="FreeSans"/>
         </w:rPr>
-        <w:t>❦</w:t>
+        <w:t>★  ★  ★</w:t>
       </w:r>
     </w:p>
     <w:p>
@@ -6180,6 +6236,7 @@
     </w:p>
     <w:p>
       <w:pPr>
+        <w:spacing w:before="160" w:after="160"/>
         <w:jc w:val="center"/>
       </w:pPr>
       <w:r>
@@ -6187,10 +6244,10 @@
           <w:b w:val="0"/>
           <w:i w:val="0"/>
           <w:color w:val="D4A017"/>
-          <w:sz w:val="26"/>
+          <w:sz w:val="22"/>
           <w:rFonts w:ascii="FreeSans" w:hAnsi="FreeSans" w:cs="FreeSans"/>
         </w:rPr>
-        <w:t>❦</w:t>
+        <w:t>★  ★  ★</w:t>
       </w:r>
     </w:p>
     <w:p>
@@ -6238,12 +6295,12 @@
         <w:tblLook w:firstColumn="1" w:firstRow="1" w:lastColumn="0" w:lastRow="0" w:noHBand="0" w:noVBand="1" w:val="04A0"/>
       </w:tblPr>
       <w:tblGrid>
-        <w:gridCol w:w="6514"/>
+        <w:gridCol w:w="6624"/>
       </w:tblGrid>
       <w:tr>
         <w:tc>
           <w:tcPr>
-            <w:tcW w:type="dxa" w:w="6514"/>
+            <w:tcW w:type="dxa" w:w="6624"/>
             <w:shd w:val="clear" w:fill="8B1A1A"/>
           </w:tcPr>
           <w:p>
@@ -6262,7 +6319,7 @@
       <w:tr>
         <w:tc>
           <w:tcPr>
-            <w:tcW w:type="dxa" w:w="6514"/>
+            <w:tcW w:type="dxa" w:w="6624"/>
             <w:shd w:val="clear" w:fill="FFF0EE"/>
           </w:tcPr>
           <w:p>
@@ -6280,7 +6337,7 @@
       <w:tr>
         <w:tc>
           <w:tcPr>
-            <w:tcW w:type="dxa" w:w="6514"/>
+            <w:tcW w:type="dxa" w:w="6624"/>
             <w:shd w:val="clear" w:fill="FFF0EE"/>
           </w:tcPr>
           <w:p>
@@ -6298,7 +6355,7 @@
       <w:tr>
         <w:tc>
           <w:tcPr>
-            <w:tcW w:type="dxa" w:w="6514"/>
+            <w:tcW w:type="dxa" w:w="6624"/>
             <w:shd w:val="clear" w:fill="FFF0EE"/>
           </w:tcPr>
           <w:p>
@@ -6316,7 +6373,7 @@
       <w:tr>
         <w:tc>
           <w:tcPr>
-            <w:tcW w:type="dxa" w:w="6514"/>
+            <w:tcW w:type="dxa" w:w="6624"/>
             <w:shd w:val="clear" w:fill="FFF0EE"/>
           </w:tcPr>
           <w:p>
@@ -6334,7 +6391,7 @@
       <w:tr>
         <w:tc>
           <w:tcPr>
-            <w:tcW w:type="dxa" w:w="6514"/>
+            <w:tcW w:type="dxa" w:w="6624"/>
             <w:shd w:val="clear" w:fill="FFF0EE"/>
           </w:tcPr>
           <w:p>
@@ -6450,6 +6507,7 @@
     </w:p>
     <w:p>
       <w:pPr>
+        <w:spacing w:before="160" w:after="160"/>
         <w:jc w:val="center"/>
       </w:pPr>
       <w:r>
@@ -6457,10 +6515,10 @@
           <w:b w:val="0"/>
           <w:i w:val="0"/>
           <w:color w:val="D4A017"/>
-          <w:sz w:val="26"/>
+          <w:sz w:val="22"/>
           <w:rFonts w:ascii="FreeSans" w:hAnsi="FreeSans" w:cs="FreeSans"/>
         </w:rPr>
-        <w:t>❦</w:t>
+        <w:t>★  ★  ★</w:t>
       </w:r>
     </w:p>
     <w:p>
@@ -6513,12 +6571,12 @@
         <w:tblLook w:firstColumn="1" w:firstRow="1" w:lastColumn="0" w:lastRow="0" w:noHBand="0" w:noVBand="1" w:val="04A0"/>
       </w:tblPr>
       <w:tblGrid>
-        <w:gridCol w:w="6514"/>
+        <w:gridCol w:w="6624"/>
       </w:tblGrid>
       <w:tr>
         <w:tc>
           <w:tcPr>
-            <w:tcW w:type="dxa" w:w="6514"/>
+            <w:tcW w:type="dxa" w:w="6624"/>
             <w:shd w:val="clear" w:fill="8B1A1A"/>
           </w:tcPr>
           <w:p>
@@ -6537,7 +6595,7 @@
       <w:tr>
         <w:tc>
           <w:tcPr>
-            <w:tcW w:type="dxa" w:w="6514"/>
+            <w:tcW w:type="dxa" w:w="6624"/>
             <w:shd w:val="clear" w:fill="FFF0EE"/>
           </w:tcPr>
           <w:p>
@@ -6555,7 +6613,7 @@
       <w:tr>
         <w:tc>
           <w:tcPr>
-            <w:tcW w:type="dxa" w:w="6514"/>
+            <w:tcW w:type="dxa" w:w="6624"/>
             <w:shd w:val="clear" w:fill="FFF0EE"/>
           </w:tcPr>
           <w:p>
@@ -6573,7 +6631,7 @@
       <w:tr>
         <w:tc>
           <w:tcPr>
-            <w:tcW w:type="dxa" w:w="6514"/>
+            <w:tcW w:type="dxa" w:w="6624"/>
             <w:shd w:val="clear" w:fill="FFF0EE"/>
           </w:tcPr>
           <w:p>
@@ -6591,7 +6649,7 @@
       <w:tr>
         <w:tc>
           <w:tcPr>
-            <w:tcW w:type="dxa" w:w="6514"/>
+            <w:tcW w:type="dxa" w:w="6624"/>
             <w:shd w:val="clear" w:fill="FFF0EE"/>
           </w:tcPr>
           <w:p>
@@ -6609,7 +6667,7 @@
       <w:tr>
         <w:tc>
           <w:tcPr>
-            <w:tcW w:type="dxa" w:w="6514"/>
+            <w:tcW w:type="dxa" w:w="6624"/>
             <w:shd w:val="clear" w:fill="FFF0EE"/>
           </w:tcPr>
           <w:p>
@@ -6692,6 +6750,7 @@
     </w:p>
     <w:p>
       <w:pPr>
+        <w:spacing w:before="160" w:after="160"/>
         <w:jc w:val="center"/>
       </w:pPr>
       <w:r>
@@ -6699,10 +6758,10 @@
           <w:b w:val="0"/>
           <w:i w:val="0"/>
           <w:color w:val="D4A017"/>
-          <w:sz w:val="26"/>
+          <w:sz w:val="22"/>
           <w:rFonts w:ascii="FreeSans" w:hAnsi="FreeSans" w:cs="FreeSans"/>
         </w:rPr>
-        <w:t>❦</w:t>
+        <w:t>★  ★  ★</w:t>
       </w:r>
     </w:p>
     <w:p>
@@ -6827,12 +6886,12 @@
         <w:tblLook w:firstColumn="1" w:firstRow="1" w:lastColumn="0" w:lastRow="0" w:noHBand="0" w:noVBand="1" w:val="04A0"/>
       </w:tblPr>
       <w:tblGrid>
-        <w:gridCol w:w="6514"/>
+        <w:gridCol w:w="6624"/>
       </w:tblGrid>
       <w:tr>
         <w:tc>
           <w:tcPr>
-            <w:tcW w:type="dxa" w:w="6514"/>
+            <w:tcW w:type="dxa" w:w="6624"/>
             <w:shd w:val="clear" w:fill="8B1A1A"/>
           </w:tcPr>
           <w:p>
@@ -6851,7 +6910,7 @@
       <w:tr>
         <w:tc>
           <w:tcPr>
-            <w:tcW w:type="dxa" w:w="6514"/>
+            <w:tcW w:type="dxa" w:w="6624"/>
             <w:shd w:val="clear" w:fill="FFF0EE"/>
           </w:tcPr>
           <w:p>
@@ -6869,7 +6928,7 @@
       <w:tr>
         <w:tc>
           <w:tcPr>
-            <w:tcW w:type="dxa" w:w="6514"/>
+            <w:tcW w:type="dxa" w:w="6624"/>
             <w:shd w:val="clear" w:fill="FFF0EE"/>
           </w:tcPr>
           <w:p>
@@ -6887,7 +6946,7 @@
       <w:tr>
         <w:tc>
           <w:tcPr>
-            <w:tcW w:type="dxa" w:w="6514"/>
+            <w:tcW w:type="dxa" w:w="6624"/>
             <w:shd w:val="clear" w:fill="FFF0EE"/>
           </w:tcPr>
           <w:p>
@@ -6905,7 +6964,7 @@
       <w:tr>
         <w:tc>
           <w:tcPr>
-            <w:tcW w:type="dxa" w:w="6514"/>
+            <w:tcW w:type="dxa" w:w="6624"/>
             <w:shd w:val="clear" w:fill="FFF0EE"/>
           </w:tcPr>
           <w:p>
@@ -6923,7 +6982,7 @@
       <w:tr>
         <w:tc>
           <w:tcPr>
-            <w:tcW w:type="dxa" w:w="6514"/>
+            <w:tcW w:type="dxa" w:w="6624"/>
             <w:shd w:val="clear" w:fill="FFF0EE"/>
           </w:tcPr>
           <w:p>
@@ -6941,7 +7000,7 @@
       <w:tr>
         <w:tc>
           <w:tcPr>
-            <w:tcW w:type="dxa" w:w="6514"/>
+            <w:tcW w:type="dxa" w:w="6624"/>
             <w:shd w:val="clear" w:fill="FFF0EE"/>
           </w:tcPr>
           <w:p>
@@ -6993,6 +7052,7 @@
     </w:p>
     <w:p>
       <w:pPr>
+        <w:spacing w:before="160" w:after="160"/>
         <w:jc w:val="center"/>
       </w:pPr>
       <w:r>
@@ -7000,10 +7060,10 @@
           <w:b w:val="0"/>
           <w:i w:val="0"/>
           <w:color w:val="D4A017"/>
-          <w:sz w:val="26"/>
+          <w:sz w:val="22"/>
           <w:rFonts w:ascii="FreeSans" w:hAnsi="FreeSans" w:cs="FreeSans"/>
         </w:rPr>
-        <w:t>❦</w:t>
+        <w:t>★  ★  ★</w:t>
       </w:r>
     </w:p>
     <w:p>
@@ -7138,12 +7198,12 @@
         <w:tblLook w:firstColumn="1" w:firstRow="1" w:lastColumn="0" w:lastRow="0" w:noHBand="0" w:noVBand="1" w:val="04A0"/>
       </w:tblPr>
       <w:tblGrid>
-        <w:gridCol w:w="6514"/>
+        <w:gridCol w:w="6624"/>
       </w:tblGrid>
       <w:tr>
         <w:tc>
           <w:tcPr>
-            <w:tcW w:type="dxa" w:w="6514"/>
+            <w:tcW w:type="dxa" w:w="6624"/>
             <w:shd w:val="clear" w:fill="8B1A1A"/>
           </w:tcPr>
           <w:p>
@@ -7162,7 +7222,7 @@
       <w:tr>
         <w:tc>
           <w:tcPr>
-            <w:tcW w:type="dxa" w:w="6514"/>
+            <w:tcW w:type="dxa" w:w="6624"/>
             <w:shd w:val="clear" w:fill="FFF0EE"/>
           </w:tcPr>
           <w:p>
@@ -7180,7 +7240,7 @@
       <w:tr>
         <w:tc>
           <w:tcPr>
-            <w:tcW w:type="dxa" w:w="6514"/>
+            <w:tcW w:type="dxa" w:w="6624"/>
             <w:shd w:val="clear" w:fill="FFF0EE"/>
           </w:tcPr>
           <w:p>
@@ -7198,7 +7258,7 @@
       <w:tr>
         <w:tc>
           <w:tcPr>
-            <w:tcW w:type="dxa" w:w="6514"/>
+            <w:tcW w:type="dxa" w:w="6624"/>
             <w:shd w:val="clear" w:fill="FFF0EE"/>
           </w:tcPr>
           <w:p>
@@ -7216,7 +7276,7 @@
       <w:tr>
         <w:tc>
           <w:tcPr>
-            <w:tcW w:type="dxa" w:w="6514"/>
+            <w:tcW w:type="dxa" w:w="6624"/>
             <w:shd w:val="clear" w:fill="FFF0EE"/>
           </w:tcPr>
           <w:p>
@@ -7234,7 +7294,7 @@
       <w:tr>
         <w:tc>
           <w:tcPr>
-            <w:tcW w:type="dxa" w:w="6514"/>
+            <w:tcW w:type="dxa" w:w="6624"/>
             <w:shd w:val="clear" w:fill="FFF0EE"/>
           </w:tcPr>
           <w:p>
@@ -7252,7 +7312,7 @@
       <w:tr>
         <w:tc>
           <w:tcPr>
-            <w:tcW w:type="dxa" w:w="6514"/>
+            <w:tcW w:type="dxa" w:w="6624"/>
             <w:shd w:val="clear" w:fill="FFF0EE"/>
           </w:tcPr>
           <w:p>
@@ -7281,6 +7341,7 @@
     </w:p>
     <w:p>
       <w:pPr>
+        <w:spacing w:before="160" w:after="160"/>
         <w:jc w:val="center"/>
       </w:pPr>
       <w:r>
@@ -7288,10 +7349,10 @@
           <w:b w:val="0"/>
           <w:i w:val="0"/>
           <w:color w:val="D4A017"/>
-          <w:sz w:val="26"/>
+          <w:sz w:val="22"/>
           <w:rFonts w:ascii="FreeSans" w:hAnsi="FreeSans" w:cs="FreeSans"/>
         </w:rPr>
-        <w:t>❦</w:t>
+        <w:t>★  ★  ★</w:t>
       </w:r>
     </w:p>
     <w:p>
@@ -7302,16 +7363,18 @@
     <w:p/>
     <w:p/>
     <w:p/>
+    <w:p/>
+    <w:p/>
     <w:p>
       <w:pPr>
         <w:pBdr>
-          <w:top w:val="single" w:sz="24" w:space="4" w:color="D4A017"/>
+          <w:bottom w:val="single" w:sz="24" w:space="4" w:color="D4A017"/>
         </w:pBdr>
       </w:pPr>
     </w:p>
     <w:p>
       <w:pPr>
-        <w:spacing w:before="280" w:after="280"/>
+        <w:spacing w:before="320" w:after="320"/>
         <w:jc w:val="center"/>
       </w:pPr>
       <w:r>
@@ -7328,13 +7391,13 @@
     <w:p>
       <w:pPr>
         <w:pBdr>
-          <w:bottom w:val="single" w:sz="24" w:space="4" w:color="D4A017"/>
+          <w:top w:val="single" w:sz="24" w:space="4" w:color="D4A017"/>
         </w:pBdr>
       </w:pPr>
     </w:p>
-    <w:p/>
-    <w:p>
-      <w:pPr>
+    <w:p>
+      <w:pPr>
+        <w:spacing w:before="160" w:after="160"/>
         <w:jc w:val="center"/>
       </w:pPr>
       <w:r>
@@ -7342,10 +7405,10 @@
           <w:b w:val="0"/>
           <w:i w:val="0"/>
           <w:color w:val="D4A017"/>
-          <w:sz w:val="26"/>
+          <w:sz w:val="22"/>
           <w:rFonts w:ascii="FreeSans" w:hAnsi="FreeSans" w:cs="FreeSans"/>
         </w:rPr>
-        <w:t>❦</w:t>
+        <w:t>★  ★  ★</w:t>
       </w:r>
     </w:p>
     <w:p>
@@ -7356,16 +7419,18 @@
     <w:p/>
     <w:p/>
     <w:p/>
+    <w:p/>
+    <w:p/>
     <w:p>
       <w:pPr>
         <w:pBdr>
-          <w:top w:val="single" w:sz="24" w:space="4" w:color="D4A017"/>
+          <w:bottom w:val="single" w:sz="24" w:space="4" w:color="D4A017"/>
         </w:pBdr>
       </w:pPr>
     </w:p>
     <w:p>
       <w:pPr>
-        <w:spacing w:before="280" w:after="280"/>
+        <w:spacing w:before="320" w:after="320"/>
         <w:jc w:val="center"/>
       </w:pPr>
       <w:r>
@@ -7382,11 +7447,10 @@
     <w:p>
       <w:pPr>
         <w:pBdr>
-          <w:bottom w:val="single" w:sz="24" w:space="4" w:color="D4A017"/>
+          <w:top w:val="single" w:sz="24" w:space="4" w:color="D4A017"/>
         </w:pBdr>
       </w:pPr>
     </w:p>
-    <w:p/>
     <w:p>
       <w:r>
         <w:t>Jusqu'ici, ce livre a raconté une guerre: celle des armes, des monnaies, des réseaux et des écrans. La partie qui s'ouvre raconte autre chose — une filiation. Car l'Alliance des États du Sahel n'est pas née en 2023 dans une salle de conférence de Bamako. Elle est née en 1957 sur un terrain de polo d'Accra, en 1961 sur une piste du Katanga, en 1962 dans une imprimerie de billets maliens, en 1987 dans la cour de la Maison du Peuple de Ouagadougou. Une première vague de dirigeants africains a tenté l'unité, la monnaie souveraine, l'armée commune. Presque tous l'ont payé du pouvoir ou de la vie. Les chapitres qui suivent remontent ce fil: Nkrumah, Lumumba, Keïta; puis Sankara; puis la génération qui a leurs portraits sur ses téléphones; et enfin l'AES elle-même, examinée pour ce qu'elle prétend être — le laboratoire grandeur nature du panafricanisme. Avec ses promesses. Et avec ses zones d'ombre, qui seront nommées.</w:t>
@@ -7394,6 +7458,7 @@
     </w:p>
     <w:p>
       <w:pPr>
+        <w:spacing w:before="160" w:after="160"/>
         <w:jc w:val="center"/>
       </w:pPr>
       <w:r>
@@ -7401,10 +7466,10 @@
           <w:b w:val="0"/>
           <w:i w:val="0"/>
           <w:color w:val="D4A017"/>
-          <w:sz w:val="26"/>
+          <w:sz w:val="22"/>
           <w:rFonts w:ascii="FreeSans" w:hAnsi="FreeSans" w:cs="FreeSans"/>
         </w:rPr>
-        <w:t>❦</w:t>
+        <w:t>★  ★  ★</w:t>
       </w:r>
     </w:p>
     <w:p>
@@ -7509,12 +7574,12 @@
         <w:tblLook w:firstColumn="1" w:firstRow="1" w:lastColumn="0" w:lastRow="0" w:noHBand="0" w:noVBand="1" w:val="04A0"/>
       </w:tblPr>
       <w:tblGrid>
-        <w:gridCol w:w="6514"/>
+        <w:gridCol w:w="6624"/>
       </w:tblGrid>
       <w:tr>
         <w:tc>
           <w:tcPr>
-            <w:tcW w:type="dxa" w:w="6514"/>
+            <w:tcW w:type="dxa" w:w="6624"/>
             <w:shd w:val="clear" w:fill="8B1A1A"/>
           </w:tcPr>
           <w:p>
@@ -7533,7 +7598,7 @@
       <w:tr>
         <w:tc>
           <w:tcPr>
-            <w:tcW w:type="dxa" w:w="6514"/>
+            <w:tcW w:type="dxa" w:w="6624"/>
             <w:shd w:val="clear" w:fill="FFF0EE"/>
           </w:tcPr>
           <w:p>
@@ -7551,7 +7616,7 @@
       <w:tr>
         <w:tc>
           <w:tcPr>
-            <w:tcW w:type="dxa" w:w="6514"/>
+            <w:tcW w:type="dxa" w:w="6624"/>
             <w:shd w:val="clear" w:fill="FFF0EE"/>
           </w:tcPr>
           <w:p>
@@ -7569,7 +7634,7 @@
       <w:tr>
         <w:tc>
           <w:tcPr>
-            <w:tcW w:type="dxa" w:w="6514"/>
+            <w:tcW w:type="dxa" w:w="6624"/>
             <w:shd w:val="clear" w:fill="FFF0EE"/>
           </w:tcPr>
           <w:p>
@@ -7587,7 +7652,7 @@
       <w:tr>
         <w:tc>
           <w:tcPr>
-            <w:tcW w:type="dxa" w:w="6514"/>
+            <w:tcW w:type="dxa" w:w="6624"/>
             <w:shd w:val="clear" w:fill="FFF0EE"/>
           </w:tcPr>
           <w:p>
@@ -7605,7 +7670,7 @@
       <w:tr>
         <w:tc>
           <w:tcPr>
-            <w:tcW w:type="dxa" w:w="6514"/>
+            <w:tcW w:type="dxa" w:w="6624"/>
             <w:shd w:val="clear" w:fill="FFF0EE"/>
           </w:tcPr>
           <w:p>
@@ -7623,7 +7688,7 @@
       <w:tr>
         <w:tc>
           <w:tcPr>
-            <w:tcW w:type="dxa" w:w="6514"/>
+            <w:tcW w:type="dxa" w:w="6624"/>
             <w:shd w:val="clear" w:fill="FFF0EE"/>
           </w:tcPr>
           <w:p>
@@ -7641,7 +7706,7 @@
       <w:tr>
         <w:tc>
           <w:tcPr>
-            <w:tcW w:type="dxa" w:w="6514"/>
+            <w:tcW w:type="dxa" w:w="6624"/>
             <w:shd w:val="clear" w:fill="FFF0EE"/>
           </w:tcPr>
           <w:p>
@@ -7659,7 +7724,7 @@
       <w:tr>
         <w:tc>
           <w:tcPr>
-            <w:tcW w:type="dxa" w:w="6514"/>
+            <w:tcW w:type="dxa" w:w="6624"/>
             <w:shd w:val="clear" w:fill="FFF0EE"/>
           </w:tcPr>
           <w:p>
@@ -7677,7 +7742,7 @@
       <w:tr>
         <w:tc>
           <w:tcPr>
-            <w:tcW w:type="dxa" w:w="6514"/>
+            <w:tcW w:type="dxa" w:w="6624"/>
             <w:shd w:val="clear" w:fill="FFF0EE"/>
           </w:tcPr>
           <w:p>
@@ -7719,6 +7784,7 @@
     </w:p>
     <w:p>
       <w:pPr>
+        <w:spacing w:before="160" w:after="160"/>
         <w:jc w:val="center"/>
       </w:pPr>
       <w:r>
@@ -7726,10 +7792,10 @@
           <w:b w:val="0"/>
           <w:i w:val="0"/>
           <w:color w:val="D4A017"/>
-          <w:sz w:val="26"/>
+          <w:sz w:val="22"/>
           <w:rFonts w:ascii="FreeSans" w:hAnsi="FreeSans" w:cs="FreeSans"/>
         </w:rPr>
-        <w:t>❦</w:t>
+        <w:t>★  ★  ★</w:t>
       </w:r>
     </w:p>
     <w:p>
@@ -7789,12 +7855,12 @@
         <w:tblLook w:firstColumn="1" w:firstRow="1" w:lastColumn="0" w:lastRow="0" w:noHBand="0" w:noVBand="1" w:val="04A0"/>
       </w:tblPr>
       <w:tblGrid>
-        <w:gridCol w:w="6514"/>
+        <w:gridCol w:w="6624"/>
       </w:tblGrid>
       <w:tr>
         <w:tc>
           <w:tcPr>
-            <w:tcW w:type="dxa" w:w="6514"/>
+            <w:tcW w:type="dxa" w:w="6624"/>
             <w:shd w:val="clear" w:fill="8B1A1A"/>
           </w:tcPr>
           <w:p>
@@ -7813,7 +7879,7 @@
       <w:tr>
         <w:tc>
           <w:tcPr>
-            <w:tcW w:type="dxa" w:w="6514"/>
+            <w:tcW w:type="dxa" w:w="6624"/>
             <w:shd w:val="clear" w:fill="FFF0EE"/>
           </w:tcPr>
           <w:p>
@@ -7831,7 +7897,7 @@
       <w:tr>
         <w:tc>
           <w:tcPr>
-            <w:tcW w:type="dxa" w:w="6514"/>
+            <w:tcW w:type="dxa" w:w="6624"/>
             <w:shd w:val="clear" w:fill="FFF0EE"/>
           </w:tcPr>
           <w:p>
@@ -7849,7 +7915,7 @@
       <w:tr>
         <w:tc>
           <w:tcPr>
-            <w:tcW w:type="dxa" w:w="6514"/>
+            <w:tcW w:type="dxa" w:w="6624"/>
             <w:shd w:val="clear" w:fill="FFF0EE"/>
           </w:tcPr>
           <w:p>
@@ -7867,7 +7933,7 @@
       <w:tr>
         <w:tc>
           <w:tcPr>
-            <w:tcW w:type="dxa" w:w="6514"/>
+            <w:tcW w:type="dxa" w:w="6624"/>
             <w:shd w:val="clear" w:fill="FFF0EE"/>
           </w:tcPr>
           <w:p>
@@ -7885,7 +7951,7 @@
       <w:tr>
         <w:tc>
           <w:tcPr>
-            <w:tcW w:type="dxa" w:w="6514"/>
+            <w:tcW w:type="dxa" w:w="6624"/>
             <w:shd w:val="clear" w:fill="FFF0EE"/>
           </w:tcPr>
           <w:p>
@@ -7970,6 +8036,7 @@
     </w:p>
     <w:p>
       <w:pPr>
+        <w:spacing w:before="160" w:after="160"/>
         <w:jc w:val="center"/>
       </w:pPr>
       <w:r>
@@ -7977,10 +8044,10 @@
           <w:b w:val="0"/>
           <w:i w:val="0"/>
           <w:color w:val="D4A017"/>
-          <w:sz w:val="26"/>
+          <w:sz w:val="22"/>
           <w:rFonts w:ascii="FreeSans" w:hAnsi="FreeSans" w:cs="FreeSans"/>
         </w:rPr>
-        <w:t>❦</w:t>
+        <w:t>★  ★  ★</w:t>
       </w:r>
     </w:p>
     <w:p>
@@ -8057,12 +8124,12 @@
         <w:tblLook w:firstColumn="1" w:firstRow="1" w:lastColumn="0" w:lastRow="0" w:noHBand="0" w:noVBand="1" w:val="04A0"/>
       </w:tblPr>
       <w:tblGrid>
-        <w:gridCol w:w="6514"/>
+        <w:gridCol w:w="6624"/>
       </w:tblGrid>
       <w:tr>
         <w:tc>
           <w:tcPr>
-            <w:tcW w:type="dxa" w:w="6514"/>
+            <w:tcW w:type="dxa" w:w="6624"/>
             <w:shd w:val="clear" w:fill="8B1A1A"/>
           </w:tcPr>
           <w:p>
@@ -8081,7 +8148,7 @@
       <w:tr>
         <w:tc>
           <w:tcPr>
-            <w:tcW w:type="dxa" w:w="6514"/>
+            <w:tcW w:type="dxa" w:w="6624"/>
             <w:shd w:val="clear" w:fill="FFF0EE"/>
           </w:tcPr>
           <w:p>
@@ -8099,7 +8166,7 @@
       <w:tr>
         <w:tc>
           <w:tcPr>
-            <w:tcW w:type="dxa" w:w="6514"/>
+            <w:tcW w:type="dxa" w:w="6624"/>
             <w:shd w:val="clear" w:fill="FFF0EE"/>
           </w:tcPr>
           <w:p>
@@ -8117,7 +8184,7 @@
       <w:tr>
         <w:tc>
           <w:tcPr>
-            <w:tcW w:type="dxa" w:w="6514"/>
+            <w:tcW w:type="dxa" w:w="6624"/>
             <w:shd w:val="clear" w:fill="FFF0EE"/>
           </w:tcPr>
           <w:p>
@@ -8159,6 +8226,7 @@
     </w:p>
     <w:p>
       <w:pPr>
+        <w:spacing w:before="160" w:after="160"/>
         <w:jc w:val="center"/>
       </w:pPr>
       <w:r>
@@ -8166,10 +8234,10 @@
           <w:b w:val="0"/>
           <w:i w:val="0"/>
           <w:color w:val="D4A017"/>
-          <w:sz w:val="26"/>
+          <w:sz w:val="22"/>
           <w:rFonts w:ascii="FreeSans" w:hAnsi="FreeSans" w:cs="FreeSans"/>
         </w:rPr>
-        <w:t>❦</w:t>
+        <w:t>★  ★  ★</w:t>
       </w:r>
     </w:p>
     <w:p>
@@ -8290,12 +8358,12 @@
         <w:tblLook w:firstColumn="1" w:firstRow="1" w:lastColumn="0" w:lastRow="0" w:noHBand="0" w:noVBand="1" w:val="04A0"/>
       </w:tblPr>
       <w:tblGrid>
-        <w:gridCol w:w="6514"/>
+        <w:gridCol w:w="6624"/>
       </w:tblGrid>
       <w:tr>
         <w:tc>
           <w:tcPr>
-            <w:tcW w:type="dxa" w:w="6514"/>
+            <w:tcW w:type="dxa" w:w="6624"/>
             <w:shd w:val="clear" w:fill="8B1A1A"/>
           </w:tcPr>
           <w:p>
@@ -8314,7 +8382,7 @@
       <w:tr>
         <w:tc>
           <w:tcPr>
-            <w:tcW w:type="dxa" w:w="6514"/>
+            <w:tcW w:type="dxa" w:w="6624"/>
             <w:shd w:val="clear" w:fill="FFF0EE"/>
           </w:tcPr>
           <w:p>
@@ -8332,7 +8400,7 @@
       <w:tr>
         <w:tc>
           <w:tcPr>
-            <w:tcW w:type="dxa" w:w="6514"/>
+            <w:tcW w:type="dxa" w:w="6624"/>
             <w:shd w:val="clear" w:fill="FFF0EE"/>
           </w:tcPr>
           <w:p>
@@ -8350,7 +8418,7 @@
       <w:tr>
         <w:tc>
           <w:tcPr>
-            <w:tcW w:type="dxa" w:w="6514"/>
+            <w:tcW w:type="dxa" w:w="6624"/>
             <w:shd w:val="clear" w:fill="FFF0EE"/>
           </w:tcPr>
           <w:p>
@@ -8368,7 +8436,7 @@
       <w:tr>
         <w:tc>
           <w:tcPr>
-            <w:tcW w:type="dxa" w:w="6514"/>
+            <w:tcW w:type="dxa" w:w="6624"/>
             <w:shd w:val="clear" w:fill="FFF0EE"/>
           </w:tcPr>
           <w:p>
@@ -8386,7 +8454,7 @@
       <w:tr>
         <w:tc>
           <w:tcPr>
-            <w:tcW w:type="dxa" w:w="6514"/>
+            <w:tcW w:type="dxa" w:w="6624"/>
             <w:shd w:val="clear" w:fill="FFF0EE"/>
           </w:tcPr>
           <w:p>
@@ -8433,12 +8501,12 @@
         <w:tblLook w:firstColumn="1" w:firstRow="1" w:lastColumn="0" w:lastRow="0" w:noHBand="0" w:noVBand="1" w:val="04A0"/>
       </w:tblPr>
       <w:tblGrid>
-        <w:gridCol w:w="6514"/>
+        <w:gridCol w:w="6624"/>
       </w:tblGrid>
       <w:tr>
         <w:tc>
           <w:tcPr>
-            <w:tcW w:type="dxa" w:w="6514"/>
+            <w:tcW w:type="dxa" w:w="6624"/>
             <w:shd w:val="clear" w:fill="8B1A1A"/>
           </w:tcPr>
           <w:p>
@@ -8457,7 +8525,7 @@
       <w:tr>
         <w:tc>
           <w:tcPr>
-            <w:tcW w:type="dxa" w:w="6514"/>
+            <w:tcW w:type="dxa" w:w="6624"/>
             <w:shd w:val="clear" w:fill="FFF0EE"/>
           </w:tcPr>
           <w:p>
@@ -8475,7 +8543,7 @@
       <w:tr>
         <w:tc>
           <w:tcPr>
-            <w:tcW w:type="dxa" w:w="6514"/>
+            <w:tcW w:type="dxa" w:w="6624"/>
             <w:shd w:val="clear" w:fill="FFF0EE"/>
           </w:tcPr>
           <w:p>
@@ -8493,7 +8561,7 @@
       <w:tr>
         <w:tc>
           <w:tcPr>
-            <w:tcW w:type="dxa" w:w="6514"/>
+            <w:tcW w:type="dxa" w:w="6624"/>
             <w:shd w:val="clear" w:fill="FFF0EE"/>
           </w:tcPr>
           <w:p>
@@ -8527,6 +8595,7 @@
     </w:p>
     <w:p>
       <w:pPr>
+        <w:spacing w:before="160" w:after="160"/>
         <w:jc w:val="center"/>
       </w:pPr>
       <w:r>
@@ -8534,10 +8603,10 @@
           <w:b w:val="0"/>
           <w:i w:val="0"/>
           <w:color w:val="D4A017"/>
-          <w:sz w:val="26"/>
+          <w:sz w:val="22"/>
           <w:rFonts w:ascii="FreeSans" w:hAnsi="FreeSans" w:cs="FreeSans"/>
         </w:rPr>
-        <w:t>❦</w:t>
+        <w:t>★  ★  ★</w:t>
       </w:r>
     </w:p>
     <w:p>
@@ -8548,16 +8617,18 @@
     <w:p/>
     <w:p/>
     <w:p/>
+    <w:p/>
+    <w:p/>
     <w:p>
       <w:pPr>
         <w:pBdr>
-          <w:top w:val="single" w:sz="24" w:space="4" w:color="D4A017"/>
+          <w:bottom w:val="single" w:sz="24" w:space="4" w:color="D4A017"/>
         </w:pBdr>
       </w:pPr>
     </w:p>
     <w:p>
       <w:pPr>
-        <w:spacing w:before="280" w:after="280"/>
+        <w:spacing w:before="320" w:after="320"/>
         <w:jc w:val="center"/>
       </w:pPr>
       <w:r>
@@ -8574,13 +8645,13 @@
     <w:p>
       <w:pPr>
         <w:pBdr>
-          <w:bottom w:val="single" w:sz="24" w:space="4" w:color="D4A017"/>
+          <w:top w:val="single" w:sz="24" w:space="4" w:color="D4A017"/>
         </w:pBdr>
       </w:pPr>
     </w:p>
-    <w:p/>
-    <w:p>
-      <w:pPr>
+    <w:p>
+      <w:pPr>
+        <w:spacing w:before="160" w:after="160"/>
         <w:jc w:val="center"/>
       </w:pPr>
       <w:r>
@@ -8588,10 +8659,10 @@
           <w:b w:val="0"/>
           <w:i w:val="0"/>
           <w:color w:val="D4A017"/>
-          <w:sz w:val="26"/>
+          <w:sz w:val="22"/>
           <w:rFonts w:ascii="FreeSans" w:hAnsi="FreeSans" w:cs="FreeSans"/>
         </w:rPr>
-        <w:t>❦</w:t>
+        <w:t>★  ★  ★</w:t>
       </w:r>
     </w:p>
     <w:p>
@@ -8602,16 +8673,18 @@
     <w:p/>
     <w:p/>
     <w:p/>
+    <w:p/>
+    <w:p/>
     <w:p>
       <w:pPr>
         <w:pBdr>
-          <w:top w:val="single" w:sz="24" w:space="4" w:color="D4A017"/>
+          <w:bottom w:val="single" w:sz="24" w:space="4" w:color="D4A017"/>
         </w:pBdr>
       </w:pPr>
     </w:p>
     <w:p>
       <w:pPr>
-        <w:spacing w:before="280" w:after="280"/>
+        <w:spacing w:before="320" w:after="320"/>
         <w:jc w:val="center"/>
       </w:pPr>
       <w:r>
@@ -8628,11 +8701,10 @@
     <w:p>
       <w:pPr>
         <w:pBdr>
-          <w:bottom w:val="single" w:sz="24" w:space="4" w:color="D4A017"/>
+          <w:top w:val="single" w:sz="24" w:space="4" w:color="D4A017"/>
         </w:pBdr>
       </w:pPr>
     </w:p>
-    <w:p/>
     <w:p>
       <w:r>
         <w:t>Jusqu'ici, ce livre a raconté un arrachement. Il reste à raconter une construction.</w:t>
@@ -8655,6 +8727,7 @@
     </w:p>
     <w:p>
       <w:pPr>
+        <w:spacing w:before="160" w:after="160"/>
         <w:jc w:val="center"/>
       </w:pPr>
       <w:r>
@@ -8662,10 +8735,10 @@
           <w:b w:val="0"/>
           <w:i w:val="0"/>
           <w:color w:val="D4A017"/>
-          <w:sz w:val="26"/>
+          <w:sz w:val="22"/>
           <w:rFonts w:ascii="FreeSans" w:hAnsi="FreeSans" w:cs="FreeSans"/>
         </w:rPr>
-        <w:t>❦</w:t>
+        <w:t>★  ★  ★</w:t>
       </w:r>
     </w:p>
     <w:p>
@@ -8944,6 +9017,7 @@
     </w:p>
     <w:p>
       <w:pPr>
+        <w:spacing w:before="160" w:after="160"/>
         <w:jc w:val="center"/>
       </w:pPr>
       <w:r>
@@ -8951,10 +9025,10 @@
           <w:b w:val="0"/>
           <w:i w:val="0"/>
           <w:color w:val="D4A017"/>
-          <w:sz w:val="26"/>
+          <w:sz w:val="22"/>
           <w:rFonts w:ascii="FreeSans" w:hAnsi="FreeSans" w:cs="FreeSans"/>
         </w:rPr>
-        <w:t>❦</w:t>
+        <w:t>★  ★  ★</w:t>
       </w:r>
     </w:p>
     <w:p>
@@ -9193,6 +9267,7 @@
     </w:p>
     <w:p>
       <w:pPr>
+        <w:spacing w:before="160" w:after="160"/>
         <w:jc w:val="center"/>
       </w:pPr>
       <w:r>
@@ -9200,10 +9275,10 @@
           <w:b w:val="0"/>
           <w:i w:val="0"/>
           <w:color w:val="D4A017"/>
-          <w:sz w:val="26"/>
+          <w:sz w:val="22"/>
           <w:rFonts w:ascii="FreeSans" w:hAnsi="FreeSans" w:cs="FreeSans"/>
         </w:rPr>
-        <w:t>❦</w:t>
+        <w:t>★  ★  ★</w:t>
       </w:r>
     </w:p>
     <w:p>
@@ -9440,6 +9515,7 @@
     </w:p>
     <w:p>
       <w:pPr>
+        <w:spacing w:before="160" w:after="160"/>
         <w:jc w:val="center"/>
       </w:pPr>
       <w:r>
@@ -9447,10 +9523,10 @@
           <w:b w:val="0"/>
           <w:i w:val="0"/>
           <w:color w:val="D4A017"/>
-          <w:sz w:val="26"/>
+          <w:sz w:val="22"/>
           <w:rFonts w:ascii="FreeSans" w:hAnsi="FreeSans" w:cs="FreeSans"/>
         </w:rPr>
-        <w:t>❦</w:t>
+        <w:t>★  ★  ★</w:t>
       </w:r>
     </w:p>
     <w:p>
@@ -9671,6 +9747,7 @@
     </w:p>
     <w:p>
       <w:pPr>
+        <w:spacing w:before="160" w:after="160"/>
         <w:jc w:val="center"/>
       </w:pPr>
       <w:r>
@@ -9678,10 +9755,10 @@
           <w:b w:val="0"/>
           <w:i w:val="0"/>
           <w:color w:val="D4A017"/>
-          <w:sz w:val="26"/>
+          <w:sz w:val="22"/>
           <w:rFonts w:ascii="FreeSans" w:hAnsi="FreeSans" w:cs="FreeSans"/>
         </w:rPr>
-        <w:t>❦</w:t>
+        <w:t>★  ★  ★</w:t>
       </w:r>
     </w:p>
     <w:p>
@@ -9835,6 +9912,7 @@
     </w:p>
     <w:p>
       <w:pPr>
+        <w:spacing w:before="160" w:after="160"/>
         <w:jc w:val="center"/>
       </w:pPr>
       <w:r>
@@ -9842,10 +9920,10 @@
           <w:b w:val="0"/>
           <w:i w:val="0"/>
           <w:color w:val="D4A017"/>
-          <w:sz w:val="26"/>
+          <w:sz w:val="22"/>
           <w:rFonts w:ascii="FreeSans" w:hAnsi="FreeSans" w:cs="FreeSans"/>
         </w:rPr>
-        <w:t>❦</w:t>
+        <w:t>★  ★  ★</w:t>
       </w:r>
     </w:p>
     <w:p>
@@ -10219,6 +10297,7 @@
     </w:p>
     <w:p>
       <w:pPr>
+        <w:spacing w:before="160" w:after="160"/>
         <w:jc w:val="center"/>
       </w:pPr>
       <w:r>
@@ -10226,10 +10305,10 @@
           <w:b w:val="0"/>
           <w:i w:val="0"/>
           <w:color w:val="D4A017"/>
-          <w:sz w:val="26"/>
+          <w:sz w:val="22"/>
           <w:rFonts w:ascii="FreeSans" w:hAnsi="FreeSans" w:cs="FreeSans"/>
         </w:rPr>
-        <w:t>❦</w:t>
+        <w:t>★  ★  ★</w:t>
       </w:r>
     </w:p>
     <w:p>
@@ -10288,6 +10367,7 @@
     </w:p>
     <w:p>
       <w:pPr>
+        <w:spacing w:before="160" w:after="160"/>
         <w:jc w:val="center"/>
       </w:pPr>
       <w:r>
@@ -10295,10 +10375,10 @@
           <w:b w:val="0"/>
           <w:i w:val="0"/>
           <w:color w:val="D4A017"/>
-          <w:sz w:val="26"/>
+          <w:sz w:val="22"/>
           <w:rFonts w:ascii="FreeSans" w:hAnsi="FreeSans" w:cs="FreeSans"/>
         </w:rPr>
-        <w:t>❦</w:t>
+        <w:t>★  ★  ★</w:t>
       </w:r>
     </w:p>
     <w:p>
@@ -10353,6 +10433,7 @@
     </w:p>
     <w:p>
       <w:pPr>
+        <w:spacing w:before="160" w:after="160"/>
         <w:jc w:val="center"/>
       </w:pPr>
       <w:r>
@@ -10360,10 +10441,10 @@
           <w:b w:val="0"/>
           <w:i w:val="0"/>
           <w:color w:val="D4A017"/>
-          <w:sz w:val="26"/>
+          <w:sz w:val="22"/>
           <w:rFonts w:ascii="FreeSans" w:hAnsi="FreeSans" w:cs="FreeSans"/>
         </w:rPr>
-        <w:t>❦</w:t>
+        <w:t>★  ★  ★</w:t>
       </w:r>
     </w:p>
     <w:p>
@@ -10390,6 +10471,7 @@
     </w:p>
     <w:p>
       <w:pPr>
+        <w:spacing w:before="160" w:after="160"/>
         <w:jc w:val="center"/>
       </w:pPr>
       <w:r>
@@ -10397,10 +10479,10 @@
           <w:b w:val="0"/>
           <w:i w:val="0"/>
           <w:color w:val="D4A017"/>
-          <w:sz w:val="26"/>
+          <w:sz w:val="22"/>
           <w:rFonts w:ascii="FreeSans" w:hAnsi="FreeSans" w:cs="FreeSans"/>
         </w:rPr>
-        <w:t>❦</w:t>
+        <w:t>★  ★  ★</w:t>
       </w:r>
     </w:p>
     <w:p>
@@ -10773,6 +10855,7 @@
     </w:p>
     <w:p>
       <w:pPr>
+        <w:spacing w:before="160" w:after="160"/>
         <w:jc w:val="center"/>
       </w:pPr>
       <w:r>
@@ -10780,10 +10863,10 @@
           <w:b w:val="0"/>
           <w:i w:val="0"/>
           <w:color w:val="D4A017"/>
-          <w:sz w:val="26"/>
+          <w:sz w:val="22"/>
           <w:rFonts w:ascii="FreeSans" w:hAnsi="FreeSans" w:cs="FreeSans"/>
         </w:rPr>
-        <w:t>❦</w:t>
+        <w:t>★  ★  ★</w:t>
       </w:r>
     </w:p>
     <w:p>
@@ -11142,6 +11225,7 @@
     </w:p>
     <w:p>
       <w:pPr>
+        <w:spacing w:before="160" w:after="160"/>
         <w:jc w:val="center"/>
       </w:pPr>
       <w:r>
@@ -11149,10 +11233,10 @@
           <w:b w:val="0"/>
           <w:i w:val="0"/>
           <w:color w:val="D4A017"/>
-          <w:sz w:val="26"/>
+          <w:sz w:val="22"/>
           <w:rFonts w:ascii="FreeSans" w:hAnsi="FreeSans" w:cs="FreeSans"/>
         </w:rPr>
-        <w:t>❦</w:t>
+        <w:t>★  ★  ★</w:t>
       </w:r>
     </w:p>
     <w:p>
@@ -11653,6 +11737,7 @@
     </w:p>
     <w:p>
       <w:pPr>
+        <w:spacing w:before="160" w:after="160"/>
         <w:jc w:val="center"/>
       </w:pPr>
       <w:r>
@@ -11660,10 +11745,10 @@
           <w:b w:val="0"/>
           <w:i w:val="0"/>
           <w:color w:val="D4A017"/>
-          <w:sz w:val="26"/>
+          <w:sz w:val="22"/>
           <w:rFonts w:ascii="FreeSans" w:hAnsi="FreeSans" w:cs="FreeSans"/>
         </w:rPr>
-        <w:t>❦</w:t>
+        <w:t>★  ★  ★</w:t>
       </w:r>
     </w:p>
     <w:p>
@@ -12429,7 +12514,7 @@
     </w:p>
     <w:sectPr>
       <w:pgSz w:w="8640" w:h="12960"/>
-      <w:pgMar w:top="1440" w:right="992" w:bottom="1440" w:left="1134" w:header="720" w:footer="720" w:gutter="0"/>
+      <w:pgMar w:top="1080" w:right="864" w:bottom="1008" w:left="1152" w:header="720" w:footer="720" w:gutter="0"/>
       <w:cols w:space="720"/>
       <w:docGrid w:linePitch="360"/>
     </w:sectPr>
@@ -12801,7 +12886,8 @@
     <w:qFormat/>
     <w:rsid w:val="00FC693F"/>
     <w:pPr>
-      <w:spacing w:after="140" w:line="336" w:lineRule="auto"/>
+      <w:widowControl/>
+      <w:spacing w:after="120" w:before="0" w:line="324" w:lineRule="auto"/>
       <w:jc w:val="both"/>
     </w:pPr>
     <w:rPr>
@@ -12865,7 +12951,8 @@
     <w:pPr>
       <w:keepNext/>
       <w:keepLines/>
-      <w:spacing w:before="480" w:after="0"/>
+      <w:widowControl/>
+      <w:spacing w:before="360" w:after="160"/>
       <w:outlineLvl w:val="0"/>
     </w:pPr>
     <w:rPr>
@@ -12874,7 +12961,7 @@
       <w:bCs/>
       <w:caps w:val="0"/>
       <w:color w:val="8B1A1A"/>
-      <w:sz w:val="38"/>
+      <w:sz w:val="36"/>
       <w:szCs w:val="28"/>
     </w:rPr>
   </w:style>
@@ -12890,7 +12977,8 @@
     <w:pPr>
       <w:keepNext/>
       <w:keepLines/>
-      <w:spacing w:before="200" w:after="0"/>
+      <w:widowControl/>
+      <w:spacing w:before="280" w:after="120"/>
       <w:outlineLvl w:val="1"/>
     </w:pPr>
     <w:rPr>
@@ -12899,7 +12987,7 @@
       <w:bCs/>
       <w:caps w:val="0"/>
       <w:color w:val="8B1A1A"/>
-      <w:sz w:val="27"/>
+      <w:sz w:val="26"/>
       <w:szCs w:val="26"/>
     </w:rPr>
   </w:style>
@@ -12915,7 +13003,8 @@
     <w:pPr>
       <w:keepNext/>
       <w:keepLines/>
-      <w:spacing w:before="200" w:after="0"/>
+      <w:widowControl/>
+      <w:spacing w:before="200" w:after="80"/>
       <w:outlineLvl w:val="2"/>
     </w:pPr>
     <w:rPr>

</xml_diff>

<commit_message>
Mise à jour : intégration transcription Mali 5 ans + réforme éducation Zambie (8 juin 2026)
Chapitre 16 — Nouvelle section « Le 5e anniversaire: bilan d'une transition en guerre »
  - Inauguration de la Maison des Pupilles de la République (7 juin 2026)
  - Bilan lucide des 5 objectifs de transition ; rôle déterminant de l'Africa Corps
  - Critique interne : reconnaissance du Maroc sur le Sahara occidental
  - Citation de solidarité panafricaine : « La victoire du Mali c'est notre victoire »

Chapitre 27 — Enrichissement de la section éducation
  - Détail de la loi zambienne : interdiction légale de refuser un enfant
  - Principe quantité/qualité : orientation vers ingénieurs, médecins, techniciens
  - Exemple concret : sculpteurs de Foumban et l'intelligence des fractales

Chronologie — Ajout : inauguration Maison des Pupilles (7 juin 2026)

DOCX Sahel Rouge KDP rebuilté : 160 Ko, 31 encadrés, 6×9 in
</commit_message>
<xml_diff>
--- a/manuscrit-edition/LIVRE-FINAL.docx
+++ b/manuscrit-edition/LIVRE-FINAL.docx
@@ -5092,6 +5092,39 @@
     <w:p>
       <w:r>
         <w:t>La boucle malienne est bouclée — mais la rupture, elle, ne fait que commencer. Car pendant que Bamako reprenait son nord, un capitaine de trente-cinq ans, à Ouagadougou, était en train de transformer la rupture en doctrine.</w:t>
+      </w:r>
+    </w:p>
+    <w:p>
+      <w:pPr>
+        <w:pStyle w:val="Heading2"/>
+      </w:pPr>
+      <w:r>
+        <w:t>Le 5e anniversaire: bilan d'une transition en guerre</w:t>
+      </w:r>
+    </w:p>
+    <w:p>
+      <w:r>
+        <w:t>Le 7 juin 2026 marque cinq ans depuis l'investiture officielle du général Assimi Goïta à la tête de la transition malienne. Ce même jour, Bamako inaugure la Maison des Pupilles de la République — un centre d'accueil dédié aux enfants des soldats et des civils tombés pour la défense du pays. La première pierre avait été posée en février 2024; le bâtiment est financé par le Fond de souveraineté présidentielle, et la cérémonie s'achève par la remise de moyens roulants à l'Office national des Pupilles du Mali.</w:t>
+      </w:r>
+    </w:p>
+    <w:p>
+      <w:r>
+        <w:t>Le symbole concentre l'enjeu sécuritaire autant que social: protéger les orphelins des combattants, c'est couper le recrutement jihadiste à sa racine. « Cette initiative tend à couper l'herbe sur le pied des groupes terroristes qui ont tendance à recruter au sein de la partie lésée de la population », analyse l'observateur panafricain Patient Parfum d'âme sur For You Media Africa, le 8 juin 2026. « Un enfant qui a perdu son géniteur dans cette guerre se retrouve isolé, sans encadrement, sans moyens — une cible pour les vendeurs d'illusion. » En prenant en charge ces enfants, l'État transforme le deuil en engagement civique: il rappelle aux orphelins le sens du sacrifice de leurs parents, et leur donne une raison de défendre à leur tour la nation.</w:t>
+      </w:r>
+    </w:p>
+    <w:p>
+      <w:r>
+        <w:t>Le bilan à cinq ans est lucide. « Ces cinq années ne furent jamais un long fleuve tranquille », résume le même analyste. Goïta a dû affronter une guerre asymétrique non voulue qui a détourné une part considérable de l'attention et des ressources vers la sécurisation du territoire. Sur le plan militaire, le partenariat avec l'Africa Corps russe a été « déterminant ». Sur le plan institutionnel, les cinq objectifs déclarés de la transition — sécurité, réfondation de l'État, gouvernance, retour à l'ordre constitutionnel et souveraineté nationale — n'ont pas tous été atteints avec la même intensité: le retour au constitutionnalisme demeure en suspens. La conclusion s'impose néanmoins: « Le Mali aujourd'hui est plus maître de son destin qu'il ne l'était en 2021. » Sécurité et économie y sont reconnues dans leur interdépendance fondamentale — elles ne peuvent progresser que l'une portant l'autre.</w:t>
+      </w:r>
+    </w:p>
+    <w:p>
+      <w:r>
+        <w:t>Un angle critique mérite d'être nommé parce qu'il vient du camp des soutiens. La reconnaissance malienne de la primauté du Maroc sur le Sahara occidental est jugée incohérente par plusieurs analystes panafricains: « Vous ne pouvez pas vous battre pour votre propre souveraineté et empêcher à un autre peuple qui réclame la sienne de le faire. » L'argument est d'ordre cognitif autant que moral — une contradiction interne qui fragilise le récit souverainiste.</w:t>
+      </w:r>
+    </w:p>
+    <w:p>
+      <w:r>
+        <w:t>La solidarité continentale autour du Mali s'exprime enfin dans une formule qui transcende les frontières: « La victoire du Mali, c'est notre victoire. Si le Mali échoue, ça va être notre échec. » Ce sentiment de destin partagé est peut-être la donnée politique la plus durable de la transition malienne: elle a transformé une crise nationale en cause panafricaine.</w:t>
       </w:r>
     </w:p>
     <w:p>
@@ -8201,12 +8234,12 @@
     </w:p>
     <w:p>
       <w:r>
-        <w:t>La démographie pose le défi avec une clarté brutale: plus de 60 % de la population africaine a moins de 25 ans. Ce potentiel est soit la plus grande force géopolitique du XXIe siècle, soit la plus grande source d'instabilité. Un jeune Sahélien non scolarisé, sans perspective, est une cible de recrutement jihadiste. Un jeune Sahélien instruit, compétent, fier de son histoire, est un bâtisseur de souveraineté. L'équation est aussi simple que cela.</w:t>
-      </w:r>
-    </w:p>
-    <w:p>
-      <w:r>
-        <w:t>Des précédents existent. La Zambie du président Hakainde Hichilema a démontré qu'un choix politique courageux peut changer la trajectoire d'une génération: depuis 2021, l'enseignement primaire et secondaire y est gratuit — inscrit dans la loi. Frais d'inscription supprimés, uniformes accessibles, manuels fournis. Le Bénin a fait le même choix pour l'éducation des filles jusqu'à la terminale. Ce sont des actes politiques, pas des effets d'annonce: ils coûtent en budget, en infrastructures, en formation d'enseignants. Et ils transforment des sociétés. « La gratuité scolaire ne doit pas se limiter à une simple suppression des frais, prévient l'analyste Parfait Patient Ndom. Construire des salles de classe, recruter des enseignants compétents, garantir le suivi rigoureux — voilà ce que signifie prendre la jeunesse au sérieux.»</w:t>
+        <w:t>La démographie pose le défi avec une clarté brutale: plus de 60 % de la population africaine a moins de 25 ans. Ce potentiel est soit la plus grande force géopolitique du XXIe siècle, soit la plus grande source d'instabilité. Un jeune Sahélien non scolarisé, sans perspective, est une cible de recrutement jihadiste. Un jeune Sahélien instruit, compétent, fier de son histoire, est un bâtisseur de souveraineté. L'équation est aussi simple que cela. La quantité, dans ce domaine, finit par créer la qualité — à condition d'être orientée vers les compétences réelles: des ingénieurs, des médecins, des techniciens, des chercheurs, des soudeurs capables de construire les infrastructures que l'Afrique devra ériger dans les prochaines décennies.</w:t>
+      </w:r>
+    </w:p>
+    <w:p>
+      <w:r>
+        <w:t>Des précédents existent. La Zambie du président Hakainde Hichilema a démontré qu'un choix politique courageux peut changer la trajectoire d'une génération: depuis 2021, l'enseignement primaire et secondaire y est gratuit — inscrit dans la loi. Frais d'inscription supprimés, frais d'examen abolis, uniformes accessibles, manuels fournis; et surtout, les établissements publics ont l'obligation légale de ne refuser aucun enfant, même si l'État n'a pas encore versé les subventions correspondantes. Ce n'est pas seulement une intention politique — c'est une architecture légale qui ferme la porte à l'exclusion. Le Bénin a fait le même choix pour l'éducation des filles jusqu'à la terminale. Ce sont des actes politiques, pas des effets d'annonce: ils coûtent en budget, en infrastructures, en formation d'enseignants. Et ils transforment des sociétés. « La gratuité scolaire ne doit pas se limiter à une simple suppression des frais, prévient l'analyste Parfait Patient Ndom. Construire des salles de classe, recruter des enseignants compétents, garantir le suivi rigoureux — voilà ce que signifie prendre la jeunesse au sérieux.»</w:t>
       </w:r>
     </w:p>
     <w:p>
@@ -8216,7 +8249,7 @@
     </w:p>
     <w:p>
       <w:r>
-        <w:t>Reste le contenu de l'enseignement, aussi décisif que son accès. Les programmes hérités de la colonisation valorisent la récitation et la formation de fonctionnaires pour une administration calquée sur la métropole. Ils fabriquent des diplômés qui ne savent ni réparer un moteur, ni cultiver une terre avec des méthodes modernes, ni coder, ni transformer localement une ressource — des consommateurs de savoirs étrangers, pas des producteurs de solutions locales. « Il faut intégrer des formations techniques, scientifiques et des métiers manuels pour former une jeunesse capable de répondre aux défis économiques locaux et globaux, en valorisant toutes les formes d'intelligence», plaide Ndom. La Corée du Sud, Singapour, l'Allemagne ont bâti leur puissance sur cette valorisation égale des intelligences intellectuelle, technique et manuelle. L'Afrique n'a pas à réinventer ce modèle; elle a à l'appliquer à la mesure de ses ressources humaines.</w:t>
+        <w:t>Reste le contenu de l'enseignement, aussi décisif que son accès. Les programmes hérités de la colonisation valorisent la récitation et la formation de fonctionnaires pour une administration calquée sur la métropole. Ils fabriquent des diplômés qui ne savent ni réparer un moteur, ni cultiver une terre avec des méthodes modernes, ni coder, ni transformer localement une ressource — des consommateurs de savoirs étrangers, pas des producteurs de solutions locales. « Il faut intégrer des formations techniques, scientifiques et des métiers manuels pour former une jeunesse capable de répondre aux défis économiques locaux et globaux, en valorisant toutes les formes d'intelligence», plaide Ndom. La Corée du Sud, Singapour, l'Allemagne ont bâti leur puissance sur cette valorisation égale des intelligences intellectuelle, technique et manuelle. L'Afrique n'a pas à réinventer ce modèle; elle a à l'appliquer à la mesure de ses ressources humaines. La vitalité de ces intelligences non académiques se lit dans un exemple frappant: les sculpteurs de Foumban, au Cameroun, produisent des œuvres dont les structures encodent des propriétés mathématiques — les fractales — sans jamais avoir ouvert un manuel de géométrie. Ces formes d'intelligence, façonnées par des siècles d'observation de la nature et de transmission orale, sont aussi réelles que la capacité à résoudre une équation algébrique. Les réduire à rien sous le poids d'un système qui ne mesure l'intelligence qu'à l'aune de la récitation, c'est amputer délibérément une société de sa moitié créatrice.</w:t>
       </w:r>
     </w:p>
     <w:p>
@@ -9692,7 +9725,7 @@
     </w:p>
     <w:p>
       <w:r>
-        <w:t>7 juin 2026 — Condamnation de l'agent Yann Vésilier à vingt ans de prison au Mali.</w:t>
+        <w:t>7 juin 2026 — 5e anniversaire de l'investiture du général Assimi Goïta; inauguration de la Maison des Pupilles de la République à Bamako. Condamnation de l'agent Yann Vésilier à vingt ans de prison au Mali.</w:t>
       </w:r>
     </w:p>
     <w:p>

</xml_diff>

<commit_message>
Intégration complète transcription 8 juin 2026 — pass 2
Ch.27 — Ajout effet tâche d'huile : si Zambie déclenche, d'autres suivent (analogue visas Bénin)
       — Citation directe : « Si des décisions pareilles ne sont pas prises, l'Afrique ne décollera jamais »

Ch.31 — 8e condition nécessaire au succès :
       — « Dialogue permanent » : la guerre n'empêche pas le dialogue (Parfum d'âme, 8 juin 2026)

DOCX Sahel Rouge KDP : 160 Ko, 31 encadrés, 6×9 in
</commit_message>
<xml_diff>
--- a/manuscrit-edition/LIVRE-FINAL.docx
+++ b/manuscrit-edition/LIVRE-FINAL.docx
@@ -8239,7 +8239,7 @@
     </w:p>
     <w:p>
       <w:r>
-        <w:t>Des précédents existent. La Zambie du président Hakainde Hichilema a démontré qu'un choix politique courageux peut changer la trajectoire d'une génération: depuis 2021, l'enseignement primaire et secondaire y est gratuit — inscrit dans la loi. Frais d'inscription supprimés, frais d'examen abolis, uniformes accessibles, manuels fournis; et surtout, les établissements publics ont l'obligation légale de ne refuser aucun enfant, même si l'État n'a pas encore versé les subventions correspondantes. Ce n'est pas seulement une intention politique — c'est une architecture légale qui ferme la porte à l'exclusion. Le Bénin a fait le même choix pour l'éducation des filles jusqu'à la terminale. Ce sont des actes politiques, pas des effets d'annonce: ils coûtent en budget, en infrastructures, en formation d'enseignants. Et ils transforment des sociétés. « La gratuité scolaire ne doit pas se limiter à une simple suppression des frais, prévient l'analyste Parfait Patient Ndom. Construire des salles de classe, recruter des enseignants compétents, garantir le suivi rigoureux — voilà ce que signifie prendre la jeunesse au sérieux.»</w:t>
+        <w:t>Des précédents existent. La Zambie du président Hakainde Hichilema a démontré qu'un choix politique courageux peut changer la trajectoire d'une génération: depuis 2021, l'enseignement primaire et secondaire y est gratuit — inscrit dans la loi. Frais d'inscription supprimés, frais d'examen abolis, uniformes accessibles, manuels fournis; et surtout, les établissements publics ont l'obligation légale de ne refuser aucun enfant, même si l'État n'a pas encore versé les subventions correspondantes. Ce n'est pas seulement une intention politique — c'est une architecture légale qui ferme la porte à l'exclusion. Le Bénin a fait le même choix pour l'éducation des filles jusqu'à la terminale. Ce sont des actes politiques, pas des effets d'annonce: ils coûtent en budget, en infrastructures, en formation d'enseignants. Et ils transforment des sociétés. « Si des décisions pareilles ne sont pas prises, l'Afrique ne décollera jamais», résume Patient Parfum d'âme. La réforme zambienne illustre aussi l'effet tâche d'huile: quand un pays déclenche, les autres suivent — exactement comme l'abolition des visas au Bénin a entraîné le Ghana, puis la République du Congo, à ouvrir leurs frontières à leur tour. Un précédent éducatif peut devenir une norme continentale. « La gratuité scolaire ne doit pas se limiter à une simple suppression des frais, prévient l'analyste Parfait Patient Ndom. Construire des salles de classe, recruter des enseignants compétents, garantir le suivi rigoureux — voilà ce que signifie prendre la jeunesse au sérieux.»</w:t>
       </w:r>
     </w:p>
     <w:p>
@@ -9309,6 +9309,24 @@
                 <w:sz w:val="18"/>
               </w:rPr>
               <w:t>Service militaire élargi: selon Nathalie Yamb, un outil de conscientisation citoyenne, pas seulement de défense</w:t>
+            </w:r>
+          </w:p>
+        </w:tc>
+      </w:tr>
+      <w:tr>
+        <w:tc>
+          <w:tcPr>
+            <w:tcW w:type="dxa" w:w="6624"/>
+            <w:shd w:val="clear" w:fill="FFF0EE"/>
+          </w:tcPr>
+          <w:p>
+            <w:r>
+              <w:rPr>
+                <w:rFonts w:ascii="FreeSans" w:hAnsi="FreeSans"/>
+                <w:color w:val="0A0A0A"/>
+                <w:sz w:val="18"/>
+              </w:rPr>
+              <w:t>Dialogue permanent: maintenir les canaux de négociation même en temps de guerre — la leçon malienne est que fermeté militaire et diplomatie ne s'excluent pas; « La guerre n'empêche pas le dialogue » (Patient Parfum d'âme, For You Media Africa, 8 juin 2026)</w:t>
             </w:r>
           </w:p>
         </w:tc>

</xml_diff>

<commit_message>
Correction nom analyste : Patient Parfait Ndoum (replace-all)
Normalise toutes les occurrences du nom de l'analyste panafricain :
- "Patient Parfum d'âme" (artefact OCR) → "Patient Parfait Ndoum"
- "Parfait Patient Ndom" → "Patient Parfait Ndoum"

Intégration transcript For You Media Africa (8 juin 2026) :
- Ch.16 : 5e anniversaire Goïta, Maison des Pupilles de la République
- Ch.27 : réforme éducation Zambie, effet tâche d'huile
- Ch.31 : 8e condition — dialogue permanent
- Chronologie : 7 juin 2026 ajouté

DOCX KDP rebuilt : 160 Ko, 31 encadrés, FreeSans Sahel Rouge 6×9 in
</commit_message>
<xml_diff>
--- a/manuscrit-edition/LIVRE-FINAL.docx
+++ b/manuscrit-edition/LIVRE-FINAL.docx
@@ -5109,7 +5109,7 @@
     </w:p>
     <w:p>
       <w:r>
-        <w:t>Le symbole concentre l'enjeu sécuritaire autant que social: protéger les orphelins des combattants, c'est couper le recrutement jihadiste à sa racine. « Cette initiative tend à couper l'herbe sur le pied des groupes terroristes qui ont tendance à recruter au sein de la partie lésée de la population », analyse l'observateur panafricain Patient Parfum d'âme sur For You Media Africa, le 8 juin 2026. « Un enfant qui a perdu son géniteur dans cette guerre se retrouve isolé, sans encadrement, sans moyens — une cible pour les vendeurs d'illusion. » En prenant en charge ces enfants, l'État transforme le deuil en engagement civique: il rappelle aux orphelins le sens du sacrifice de leurs parents, et leur donne une raison de défendre à leur tour la nation.</w:t>
+        <w:t>Le symbole concentre l'enjeu sécuritaire autant que social: protéger les orphelins des combattants, c'est couper le recrutement jihadiste à sa racine. « Cette initiative tend à couper l'herbe sur le pied des groupes terroristes qui ont tendance à recruter au sein de la partie lésée de la population », analyse l'observateur panafricain Patient Parfait Ndoum sur For You Media Africa, le 8 juin 2026. « Un enfant qui a perdu son géniteur dans cette guerre se retrouve isolé, sans encadrement, sans moyens — une cible pour les vendeurs d'illusion. » En prenant en charge ces enfants, l'État transforme le deuil en engagement civique: il rappelle aux orphelins le sens du sacrifice de leurs parents, et leur donne une raison de défendre à leur tour la nation.</w:t>
       </w:r>
     </w:p>
     <w:p>
@@ -8239,7 +8239,7 @@
     </w:p>
     <w:p>
       <w:r>
-        <w:t>Des précédents existent. La Zambie du président Hakainde Hichilema a démontré qu'un choix politique courageux peut changer la trajectoire d'une génération: depuis 2021, l'enseignement primaire et secondaire y est gratuit — inscrit dans la loi. Frais d'inscription supprimés, frais d'examen abolis, uniformes accessibles, manuels fournis; et surtout, les établissements publics ont l'obligation légale de ne refuser aucun enfant, même si l'État n'a pas encore versé les subventions correspondantes. Ce n'est pas seulement une intention politique — c'est une architecture légale qui ferme la porte à l'exclusion. Le Bénin a fait le même choix pour l'éducation des filles jusqu'à la terminale. Ce sont des actes politiques, pas des effets d'annonce: ils coûtent en budget, en infrastructures, en formation d'enseignants. Et ils transforment des sociétés. « Si des décisions pareilles ne sont pas prises, l'Afrique ne décollera jamais», résume Patient Parfum d'âme. La réforme zambienne illustre aussi l'effet tâche d'huile: quand un pays déclenche, les autres suivent — exactement comme l'abolition des visas au Bénin a entraîné le Ghana, puis la République du Congo, à ouvrir leurs frontières à leur tour. Un précédent éducatif peut devenir une norme continentale. « La gratuité scolaire ne doit pas se limiter à une simple suppression des frais, prévient l'analyste Parfait Patient Ndom. Construire des salles de classe, recruter des enseignants compétents, garantir le suivi rigoureux — voilà ce que signifie prendre la jeunesse au sérieux.»</w:t>
+        <w:t>Des précédents existent. La Zambie du président Hakainde Hichilema a démontré qu'un choix politique courageux peut changer la trajectoire d'une génération: depuis 2021, l'enseignement primaire et secondaire y est gratuit — inscrit dans la loi. Frais d'inscription supprimés, frais d'examen abolis, uniformes accessibles, manuels fournis; et surtout, les établissements publics ont l'obligation légale de ne refuser aucun enfant, même si l'État n'a pas encore versé les subventions correspondantes. Ce n'est pas seulement une intention politique — c'est une architecture légale qui ferme la porte à l'exclusion. Le Bénin a fait le même choix pour l'éducation des filles jusqu'à la terminale. Ce sont des actes politiques, pas des effets d'annonce: ils coûtent en budget, en infrastructures, en formation d'enseignants. Et ils transforment des sociétés. « Si des décisions pareilles ne sont pas prises, l'Afrique ne décollera jamais», résume Patient Parfait Ndoum. La réforme zambienne illustre aussi l'effet tâche d'huile: quand un pays déclenche, les autres suivent — exactement comme l'abolition des visas au Bénin a entraîné le Ghana, puis la République du Congo, à ouvrir leurs frontières à leur tour. Un précédent éducatif peut devenir une norme continentale. « La gratuité scolaire ne doit pas se limiter à une simple suppression des frais, prévient l'analyste Patient Parfait Ndoum. Construire des salles de classe, recruter des enseignants compétents, garantir le suivi rigoureux — voilà ce que signifie prendre la jeunesse au sérieux.»</w:t>
       </w:r>
     </w:p>
     <w:p>
@@ -9326,7 +9326,7 @@
                 <w:color w:val="0A0A0A"/>
                 <w:sz w:val="18"/>
               </w:rPr>
-              <w:t>Dialogue permanent: maintenir les canaux de négociation même en temps de guerre — la leçon malienne est que fermeté militaire et diplomatie ne s'excluent pas; « La guerre n'empêche pas le dialogue » (Patient Parfum d'âme, For You Media Africa, 8 juin 2026)</w:t>
+              <w:t>Dialogue permanent: maintenir les canaux de négociation même en temps de guerre — la leçon malienne est que fermeté militaire et diplomatie ne s'excluent pas; « La guerre n'empêche pas le dialogue » (Patient Parfait Ndoum, For You Media Africa, 8 juin 2026)</w:t>
             </w:r>
           </w:p>
         </w:tc>

</xml_diff>

<commit_message>
Intégration analyse Laith Marouf: milices Al-Julani redéployées au Sahel
Deux insertions dans le manuscrit:

Ch.12 (L'explosion du terrorisme) — nouvelle sous-section
"La greffe syrienne: l'après-Damas au Sahel"
- Milices liées à Ahmad al-Sharaa (ex-Al-Julani) redéployées vers Mali/Niger
- Mécanisme: noyau syrien fragilisé → surplus de combattants exportés
- Architecture de sous-traitance: encadrement syrien + recrues locales précarisées
- Troisième maillon après greffe algérienne (1990s) et armes libyennes (2011)

Ch.20 (La guerre proxy) — extension du passage Banda Kani
- Identification de l'encadrement étranger des 12 000 hommes
- Chronologie des effondrements régionaux → internationalisation des forces

DOCX KDP rebuilt : 161 Ko, 31 encadrés, 6×9 in
</commit_message>
<xml_diff>
--- a/manuscrit-edition/LIVRE-FINAL.docx
+++ b/manuscrit-edition/LIVRE-FINAL.docx
@@ -4008,6 +4008,29 @@
     <w:p>
       <w:r>
         <w:t>Doumbé rappelle aussi l'enjeu qui dort sous le sable: le Niger détient à lui seul environ 5 % des réserves mondiales d'uranium — quelque 310 000 tonnes — et la zone AES élargie produit environ 230 tonnes d'or par an (Siké Doumbé, For You Media). La stabilité du Sahel n'intéresse pas grand monde. L'accès à ses sous-sols, si.</w:t>
+      </w:r>
+    </w:p>
+    <w:p>
+      <w:pPr>
+        <w:pStyle w:val="Heading2"/>
+      </w:pPr>
+      <w:r>
+        <w:t>La greffe syrienne: l'après-Damas au Sahel</w:t>
+      </w:r>
+    </w:p>
+    <w:p>
+      <w:r>
+        <w:t>La matrice que décrit Tiani — de l'Afghanistan à la Syrie, de la Syrie au Sahel — a pris, depuis la chute d'Assad, une réalité organisationnelle concrète. L'analyste Laith Marouf, depuis le théâtre levantin, documente ce que les cartographies des corridors commencent à révéler sur le terrain: des milices liées à Ahmad al-Sharaa — l'ancien Abou Mohammad al-Julani, maître de Damas depuis décembre 2024 — ont été progressivement redéployées hors de Syrie vers l'Afrique centrale et le Sahel, y compris le Niger et le Mali. Ce que Marouf nomme les « milices de la mort» ne se dissolvent pas avec la victoire de leur chef: elles s'exportent.</w:t>
+      </w:r>
+    </w:p>
+    <w:p>
+      <w:r>
+        <w:t>La logique du redéploiement est double. D'un côté, le noyau résiduel de ces milices en Syrie est aujourd'hui fragilisé — leur emprise territoriale précaire, leur économie de guerre menacée. De l'autre, des commanditaires sahéliens ou régionaux cherchent précisément ce que ces combattants apportent: un encadrement tactique et idéologique pour des recrues locales précarisées. Les milices syriennes fournissent l'ossature; la misère sahélienne fournit les effectifs. Ce n'est pas une rencontre fortuite — c'est une architecture de sous-traitance.</w:t>
+      </w:r>
+    </w:p>
+    <w:p>
+      <w:r>
+        <w:t>Ce flux illustre la dimension transnationale des conflits armés contemporains: des groupes constitués dans une guerre s'exportent dans une autre. Greffe algérienne, armes libyennes, miliciens syriens — chaque effondrement régional produit une cohorte de combattants disponibles qui cherchent un marché. Le Sahel est ce marché. Et la question que pose Siké Doumbé — « qui arme ces groupes, qui les finance, à qui profite l'instabilité?» — trouve ici une réponse supplémentaire: pas seulement des États, mais des surplus humains de conflits achevés, recyclés vers des conflits en cours.</w:t>
       </w:r>
     </w:p>
     <w:p>
@@ -6050,7 +6073,7 @@
     <w:p/>
     <w:p>
       <w:r>
-        <w:t>La coordination entre jihadistes et séparatistes, longtemps niée, s'affiche cette fois publiquement: Iyad Ag Ghali, chef du JNIM, et Alghabass Ag Intala commentent ensemble les attaques en vidéo; et le porte-parole du FLA déclare, sans qu'on le lui demande: « Nous avons de bons contacts avec les Ukrainiens tout comme avec la France, avec les États-Unis, avec presque tout le monde.» Banda Kani va plus loin: il décrit un contingent d'environ 12 000 hommes mêlant recrues sahéliennes précarisées et encadrement étranger, et des chefs de groupes armés en contact direct avec des cercles stratégiques français.</w:t>
+        <w:t>La coordination entre jihadistes et séparatistes, longtemps niée, s'affiche cette fois publiquement: Iyad Ag Ghali, chef du JNIM, et Alghabass Ag Intala commentent ensemble les attaques en vidéo; et le porte-parole du FLA déclare, sans qu'on le lui demande: « Nous avons de bons contacts avec les Ukrainiens tout comme avec la France, avec les États-Unis, avec presque tout le monde.» Banda Kani va plus loin: il décrit un contingent d'environ 12 000 hommes mêlant recrues sahéliennes précarisées et encadrement étranger, et des chefs de groupes armés en contact direct avec des cercles stratégiques français. L'analyste Laith Marouf apporte un éclairage complémentaire sur la composition de cet encadrement: des combattants issus des milices liées à Ahmad al-Sharaa, constituées dans le creuset syrien, auraient été progressivement redéployés vers le Sahel à mesure que leur noyau résiduel en Syrie fragilisait son emprise territoriale. Greffe algérienne des années 1990, armes libyennes de 2011, miliciens syriens de l'après-2024 — l'internationalisation de la force combattante au Sahel suit la chronologie des effondrements régionaux que l'Occident a provoqués ou laissé prospérer.</w:t>
       </w:r>
     </w:p>
     <w:p>

</xml_diff>

<commit_message>
Ch.14 — Guerre algorithmique: l'architecture des plateformes comme arme (Banda Kani)
Extension du "Deuxième front: le numérique" (Chapitre 14):
- L'algorithme comme arme de suppression du contenu géopolitique africain
- Amplification délibérée du triptyque sexe/bling/futilité vs. suppression des voix
  de conscience (stagnation autour de 1 000 vues pour les sujets de fond)
- Citation directe Banda Kani: "cas d'école de guerre, c'est avoué, on ne le cache même plus"
- La frivolité érigée en démarche stratégique avouée — code algorithmique comme
  front de combat distinct des influenceurs stipendiés

DOCX KDP rebuilt : 162 Ko, 31 encadrés, 6×9 in
</commit_message>
<xml_diff>
--- a/manuscrit-edition/LIVRE-FINAL.docx
+++ b/manuscrit-edition/LIVRE-FINAL.docx
@@ -4506,6 +4506,16 @@
     <w:p>
       <w:r>
         <w:t>C'est sur ce front que se joue la bataille du récit fondateur. Le récit dominant présente les transitions sahéliennes comme des produits de la manipulation russe. La chronologie le dément: la prise de pouvoir de Bamako date d'août 2020, l'arrivée massive de Wagner lui est postérieure. La rupture avec Paris est première; la diversification vers la Russie est une conséquence, pas une cause. Inverser l'ordre des deux événements, c'est inverser la responsabilité — et c'est exactement la fonction de ce récit.</w:t>
+      </w:r>
+    </w:p>
+    <w:p>
+      <w:r>
+        <w:t>Banda Kani formule l'enjeu de ce front en termes qui dépassent les opérations ciblées: c'est l'architecture même des plateformes qui constitue l'arme. « Quand toi tu parles de géopolitique, tu parles de l'avenir de l'Afrique, tu portes des futurs importants — on te bloque d'abord, on algorithmise tes contenus au trou là, tu tournes autour de 1 000 vues. Mais elle, dès qu'elle fait un contenu — de simples salutations banales, bonjour bonsoir vous allez bien — ce sont les vues qui pleuvent. À combien plus forte raison lorsqu'elle s'assoit pour faire des vidéos où c'est du sexe, du bling bling.» Et sa conclusion: « C'est avoué. Dans les cas d'école de guerre, c'est avoué, on ne le cache même plus. La frivolité, le voyeurisme élevé au niveau le plus élaboré comme une démarche stratégique.»</w:t>
+      </w:r>
+    </w:p>
+    <w:p>
+      <w:r>
+        <w:t>Ce mécanisme n'est pas une métaphore. C'est une architecture de combat: pendant que les voix qui analysent l'avenir de l'Afrique tournent en circuit fermé, le triptyque sexe-bling-futilité inonde les flux de cinq cents millions de téléphones africains. La guerre cognitive ne s'arrête pas aux influenceurs stipendiés; elle se joue au niveau du code — l'algorithme qui décide ce que chaque Africain verra demain matin à son réveil. Sur ce point, Banda Kani nomme le responsable: « La France a un problème. C'est son problème.»</w:t>
       </w:r>
     </w:p>
     <w:p>

</xml_diff>

<commit_message>
Ch.20 — Affaire SPEAR/Dande Christian: pendant américain du cas Quignolot
Extension de la section "L'armée fantôme" (Chapitre 20):
- Agent SPEAR (DSS/Département d'État) arrêté à Bangui avec 5 410 gélules
  de tramadol et Glock de dotation américaine (juin 2026)
- Programme SPEAR: créé après Benghazi, protection d'ambassade US en RCA
- Complices: Mohamed Azwa et Ngaisse Edgar (PK-5, Bangui)
- Même architecture que Quignolot: statut para-diplomatique = immunité de fait
- Question non répondue: ignorance ou complaisance érigée en doctrine?
- Source: Centrafrique Info, 17 juin 2026

DOCX KDP rebuilt : 162 Ko, 31 encadrés, 6×9 in
</commit_message>
<xml_diff>
--- a/manuscrit-edition/LIVRE-FINAL.docx
+++ b/manuscrit-edition/LIVRE-FINAL.docx
@@ -5892,6 +5892,16 @@
     <w:p>
       <w:r>
         <w:t>Ces hommes opèrent dans la zone grise des ESSD — les entreprises de services de sécurité et de défense. Concrètement, ce sont des sociétés privées qui vendent des prestations militaires: protection, formation, renseignement. Ni armée, ni police, ni service officiel, elles permettent à un État d'agir là où son drapeau ne peut plus flotter — et de tout nier en cas d'arrestation. Pour chaque agent pris, combien opèrent sans incident? Ce chiffre n'existe pas dans les archives publiques. La guerre secrète française au Sahel, on l'a vu au chapitre 13, a précédé la guerre officielle; elle lui a aussi survécu.</w:t>
+      </w:r>
+    </w:p>
+    <w:p>
+      <w:r>
+        <w:t>Washington n'est pas absent de cette géographie de la zone grise. En juin 2026, l'arrestation à Bangui de Dande Christian ajoute une dimension nouvelle à l'arsenal des parapluies diplomatiques. L'agent n'est ni un sous-officier reconverti ni un employé d'une ESSD obscure: il est membre du programme SPEAR — unité de protection créée par le Bureau de la sécurité diplomatique américain (DSS) après l'attaque de Benghazi, financée par le Département d'État, déployée pour la protection de l'ambassade des États-Unis à Bangui. Interpellé en flagrant délit de cession de 5 410 gélules de tramadol — l'opioïde de synthèse qui dévaste la jeunesse des quartiers de Bangui —, Dande Christian portait un Glock de dotation américaine: l'arme réglementaire remise par l'ambassade, inscrite à l'inventaire officiel. Ses complices présumés, Mohamed Azwa et Ngaisse Edgar, sont des figures du quartier PK-5, le marché central de la capitale centrafricaine qui sert de plaque tournante à plusieurs économies informelles (Centrafrique Info, 17 juin 2026).</w:t>
+      </w:r>
+    </w:p>
+    <w:p>
+      <w:r>
+        <w:t>Ce que l'affaire Dande Christian révèle est structurellement identique à ce que Quignolot avait révélé côté français: le statut diplomatique ou para-diplomatique construit une immunité de fait. Qui, à Bangui, fouille le véhicule ou vérifie le chargement d'un homme portant l'uniforme et la carte d'un programme américain? Centrafrique Info formule la question qui reste sans réponse officielle: « Ignoriez-vous vraiment qui vous embauchiez et qui vous armiez? Ou le saviez-vous, mais préfériez-vous fermer les yeux?» La réponse de l'ambassade américaine n'a pas été rendue publique à l'heure où ce livre s'écrit. Comme pour Quignolot, le silence actif vaut information.</w:t>
       </w:r>
     </w:p>
     <w:p>

</xml_diff>

<commit_message>
Ch.20 — Jeune Afrique: drones ukrainiens et formation proposés aux exilés maliens (juin-août 2025)
Nouvelle sous-section "L'étape suivante: drones et changement de régime":
- Juin-août 2025: intermédiaires français ("barbouzes") → GUR ukrainien → opposition
  malienne en exil: offre de drones militarisés + formations en Ukraine
- Évolution du canal France-Ukraine-Sahel: de l'appui renseignement (Tinzawaten)
  vers l'armement et l'entraînement au changement de régime
- Source: Matthieu Millecamps, Jeune Afrique, 17 juin 2026
- Déniabilité structurelle: "faux agents français" / dispositif ESSD-identique
- Note épistémique: Jeune Afrique comme source adverse qui confirme

DOCX KDP rebuilt : 163 Ko, 31 encadrés, 6×9 in
</commit_message>
<xml_diff>
--- a/manuscrit-edition/LIVRE-FINAL.docx
+++ b/manuscrit-edition/LIVRE-FINAL.docx
@@ -5930,6 +5930,29 @@
     <w:p>
       <w:r>
         <w:t>Le Mali, puis le Niger, rompent leurs relations diplomatiques avec Kiev. Décision qualifiée d'« émotionnelle» par certains commentateurs occidentaux; cohérence élémentaire en réalité: si tu fournis à mon ennemi les renseignements qui tuent mes soldats, tu es mon ennemi. Le 19 août 2024, les trois ministres des Affaires étrangères de l'AES saisissent formellement le Conseil de sécurité de l'ONU, dénonçant « le soutien ouvert et assumé du Gouvernement de la République d'Ukraine au terrorisme international, en particulier au Sahel» (communiqué conjoint AES, 19 août 2024). Le Conseil — dont la France est membre permanent avec droit de veto — n'agit pas. Ce silence rejoint un précédent: en juillet 2022 déjà, quand le Mali avait voulu présenter au Conseil des preuves que les terroristes étaient « fabriqués, entretenus et entraînés contre nos États», un veto avait bloqué la présentation publique. Choguel Maïga rapporte la justification qui en aurait été donnée en coulisses: « Si jamais les Maliens montrent leurs preuves, tous les Africains vont se révolter». Les preuves matérielles, elles, s'accumulent: le 23 mai 2025, lors d'une embuscade près de Sofara, les FAMa saisissent sur des combattants du JNIM un téléphone contenant des documents présentés comme issus du renseignement ukrainien, ainsi qu'un drone à marquages ukrainiens (Lefaso.net, 23 juin 2025). Et Tiani pose l'argument matériel le plus simple: les terroristes alignent des mitrailleuses lourdes « que les forces de l'AES ne possèdent même pas». On ne vole pas à l'adversaire ce qu'il n'a pas.</w:t>
+      </w:r>
+    </w:p>
+    <w:p>
+      <w:pPr>
+        <w:pStyle w:val="Heading2"/>
+      </w:pPr>
+      <w:r>
+        <w:t>L'étape suivante: drones et changement de régime</w:t>
+      </w:r>
+    </w:p>
+    <w:p>
+      <w:r>
+        <w:t>Entre août 2024 et l'été 2025, le canal France-Ukraine-Sahel évolue de l'appui renseignement vers quelque chose de plus concret. Jeune Afrique révèle, dans une enquête signée Matthieu Millecamps publiée le 17 juin 2026, ce qui s'était passé à l'été précédent: entre juin et août 2025, des intermédiaires français — se présentant comme proches des services de renseignement français — ont pris contact avec des « membres du gouvernement malien en exil» et les ont mis en relation avec les renseignements militaires ukrainiens, le GUR. L'objet de la démarche: proposer des drones militarisés et des formations en Ukraine, pour combattre la junte d'Assimi Goïta. Ce que le GUR avait fourni à Tinzawaten — de la donnée, des coordonnées —, le réseau tentait désormais de le compléter par de l'armement et de l'entraînement au changement de régime.</w:t>
+      </w:r>
+    </w:p>
+    <w:p>
+      <w:r>
+        <w:t>L'enquête de Jeune Afrique s'intitule: « Barbouzes, drones et exilés: des Français ont proposé des armes ukrainiennes aux opposants maliens» — « barbouzes» désignant dans l'argot des services les agents non officiels, ceux dont l'État peut se désolidariser si l'opération tourne mal. La précision du terme est à retenir: l'article parle de « faux agents français», et non de fonctionnaires identifiés. Le dispositif est construit pour la déniabilité — exactement le même principe que les ESSD de Quignolot, ou le masque ukrainien employé après le retrait de Barkhane. La source de l'article est un opposant malien de la diaspora qui confie l'information « début mai» 2026 « sur le ton de la confidence» — ce qui situe la révélation dans le même moment que les attaques du 25 avril et les révélations de RTL. La séquence est lisible: les offres de drones et de formation de juin-août 2025 n'ayant pas produit de changement de régime, l'escalade vers l'action directe a suivi.</w:t>
+      </w:r>
+    </w:p>
+    <w:p>
+      <w:r>
+        <w:t>La note de Jeune Afrique mérite d'être pesée: ce n'est pas un site panafricaniste, ni un organe des gouvernements de l'AES. C'est l'une des publications africaines les plus lues, avec des correspondants et des avocats. Que le magazine publie une telle enquête — en nommant le lien entre intermédiaires français, GUR et exilés maliens — place ce fait dans la catégorie des informations que l'adversaire lui-même ne peut plus démentir sans risquer sa crédibilité.</w:t>
       </w:r>
     </w:p>
     <w:p>

</xml_diff>

<commit_message>
Ch.20: intègre déclaration Bruno Fuchs/RFI + analyse JNIM comme acteur politique
Nouvelle sous-section "L'agenda révélé: le JNIM comme futur acteur politique":
- Bruno Fuchs (commission AF, AN française) sur RFI le 25/04/26: junta tombe
  "dans quelques semaines ou quelques mois", JNIM à intégrer en transition
- Modèle structurel: Forces Nouvelles CI 2010 → al-Sharaa Syrie 2024 → JNIM Mali
- "Transaction model": député salarié par ceux qu'il défend (Matingé, Festin Panafricain)
- FLA: antennes ouvertes à Lomé, Abidjan, Ndjamena
- Complicité interne: Premier ministre absent le 25/04, général Abdoulaye Maïga signalé
- Comparaison Niger/Mali: Tiani + PM civil Lamine Zeine = 6 mois réserves devises
- Coût du pivot marocain: Algérie ferme les yeux sur le JNIM (frontière nord)
- Source: Festin Panafricain (Panafrican Média TV), juin 2026; Matingé & Banda Kani

DOCX: 167 Ko, 31 encadrés
</commit_message>
<xml_diff>
--- a/manuscrit-edition/LIVRE-FINAL.docx
+++ b/manuscrit-edition/LIVRE-FINAL.docx
@@ -6219,6 +6219,49 @@
     <w:p>
       <w:r>
         <w:t>Puis vient l'aveu. Le 9 mai 2026, sur RTL, George Malbruno rapporte les propos d'une source sécuritaire française: « On est dans la froide réalité du terrain. Des ex-légionnaires francophones travaillent avec le GUR ukrainien. Le verrou semble levé.» Macron s'emporte publiquement contre le journaliste. Il ne dément pas le fond. Ce silence actif vaut validation. Fait remarquable: c'est l'adversaire lui-même qui confirme. Choguel Maïga, traité de « complotiste» en 2021 lorsqu'il parlait d'un terrorisme fabriqué, est confirmé en 2026 par une source sécuritaire française.</w:t>
+      </w:r>
+    </w:p>
+    <w:p>
+      <w:pPr>
+        <w:pStyle w:val="Heading2"/>
+      </w:pPr>
+      <w:r>
+        <w:t>L'agenda révélé: le JNIM comme futur acteur politique</w:t>
+      </w:r>
+    </w:p>
+    <w:p>
+      <w:r>
+        <w:t>Pendant que les bombes tombaient à Bamako, un élu français livrait publiquement l'acte suivant du scénario. Le 25 avril 2026 — jour de l'attentat contre Sadio Camara —, Bruno Fuchs, président de la commission des Affaires étrangères de l'Assemblée nationale française, accordait une interview à RFI. Sa déclaration mérite d'être citée dans son intégralité analytique: «la junte au pouvoir à Bamako va tomber dans quelques semaines ou quelques mois»; les Russes sont en train de négocier leur départ; le JNIM doit être intégré comme acteur politique dans la future transition — selon le modèle de la réconciliation. Deux scénarios sont esquissés: un effondrement négocié, ou un effondrement forcé vers un «modèle afghan». Cette déclaration n'est pas une prédiction. C'est un signal.</w:t>
+      </w:r>
+    </w:p>
+    <w:p>
+      <w:r>
+        <w:t>L'analyste Jonathan Matingé, dans un décryptage publié par Festin Panafricain (juin 2026), identifie la logique structurelle: Fuchs n'est pas ministre — il ne peut donc pas engager officiellement la France. Mais il préside la commission compétente, et dans la grammaire diplomatique française, un président de commission parle quand un ministre ne peut pas. Le message est adressé au JNIM, pas à l'opinion française. Le modèle opératoire est répétitif: Forces Nouvelles de Côte d'Ivoire en 2010 — groupe armé qualifié de terroriste, devenu interlocuteur politique, puis pilier de l'État Ouattara; Ahmad al-Sharaa en Syrie en 2024-2025 — chef d'organisation terroriste reconnue, reçu à l'Élysée dès décembre 2024, Premier ministre de facto de Damas six mois plus tard. La formule de Matingé résume la doctrine: «Les terroristes sont nos hommes politiques de demain.» Si le schéma tient, le JNIM est le candidat malien au même recyclage.</w:t>
+      </w:r>
+    </w:p>
+    <w:p>
+      <w:r>
+        <w:t>La question du financement de ces prises de position publiques est posée explicitement. Matingé rappelle que dans le système politique français, un député est un élu qui se finance — et que ceux qui défendent des intérêts étrangers dans l'hémicycle sont souvent ceux que ces intérêts ont aidé à y entrer. «Un député, c'est quelqu'un qui est salarié de ceux qu'il défend», résume-t-il (Festin Panafricain, juin 2026). Cette logique — contestée, non prouvée individuellement, mais cohérente avec des précédents documentés dans d'autres contextes — constitue, selon les analystes panafricains présents, le sous-texte de la déclaration Fuchs.</w:t>
+      </w:r>
+    </w:p>
+    <w:p>
+      <w:r>
+        <w:t>Sur le terrain, le FLA — Forces de Libération de l'Azawad — a entre-temps structuré sa présence diplomatique: des antennes ont été ouvertes à Lomé, Abidjan et Ndjamena, selon des informations recoupées par Festin Panafricain (juin 2026). Ces implantations ne sont pas des bureaux touristiques. Elles représentent une projection politique dans les capitales de pays qui maintiennent des relations avec Paris, et qui jouxtent ou jouxtaient le Mali — un maillage de représentation pour un groupe armé qui anticipe sa reconversion politique.</w:t>
+      </w:r>
+    </w:p>
+    <w:p>
+      <w:r>
+        <w:t>L'analyse du 25 avril apporte un angle supplémentaire: la question de la complicité interne. L'attentat contre Sadio Camara, dans sa précision chirurgicale — cible identifiée, timing politique, impact maximal —, implique une connaissance intime du dispositif de sécurité. Matingé et Banda Kani relèvent que le Premier ministre malien était absent de Bamako le 25 avril, en déplacement officiel au Burkina Faso. Cette absence simultanée à l'attentat majeur de la décennie nourrit des interrogations sur la chaîne de décision à la primature — interrogations que les analystes panafricains formulent avec prudence, mais formulent. La figure du «militaire de la primature» — le général Abdoulaye Maïga — est citée dans ce contexte comme un point de vulnérabilité institutionnelle que la transition devrait examiner.</w:t>
+      </w:r>
+    </w:p>
+    <w:p>
+      <w:r>
+        <w:t>La comparaison avec le Niger est instruite à ce moment de l'analyse. Le général Tiani, à Niamey, a fait un choix que Bamako n'a pas fait: maintenir un Premier ministre civil, Lamine Zeine, spécialiste reconnu en économie internationale. Résultat mesuré: six mois de réserves en devises au Niger contre une situation plus tendue au Mali. Les analystes du Festin Panafricain en tirent une recommandation directe à Goïta: restructurer la transition, réintégrer Choguel Maïga au premier plan du dispositif civil, consolider la gouvernance économique parallèlement à l'effort militaire. Non par idéalisme, mais parce que la résilience financière est elle-même une arme dans une guerre qui dure.</w:t>
+      </w:r>
+    </w:p>
+    <w:p>
+      <w:r>
+        <w:t>Dernier angle géopolitique: la décision malienne sur le Sahara occidental a eu un coût diplomatique précis. En rejoignant la position marocaine, Bamako s'est isolé d'Alger. L'Algérie, qui partage une longue frontière avec le Mali et qui peut — quand elle le choisit — exercer une pression sur les flux logistiques du JNIM, a depuis lors adopté une posture de neutralité bienveillante envers le groupe armé. «L'Algérie ferme les yeux sur le JNIM» (Festin Panafricain, juin 2026): ce changement de posture algérien est une conséquence directe d'une décision diplomatique malienne qui a été prise sans calculer ses implications sécuritaires sur le flanc nord. La géographie a ses représailles.</w:t>
       </w:r>
     </w:p>
     <w:p>

</xml_diff>

<commit_message>
Ch.20: corrige attribution — Jonathan Matingé → Bertrand Batenguene
La section "L'agenda révélé: le JNIM comme futur acteur politique"
attribuait l'analyse à "Jonathan Matingé" (erreur). L'auteur est
Bertrand Batenguene (Festin Panafricain, juin 2026).
Batenguene ajouté à la liste des analystes en note méthodologique.
Jonathan Batenguène (déjà présent) est une personne distincte.
</commit_message>
<xml_diff>
--- a/manuscrit-edition/LIVRE-FINAL.docx
+++ b/manuscrit-edition/LIVRE-FINAL.docx
@@ -6236,12 +6236,12 @@
     </w:p>
     <w:p>
       <w:r>
-        <w:t>L'analyste Jonathan Matingé, dans un décryptage publié par Festin Panafricain (juin 2026), identifie la logique structurelle: Fuchs n'est pas ministre — il ne peut donc pas engager officiellement la France. Mais il préside la commission compétente, et dans la grammaire diplomatique française, un président de commission parle quand un ministre ne peut pas. Le message est adressé au JNIM, pas à l'opinion française. Le modèle opératoire est répétitif: Forces Nouvelles de Côte d'Ivoire en 2010 — groupe armé qualifié de terroriste, devenu interlocuteur politique, puis pilier de l'État Ouattara; Ahmad al-Sharaa en Syrie en 2024-2025 — chef d'organisation terroriste reconnue, reçu à l'Élysée dès décembre 2024, Premier ministre de facto de Damas six mois plus tard. La formule de Matingé résume la doctrine: «Les terroristes sont nos hommes politiques de demain.» Si le schéma tient, le JNIM est le candidat malien au même recyclage.</w:t>
-      </w:r>
-    </w:p>
-    <w:p>
-      <w:r>
-        <w:t>La question du financement de ces prises de position publiques est posée explicitement. Matingé rappelle que dans le système politique français, un député est un élu qui se finance — et que ceux qui défendent des intérêts étrangers dans l'hémicycle sont souvent ceux que ces intérêts ont aidé à y entrer. «Un député, c'est quelqu'un qui est salarié de ceux qu'il défend», résume-t-il (Festin Panafricain, juin 2026). Cette logique — contestée, non prouvée individuellement, mais cohérente avec des précédents documentés dans d'autres contextes — constitue, selon les analystes panafricains présents, le sous-texte de la déclaration Fuchs.</w:t>
+        <w:t>L'analyste Bertrand Batenguene, dans un décryptage publié par Festin Panafricain (juin 2026), identifie la logique structurelle: Fuchs n'est pas ministre — il ne peut donc pas engager officiellement la France. Mais il préside la commission compétente, et dans la grammaire diplomatique française, un président de commission parle quand un ministre ne peut pas. Le message est adressé au JNIM, pas à l'opinion française. Le modèle opératoire est répétitif: Forces Nouvelles de Côte d'Ivoire en 2010 — groupe armé qualifié de terroriste, devenu interlocuteur politique, puis pilier de l'État Ouattara; Ahmad al-Sharaa en Syrie en 2024-2025 — chef d'organisation terroriste reconnue, reçu à l'Élysée dès décembre 2024, Premier ministre de facto de Damas six mois plus tard. La formule de Batenguene résume la doctrine: «Les terroristes sont nos hommes politiques de demain.» Si le schéma tient, le JNIM est le candidat malien au même recyclage.</w:t>
+      </w:r>
+    </w:p>
+    <w:p>
+      <w:r>
+        <w:t>La question du financement de ces prises de position publiques est posée explicitement. Batenguene rappelle que dans le système politique français, un député est un élu qui se finance — et que ceux qui défendent des intérêts étrangers dans l'hémicycle sont souvent ceux que ces intérêts ont aidé à y entrer. «Un député, c'est quelqu'un qui est salarié de ceux qu'il défend», résume-t-il (Festin Panafricain, juin 2026). Cette logique — contestée, non prouvée individuellement, mais cohérente avec des précédents documentés dans d'autres contextes — constitue, selon les analystes panafricains présents, le sous-texte de la déclaration Fuchs.</w:t>
       </w:r>
     </w:p>
     <w:p>
@@ -6251,7 +6251,7 @@
     </w:p>
     <w:p>
       <w:r>
-        <w:t>L'analyse du 25 avril apporte un angle supplémentaire: la question de la complicité interne. L'attentat contre Sadio Camara, dans sa précision chirurgicale — cible identifiée, timing politique, impact maximal —, implique une connaissance intime du dispositif de sécurité. Matingé et Banda Kani relèvent que le Premier ministre malien était absent de Bamako le 25 avril, en déplacement officiel au Burkina Faso. Cette absence simultanée à l'attentat majeur de la décennie nourrit des interrogations sur la chaîne de décision à la primature — interrogations que les analystes panafricains formulent avec prudence, mais formulent. La figure du «militaire de la primature» — le général Abdoulaye Maïga — est citée dans ce contexte comme un point de vulnérabilité institutionnelle que la transition devrait examiner.</w:t>
+        <w:t>L'analyse du 25 avril apporte un angle supplémentaire: la question de la complicité interne. L'attentat contre Sadio Camara, dans sa précision chirurgicale — cible identifiée, timing politique, impact maximal —, implique une connaissance intime du dispositif de sécurité. Batenguene et Banda Kani relèvent que le Premier ministre malien était absent de Bamako le 25 avril, en déplacement officiel au Burkina Faso. Cette absence simultanée à l'attentat majeur de la décennie nourrit des interrogations sur la chaîne de décision à la primature — interrogations que les analystes panafricains formulent avec prudence, mais formulent. La figure du «militaire de la primature» — le général Abdoulaye Maïga — est citée dans ce contexte comme un point de vulnérabilité institutionnelle que la transition devrait examiner.</w:t>
       </w:r>
     </w:p>
     <w:p>
@@ -10906,7 +10906,7 @@
     </w:p>
     <w:p>
       <w:r>
-        <w:t>Banda Kani, Franklin Nyamsi, Jonathan Batenguène, Anatole Ayissi, Dr Yamb Ntimba,</w:t>
+        <w:t>Banda Kani, Franklin Nyamsi, Jonathan Batenguène, Bertrand Batenguene, Anatole Ayissi, Dr Yamb Ntimba,</w:t>
       </w:r>
     </w:p>
     <w:p>

</xml_diff>

<commit_message>
Ch.20: corrige attribution — Bertrand → Jonathan Batenguene; supprime doublon
L'analyste cité dans la section JNIM/Fuchs est Jonathan Batenguene
(et non Bertrand). Doublon supprimé dans la note méthodologique;
orthographe unifiée: Jonathan Batenguene (sans accent).
</commit_message>
<xml_diff>
--- a/manuscrit-edition/LIVRE-FINAL.docx
+++ b/manuscrit-edition/LIVRE-FINAL.docx
@@ -6236,7 +6236,7 @@
     </w:p>
     <w:p>
       <w:r>
-        <w:t>L'analyste Bertrand Batenguene, dans un décryptage publié par Festin Panafricain (juin 2026), identifie la logique structurelle: Fuchs n'est pas ministre — il ne peut donc pas engager officiellement la France. Mais il préside la commission compétente, et dans la grammaire diplomatique française, un président de commission parle quand un ministre ne peut pas. Le message est adressé au JNIM, pas à l'opinion française. Le modèle opératoire est répétitif: Forces Nouvelles de Côte d'Ivoire en 2010 — groupe armé qualifié de terroriste, devenu interlocuteur politique, puis pilier de l'État Ouattara; Ahmad al-Sharaa en Syrie en 2024-2025 — chef d'organisation terroriste reconnue, reçu à l'Élysée dès décembre 2024, Premier ministre de facto de Damas six mois plus tard. La formule de Batenguene résume la doctrine: «Les terroristes sont nos hommes politiques de demain.» Si le schéma tient, le JNIM est le candidat malien au même recyclage.</w:t>
+        <w:t>L'analyste Jonathan Batenguene, dans un décryptage publié par Festin Panafricain (juin 2026), identifie la logique structurelle: Fuchs n'est pas ministre — il ne peut donc pas engager officiellement la France. Mais il préside la commission compétente, et dans la grammaire diplomatique française, un président de commission parle quand un ministre ne peut pas. Le message est adressé au JNIM, pas à l'opinion française. Le modèle opératoire est répétitif: Forces Nouvelles de Côte d'Ivoire en 2010 — groupe armé qualifié de terroriste, devenu interlocuteur politique, puis pilier de l'État Ouattara; Ahmad al-Sharaa en Syrie en 2024-2025 — chef d'organisation terroriste reconnue, reçu à l'Élysée dès décembre 2024, Premier ministre de facto de Damas six mois plus tard. La formule de Batenguene résume la doctrine: «Les terroristes sont nos hommes politiques de demain.» Si le schéma tient, le JNIM est le candidat malien au même recyclage.</w:t>
       </w:r>
     </w:p>
     <w:p>
@@ -10906,7 +10906,7 @@
     </w:p>
     <w:p>
       <w:r>
-        <w:t>Banda Kani, Franklin Nyamsi, Jonathan Batenguène, Bertrand Batenguene, Anatole Ayissi, Dr Yamb Ntimba,</w:t>
+        <w:t>Banda Kani, Franklin Nyamsi, Jonathan Batenguene, Anatole Ayissi, Dr Yamb Ntimba,</w:t>
       </w:r>
     </w:p>
     <w:p>

</xml_diff>

<commit_message>
Ch.30: corrige attribution — Jonathan Guinée → Jonathan Batenguene; supprime doublon
</commit_message>
<xml_diff>
--- a/manuscrit-edition/LIVRE-FINAL.docx
+++ b/manuscrit-edition/LIVRE-FINAL.docx
@@ -9123,7 +9123,7 @@
     </w:p>
     <w:p>
       <w:r>
-        <w:t>Le terme «francophonie» a été forgé en 1883 par Onésime Reclus, géographe français et ancien militaire colonial, dans son ouvrage «France Algérie et colonies»: la survie et la prépondérance de la France passaient, selon lui, par l'expansion de sa langue — une expansion ne pouvant se réaliser que par la domination sans réserve d'autres peuples. L'inventeur du mot a posé d'emblée la vérité de l'institution. Jonathan Guinée, sociologue à l'université de Douala, note que la France n'a fait ensuite que copier le modèle britannique: «Les Anglais dans les années 1930 ont créé le Commonwealth en se rendant compte que les dynamiques de décolonisation étaient inéluctables et irréversibles. Il fallait préparer la consolidation de l'Empire autour d'une entente mutuelle — consensus autour de la langue anglaise, avec les règles édictées par les Anglais, mais admises par la communauté comme étant derrière quoi tout le monde sait que c'est l'Angleterre qui tire les marrons du feu.» La France en 1970 reprendit sur le même modèle. La formule profonde est empruntée à Rousseau: «Le plus fort n'est jamais sûr d'être le plus fort s'il ne transforme sa force en droit et l'obéissance en devoir.» On ne frappe plus; on fait vouloir.</w:t>
+        <w:t>Le terme «francophonie» a été forgé en 1883 par Onésime Reclus, géographe français et ancien militaire colonial, dans son ouvrage «France Algérie et colonies»: la survie et la prépondérance de la France passaient, selon lui, par l'expansion de sa langue — une expansion ne pouvant se réaliser que par la domination sans réserve d'autres peuples. L'inventeur du mot a posé d'emblée la vérité de l'institution. Jonathan Batenguene, sociologue à l'université de Douala, note que la France n'a fait ensuite que copier le modèle britannique: «Les Anglais dans les années 1930 ont créé le Commonwealth en se rendant compte que les dynamiques de décolonisation étaient inéluctables et irréversibles. Il fallait préparer la consolidation de l'Empire autour d'une entente mutuelle — consensus autour de la langue anglaise, avec les règles édictées par les Anglais, mais admises par la communauté comme étant derrière quoi tout le monde sait que c'est l'Angleterre qui tire les marrons du feu.» La France en 1970 reprendit sur le même modèle. La formule profonde est empruntée à Rousseau: «Le plus fort n'est jamais sûr d'être le plus fort s'il ne transforme sa force en droit et l'obéissance en devoir.» On ne frappe plus; on fait vouloir.</w:t>
       </w:r>
     </w:p>
     <w:p>
@@ -9148,7 +9148,7 @@
     </w:p>
     <w:p>
       <w:r>
-        <w:t>Jonathan Guinée décrit le mécanisme d'aliénation intellectuelle avec une précision qui dépasse la politique: c'est la personnalité elle-même qui est travaillée. «On a construit chez vous une acceptation de la domination — une naturalisation de la domination. En ce moment, vous avez l'impression que les choses sont normales comme ça» (Guinée, Panafrican Média TV, juin 2026). Sur le plan éducatif, le modèle Jules Ferry — cycles calqués sur le système français, imposés à l'ensemble des pays membres — a produit des cursus plus longs que le système anglosaxon pour des résultats moins compétitifs au niveau de l'insertion internationale. Sur le plan académique, les chercheurs africains francophones sont systématiquement repositionnés en commentateurs de la science occidentale: «Peu importe votre bravoure en Afrique, vous ne pouvez être aligné que sur les modèles des deux grands pôles francophones — la France et le Canada. Nous avons des professeurs qui passent la majeure partie du temps à parler des travaux des autres plutôt que des leurs.» La coopération intellectuelle francophone, concrètement, est un monopole opéré par Paris et Toronto sur la définition de ce qu'est le savoir légitime en zone francophone. Le mécanisme du postdoc illustre la chaîne: un chercheur africain envoyé se perfectionner à Bruxelles y rencontre des travaux développés avec une faible connaissance du terrain africain, mais «subtilement» appliqués à ce terrain — il revient adapter des cadres conçus ailleurs. «C'est le schéma le plus dangereux: on fabrique des personnes présentées comme la figure de l'excellence, mais qui sont en fait le nec plus ultra de l'aide de maison» (Guinée).</w:t>
+        <w:t>Jonathan Batenguene décrit le mécanisme d'aliénation intellectuelle avec une précision qui dépasse la politique: c'est la personnalité elle-même qui est travaillée. «On a construit chez vous une acceptation de la domination — une naturalisation de la domination. En ce moment, vous avez l'impression que les choses sont normales comme ça» (Guinée, Panafrican Média TV, juin 2026). Sur le plan éducatif, le modèle Jules Ferry — cycles calqués sur le système français, imposés à l'ensemble des pays membres — a produit des cursus plus longs que le système anglosaxon pour des résultats moins compétitifs au niveau de l'insertion internationale. Sur le plan académique, les chercheurs africains francophones sont systématiquement repositionnés en commentateurs de la science occidentale: «Peu importe votre bravoure en Afrique, vous ne pouvez être aligné que sur les modèles des deux grands pôles francophones — la France et le Canada. Nous avons des professeurs qui passent la majeure partie du temps à parler des travaux des autres plutôt que des leurs.» La coopération intellectuelle francophone, concrètement, est un monopole opéré par Paris et Toronto sur la définition de ce qu'est le savoir légitime en zone francophone. Le mécanisme du postdoc illustre la chaîne: un chercheur africain envoyé se perfectionner à Bruxelles y rencontre des travaux développés avec une faible connaissance du terrain africain, mais «subtilement» appliqués à ce terrain — il revient adapter des cadres conçus ailleurs. «C'est le schéma le plus dangereux: on fabrique des personnes présentées comme la figure de l'excellence, mais qui sont en fait le nec plus ultra de l'aide de maison» (Guinée).</w:t>
       </w:r>
     </w:p>
     <w:p>
@@ -10974,7 +10974,7 @@
     </w:p>
     <w:p>
       <w:r>
-        <w:t>Banda Kani, Franklin Nyamsi, Jonathan Batenguene, Jonathan Guinée, Anatole Ayissi, Dr Yamb Ntimba,</w:t>
+        <w:t>Banda Kani, Franklin Nyamsi, Jonathan Batenguene, Anatole Ayissi, Dr Yamb Ntimba,</w:t>
       </w:r>
     </w:p>
     <w:p>

</xml_diff>

<commit_message>
Ch.20: intègre deuxième attaque aéroport Niamey (18 juin 2026)
18/06/2026 ~6h: mercenaires en taxis banalisés + ceintures explosives.
FDS ripostent immédiatement; attaque repoussée en quelques heures.
13 martyrs nigériens, 22 assaillants neutralisés, ~20 suspects interpellés.
Attribution officielle: «mercenaires à la solde de France d'Emmanuel Macron».
Aéroport resté ouvert au trafic. 2e frappe sur le même site en 2026
(1ère = janvier 2026). DOCX: 173 Ko, 31 encadrés.
Source: Télé Sahel / Tani Umaru, 18 juin 2026
</commit_message>
<xml_diff>
--- a/manuscrit-edition/LIVRE-FINAL.docx
+++ b/manuscrit-edition/LIVRE-FINAL.docx
@@ -6282,6 +6282,11 @@
     <w:p>
       <w:r>
         <w:t>Dernier angle géopolitique: la décision malienne sur le Sahara occidental a eu un coût diplomatique précis. En rejoignant la position marocaine, Bamako s'est isolé d'Alger. L'Algérie, qui partage une longue frontière avec le Mali et qui peut — quand elle le choisit — exercer une pression sur les flux logistiques du JNIM, a depuis lors adopté une posture de neutralité bienveillante envers le groupe armé. «L'Algérie ferme les yeux sur le JNIM» (Festin Panafricain, juin 2026): ce changement de posture algérien est une conséquence directe d'une décision diplomatique malienne qui a été prise sans calculer ses implications sécuritaires sur le flanc nord. La géographie a ses représailles.</w:t>
+      </w:r>
+    </w:p>
+    <w:p>
+      <w:r>
+        <w:t>La réponse ne s'arrête pas là. Le 18 juin 2026, aux environs de 6h du matin, l'aéroport international Diori Hamani de Niamey est attaqué une deuxième fois dans la même année. Des mercenaires armés — «à la solde de France d'Emmanuel Macron», selon le communiqué officiel du ministère de la Défense nigérien — s'infiltrent à bord de taxis et de minibus urbains, certains portant des ceintures explosives. L'effet de surprise recherché échoue: alertées par les premiers coups de feu, les forces de défense et de sécurité réagissent immédiatement. L'attaque est repoussée en quelques heures. Bilan: 13 martyrs côté nigérien (11 FDS et 2 civils), 4 blessés; 22 assaillants neutralisés, une vingtaine de suspects interpellés. Matériel saisi: M80, RPG-7, AK-47, grenades, munitions, portables VHF — et deux taxis et une fourgonnette. L'aéroport, «totalement sécurisé», demeure ouvert au trafic aérien. La logistique de l'attaque — véhicules de transport urbain banalisés, ceintures explosives, ciblage répété de la même infrastructure stratégique — confirme une planification extérieure. La première frappe de janvier 2026 était une répétition générale; la deuxième du 18 juin 2026 est la confirmation que la cible ne change pas: paralyser la capitale nigérienne par son nœud aérien. Deux fois, les FDS ont tenu.</w:t>
       </w:r>
     </w:p>
     <w:p>

</xml_diff>

<commit_message>
Ch.30: intégration Canal Plus/CSC Burkina + correction attributions Batenguene
- Canal Plus Afrique: amende CSC Burkina (50M CFA), 9,7M abonnés, argument
  souveraineté audiovisuelle; logique Air France = Canal Plus (licence commerciale
  comme levier politique); l'Afrique est une puissance, pas un client
- Correction 4 citations résiduelles "(Guinée, ...)" → "(Batenguene, ...)" et
  "(Guinée)" → "(Batenguene)" dans les paragraphes aliénation intellectuelle,
  cas rwandais et fédération linguistique
- DOCX KDP reconstruit: 173 Ko, 31 encadrés
</commit_message>
<xml_diff>
--- a/manuscrit-edition/LIVRE-FINAL.docx
+++ b/manuscrit-edition/LIVRE-FINAL.docx
@@ -9119,6 +9119,11 @@
       </w:r>
     </w:p>
     <w:p>
+      <w:r>
+        <w:t>Canal Plus Afrique illustre la même logique dans le domaine audiovisuel. Le groupe, propriété de Vivendi, revendique 9,7 millions d'abonnés en Afrique, une couverture de 350 millions de téléspectateurs et une notoriété supérieure à 96 % sur plusieurs marchés du continent. Au Cameroun seulement, ses revenus annuels sont estimés à plusieurs dizaines de milliards de francs CFA. L'Afrique n'est pas pour Canal Plus un marché secondaire — elle est l'un des piliers structurels de son modèle économique. Or pendant des années, Canal Plus Afrique a relégué les chaînes publiques nationales en marge de ses bouquets, ou les a omises, au profit de ses propres offres de contenus. Pourquoi des chaînes financées par les contribuables africains devraient-elles dépendre du bon vouloir d'un opérateur étranger pour être visibles auprès de leur propre population? Le Burkina Faso vient de répondre par un acte de régulation: le Conseil supérieur de la communication (CSC) a condamné Canal Plus Afrique à une amende de 50 millions de francs CFA pour manquement grave à ses obligations légales — non-respect de la diffusion obligatoire et continue des chaînes publiques nationales sur ses bouquets. L'amende dit trois choses: que l'espace audiovisuel national est souverain; que les licences commerciales étrangères ont des contreparties exigibles; et que le rapport de force entre un opérateur privé et un État régulateur est inversible. Air France, Canal Plus: deux entreprises françaises, deux secteurs différents, une même logique — la licence commerciale accordée par un État africain peut être retirée ou sanctionnée si l'entreprise déborde dans le politique ou néglige ses obligations légales. Un marché de près d'un milliard et demi d'habitants n'est pas un client. C'est une puissance.</w:t>
+      </w:r>
+    </w:p>
+    <w:p>
       <w:pPr>
         <w:pStyle w:val="Heading2"/>
       </w:pPr>
@@ -9153,17 +9158,17 @@
     </w:p>
     <w:p>
       <w:r>
-        <w:t>Jonathan Batenguene décrit le mécanisme d'aliénation intellectuelle avec une précision qui dépasse la politique: c'est la personnalité elle-même qui est travaillée. «On a construit chez vous une acceptation de la domination — une naturalisation de la domination. En ce moment, vous avez l'impression que les choses sont normales comme ça» (Guinée, Panafrican Média TV, juin 2026). Sur le plan éducatif, le modèle Jules Ferry — cycles calqués sur le système français, imposés à l'ensemble des pays membres — a produit des cursus plus longs que le système anglosaxon pour des résultats moins compétitifs au niveau de l'insertion internationale. Sur le plan académique, les chercheurs africains francophones sont systématiquement repositionnés en commentateurs de la science occidentale: «Peu importe votre bravoure en Afrique, vous ne pouvez être aligné que sur les modèles des deux grands pôles francophones — la France et le Canada. Nous avons des professeurs qui passent la majeure partie du temps à parler des travaux des autres plutôt que des leurs.» La coopération intellectuelle francophone, concrètement, est un monopole opéré par Paris et Toronto sur la définition de ce qu'est le savoir légitime en zone francophone. Le mécanisme du postdoc illustre la chaîne: un chercheur africain envoyé se perfectionner à Bruxelles y rencontre des travaux développés avec une faible connaissance du terrain africain, mais «subtilement» appliqués à ce terrain — il revient adapter des cadres conçus ailleurs. «C'est le schéma le plus dangereux: on fabrique des personnes présentées comme la figure de l'excellence, mais qui sont en fait le nec plus ultra de l'aide de maison» (Guinée).</w:t>
-      </w:r>
-    </w:p>
-    <w:p>
-      <w:r>
-        <w:t>Le cas rwandais est la démonstration empirique qu'une sortie est possible — et que Paris en connaît le prix. Après le génocide de 1994 et la complicité française mise à nu, Kigali a quitté la Francophonie, rejoint le Commonwealth et adopté l'anglais et le kinyarwanda comme langues nationales. La réponse de Paris a été mécanique: pour ramener le Rwanda dans l'orbite francophone, la France a offert la présidence de l'OIF à Louise Mushikiwabo, alors ministre rwandaise des Affaires étrangères. «Sortir de la Francophonie, c'est se donner les moyens d'en influencer les règles. De l'intérieur, vous ne pouvez pas changer grand-chose» (Guinée).</w:t>
-      </w:r>
-    </w:p>
-    <w:p>
-      <w:r>
-        <w:t>La voie de sortie proposée est programmatique, non catastrophiste: une réforme sur dix ans des curriculas éducatifs vers les langues nationales; des instituts de linguistique africaine pour codifier des langues à fort potentiel de diffusion — le bambara, le fulfulde, le swahili, le lingala; et une grande entreprise de traduction des travaux scientifiques majeurs en langues africaines, sur le modèle de ce que l'Europe a fait à la Renaissance en traduisant les auteurs arabes pour faire émerger la science européenne en langue vernaculaire. «Pour que le grec devienne l'Europe, il a fallu que les Européens traduisent les auteurs arabes. C'est le travail que la nouvelle génération africaine peut se donner» (Guinée, Panafrican Média TV, juin 2026). Il y associe un ancrage géopolitique direct: le Mali, la Guinée Conakry, le Burkina Faso et le Niger — qui partagent le bambara comme langue de communication majeure — pourraient construire une fédération linguistique qui serait à l'espace sahélien ce que la Francophonie a été au pré-carré français: un espace de souveraineté culturelle, mais cette fois au service des peuples qui le parlent.</w:t>
+        <w:t>Jonathan Batenguene décrit le mécanisme d'aliénation intellectuelle avec une précision qui dépasse la politique: c'est la personnalité elle-même qui est travaillée. «On a construit chez vous une acceptation de la domination — une naturalisation de la domination. En ce moment, vous avez l'impression que les choses sont normales comme ça» (Batenguene, Panafrican Média TV, juin 2026). Sur le plan éducatif, le modèle Jules Ferry — cycles calqués sur le système français, imposés à l'ensemble des pays membres — a produit des cursus plus longs que le système anglosaxon pour des résultats moins compétitifs au niveau de l'insertion internationale. Sur le plan académique, les chercheurs africains francophones sont systématiquement repositionnés en commentateurs de la science occidentale: «Peu importe votre bravoure en Afrique, vous ne pouvez être aligné que sur les modèles des deux grands pôles francophones — la France et le Canada. Nous avons des professeurs qui passent la majeure partie du temps à parler des travaux des autres plutôt que des leurs.» La coopération intellectuelle francophone, concrètement, est un monopole opéré par Paris et Toronto sur la définition de ce qu'est le savoir légitime en zone francophone. Le mécanisme du postdoc illustre la chaîne: un chercheur africain envoyé se perfectionner à Bruxelles y rencontre des travaux développés avec une faible connaissance du terrain africain, mais «subtilement» appliqués à ce terrain — il revient adapter des cadres conçus ailleurs. «C'est le schéma le plus dangereux: on fabrique des personnes présentées comme la figure de l'excellence, mais qui sont en fait le nec plus ultra de l'aide de maison» (Batenguene).</w:t>
+      </w:r>
+    </w:p>
+    <w:p>
+      <w:r>
+        <w:t>Le cas rwandais est la démonstration empirique qu'une sortie est possible — et que Paris en connaît le prix. Après le génocide de 1994 et la complicité française mise à nu, Kigali a quitté la Francophonie, rejoint le Commonwealth et adopté l'anglais et le kinyarwanda comme langues nationales. La réponse de Paris a été mécanique: pour ramener le Rwanda dans l'orbite francophone, la France a offert la présidence de l'OIF à Louise Mushikiwabo, alors ministre rwandaise des Affaires étrangères. «Sortir de la Francophonie, c'est se donner les moyens d'en influencer les règles. De l'intérieur, vous ne pouvez pas changer grand-chose» (Batenguene).</w:t>
+      </w:r>
+    </w:p>
+    <w:p>
+      <w:r>
+        <w:t>La voie de sortie proposée est programmatique, non catastrophiste: une réforme sur dix ans des curriculas éducatifs vers les langues nationales; des instituts de linguistique africaine pour codifier des langues à fort potentiel de diffusion — le bambara, le fulfulde, le swahili, le lingala; et une grande entreprise de traduction des travaux scientifiques majeurs en langues africaines, sur le modèle de ce que l'Europe a fait à la Renaissance en traduisant les auteurs arabes pour faire émerger la science européenne en langue vernaculaire. «Pour que le grec devienne l'Europe, il a fallu que les Européens traduisent les auteurs arabes. C'est le travail que la nouvelle génération africaine peut se donner» (Batenguene, Panafrican Média TV, juin 2026). Il y associe un ancrage géopolitique direct: le Mali, la Guinée Conakry, le Burkina Faso et le Niger — qui partagent le bambara comme langue de communication majeure — pourraient construire une fédération linguistique qui serait à l'espace sahélien ce que la Francophonie a été au pré-carré français: un espace de souveraineté culturelle, mais cette fois au service des peuples qui le parlent.</w:t>
       </w:r>
     </w:p>
     <w:p>

</xml_diff>

<commit_message>
Ch.21: intégration RCA/programme SPEAR + générateur PDF WeasyPrint
- Nouvelle sous-section "La Centrafrique: la question du programme SPEAR"
  (Ndjoni Sango, 18 juin 2026): affaire Dande Christian, saisie d'armes/insignes
  officiels RCA, responsabilité américaine; parallèle base 201 Agadez/gouvernance
  des armes; mise à jour de la conclusion d'encerclement (Tchad, Algérie,
  Mauritanie, Émirats, Côte d'Ivoire + Centrafrique)
- Ajout build_pdf.py: générateur PDF Sahel Rouge via WeasyPrint (634 Ko, 6×9 in)
- DOCX KDP: 174 Ko, 31 encadrés
</commit_message>
<xml_diff>
--- a/manuscrit-edition/LIVRE-FINAL.docx
+++ b/manuscrit-edition/LIVRE-FINAL.docx
@@ -6607,8 +6607,26 @@
       </w:r>
     </w:p>
     <w:p>
-      <w:r>
-        <w:t>Voilà donc l'environnement dans lequel l'alliance doit survivre: un Tchad sous double tutelle, une Algérie qui tire sur ses drones, une Mauritanie qui héberge ses ennemis en monétisant son gaz, des Émirats qui industrialisent la déstabilisation, une Côte d'Ivoire officiellement neutre mais dont la frontière sert de couloir de formation et d'infiltration — avec, en contrepoids, une opinion ivoirienne que la popularité de Gbagbo maintient, pour l'instant, hors du dispositif ennemi. Face à cet encerclement, l'AES tient — et c'est précisément ce qui oblige à poser une autre question: d'où vient cette capacité de résistance? Pour y répondre, il faut quitter un instant la géopolitique des États et remonter aux sources — car cette rupture vient de loin, de Nkrumah, de Lumumba, de Modibo Keïta, de Sankara: le réveil que le Sahel incarne aujourd'hui, l'Afrique l'avait rêvé, payé et enterré une première fois il y a soixante ans.</w:t>
+      <w:pPr>
+        <w:pStyle w:val="Heading2"/>
+      </w:pPr>
+      <w:r>
+        <w:t>La Centrafrique: la question du programme SPEAR</w:t>
+      </w:r>
+    </w:p>
+    <w:p>
+      <w:r>
+        <w:t>À l'est, la République Centrafricaine ajoute une dimension que les médias occidentaux traitent peu: la présence américaine via le programme SPEAR. Le 18 juin 2026, Ndjoni Sango — média centrafricain de référence, nommément cité dans la méthodologie de cet ouvrage — publie un article intitulé «RCA: l'affaire Dande Christian relance les interrogations sur le programme SPEAR et la responsabilité américaine». L'affaire porte sur l'arrestation d'un individu dont l'interpellation donne lieu à la saisie d'armes, de munitions et d'insignes officiels des forces de sécurité centrafricaines — matériel dont la présence entre des mains privées interroge les circuits de traçabilité du programme américain. SPEAR est l'un des programmes d'assistance sécuritaire américains déployés en RCA dans le cadre de la lutte contre les groupes armés — un programme dont la gestion et les effets de bord sont désormais questionnés par la presse centrafricaine elle-même.</w:t>
+      </w:r>
+    </w:p>
+    <w:p>
+      <w:r>
+        <w:t>L'affaire Dande Christian n'est pas isolée. Elle s'inscrit dans un schéma que la base 201 d'Agadez au Niger avait déjà révélé: les programmes d'assistance sécuritaire américains — formation, armement, équipements — créent des acteurs locaux dont le contrôle à long terme échappe parfois au bailleur. Quand le Niger a expulsé les forces américaines en 2024, la question n'était pas que stratégique; elle était aussi logistique: que deviennent les armes, les véhicules, les liaisons humaines construites pendant des années de présence? La réponse centrafricaine — une affaire de détournement d'armes et d'insignes officiels reliant un individu au programme SPEAR — est, pour l'AES, une leçon d'anatomie: les États-Unis ne sont pas seulement présents au nord-ouest via la base d'Agadez désormais fermée; ils sont présents à l'est via Bangui, avec les mêmes fragilités de gouvernance. La responsabilité américaine que pointe Ndjoni Sango n'est pas une accusation rhétorique; c'est une question de gouvernance des armes que l'AES a, de son côté, posée en sens inverse — en reprenant le contrôle de son propre territoire. (Ndjoni Sango, 18 juin 2026.)</w:t>
+      </w:r>
+    </w:p>
+    <w:p>
+      <w:r>
+        <w:t>Voilà donc l'environnement dans lequel l'alliance doit survivre: un Tchad sous double tutelle, une Algérie qui tire sur ses drones, une Mauritanie qui héberge ses ennemis en monétisant son gaz, des Émirats qui industrialisent la déstabilisation, une Côte d'Ivoire officiellement neutre dont la frontière sert de couloir d'infiltration, et à l'est une Centrafrique traversée par les fragilités du programme sécuritaire américain SPEAR — avec, en contrepoids, une opinion ivoirienne que la popularité de Gbagbo maintient hors du dispositif ennemi. Face à cet encerclement, l'AES tient — et c'est précisément ce qui oblige à poser une autre question: d'où vient cette capacité de résistance? Pour y répondre, il faut quitter un instant la géopolitique des États et remonter aux sources — car cette rupture vient de loin, de Nkrumah, de Lumumba, de Modibo Keïta, de Sankara: le réveil que le Sahel incarne aujourd'hui, l'Afrique l'avait rêvé, payé et enterré une première fois il y a soixante ans.</w:t>
       </w:r>
     </w:p>
     <w:p>

</xml_diff>

<commit_message>
Ch.21: parade FLA à Bordj Badji Mokhtar (Ndjoni Sango, 16 juin 2026)
Première preuve visuelle documentée de présence assumée du FLA en territoire
algérien: combattants avec drapeaux et véhicules à Bordj Badji Mokhtar (extrême
sud Algérie). Caractère ostensible exclut l'infiltration clandestine — présence
tolérée ou non réprimée. Contradiction diplomatique algérienne relevée: soutien
au Polisario (autodétermination Sahara occidental) vs hébergement du FLA visant
des territoires maliens souverains. Intégré dans section "L'Algérie: le médiateur
qui tire" après le paragraphe Sahara occidental/25 avril.
DOCX KDP: 175 Ko, 31 encadrés.
</commit_message>
<xml_diff>
--- a/manuscrit-edition/LIVRE-FINAL.docx
+++ b/manuscrit-edition/LIVRE-FINAL.docx
@@ -6402,6 +6402,11 @@
     <w:p>
       <w:r>
         <w:t>Le 22 mars 2026, la rupture devient frontale: lors d'une réunion de la Ligue arabe, le Mali reconnaît la souveraineté marocaine sur le Sahara occidental. Pour Alger, dont la politique étrangère est structurée autour du soutien au Front Polisario, c'est un camouflet géopolitique majeur — Bamako choisit Rabat sur la question la plus sensible du Maghreb. Quatre semaines plus tard surviennent les attaques du 25 avril, revendiquées par le JNIM d'Iyad Ag Ghali — lequel entretient des liens historiques documentés avec les services algériens. Coïncidence ou causalité? La question reste ouverte; elle ne peut être fermée ni par le déni ni par l'affirmation, et elle appellera une réponse judiciaire et diplomatique que l'histoire devra trancher.</w:t>
+      </w:r>
+    </w:p>
+    <w:p>
+      <w:r>
+        <w:t>La pièce factuelle la plus concrète du dossier algéro-malien arrive le 16 juin 2026: une vidéo publiée par Ndjoni Sango (Erick Ngaba, Bangui) montre des combattants du FLA paradant avec drapeaux et véhicules à Bordj Badji Mokhtar, dans l'extrême sud de l'Algérie. Plusieurs observateurs la qualifient de «première preuve visuelle documentée de la présence publique et assumée» du mouvement séparatiste en territoire algérien. Le caractère ostensible de la démonstration — drapeaux déployés, convoi en pleine localité frontalière — exclut la thèse de l'infiltration clandestine; c'est une présence tolérée, ou du moins non réprimée. À la date de publication, ni Alger ni Bamako n'ont officiellement réagi. L'article de Ndjoni Sango pointe un contraste diplomatique que personne à Alger ne peut réfuter: l'Algérie structure sa politique étrangère autour du droit à l'autodétermination du peuple sahraoui — mais héberge visiblement le FLA, dont l'ambition déclarée est de contrôler davantage de territoires maliens souverains. La carte morale de l'autodétermination vaut pour les mouvements qu'Alger soutient; elle ne vaut pas pour les États dont elle conteste implicitement la souveraineté territoriale. (Ndjoni Sango, 16 juin 2026.)</w:t>
       </w:r>
     </w:p>
     <w:p>

</xml_diff>

<commit_message>
Ch.21: accord Bangui-Washington — déportés US en RCA (Mariam Cony, juin 2026)
Vol nuit Mpoko (22h, accès presse refusé): iraniens, syriens, afghans expulsés
des États-Unis, destination inconnue jusqu'à l'arrivée. Accord Bangui/Washington
peu transparent: OIM chargée de la prise en charge pour 25M$, plusieurs centaines
de migrants prévus. Intégré dans section Centrafrique/question américaine après
SPEAR: même logique — Washington paie, Bangui reçoit, accord opaque.
Formule analytique ajoutée: la souveraineté n'est pas niée, elle est achetée.
DOCX KDP: 175 Ko, 31 encadrés.
</commit_message>
<xml_diff>
--- a/manuscrit-edition/LIVRE-FINAL.docx
+++ b/manuscrit-edition/LIVRE-FINAL.docx
@@ -6627,6 +6627,11 @@
     <w:p>
       <w:r>
         <w:t>L'affaire Dande Christian n'est pas isolée. Elle s'inscrit dans un schéma que la base 201 d'Agadez au Niger avait déjà révélé: les programmes d'assistance sécuritaire américains — formation, armement, équipements — créent des acteurs locaux dont le contrôle à long terme échappe parfois au bailleur. Quand le Niger a expulsé les forces américaines en 2024, la question n'était pas que stratégique; elle était aussi logistique: que deviennent les armes, les véhicules, les liaisons humaines construites pendant des années de présence? La réponse centrafricaine — une affaire de détournement d'armes et d'insignes officiels reliant un individu au programme SPEAR — est, pour l'AES, une leçon d'anatomie: les États-Unis ne sont pas seulement présents au nord-ouest via la base d'Agadez désormais fermée; ils sont présents à l'est via Bangui, avec les mêmes fragilités de gouvernance. La responsabilité américaine que pointe Ndjoni Sango n'est pas une accusation rhétorique; c'est une question de gouvernance des armes que l'AES a, de son côté, posée en sens inverse — en reprenant le contrôle de son propre territoire. (Ndjoni Sango, 18 juin 2026.)</w:t>
+      </w:r>
+    </w:p>
+    <w:p>
+      <w:r>
+        <w:t>Un deuxième élément, survenu quelques jours plus tôt, complète le tableau. Un vol en provenance des États-Unis — escale au Ghana — atterrit discrètement à l'aéroport international de Mpoko, à Bangui, aux alentours de 22h, à l'heure où l'aéroport est normalement fermé au public. Les autorités refusent l'accès à la presse; seul le cortège peut être filmé peu après. À bord: des étrangers expulsés des États-Unis, dont aucun n'est centrafricain — au moins trois ressortissants iraniens, syriens et afghans sont identifiés parmi eux. Ils n'ont appris leur destination finale qu'à l'arrivée. Le dispositif repose sur un accord entre Bangui et Washington dont très peu d'éléments ont été rendus publics: l'OIM (Organisation internationale pour les migrations), rattachée aux Nations Unies, en assure la prise en charge moyennant 25 millions de dollars versés par Washington; l'accord prévoirait l'arrivée de plusieurs centaines de migrants en Centrafrique. Ni le gouvernement centrafricain ni l'OIM en RCA n'ont donné suite aux demandes d'entretien (Mariam Cony, Bangui, correspondante radio, juin 2026). La Centrafrique rejoint ainsi la liste des pays africains ayant accepté ce dispositif américain consistant à envoyer des étrangers expulsés des États-Unis vers des pays tiers — y compris des pays en situation sécuritaire fragile. La logique est identique à celle du programme SPEAR: Washington paie, Bangui reçoit, l'accord reste opaque. Ce que ce double épisode révèle à l'AES est structurel: un État africain sous pression financière peut, à faible coût pour Washington, être transformé en espace de gestion des problèmes américains — arsenaux d'armes orphelines hier, territoire d'accueil de déportés aujourd'hui. La souveraineté n'est pas niée; elle est achetée.</w:t>
       </w:r>
     </w:p>
     <w:p>

</xml_diff>

<commit_message>
Ch.21: MPAL/12 apôtres RCA — ingérence judiciaire et médiatique (nov. 2025)
MPAL Bangui (3 nov. 2025, Ndjoni Sango): groupe "12 apôtres"/Kerembeisse accusé
d'instrument néocolonial, connexions CPC/Bozizé, avocat Larochelle/plainte CPI
contre autorités centrafricaines présentée comme manœuvre subversive. Troisième
registre d'ingérence en RCA: armes SPEAR + déportés US + CPI comme arme juridique.
Formule analytique: "le manuel est le même, seuls les instruments changent."
Conclusion d'encerclement mise à jour: "triple pression américaine et néocoloniale"
+ MPAL comme contre-mouvement panafricain organisé en RCA.
DOCX KDP: 176 Ko, 31 encadrés.
</commit_message>
<xml_diff>
--- a/manuscrit-edition/LIVRE-FINAL.docx
+++ b/manuscrit-edition/LIVRE-FINAL.docx
@@ -6636,7 +6636,12 @@
     </w:p>
     <w:p>
       <w:r>
-        <w:t>Voilà donc l'environnement dans lequel l'alliance doit survivre: un Tchad sous double tutelle, une Algérie qui tire sur ses drones, une Mauritanie qui héberge ses ennemis en monétisant son gaz, des Émirats qui industrialisent la déstabilisation, une Côte d'Ivoire officiellement neutre dont la frontière sert de couloir d'infiltration, et à l'est une Centrafrique traversée par les fragilités du programme sécuritaire américain SPEAR — avec, en contrepoids, une opinion ivoirienne que la popularité de Gbagbo maintient hors du dispositif ennemi. Face à cet encerclement, l'AES tient — et c'est précisément ce qui oblige à poser une autre question: d'où vient cette capacité de résistance? Pour y répondre, il faut quitter un instant la géopolitique des États et remonter aux sources — car cette rupture vient de loin, de Nkrumah, de Lumumba, de Modibo Keïta, de Sankara: le réveil que le Sahel incarne aujourd'hui, l'Afrique l'avait rêvé, payé et enterré une première fois il y a soixante ans.</w:t>
+        <w:t>Le troisième registre d'ingérence en RCA est judiciaire et médiatique — et il est documenté de l'intérieur. Le 3 novembre 2025, le Mouvement Panafricain pour une Afrique Libre (MPAL) tient une conférence de presse à Bangui pour dénoncer les activités du groupe autoproclamé des «12 apôtres», dirigé par un certain Kerembeisse. Selon les orateurs — Socrate Gutenberg Taramboye, Yannick Davy Anguida, Alvaro Mapouka, Mac Laurens Dakou, Steve Yombi — ce groupe agirait comme «instrument d'influence néocoloniale» au service de forces étrangères visant à fragiliser la souveraineté nationale; il aurait des connexions présumées avec la Coalition des Patriotes pour le Changement (CPC), le mouvement rebelle de l'ex-président François Bozizé, dont les liens avec des soutiens extérieurs sont documentés. Ce qui retient l'attention analytique, c'est la figure de l'avocat Philippe Larochelle, qualifié par les intervenants de «défenseur systématique des chefs de groupes armés»: sa plainte à la Cour pénale internationale contre les autorités centrafricaines est présentée comme une manœuvre juridique destinée à couvrir des entreprises subversives. Le MPAL nomme explicitement le mécanisme: «après avoir échoué militairement, certains acteurs extérieurs cherchent à affaiblir les institutions nationales par des voies judiciaires et médiatiques.» (Ndjoni Sango, Mamadou NGAINAM, 3 novembre 2025.) Ce schéma — CPI contre un gouvernement africain souverain utilisée non pour la justice mais pour la déstabilisation — est exactement celui que le chapitre 15 documente à l'échelle régionale: une justice internationale dont la géographie des condamnations n'a jamais atteint un ressortissant français ou américain, mais dont le mécanisme peut être actionné contre n'importe quel gouvernement africain jugé inconvenant. La RCA en fait désormais l'expérience par trois voies simultanées: les armes orphelines du SPEAR, le territoire monnayé pour les déportés américains, et la plainte CPI comme arme juridique. Le manuel est le même; seuls les instruments changent.</w:t>
+      </w:r>
+    </w:p>
+    <w:p>
+      <w:r>
+        <w:t>Voilà donc l'environnement dans lequel l'alliance doit survivre: un Tchad sous double tutelle, une Algérie qui tire sur ses drones, une Mauritanie qui héberge ses ennemis en monétisant son gaz, des Émirats qui industrialisent la déstabilisation, une Côte d'Ivoire officiellement neutre dont la frontière sert de couloir d'infiltration, et à l'est une Centrafrique sous triple pression américaine et néocoloniale — SPEAR, déportés, CPI — avec, en contrepoids, une résistance panafricaine organisée (MPAL) et une opinion ivoirienne que la popularité de Gbagbo maintient hors du dispositif ennemi. Face à cet encerclement, l'AES tient — et c'est précisément ce qui oblige à poser une autre question: d'où vient cette capacité de résistance? Pour y répondre, il faut quitter un instant la géopolitique des États et remonter aux sources — car cette rupture vient de loin, de Nkrumah, de Lumumba, de Modibo Keïta, de Sankara: le réveil que le Sahel incarne aujourd'hui, l'Afrique l'avait rêvé, payé et enterré une première fois il y a soixante ans.</w:t>
       </w:r>
     </w:p>
     <w:p>

</xml_diff>

<commit_message>
Ch.21: chaîne de financement 12 apôtres — Lili Champagne (Ndjoni Sango, mars 2025)
Aveu vidéo de Lili Champagne (membre "12 apôtres", Paris): argent reçu de
Dologuélé, Meckassoua, Ziguélé pour manifestations anti-Bangui depuis la France;
sanction GAF évoquée. Statut épistémique clairement posé: source primaire
(auto-incrimination filmée) dissociée de l'éditorialisation de l'article Opinion.
Quatrième voie d'ingérence en RCA ajoutée: diaspora France comme levier financier
de déstabilisation électorale (SPEAR + déportés + CPI + financement diaspora).
DOCX KDP: 177 Ko, 31 encadrés.
</commit_message>
<xml_diff>
--- a/manuscrit-edition/LIVRE-FINAL.docx
+++ b/manuscrit-edition/LIVRE-FINAL.docx
@@ -6636,7 +6636,12 @@
     </w:p>
     <w:p>
       <w:r>
-        <w:t>Le troisième registre d'ingérence en RCA est judiciaire et médiatique — et il est documenté de l'intérieur. Le 3 novembre 2025, le Mouvement Panafricain pour une Afrique Libre (MPAL) tient une conférence de presse à Bangui pour dénoncer les activités du groupe autoproclamé des «12 apôtres», dirigé par un certain Kerembeisse. Selon les orateurs — Socrate Gutenberg Taramboye, Yannick Davy Anguida, Alvaro Mapouka, Mac Laurens Dakou, Steve Yombi — ce groupe agirait comme «instrument d'influence néocoloniale» au service de forces étrangères visant à fragiliser la souveraineté nationale; il aurait des connexions présumées avec la Coalition des Patriotes pour le Changement (CPC), le mouvement rebelle de l'ex-président François Bozizé, dont les liens avec des soutiens extérieurs sont documentés. Ce qui retient l'attention analytique, c'est la figure de l'avocat Philippe Larochelle, qualifié par les intervenants de «défenseur systématique des chefs de groupes armés»: sa plainte à la Cour pénale internationale contre les autorités centrafricaines est présentée comme une manœuvre juridique destinée à couvrir des entreprises subversives. Le MPAL nomme explicitement le mécanisme: «après avoir échoué militairement, certains acteurs extérieurs cherchent à affaiblir les institutions nationales par des voies judiciaires et médiatiques.» (Ndjoni Sango, Mamadou NGAINAM, 3 novembre 2025.) Ce schéma — CPI contre un gouvernement africain souverain utilisée non pour la justice mais pour la déstabilisation — est exactement celui que le chapitre 15 documente à l'échelle régionale: une justice internationale dont la géographie des condamnations n'a jamais atteint un ressortissant français ou américain, mais dont le mécanisme peut être actionné contre n'importe quel gouvernement africain jugé inconvenant. La RCA en fait désormais l'expérience par trois voies simultanées: les armes orphelines du SPEAR, le territoire monnayé pour les déportés américains, et la plainte CPI comme arme juridique. Le manuel est le même; seuls les instruments changent.</w:t>
+        <w:t>Le troisième registre d'ingérence en RCA est judiciaire et médiatique — et il est documenté de l'intérieur. Le 3 novembre 2025, le Mouvement Panafricain pour une Afrique Libre (MPAL) tient une conférence de presse à Bangui pour dénoncer les activités du groupe autoproclamé des «12 apôtres», dirigé par un certain Kerembeisse. Selon les orateurs — Socrate Gutenberg Taramboye, Yannick Davy Anguida, Alvaro Mapouka, Mac Laurens Dakou, Steve Yombi — ce groupe agirait comme «instrument d'influence néocoloniale» au service de forces étrangères visant à fragiliser la souveraineté nationale; il aurait des connexions présumées avec la Coalition des Patriotes pour le Changement (CPC), le mouvement rebelle de l'ex-président François Bozizé, dont les liens avec des soutiens extérieurs sont documentés. Ce qui retient l'attention analytique, c'est la figure de l'avocat Philippe Larochelle, qualifié par les intervenants de «défenseur systématique des chefs de groupes armés»: sa plainte à la Cour pénale internationale contre les autorités centrafricaines est présentée comme une manœuvre juridique destinée à couvrir des entreprises subversives. Le MPAL nomme explicitement le mécanisme: «après avoir échoué militairement, certains acteurs extérieurs cherchent à affaiblir les institutions nationales par des voies judiciaires et médiatiques.» (Ndjoni Sango, Mamadou NGAINAM, 3 novembre 2025.) Ce schéma — CPI contre un gouvernement africain souverain utilisée non pour la justice mais pour la déstabilisation — est exactement celui que le chapitre 15 documente à l'échelle régionale: une justice internationale dont la géographie des condamnations n'a jamais atteint un ressortissant français ou américain, mais dont le mécanisme peut être actionné contre n'importe quel gouvernement africain jugé inconvenant.</w:t>
+      </w:r>
+    </w:p>
+    <w:p>
+      <w:r>
+        <w:t>La chaîne de financement du réseau est documentée par une source interne au groupe lui-même. Dans une vidéo diffusée sur les réseaux sociaux en mars 2025, Lili Champagne — figure de l'opposition centrafricaine en France et membre déclarée des «12 apôtres» — admet avoir reçu de l'argent de personnalités de l'opposition centrafricaine: Anicet-Georges Dologuélé, Karim Meckassoua et Martin Ziguélé, pour organiser des manifestations contre les autorités centrafricaines depuis la France. Elle ajoute avoir été sanctionnée par une autorité financière française (désignée sous l'acronyme GAF) pour avoir reçu une somme importante sur son compte bancaire à cette fin. Cette déclaration, recueillie à la source et non contestée à la date de publication, est retranscrite avec son statut propre: un aveu spontané filmé, non une affirmation de tiers, et son contenu doit être distingué de l'éditorialisation de l'article d'opinion qui le rapporte (Ndjoni Sango, Basta BALOUWA, 6 mars 2025). Elle établit néanmoins la réalité d'une chaîne: opposition centrafricaine basée en France → financement via diaspora → manifestations organisées contre le gouvernement de Bangui. Ce schéma est identique, structurellement, à ce que l'AES documente sur son propre sol: des opposants et des groupes armés financés depuis Paris ou Abu Dhabi, opérant sur le territoire de l'État souverain qu'ils cherchent à déstabiliser. La RCA en fait l'expérience par quatre voies simultanées: les armes orphelines du SPEAR, le territoire monnayé pour les déportés américains, la plainte CPI comme arme juridique, et la diaspora de France comme levier financier de déstabilisation électorale. Le manuel est le même; seuls les instruments changent.</w:t>
       </w:r>
     </w:p>
     <w:p>

</xml_diff>

<commit_message>
Ch.21: Figueira/FHI 360 (5e couche RCA) + rétorsion visa Tchad/Trump
Centrafrique — 5e registre: Joseph Figueira (FHI 360, ONG américaine) arrêté par
FACA — preuves: passeports multiples, conversations déstabilisation + complot
assassinat Touadéra, présence camps rebelles. UE/Kajas exige libération + menace
sanctions; refus souverain de Touadéra. Parallèle Arche de Zoé 2007 (Tchad:
103 enfants, Sarkozy "j'irai les chercher") = même mécanisme humanitaire-couverture.
Précédent Wan Kinoloi cité. Appel à intégration RCA dans AES noté.
RCA: 5 registres d'ingérence désormais documentés dans le texte.

Tchad — rétorsion visa Trump: Déby répond à la liste US par réciprocité (visa ban
sur Américains). Rhétorique souverainiste désormais exportée hors AES.
DOCX KDP: 179 Ko, 31 encadrés.
</commit_message>
<xml_diff>
--- a/manuscrit-edition/LIVRE-FINAL.docx
+++ b/manuscrit-edition/LIVRE-FINAL.docx
@@ -6373,7 +6373,7 @@
     </w:p>
     <w:p>
       <w:r>
-        <w:t>Le Tchad n'échappe pas pour autant à la tourmente: du 4 au 6 mai 2026, dans la foulée immédiate du 25 avril, Boko Haram l'attaque à son tour. La pression s'exerce sur tous les acteurs régionaux simultanément — y compris sur le front humanitaire: en 2025, le Niger a expulsé le CICR, Tiani l'accusant d'avoir servi de vecteur financier lors de réunions secrètes à Abuja entre représentants occidentaux et groupes armés.</w:t>
+        <w:t>Le Tchad n'échappe pas pour autant à la tourmente: du 4 au 6 mai 2026, dans la foulée immédiate du 25 avril, Boko Haram l'attaque à son tour. La pression s'exerce sur tous les acteurs régionaux simultanément — y compris sur le front humanitaire: en 2025, le Niger a expulsé le CICR, Tiani l'accusant d'avoir servi de vecteur financier lors de réunions secrètes à Abuja entre représentants occidentaux et groupes armés. Entre ces deux pôles de dépendance — Paris et Abu Dhabi — Déby conserve néanmoins une marge de manœuvre minimale dont il use ponctuellement. Quand Donald Trump, dans le cadre de sa politique migratoire, inscrit le Tchad sur la liste des pays dont les ressortissants se voient refuser le visa américain, Mahamat Idriss Déby répond par la réciprocité: les citoyens américains n'auront plus non plus de visa pour entrer au Tchad. «Le Tchad est un pays souverain», résume le dispositif (Panafrican Media TV, Échiquier Mondial). Ce geste, symbolique autant que pratique, montre que la rhétorique de souveraineté n'est plus réservée aux trois États de l'AES: elle irrigue désormais même les États encore dans l'orbite occidentale, contraints de répondre à leurs populations par un langage que l'AES a rendu audible et légitime.</w:t>
       </w:r>
     </w:p>
     <w:p>
@@ -6641,12 +6641,12 @@
     </w:p>
     <w:p>
       <w:r>
-        <w:t>La chaîne de financement du réseau est documentée par une source interne au groupe lui-même. Dans une vidéo diffusée sur les réseaux sociaux en mars 2025, Lili Champagne — figure de l'opposition centrafricaine en France et membre déclarée des «12 apôtres» — admet avoir reçu de l'argent de personnalités de l'opposition centrafricaine: Anicet-Georges Dologuélé, Karim Meckassoua et Martin Ziguélé, pour organiser des manifestations contre les autorités centrafricaines depuis la France. Elle ajoute avoir été sanctionnée par une autorité financière française (désignée sous l'acronyme GAF) pour avoir reçu une somme importante sur son compte bancaire à cette fin. Cette déclaration, recueillie à la source et non contestée à la date de publication, est retranscrite avec son statut propre: un aveu spontané filmé, non une affirmation de tiers, et son contenu doit être distingué de l'éditorialisation de l'article d'opinion qui le rapporte (Ndjoni Sango, Basta BALOUWA, 6 mars 2025). Elle établit néanmoins la réalité d'une chaîne: opposition centrafricaine basée en France → financement via diaspora → manifestations organisées contre le gouvernement de Bangui. Ce schéma est identique, structurellement, à ce que l'AES documente sur son propre sol: des opposants et des groupes armés financés depuis Paris ou Abu Dhabi, opérant sur le territoire de l'État souverain qu'ils cherchent à déstabiliser. La RCA en fait l'expérience par quatre voies simultanées: les armes orphelines du SPEAR, le territoire monnayé pour les déportés américains, la plainte CPI comme arme juridique, et la diaspora de France comme levier financier de déstabilisation électorale. Le manuel est le même; seuls les instruments changent.</w:t>
-      </w:r>
-    </w:p>
-    <w:p>
-      <w:r>
-        <w:t>Voilà donc l'environnement dans lequel l'alliance doit survivre: un Tchad sous double tutelle, une Algérie qui tire sur ses drones, une Mauritanie qui héberge ses ennemis en monétisant son gaz, des Émirats qui industrialisent la déstabilisation, une Côte d'Ivoire officiellement neutre dont la frontière sert de couloir d'infiltration, et à l'est une Centrafrique sous triple pression américaine et néocoloniale — SPEAR, déportés, CPI — avec, en contrepoids, une résistance panafricaine organisée (MPAL) et une opinion ivoirienne que la popularité de Gbagbo maintient hors du dispositif ennemi. Face à cet encerclement, l'AES tient — et c'est précisément ce qui oblige à poser une autre question: d'où vient cette capacité de résistance? Pour y répondre, il faut quitter un instant la géopolitique des États et remonter aux sources — car cette rupture vient de loin, de Nkrumah, de Lumumba, de Modibo Keïta, de Sankara: le réveil que le Sahel incarne aujourd'hui, l'Afrique l'avait rêvé, payé et enterré une première fois il y a soixante ans.</w:t>
+        <w:t>La chaîne de financement du réseau est documentée par une source interne au groupe lui-même. Dans une vidéo diffusée sur les réseaux sociaux en mars 2025, Lili Champagne — figure de l'opposition centrafricaine en France et membre déclarée des «12 apôtres» — admet avoir reçu de l'argent de personnalités de l'opposition centrafricaine: Anicet-Georges Dologuélé, Karim Meckassoua et Martin Ziguélé, pour organiser des manifestations contre les autorités centrafricaines depuis la France. Elle ajoute avoir été sanctionnée par une autorité financière française (désignée sous l'acronyme GAF) pour avoir reçu une somme importante sur son compte bancaire à cette fin. Cette déclaration, recueillie à la source et non contestée à la date de publication, est retranscrite avec son statut propre: un aveu spontané filmé, non une affirmation de tiers, et son contenu doit être distingué de l'éditorialisation de l'article d'opinion qui le rapporte (Ndjoni Sango, Basta BALOUWA, 6 mars 2025). Elle établit néanmoins la réalité d'une chaîne: opposition centrafricaine basée en France → financement via diaspora → manifestations organisées contre le gouvernement de Bangui. Ce schéma est identique, structurellement, à ce que l'AES documente sur son propre sol: des opposants et des groupes armés financés depuis Paris ou Abu Dhabi, opérant sur le territoire de l'État souverain qu'ils cherchent à déstabiliser. La cinquième couche révèle le mécanisme le plus sophistiqué: le détournement du statut humanitaire comme couverture de renseignement. Joseph Figueira est un employé de Family Health International 360 (FHI 360), ONG américaine active dans plusieurs pays africains sous mandat santé. Les forces de sécurité centrafricaines (FACA et services spéciaux) l'arrêtent; les saisies comprennent plusieurs passeports, des conversations téléphoniques établissant des plans de déstabilisation de la RCA et d'assassinat du président Touadéra, ainsi que des preuves de présence dans des camps d'entraînement rebelles qu'il alimentait en renseignements et en logistique. L'Union européenne, par la voix de la commissaire Kala Kajas — «la dame de fer» —, exige sa libération et menace de sanctions. Touadéra refuse: les preuves existent, la justice centrafricaine est compétente, un espion ne se libère pas sur ordre de Bruxelles. Ce refus est analysé dans le cadre de l'émission Échiquier Mondial (Panafrican Media TV, Dr. Essouet, Maître Jeanvier Momo, Hamzat) comme le moment où la RCA formule sa propre doctrine souverainiste: «vous semblez ignorer que la République centrafricaine est un État souverain.» L'invocation de «l'état de santé» de Figueira par l'UE — argument classique de protection d'actifs compromis, déjà utilisé dans le précédent centrafricain dit «Wan Kinoloi» — est mise en parallèle par les panélistes avec l'Arche de Zoé (Tchad, octobre 2007): 103 enfants tchadiens tentés d'être exportés vers la France sous couverture humanitaire, parmi lesquels trois journalistes français dont Sarkozy avait déclaré «j'irai les chercher quoi qu'ils aient fait» — langage identique à celui employé par Macron pour Bazoum. La lecture structurelle est posée sans ambiguïté: l'humanitaire a remplacé les missions religieuses comme vecteur d'entrée; FHI 360 est l'Arche de Zoé du XXIe siècle; la grammaire est identique. Un prolongement géopolitique mérite d'être noté: lors de ce même débat, plusieurs intervenants ont explicitement appelé Touadéra à solliciter son intégration dans l'AES, au motif qu'il «mène le même combat» que Bamako, Ouagadougou et Niamey — seul, sous les mêmes pressions. Si cette candidature se formalisait, la RCA deviendrait le premier État non fondateur à rejoindre la Confédération. La RCA cumule ainsi cinq registres d'ingérence simultanés documentés: armes SPEAR orphelines, territoire vendu pour déportés américains, CPI comme arme juridique, diaspora-France comme levier électoral, ONG américaine comme couverture de renseignement. Le manuel est le même; seuls les instruments changent.</w:t>
+      </w:r>
+    </w:p>
+    <w:p>
+      <w:r>
+        <w:t>Voilà donc l'environnement dans lequel l'alliance doit survivre: un Tchad sous double tutelle, une Algérie qui tire sur ses drones, une Mauritanie qui héberge ses ennemis en monétisant son gaz, des Émirats qui industrialisent la déstabilisation, une Côte d'Ivoire officiellement neutre dont la frontière sert de couloir d'infiltration, et à l'est une Centrafrique sous pression américaine et néocoloniale à cinq registres documentés — SPEAR, déportés, CPI, armée numérique, ONG-couverture (Figueira/FHI 360) — avec, en contrepoids, une résistance panafricaine organisée (MPAL) et une opinion ivoirienne que la popularité de Gbagbo maintient hors du dispositif ennemi. Face à cet encerclement, l'AES tient — et c'est précisément ce qui oblige à poser une autre question: d'où vient cette capacité de résistance? Pour y répondre, il faut quitter un instant la géopolitique des États et remonter aux sources — car cette rupture vient de loin, de Nkrumah, de Lumumba, de Modibo Keïta, de Sankara: le réveil que le Sahel incarne aujourd'hui, l'Afrique l'avait rêvé, payé et enterré une première fois il y a soixante ans.</w:t>
       </w:r>
     </w:p>
     <w:p>

</xml_diff>

<commit_message>
Ch.21: CICAUSAC Bangui (mars 2024) — résistance populaire anti-américaine
CICAUSAC (Comité d'Initiative pour le Contrôle des Actions des États-Unis en
Centrafrique), président Socrate Gutenberg Taramboye (même acteur que MPAL 2025):
sensibilisation quartiers Bakongo/Sciotte/Dékongo, 2ème arrdt Bangui, 26 mars 2024.
USAID nommée comme fournisseur d'armes aux groupes armés (affirmation de l'orateur,
statut épistémique posé). Continuité 2024→2025: CICAUSAC→MPAL = même réseau civique.
Conclusion: anti-impérialisme centrafricain grassroots préexiste à l'AES.
Triptyque résistance: CICAUSAC + MPAL + Talitha Koum.
DOCX KDP: 180 Ko, 31 encadrés.
</commit_message>
<xml_diff>
--- a/manuscrit-edition/LIVRE-FINAL.docx
+++ b/manuscrit-edition/LIVRE-FINAL.docx
@@ -6641,7 +6641,12 @@
     </w:p>
     <w:p>
       <w:r>
-        <w:t>La chaîne de financement du réseau est documentée par une source interne au groupe lui-même. Dans une vidéo diffusée sur les réseaux sociaux en mars 2025, Lili Champagne — figure de l'opposition centrafricaine en France et membre déclarée des «12 apôtres» — admet avoir reçu de l'argent de personnalités de l'opposition centrafricaine: Anicet-Georges Dologuélé, Karim Meckassoua et Martin Ziguélé, pour organiser des manifestations contre les autorités centrafricaines depuis la France. Elle ajoute avoir été sanctionnée par une autorité financière française (désignée sous l'acronyme GAF) pour avoir reçu une somme importante sur son compte bancaire à cette fin. Cette déclaration, recueillie à la source et non contestée à la date de publication, est retranscrite avec son statut propre: un aveu spontané filmé, non une affirmation de tiers, et son contenu doit être distingué de l'éditorialisation de l'article d'opinion qui le rapporte (Ndjoni Sango, Basta BALOUWA, 6 mars 2025). Elle établit néanmoins la réalité d'une chaîne: opposition centrafricaine basée en France → financement via diaspora → manifestations organisées contre le gouvernement de Bangui. Ce schéma est identique, structurellement, à ce que l'AES documente sur son propre sol: des opposants et des groupes armés financés depuis Paris ou Abu Dhabi, opérant sur le territoire de l'État souverain qu'ils cherchent à déstabiliser. La cinquième couche révèle le mécanisme le plus sophistiqué: le détournement du statut humanitaire comme couverture de renseignement. Joseph Figueira est un employé de Family Health International 360 (FHI 360), ONG américaine active dans plusieurs pays africains sous mandat santé. Les forces de sécurité centrafricaines (FACA et services spéciaux) l'arrêtent; les saisies comprennent plusieurs passeports, des conversations téléphoniques établissant des plans de déstabilisation de la RCA et d'assassinat du président Touadéra, ainsi que des preuves de présence dans des camps d'entraînement rebelles qu'il alimentait en renseignements et en logistique. L'Union européenne, par la voix de la commissaire Kala Kajas — «la dame de fer» —, exige sa libération et menace de sanctions. Touadéra refuse: les preuves existent, la justice centrafricaine est compétente, un espion ne se libère pas sur ordre de Bruxelles. Ce refus est analysé dans le cadre de l'émission Échiquier Mondial (Panafrican Media TV, Dr. Essouet, Maître Jeanvier Momo, Hamzat) comme le moment où la RCA formule sa propre doctrine souverainiste: «vous semblez ignorer que la République centrafricaine est un État souverain.» L'invocation de «l'état de santé» de Figueira par l'UE — argument classique de protection d'actifs compromis, déjà utilisé dans le précédent centrafricain dit «Wan Kinoloi» — est mise en parallèle par les panélistes avec l'Arche de Zoé (Tchad, octobre 2007): 103 enfants tchadiens tentés d'être exportés vers la France sous couverture humanitaire, parmi lesquels trois journalistes français dont Sarkozy avait déclaré «j'irai les chercher quoi qu'ils aient fait» — langage identique à celui employé par Macron pour Bazoum. La lecture structurelle est posée sans ambiguïté: l'humanitaire a remplacé les missions religieuses comme vecteur d'entrée; FHI 360 est l'Arche de Zoé du XXIe siècle; la grammaire est identique. Un prolongement géopolitique mérite d'être noté: lors de ce même débat, plusieurs intervenants ont explicitement appelé Touadéra à solliciter son intégration dans l'AES, au motif qu'il «mène le même combat» que Bamako, Ouagadougou et Niamey — seul, sous les mêmes pressions. Si cette candidature se formalisait, la RCA deviendrait le premier État non fondateur à rejoindre la Confédération. La RCA cumule ainsi cinq registres d'ingérence simultanés documentés: armes SPEAR orphelines, territoire vendu pour déportés américains, CPI comme arme juridique, diaspora-France comme levier électoral, ONG américaine comme couverture de renseignement. Le manuel est le même; seuls les instruments changent.</w:t>
+        <w:t>La chaîne de financement du réseau est documentée par une source interne au groupe lui-même. Dans une vidéo diffusée sur les réseaux sociaux en mars 2025, Lili Champagne — figure de l'opposition centrafricaine en France et membre déclarée des «12 apôtres» — admet avoir reçu de l'argent de personnalités de l'opposition centrafricaine: Anicet-Georges Dologuélé, Karim Meckassoua et Martin Ziguélé, pour organiser des manifestations contre les autorités centrafricaines depuis la France. Elle ajoute avoir été sanctionnée par une autorité financière française (désignée sous l'acronyme GAF) pour avoir reçu une somme importante sur son compte bancaire à cette fin. Cette déclaration, recueillie à la source et non contestée à la date de publication, est retranscrite avec son statut propre: un aveu spontané filmé, non une affirmation de tiers, et son contenu doit être distingué de l'éditorialisation de l'article d'opinion qui le rapporte (Ndjoni Sango, Basta BALOUWA, 6 mars 2025). Elle établit néanmoins la réalité d'une chaîne: opposition centrafricaine basée en France → financement via diaspora → manifestations organisées contre le gouvernement de Bangui. Ce schéma est identique, structurellement, à ce que l'AES documente sur son propre sol: des opposants et des groupes armés financés depuis Paris ou Abu Dhabi, opérant sur le territoire de l'État souverain qu'ils cherchent à déstabiliser. La cinquième couche révèle le mécanisme le plus sophistiqué: le détournement du statut humanitaire comme couverture de renseignement. Joseph Figueira est un employé de Family Health International 360 (FHI 360), ONG américaine active dans plusieurs pays africains sous mandat santé. Les forces de sécurité centrafricaines (FACA et services spéciaux) l'arrêtent; les saisies comprennent plusieurs passeports, des conversations téléphoniques établissant des plans de déstabilisation de la RCA et d'assassinat du président Touadéra, ainsi que des preuves de présence dans des camps d'entraînement rebelles qu'il alimentait en renseignements et en logistique. L'Union européenne, par la voix de la commissaire Kala Kajas — «la dame de fer» —, exige sa libération et menace de sanctions. Touadéra refuse: les preuves existent, la justice centrafricaine est compétente, un espion ne se libère pas sur ordre de Bruxelles. Ce refus est analysé dans le cadre de l'émission Échiquier Mondial (Panafrican Media TV, Dr. Essouet, Maître Jeanvier Momo, Hamzat) comme le moment où la RCA formule sa propre doctrine souverainiste: «vous semblez ignorer que la République centrafricaine est un État souverain.» L'invocation de «l'état de santé» de Figueira par l'UE — argument classique de protection d'actifs compromis, déjà utilisé dans le précédent centrafricain dit «Wan Kinoloi» — est mise en parallèle par les panélistes avec l'Arche de Zoé (Tchad, octobre 2007): 103 enfants tchadiens tentés d'être exportés vers la France sous couverture humanitaire, parmi lesquels trois journalistes français dont Sarkozy avait déclaré «j'irai les chercher quoi qu'ils aient fait» — langage identique à celui employé par Macron pour Bazoum. La lecture structurelle est posée sans ambiguïté: l'humanitaire a remplacé les missions religieuses comme vecteur d'entrée; FHI 360 est l'Arche de Zoé du XXIe siècle; la grammaire est identique. Un prolongement géopolitique mérite d'être noté: lors de ce même débat, plusieurs intervenants ont explicitement appelé Touadéra à solliciter son intégration dans l'AES, au motif qu'il «mène le même combat» que Bamako, Ouagadougou et Niamey — seul, sous les mêmes pressions. Si cette candidature se formalisait, la RCA deviendrait le premier État non fondateur à rejoindre la Confédération. Ce que révèle le cas centrafricain, au-delà des affaires Figueira et SPEAR, c'est l'existence d'une résistance populaire organisée, antérieure aux ruptures sahéliennes. Le 26 mars 2024, dans les quartiers Bakongo, Sciotte et Dékongo du 2ème arrondissement de Bangui, plus d'une centaine de personnes se réunissent sur le terrain de l'Église Dékongo à l'invitation du Comité d'Initiative pour le Contrôle des Actions des États-Unis en Centrafrique (CICAUSAC). Son président: Socrate Gutenberg Taramboye — le même qui prendra la parole à la conférence du MPAL en novembre 2025 et qui figure parmi les dénonciateurs des «12 apôtres». La continuité de l'acteur — du CICAUSAC (2024) au MPAL (2025) — révèle une mobilisation civique cohérente et durable, non conjoncturelle. Le CICAUSAC a été créé en réponse directe à la présence militaire américaine en RCA, jugée redondante avec les alliés russes et rwandais déjà en place. Son président décrit la méthode en ces termes: «Les États-Unis, c'est la première puissance mondiale. Son travail c'est de diviser les pays en créant des troubles. Pendant que les gens se battent, ils vont venir pour mettre la paix et vont profiter à voler les ressources naturelles.» Il nomme l'USAID parmi les ONG qu'il accuse de «fournir les armes aux groupes armés» et décrit la mécanique des dons convertis en «prêts à taux d'intérêt exorbitant» (Ndjoni Sango, Mamadou NGAINAM, 26 mars 2024). Ces affirmations émanent d'un militant engagé et sont retranscrites avec ce statut; leur cohérence avec les faits documentés par ailleurs — SPEAR, FHI 360/Figueira, base 201 d'Agadez — leur confère une valeur de témoignage direct, non de preuve indépendante. Ce qui est établi sans ambiguïté: une organisation civique centrafricaine dédiée à la surveillance des actions américaines existait en mars 2024, animait les quartiers populaires de Bangui, et comptait parmi ses cadres des figures qui se retrouveront, un an plus tard, dans les structures de résistance à l'ingérence française. L'anti-impérialisme centrafricain a ses propres réseaux — et ils précèdent, géographiquement et chronologiquement, l'AES.</w:t>
+      </w:r>
+    </w:p>
+    <w:p>
+      <w:r>
+        <w:t>La RCA cumule ainsi cinq registres d'ingérence simultanés documentés: armes SPEAR orphelines, territoire vendu pour déportés américains, CPI comme arme juridique, armée numérique financée depuis la France, ONG américaine comme couverture de renseignement. Et en face: CICAUSAC, MPAL, Talitha Koum — trois mouvements citoyens organisés qui disent, quartier par quartier, ce que l'AES dit à l'échelle régionale. Le manuel est le même; seuls les instruments changent.</w:t>
       </w:r>
     </w:p>
     <w:p>

</xml_diff>

<commit_message>
Ch.14: Camille Makosso — armée numérique pro-Ouattara / auto-incrimination Traoré
Ajout dans le chapitre 14 (La bataille de l'information) d'un paragraphe
documentant Camille Makosso comme archétype de l'armée numérique pro-occidentale:
format TikTok, engagement émotionnel, claims non vérifiés explicitement marqués.
Retournement analytique: Makosso diffuse une vidéo de Traoré lui-même reconnaissant
les racines internes du terrorisme burkinabè («nous avons maltraité les régions des
Peuls»), fournissant involontairement l'argument le plus solide de la thèse adverse.
</commit_message>
<xml_diff>
--- a/manuscrit-edition/LIVRE-FINAL.docx
+++ b/manuscrit-edition/LIVRE-FINAL.docx
@@ -4536,6 +4536,11 @@
     <w:p>
       <w:r>
         <w:t>Ce mécanisme n'est pas une métaphore. C'est une architecture de combat: pendant que les voix qui analysent l'avenir de l'Afrique tournent en circuit fermé, le triptyque sexe-bling-futilité inonde les flux de cinq cents millions de téléphones africains. La guerre cognitive ne s'arrête pas aux influenceurs stipendiés; elle se joue au niveau du code — l'algorithme qui décide ce que chaque Africain verra demain matin à son réveil. Sur ce point, Banda Kani nomme le responsable: « La France a un problème. C'est son problème.»</w:t>
+      </w:r>
+    </w:p>
+    <w:p>
+      <w:r>
+        <w:t>Un cas concret illustre ce front numérique dans sa dimension africaine pro-occidentale. Le pasteur ivoirien Camille Makosso opère depuis Abidjan des livestreams à très forte audience sur les réseaux sociaux — des sessions qualifiées par leur auteur lui-même d'«armée numérique». Sa grammaire est celle de l'agitation émotionnelle décrite par Banda Kani: injonctions répétées au public («tapotez, mettez les cœurs, on monte à 100000»), attaques nominales des dirigeants de l'AES (Tiani, Traoré, Goïta qualifiés de «voyous», «bandits», «présidents de quartier»), données non sourcées présentées comme des «preuves». Le contenu de ces sessions est retranscrit avec le statut qui lui revient: celui d'un influenceur militant, dont les allégations factuelles non vérifiées (chiffres de pertes, accusations de complicité terroriste, menaces de représailles contre la diaspora burkinabè en Côte d'Ivoire) ne constituent pas une source indépendante mais un document de la guerre informationnelle elle-même. Ce qui retient l'attention analytique n'est pas ce que Makosso dit, mais ce qu'il montre. Dans une session où il attaque Ibrahim Traoré, il diffuse une vidéo du président burkinabè lui-même — source primaire non contestable — dans laquelle Traoré déclare: «Nous avons toujours le slogan que c'est un pays pauvre. Vous êtes bien conscients que le pays n'est pas pauvre, c'est parce qu'on est méchant. On est sérieusement méchant entre nous. Les jeunes n'ont rien à faire. On a des terres cultivables.» Et, sur les causes du terrorisme: «Nous avons maltraité les régions [des Peuls]. Qu'avons-nous construit là-bas? Quel projet de développement avons-nous envoyé là-bas?» C'est le principe de «l'adversaire qui confirme» appliqué à rebours: un influenceur pro-Ouattara montre, pour l'attaquer, une déclaration du président burkinabè qui reconnaît — avant tout autre — que la radicalisation a des racines internes profondes dans la négligence des régions périphériques. Ce que Makosso présente comme une mise en cause de Traoré est en réalité la preuve que Traoré comprend les causes structurelles du terrorisme mieux que ne le font les rapports d'ONG qui les ignorent. L'armée numérique pro-occidentale a fourni, involontairement, l'un des arguments les plus solides de la thèse adverse.</w:t>
       </w:r>
     </w:p>
     <w:p>

</xml_diff>

<commit_message>
Ch.30: sommet diaspora Élysée — recyclage des paradigmes (Tchicaya/IPSE)
Nouvelle sous-section "Le sommet diaspora, ou le recyclage des paradigmes":
analyse de Jean-Claude Félix Tchicaya (IPSE) sur la convocation de la diaspora
africaine par Macron à l'Élysée. Quatre axes: continuité Sarkozy/Hollande/Macron,
essentialisation d'"une Afrique" de 55 pays, audience triée sans oppositions ni
dissidents, sportifs/musiciens en lieu d'acteurs géopolitiques. Formule centrale:
"sortir de la Françafrique = aussi sortir de l'Afrique-France, mouvement réciproque
requis". Lien Libye/migrants et ZLECAf. DOCX 182 Ko.
</commit_message>
<xml_diff>
--- a/manuscrit-edition/LIVRE-FINAL.docx
+++ b/manuscrit-edition/LIVRE-FINAL.docx
@@ -9217,6 +9217,44 @@
     <w:p>
       <w:r>
         <w:t>La voie de sortie proposée est programmatique, non catastrophiste: une réforme sur dix ans des curriculas éducatifs vers les langues nationales; des instituts de linguistique africaine pour codifier des langues à fort potentiel de diffusion — le bambara, le fulfulde, le swahili, le lingala; et une grande entreprise de traduction des travaux scientifiques majeurs en langues africaines, sur le modèle de ce que l'Europe a fait à la Renaissance en traduisant les auteurs arabes pour faire émerger la science européenne en langue vernaculaire. «Pour que le grec devienne l'Europe, il a fallu que les Européens traduisent les auteurs arabes. C'est le travail que la nouvelle génération africaine peut se donner» (Batenguene, Panafrican Média TV, juin 2026). Il y associe un ancrage géopolitique direct: le Mali, la Guinée Conakry, le Burkina Faso et le Niger — qui partagent le bambara comme langue de communication majeure — pourraient construire une fédération linguistique qui serait à l'espace sahélien ce que la Francophonie a été au pré-carré français: un espace de souveraineté culturelle, mais cette fois au service des peuples qui le parlent.</w:t>
+      </w:r>
+    </w:p>
+    <w:p>
+      <w:pPr>
+        <w:pStyle w:val="Heading2"/>
+      </w:pPr>
+      <w:r>
+        <w:t>Le sommet diaspora, ou le recyclage des paradigmes</w:t>
+      </w:r>
+    </w:p>
+    <w:p>
+      <w:r>
+        <w:t>Paris, 2025. Emmanuel Macron convie à l'Élysée des dizaines de membres de la diaspora africaine. L'intention déclarée: «construire un nouveau pivot avec l'Afrique», sortir enfin des «vieux schémas». L'analyse de Jean-Claude Félix Tchicaya, chercheur à l'Institut de prospective et de sécurité en Europe (IPSE), est chirurgicale — et d'autant plus précieuse qu'elle ne vient pas du camp panafricaniste: «C'est du déjà-entendu en France, même à l'Élysée, avec Nicolas Sarkozy, François Hollande, qui voulaient sortir de la Françafrique» (Tchicaya, IPSE, commentaire télévisé, 2025). Même intention proclamée. Même obstruction structurelle. Différent président, mêmes mots.</w:t>
+      </w:r>
+    </w:p>
+    <w:p>
+      <w:r>
+        <w:t>La première critique porte sur la catégorie elle-même. «L'Afrique, c'est 55 pays» — d'Alger au Cap — et l'on continue de s'adresser à ce continent comme à une entité homogène et racialement définie. «C'est le seul territoire, le seul continent au monde où on s'adresse à un continent de la sorte»: on ne parle pas «à l'Asie» ou «à l'Europe» avec ce registre. L'essentialisation n'est pas un oubli de protocole: elle est la condition de la leçon. On ne peut pas faire la leçon à 55 États avec leurs conflits géopolitiques, leurs trajectoires économiques distinctes, leurs oppositions internes. On peut en revanche faire la leçon à «l'Afrique» — un objet unique, unifié par le regard qui le convoque. Macron déclare ne pas vouloir en faire; il le fait, parce que la structure du rapport ne lui laisse pas d'autre grammaire.</w:t>
+      </w:r>
+    </w:p>
+    <w:p>
+      <w:r>
+        <w:t>La deuxième critique porte sur la composition de la salle. La diaspora invitée était «triée sur le volet» — différence qualitative d'avec Ouagadougou en novembre 2017, où les étudiants burkinabè avaient frontalement confronté Macron. À Paris: pas d'oppositions en exil, pas de dissidents, pas de voix qui «ne peuvent pas justement exprimer leur désaccord» depuis leur pays d'origine. Or ce sont précisément ces acteurs qui forment le capital politique le plus vivant de la diaspora — ceux qui ont payé de leur liberté ou de leur vie «le voeu de vivre en démocratie dans leur pays». Tchicaya leur rend explicitement hommage, là où l'Élysée les avait simplement écartés. Un sommet sur «l'Afrique nouvelle» dont les voix les plus critiques sont absentes est, structurellement, un sommet de l'ancienne Afrique.</w:t>
+      </w:r>
+    </w:p>
+    <w:p>
+      <w:r>
+        <w:t>La troisième critique est peut-être la plus révélatrice: parmi les invités, des sportifs et des musiciens. «La culture c'est important, la musique et le sport» — mais «souvent on parle un peu plus du sport et de la musique quand il s'agit de l'Afrique». Inviter l'Australie ou la Chine avec des sportifs serait inconcevable: on traite avec leurs acteurs politiques et économiques parce qu'on les reconnaît comme des puissances. L'exclusion des acteurs géopolitiques africains au profit de la vitrine culturelle n'est pas un accident de casting: c'est un mode de relation sédimenté. Parler aux sportifs, c'est parler à des individus. Parler aux acteurs économiques et politiques, c'est parler à une puissance — et c'est précisément ce que l'Afrique est devenue, à l'heure où la ZLECAf construit un marché commun d'un milliard et demi d'habitants que Tchicaya compare au traité de Rome comme moment fondateur d'un espace économique continental autonome.</w:t>
+      </w:r>
+    </w:p>
+    <w:p>
+      <w:r>
+        <w:t>Tchicaya pointe enfin ce que la rhétorique du «nouveau départ» efface soigneusement: «Sortir de la Françafrique, c'est aussi sortir de l'Afrique-France — parce que dans la création de la Françafrique, il y avait autant d'Africains que de Français d'accord pour la mettre en place. Il faut donc un mouvement réciproque.» La Françafrique n'est pas un dispositif imposé à une Afrique passive: c'est un système co-construit. Sa déconstruction exige que les deux parties avancent simultanément. Un président français peut convoquer la diaspora à l'Élysée; cela ne constitue pas un «mouvement réciproque». Un vrai mouvement réciproque inclurait les oppositions africaines, les syndicalistes, les intellectuels critiques — et la reconnaissance que les migrants qui arrivent en Méditerranée avec des gilets orange sont, au moins en partie, le produit d'une politique française en Libye (chapitre 11): «Est-ce qu'on y est pour rien, nous, la France et l'Europe, parfois en donnant à la Libye où il y a de l'esclavage?» (Tchicaya, 2025).</w:t>
+      </w:r>
+    </w:p>
+    <w:p>
+      <w:r>
+        <w:t>L'analyse de Tchicaya rejoint ici la thèse centrale de ce chapitre: la recomposition ne change pas l'objectif. Elle change l'instrument. Hier des soldats; aujourd'hui des sportifs à l'Élysée, une Francophonie réformée, des entreprises plus discrètes. Mais dans tous les cas, une «Afrique» convoquée comme objet — jamais rencontrée comme sujet.</w:t>
       </w:r>
     </w:p>
     <w:p>

</xml_diff>

<commit_message>
Ch.28: L'Éco/CEDEAO — réforme ou substitution? (La palabre intellectuelle, Afrique Média)
Nouvelle sous-section entre Amaïzo et la base de la monnaie AES: débat Éco
documenté depuis la rencontre Élysée (Akufo-Addo, 15% échanges intra-africains
vs 60% UE, marché 350M hab., comité Ghana/Nigeria/CI/Niger). Macron "no taboo"
CFA = anticipation pour contrôler la forme via parité fixe à l'euro (Ngom).
Jean Sa-Pollo: concession arrachée par la lutte. Wangem: enjeu réel = crédit
bancaire + production locale. Convergence de diagnostic avec l'AES: taux de
change, politique de crédit et transformation productive = trois conditions.
DOCX 184 Ko.
</commit_message>
<xml_diff>
--- a/manuscrit-edition/LIVRE-FINAL.docx
+++ b/manuscrit-edition/LIVRE-FINAL.docx
@@ -8672,6 +8672,39 @@
     <w:p>
       <w:r>
         <w:t>L'étape institutionnelle suivante a désormais une date: un Institut monétaire africain est annoncé pour septembre 2026, dans le sillage de la réunion des gouverneurs de banques centrales africaines à Dakar. Concrètement, un institut monétaire est l'embryon d'une banque centrale: l'organe qui prépare les statuts, les règles d'émission et les mécanismes de change avant qu'une monnaie n'existe. Le calendrier n'est pas anodin: en mai 2026, Bloomberg et Citigroup recommandaient une dévaluation du franc CFA de la zone CEMAC — un signal, analysé par Jonathan Batenguène, que Paris elle-même pourrait utiliser la dévaluation comme outil de pression. Le rappel du mécanisme complet du CFA appartient au chapitre 7; retenons ici l'essentiel: une monnaie dont le taux de change et les règles se décident ailleurs n'est pas une monnaie, c'est une laisse.</w:t>
+      </w:r>
+    </w:p>
+    <w:p>
+      <w:pPr>
+        <w:pStyle w:val="Heading2"/>
+      </w:pPr>
+      <w:r>
+        <w:t>L'Éco et la CEDEAO: réforme ou substitution?</w:t>
+      </w:r>
+    </w:p>
+    <w:p>
+      <w:r>
+        <w:t>Le chemin de l'AES vers la souveraineté monétaire n'est pas le seul qui soit ouvert. À l'ouest, la CEDEAO porte depuis plusieurs années un autre projet: l'Éco, monnaie unique d'une zone de 350 millions d'habitants. Lors de la rencontre Macron-diaspora africaine à l'Élysée, le président ghanéen Nana Akufo-Addo en a défendu la logique avec des arguments chiffrés: les échanges commerciaux intra-africains ne représentent que 15 % du commerce total du continent, contre 60 % au sein de l'Union européenne. L'Éco devrait permettre d'organiser un marché commun de l'ampleur du traité de Rome — en commençant par les pays remplissant les critères de convergence, les autres rejoignant progressivement; critères définis, modèle de banque centrale arrêté, comité de pilotage désigné comprenant le Ghana, le Nigeria, la Côte d'Ivoire et le Niger («La palabre intellectuelle», Afrique Média, 2019).</w:t>
+      </w:r>
+    </w:p>
+    <w:p>
+      <w:r>
+        <w:t>C'est précisément dans ce contexte qu'il faut lire la déclaration d'Emmanuel Macron au même événement: il n'y aurait «pas de tabou» concernant le franc CFA, et la France était prête à avancer — à condition de préserver la «stabilité». Le mot a immédiatement interpellé les analystes. La question: «stabilité» signifie-t-il une parité fixe avec l'euro maintenue de facto, protégeant les intérêts des multinationales françaises dans la zone? Et Jean Sa-Pollo de rappeler la logique de rapport de forces sous-jacente: «Si la France lâche sur le franc CFA, c'est uniquement parce que les Africains se sont battus» — non par générosité stratégique, mais par anticipation d'une pression devenue ingérable.</w:t>
+      </w:r>
+    </w:p>
+    <w:p>
+      <w:r>
+        <w:t>L'analyste Bastion Parfait Ngom pose la thèse la plus structurelle: la France ne concède pas la réforme monétaire, elle tente de l'anticiper pour en contrôler la forme. Pousser vers une Éco à parité fixe avec l'euro, c'est enjamber la contestation du CFA tout en préservant l'essentiel du mécanisme — la détermination externe du taux de change, qui protège les importations françaises et pénalise les exportations africaines. «L'indépendance réelle ne viendra que si les Africains sont les seuls maîtres de la gestion de leur monnaie, sans interférence extérieure sur les mécanismes de parité» (Ngom, «La palabre intellectuelle», Afrique Média, 2019). Le Nigeria, première économie d'Afrique, imposerait selon lui des conditions strictes avant tout engagement: refuser d'entrer dans ce qui serait autrement un «marché de dupes».</w:t>
+      </w:r>
+    </w:p>
+    <w:p>
+      <w:r>
+        <w:t>L'analyste Patrick Wangem déplace la focale vers l'économie réelle: la vraie question n'est pas monétaire en premier lieu, c'est la libération du crédit bancaire et le renforcement de la production locale pour rééquilibrer une balance commerciale structurellement déficitaire. Une monnaie nouvelle sans transformation productive, c'est une coquille — et si la CEMAC ne suit pas cette dynamique, les tensions sociales s'y accumuleront jusqu'à la déstabilisation.</w:t>
+      </w:r>
+    </w:p>
+    <w:p>
+      <w:r>
+        <w:t>Le débat Éco pointe ainsi vers la même conclusion que le chemin de l'AES, par une autre voie: la souveraineté monétaire ne se joue pas sur le nom ou le logo, mais sur trois conditions — maîtrise du taux de change, autonomie de la politique de crédit, capacité à transformer les ressources naturelles en investissement domestique. Sur ces trois conditions, l'Éco version «stabilité» de Macron ne satisfait ni la première ni la deuxième. Le diagnostic converge avec celui de Tiani: la monnaie est le toit. On ne le pose pas avant d'avoir les murs.</w:t>
       </w:r>
     </w:p>
     <w:p>

</xml_diff>

<commit_message>
Ch.10: biens mal acquis — fortune compradore devant les juges (Sherpa/TI France)
Nouvelle sous-section entre "La loi des valets" et l'audio du 17 février 2022:
Bongo/Sassou-Nguesso/Obiang (2008), hôtel particulier 10M€/Yvelines + apt 16e,
150M€ saisis Guinée équatoriale. FIBA/Chirac/Eva Joly, diamants Bokassa/Giscard,
financement campagnes françaises. Sarkozy "rupture françafrique"/limogeage Bockel.
Double face: corrupteur (Areva/Niger) ET corruptible. Principe: restitution aux
populations exige société civile intégrée. "Victime de la mafia française ET
coupable" (Camara/UIJA). DOCX 186 Ko.
</commit_message>
<xml_diff>
--- a/manuscrit-edition/LIVRE-FINAL.docx
+++ b/manuscrit-edition/LIVRE-FINAL.docx
@@ -3460,6 +3460,49 @@
     <w:p>
       <w:r>
         <w:t>Alassane Ouattara, enfin — le cas le plus instructif, parce qu'il est en cours. Ancien directeur du département Afrique du FMI, il fut l'architecte institutionnel des plans d'ajustement structurel imposés au continent — ces programmes dont on a vu la mécanique au chapitre 9. Porté au pouvoir en 2011 grâce à la rébellion de Guillaume Soro et à l'intervention française, il condamne dix ans plus tard ce même Soro à vingt ans de prison pour les actes qu'il avait lui-même commandités. La France ne lève pas le petit doigt. Mabiala en tire la loi: « L'Empire n'a pas de mémoire pour ses valets. Il n'a que des intérêts.» L'Occident utilise, puis jette.</w:t>
+      </w:r>
+    </w:p>
+    <w:p>
+      <w:pPr>
+        <w:pStyle w:val="Heading2"/>
+      </w:pPr>
+      <w:r>
+        <w:t>Les biens mal acquis: la fortune compradore devant les juges</w:t>
+      </w:r>
+    </w:p>
+    <w:p>
+      <w:r>
+        <w:t>L'empire n'a pas de mémoire pour ses valets — mais ses valets ont des hôtels particuliers. Les «biens mal acquis» sont la face visible du contrat compradore: des biens acquis en France — immobilier, voitures de luxe, comptes bancaires — par des dirigeants africains et leur entourage, au moyen de fonds publics détournés dans leur pays d'origine et blanchis sur le territoire français.</w:t>
+      </w:r>
+    </w:p>
+    <w:p>
+      <w:r>
+        <w:t>En 2008, la justice française ouvre une information judiciaire sur les avoirs détenus en France par trois chefs d'État africains, pivots de l'influence française sur le continent: Omar Bongo (Gabon, au pouvoir depuis quarante ans), Denis Sassou-Nguesso (Congo-Brazzaville) et Teodorin Obiang (vice-président de Guinée équatoriale). La juge d'instruction donne suite à une plainte déposée par Transparency International France et l'association Sherpa — après que le parquet de Paris avait classé le dossier sans suite à deux reprises, illustrant à lui seul la perméabilité de l'institution judiciaire française aux pressions diplomatiques. Les biens documentés ne souffrent guère d'interprétation: pour Bongo, un hôtel particulier et quatre appartements dans le 16e arrondissement de Paris; pour Sassou-Nguesso, un hôtel particulier de 700 m² estimé à 10 millions d'euros dans les Yvelines et un appartement dans le 7e arrondissement. «Tout ça, il l'a payé avec son salaire de chef d'État africain?» («Face à Face», TV débat, v. 2008).</w:t>
+      </w:r>
+    </w:p>
+    <w:p>
+      <w:r>
+        <w:t>Les montants parlent d'eux-mêmes: pour la seule Guinée équatoriale, les avoirs saisis à l'issue des procédures contre Teodorin Obiang sont évalués à environ 150 millions d'euros — une somme qui aurait permis de vacciner trois fois la population du pays. En comptant les plus de vingt affaires actives en France, les ordres de grandeur dépassent les centaines de millions d'euros. Ce n'est pas de la corruption marginale: c'est un régime de captation systémique, où les élites compradores placent en France le produit de l'extraction africaine — reproduisant, à leur échelle, le mécanisme de sortie de capitaux documenté au chapitre 7 pour le franc CFA.</w:t>
+      </w:r>
+    </w:p>
+    <w:p>
+      <w:r>
+        <w:t>Mais la véritable portée de ces affaires tient dans ce que la juriste Perdriel Vissière (Sherpa) nomme «dénoncer un système». Car le système a deux faces, et les plaignants le savent: «La corruption a un corrupteur ET un corruptible.» La France est nommée des deux côtés du guichet. La banque FIBA drainait, selon les enquêteurs, l'argent de Bongo et de Chirac; elle a disparu avec ses fonds peu après les premières dénonciations d'Eva Joly. Les diamants de Bokassa, acceptés par Giscard d'Estaing, n'ont jamais fait l'objet de poursuites françaises. Bongo aurait financé des campagnes électorales françaises — nommément, selon le journaliste Camara (UIJA). Areva est pointée comme corrupteur au Niger, en miroir des chefs d'État ciblés. Transparency International France épingle elle-même la France dans ses rapports annuels sur la corruption des entreprises.</w:t>
+      </w:r>
+    </w:p>
+    <w:p>
+      <w:r>
+        <w:t>Cette réciprocité n'invalide pas les procédures. Elle les élargit — et fait de la réponse de Paris un indicateur politique autant que judiciaire. Sarkozy avait proclamé la «rupture avec la Françafrique»; mais son gouvernement avait écarté Jean-Marie Bockel du moment où celui-ci avait demandé «l'acte de décès de la Françafrique». La juge d'instruction peut être indépendante; les parquets restent exposés à la pression diplomatique — dont tous les acteurs du débat reconnaissent l'existence. La leçon est structurelle: la Françafrique produit non seulement des compradore qui pillent leur peuple, mais aussi des circuits financiers franco-africains qui couvrent les deux partis, et une inertie judiciaire calibrée par les intérêts des États.</w:t>
+      </w:r>
+    </w:p>
+    <w:p>
+      <w:r>
+        <w:t>La leçon la plus durable des procédures «biens mal acquis» n'est donc pas judiciaire: c'est le principe, arraché après des années de plaidoyer, que les avoirs confisqués doivent revenir aux populations d'origine. Avant l'adoption du mécanisme légal — inscrit dans la loi «développement solidaire et lutte contre les inégalités mondiales» —, ces biens tombaient dans le budget général de l'État français: de l'argent volé en Afrique, retenu en France. La restitution elle-même exige des garanties: là où la société civile du pays d'origine a été écartée du processus — Suisse, États-Unis, Royaume-Uni l'ont montré —, l'argent réapparaît dans les mains de ceux qui l'avaient détourné. Restituer sans démocratiser, c'est boucler la boucle.</w:t>
+      </w:r>
+    </w:p>
+    <w:p>
+      <w:r>
+        <w:t>Les militants anticorruption gabonais qui travaillaient avec Sherpa avaient été arrêtés illégalement en décembre 2008. L'empire protège ses valets — jusqu'à ce qu'ils ne servent plus. Omar Bongo lui-même était, selon l'analyste Camara, «victime de la mafia financière française — ET coupable». Les deux ne s'excluent pas: le comprador protège l'empire, l'empire protège le comprador, jusqu'au moment où la juge d'instruction trouve son chemin. Ce que Mobutu, Bongo et les autres n'avaient pas prévu, c'est que les tribunaux français pouvaient, un jour, leur survivre.</w:t>
       </w:r>
     </w:p>
     <w:p>

</xml_diff>

<commit_message>
Ch.21 RCA: Groupe Albatros/Douala — consolidation fiscale souveraine (Panafrican Media)
Insertion avant la synthèse des cinq registres d'ingérence: contrepoint souverainiste
positif — lancement du dispositif électronique de suivi de cargaison et redevance
armatoriale de la RCA, Groupe Albatros mandataire exclusif, ports Douala+Kribi,
cadre CEMAC/TPI. Avant: plusieurs mandataires, pas de visibilité sur les flux.
Maintenant: un seul groupe, traçabilité consolidée, sécurisation des recettes.
Lecture: l'État centrafricain voit enfin clair dans ses propres flux — exactement
ce que les "assassins financiers" (ch.9) ont toujours cherché à empêcher.
DOCX 186 Ko.
</commit_message>
<xml_diff>
--- a/manuscrit-edition/LIVRE-FINAL.docx
+++ b/manuscrit-edition/LIVRE-FINAL.docx
@@ -6690,6 +6690,11 @@
     <w:p>
       <w:r>
         <w:t>La chaîne de financement du réseau est documentée par une source interne au groupe lui-même. Dans une vidéo diffusée sur les réseaux sociaux en mars 2025, Lili Champagne — figure de l'opposition centrafricaine en France et membre déclarée des «12 apôtres» — admet avoir reçu de l'argent de personnalités de l'opposition centrafricaine: Anicet-Georges Dologuélé, Karim Meckassoua et Martin Ziguélé, pour organiser des manifestations contre les autorités centrafricaines depuis la France. Elle ajoute avoir été sanctionnée par une autorité financière française (désignée sous l'acronyme GAF) pour avoir reçu une somme importante sur son compte bancaire à cette fin. Cette déclaration, recueillie à la source et non contestée à la date de publication, est retranscrite avec son statut propre: un aveu spontané filmé, non une affirmation de tiers, et son contenu doit être distingué de l'éditorialisation de l'article d'opinion qui le rapporte (Ndjoni Sango, Basta BALOUWA, 6 mars 2025). Elle établit néanmoins la réalité d'une chaîne: opposition centrafricaine basée en France → financement via diaspora → manifestations organisées contre le gouvernement de Bangui. Ce schéma est identique, structurellement, à ce que l'AES documente sur son propre sol: des opposants et des groupes armés financés depuis Paris ou Abu Dhabi, opérant sur le territoire de l'État souverain qu'ils cherchent à déstabiliser. La cinquième couche révèle le mécanisme le plus sophistiqué: le détournement du statut humanitaire comme couverture de renseignement. Joseph Figueira est un employé de Family Health International 360 (FHI 360), ONG américaine active dans plusieurs pays africains sous mandat santé. Les forces de sécurité centrafricaines (FACA et services spéciaux) l'arrêtent; les saisies comprennent plusieurs passeports, des conversations téléphoniques établissant des plans de déstabilisation de la RCA et d'assassinat du président Touadéra, ainsi que des preuves de présence dans des camps d'entraînement rebelles qu'il alimentait en renseignements et en logistique. L'Union européenne, par la voix de la commissaire Kala Kajas — «la dame de fer» —, exige sa libération et menace de sanctions. Touadéra refuse: les preuves existent, la justice centrafricaine est compétente, un espion ne se libère pas sur ordre de Bruxelles. Ce refus est analysé dans le cadre de l'émission Échiquier Mondial (Panafrican Media TV, Dr. Essouet, Maître Jeanvier Momo, Hamzat) comme le moment où la RCA formule sa propre doctrine souverainiste: «vous semblez ignorer que la République centrafricaine est un État souverain.» L'invocation de «l'état de santé» de Figueira par l'UE — argument classique de protection d'actifs compromis, déjà utilisé dans le précédent centrafricain dit «Wan Kinoloi» — est mise en parallèle par les panélistes avec l'Arche de Zoé (Tchad, octobre 2007): 103 enfants tchadiens tentés d'être exportés vers la France sous couverture humanitaire, parmi lesquels trois journalistes français dont Sarkozy avait déclaré «j'irai les chercher quoi qu'ils aient fait» — langage identique à celui employé par Macron pour Bazoum. La lecture structurelle est posée sans ambiguïté: l'humanitaire a remplacé les missions religieuses comme vecteur d'entrée; FHI 360 est l'Arche de Zoé du XXIe siècle; la grammaire est identique. Un prolongement géopolitique mérite d'être noté: lors de ce même débat, plusieurs intervenants ont explicitement appelé Touadéra à solliciter son intégration dans l'AES, au motif qu'il «mène le même combat» que Bamako, Ouagadougou et Niamey — seul, sous les mêmes pressions. Si cette candidature se formalisait, la RCA deviendrait le premier État non fondateur à rejoindre la Confédération. Ce que révèle le cas centrafricain, au-delà des affaires Figueira et SPEAR, c'est l'existence d'une résistance populaire organisée, antérieure aux ruptures sahéliennes. Le 26 mars 2024, dans les quartiers Bakongo, Sciotte et Dékongo du 2ème arrondissement de Bangui, plus d'une centaine de personnes se réunissent sur le terrain de l'Église Dékongo à l'invitation du Comité d'Initiative pour le Contrôle des Actions des États-Unis en Centrafrique (CICAUSAC). Son président: Socrate Gutenberg Taramboye — le même qui prendra la parole à la conférence du MPAL en novembre 2025 et qui figure parmi les dénonciateurs des «12 apôtres». La continuité de l'acteur — du CICAUSAC (2024) au MPAL (2025) — révèle une mobilisation civique cohérente et durable, non conjoncturelle. Le CICAUSAC a été créé en réponse directe à la présence militaire américaine en RCA, jugée redondante avec les alliés russes et rwandais déjà en place. Son président décrit la méthode en ces termes: «Les États-Unis, c'est la première puissance mondiale. Son travail c'est de diviser les pays en créant des troubles. Pendant que les gens se battent, ils vont venir pour mettre la paix et vont profiter à voler les ressources naturelles.» Il nomme l'USAID parmi les ONG qu'il accuse de «fournir les armes aux groupes armés» et décrit la mécanique des dons convertis en «prêts à taux d'intérêt exorbitant» (Ndjoni Sango, Mamadou NGAINAM, 26 mars 2024). Ces affirmations émanent d'un militant engagé et sont retranscrites avec ce statut; leur cohérence avec les faits documentés par ailleurs — SPEAR, FHI 360/Figueira, base 201 d'Agadez — leur confère une valeur de témoignage direct, non de preuve indépendante. Ce qui est établi sans ambiguïté: une organisation civique centrafricaine dédiée à la surveillance des actions américaines existait en mars 2024, animait les quartiers populaires de Bangui, et comptait parmi ses cadres des figures qui se retrouveront, un an plus tard, dans les structures de résistance à l'ingérence française. L'anti-impérialisme centrafricain a ses propres réseaux — et ils précèdent, géographiquement et chronologiquement, l'AES.</w:t>
+      </w:r>
+    </w:p>
+    <w:p>
+      <w:r>
+        <w:t>À ces cinq registres d'ingérence, il convient d'opposer un acte de souveraineté fiscale qui, s'il est moins spectaculaire, en dit autant sur la trajectoire de l'État centrafricain. La ville de Douala abrite la cérémonie officielle de lancement du dispositif électronique de gestion du bordeau de suivi de cargaison et de la redevance armatoriale de la République centrafricaine — un système dont l'État confie la gestion au groupe Albatros, désormais mandataire exclusif, en remplacement d'un système antérieur à mandataires multiples sans visibilité consolidée sur les flux financiers. «Pendant longtemps dans ce secteur, nous avions plusieurs mandataires et nous n'avions pas assez de visibilité sur le flux financier, c'est-à-dire la mobilisation des ressources publiques», déclare un responsable gouvernemental au lancement (Panafrican Media, Douala, 2026). Concrètement: l'État centrafricain centralise la gestion de ses recettes du commerce international — suivi des cargaisons, redevances armatoriales, sécurisation des recettes — sous un dispositif traçable opérant à partir des ports de Douala et Kribi, dans le cadre des textes CEMAC et des conventions TPI avec le Cameroun. Le choix de Douala illustre la logique de coopération régionale sud-sud: la RCA, pays enclavé, dépend intégralement des couloirs maritimes camerounais pour ses échanges extérieurs. Consolider la traçabilité de ses recettes portuaires depuis Douala, c'est aussi consolider un partenariat entre deux États membres de la CEMAC — hors de la tutelle française. Ce que ce dispositif signifie dans la grille de lecture de ce chapitre, c'est précisément ce que les «assassins financiers» du chapitre 9 ont toujours cherché à empêcher: que l'État africain voie clair dans ses propres flux. «Nous allons vers la transformation», dit le responsable; «et ça, c'est la philosophie même du président de la République.»</w:t>
       </w:r>
     </w:p>
     <w:p>

</xml_diff>

<commit_message>
Ch.10: enrichissement biens mal acquis — perquisition 42 av. Foch + Malabo
Deux nouveaux blocs insérés dans la sous-section "biens mal acquis":
1/ Enquête intérieure (Jean-Philippe, DCPJ): mécanisme sociétés écrans (bois/BTP),
   perquisition 42 av. Foch (4-5j, 50 policiers, ~1000 objets, 200M€ total),
   Bugatti/Ferrari/Christie's, Malibu+Michael Jackson (DOJ), Rio/carnaval,
   jugement 2019 (2 ans sursis) = premier précédent historique.
2/ Contre-mobilisation Malabo: manifestation pro-Obiang ambassade France,
   argument avocats "procès politique"/"immunité vice-président en exercice",
   contradiction révélatrice: défense s'oppose à restitution à l'État équato-guinéen
   par le vice-président qui l'a vidé. 100M€ patrimony confirmé à l'audience.
Ajout circulaire 22 nov. 2022 dans paragraphe restitution. DOCX 188 Ko.
</commit_message>
<xml_diff>
--- a/manuscrit-edition/LIVRE-FINAL.docx
+++ b/manuscrit-edition/LIVRE-FINAL.docx
@@ -3487,6 +3487,16 @@
     </w:p>
     <w:p>
       <w:r>
+        <w:t>L'enquête qui aboutira à la première condamnation de cette série mérite d'être racontée depuis l'intérieur — car elle révèle autant sur les mécanismes du blanchiment que sur la difficulté de les démonter. Le commandant Jean-Philippe, de la Direction centrale de la police judiciaire (service anti-blanchiment), en est le directeur d'enquête depuis janvier 2011, après que la Cour de cassation — contre l'avis du parquet de Paris — a donné raison aux associations et imposé l'ouverture d'une information judiciaire. L'enquête remonte dix ans en arrière: train de vie «en totale inadéquation avec ses revenus officiels», Ferrari, Bentley, Bugatti Veyron, objets d'art acquis chez Christie's, mobilier acheté chez les antiquaires de la place de Paris. Ce qui frappe l'enquêteur, c'est le mécanisme de financement: «C'est pas forcément monsieur Obiang qui finance directement — c'était souvent par des sociétés qui apparaissaient, qui n'avaient aucune logique économique: des sociétés d'exploitation de bois, de BTP, qui payaient pour son compte» («Police, le podcast», 2024). Sociétés écrans sans activité réelle, domiciliées dans des paradis fiscaux — c'est la chaîne complète du blanchiment, du pétrole équato-guinéen aux antiquaires parisiens. Le 4 février 2012, une cinquantaine de policiers investissent le 42 avenue Foch: un hôtel particulier de 3 000 m² avec discothèque, salon de coiffure et salle de musculation. Quatre à cinq jours de perquisition, presque 1 000 objets saisis. «On se disait avec notre petite liste qu'on allait en saisir un peu. Et là, des objets partout — impossible à identifier. On a pris tout.» Au total, environ 200 millions d'euros de biens saisis: hôtel particulier, voitures et biens meubles. L'affaire a aussi une dimension internationale: aux États-Unis, propriété à Malibu et objets de Michael Jackson exportés illégalement (ce qui vaut l'intérêt direct du Department of Justice américain); au Brésil, propriétés à Rio et dépenses au carnaval. L'enquête policière s'achève vers 2015-2016; le jugement définitif intervient en 2019: deux ans avec sursis. «Anecdotique comme peine, dit Jean-Philippe, mais c'était surtout la confirmation de tout ce qu'on avait saisi. C'était la première. Si ça avait été négatif, les autres enquêtes auraient eu un peu dans l'aile.» Première enquête, premier jugement, premier précédent: posé.</w:t>
+      </w:r>
+    </w:p>
+    <w:p>
+      <w:r>
+        <w:t>La réponse équato-guinéenne ne passe pas que par les avocats. À Malabo, des militants pro-Obiang ont marché sous la pluie jusqu'aux grilles de l'ambassade de France, remettant à l'ambassadeur une lettre de protestation: «Il n'y a aucune institution équato-guinéenne qui a porté plainte contre ce monsieur — alors de quoi la justice française se permet-elle de juger un vice-président en fonction?» (reportage télévisé, Malabo). À Paris, dans la chambre des criées, les avocats de la défense ont tenté de suspendre la procédure: «On n'attaque pas un vice-président en fonction. La finalité de tout cela est la déstabilisation du régime.» L'argument de l'immunité ratione personae — qui protège en droit international les hauts responsables gouvernementaux en exercice — est le plus juridiquement sérieux et reste objet de débat. Mais l'argument le plus révélateur des logiques en présence est un autre: «Il ne faut pas rendre cet argent à la République tant que les dirigeants politiques sont en place.» Retraduit: les avocats de la défense s'opposent, au nom de leur client, à la restitution de l'argent au peuple équato-guinéen — parce que ce retour bénéficierait précisément à l'État dont leur client est vice-président. Les caisses de l'État sont vides parce que le vice-président les a vidées; restituer à l'État, c'est restituer à ceux qui ont volé. La contradiction est totale — et instructive. Le tribunal a refusé le renvoi: le procès a duré jusqu'au 6 juillet. Patrimoine documenté et confirmé à l'audience: plus de 100 millions d'euros.</w:t>
+      </w:r>
+    </w:p>
+    <w:p>
+      <w:r>
         <w:t>Mais la véritable portée de ces affaires tient dans ce que la juriste Perdriel Vissière (Sherpa) nomme «dénoncer un système». Car le système a deux faces, et les plaignants le savent: «La corruption a un corrupteur ET un corruptible.» La France est nommée des deux côtés du guichet. La banque FIBA drainait, selon les enquêteurs, l'argent de Bongo et de Chirac; elle a disparu avec ses fonds peu après les premières dénonciations d'Eva Joly. Les diamants de Bokassa, acceptés par Giscard d'Estaing, n'ont jamais fait l'objet de poursuites françaises. Bongo aurait financé des campagnes électorales françaises — nommément, selon le journaliste Camara (UIJA). Areva est pointée comme corrupteur au Niger, en miroir des chefs d'État ciblés. Transparency International France épingle elle-même la France dans ses rapports annuels sur la corruption des entreprises.</w:t>
       </w:r>
     </w:p>
@@ -3497,7 +3507,7 @@
     </w:p>
     <w:p>
       <w:r>
-        <w:t>La leçon la plus durable des procédures «biens mal acquis» n'est donc pas judiciaire: c'est le principe, arraché après des années de plaidoyer, que les avoirs confisqués doivent revenir aux populations d'origine. Avant l'adoption du mécanisme légal — inscrit dans la loi «développement solidaire et lutte contre les inégalités mondiales» —, ces biens tombaient dans le budget général de l'État français: de l'argent volé en Afrique, retenu en France. La restitution elle-même exige des garanties: là où la société civile du pays d'origine a été écartée du processus — Suisse, États-Unis, Royaume-Uni l'ont montré —, l'argent réapparaît dans les mains de ceux qui l'avaient détourné. Restituer sans démocratiser, c'est boucler la boucle.</w:t>
+        <w:t>La leçon la plus durable des procédures «biens mal acquis» n'est donc pas judiciaire: c'est le principe, arraché après des années de plaidoyer, que les avoirs confisqués doivent revenir aux populations d'origine. Avant l'adoption du mécanisme légal — inscrit dans la loi «développement solidaire et lutte contre les inégalités mondiales», puis précisé par la circulaire du 22 novembre 2022 qui permet explicitement de restituer biens et recettes aux populations des États étrangers concernés —, ces biens tombaient dans le budget général de l'État français: de l'argent volé en Afrique, retenu en France. La restitution elle-même exige des garanties: là où la société civile du pays d'origine a été écartée du processus — Suisse, États-Unis, Royaume-Uni l'ont montré —, l'argent réapparaît dans les mains de ceux qui l'avaient détourné. Restituer sans démocratiser, c'est boucler la boucle.</w:t>
       </w:r>
     </w:p>
     <w:p>

</xml_diff>

<commit_message>
Correction attribution: Matingé → Jonathan Batenguène (4 occurrences, Ch.19 coupe du monde)
</commit_message>
<xml_diff>
--- a/manuscrit-edition/LIVRE-FINAL.docx
+++ b/manuscrit-edition/LIVRE-FINAL.docx
@@ -4849,7 +4849,7 @@
         <w:t>Un tournoi sans peuple.</w:t>
       </w:r>
       <w:r>
-        <w:t xml:space="preserve"> Des dizaines de milliers de supporters africains, iraniens et d'autres nations jugées « à risque» se sont vu refuser des visas d'entrée ou ont été interceptés à la frontière. La délégation sénégalaise — championne d'Afrique en titre —, « fouillée jusqu'au caleçon» à son arrivée. La RDC exclue sous prétexte d'Ebola: des supporters avaient acheté des billets à 15 000 dollars et n'ont pas été remboursés. Le meilleur arbitre africain désigné par la CAF refoulé pour un supposé lien avec un mouvement terroriste opérant en Somalie — pays dont il n'est pas originaire. « On a gardé le spectacle mais on a banni les spectateurs », résume Jonathan Matingé sur Panafrican Média TV le 14 juin 2026. « On a conservé le ballon mais on a chassé les battements de cœur. C'est l'antifootball. Un roi sans sujets. Une coupe du monde qui n'aura plus de monde.»</w:t>
+        <w:t xml:space="preserve"> Des dizaines de milliers de supporters africains, iraniens et d'autres nations jugées « à risque» se sont vu refuser des visas d'entrée ou ont été interceptés à la frontière. La délégation sénégalaise — championne d'Afrique en titre —, « fouillée jusqu'au caleçon» à son arrivée. La RDC exclue sous prétexte d'Ebola: des supporters avaient acheté des billets à 15 000 dollars et n'ont pas été remboursés. Le meilleur arbitre africain désigné par la CAF refoulé pour un supposé lien avec un mouvement terroriste opérant en Somalie — pays dont il n'est pas originaire. « On a gardé le spectacle mais on a banni les spectateurs », résume Jonathan Batenguène sur Panafrican Média TV le 14 juin 2026. « On a conservé le ballon mais on a chassé les battements de cœur. C'est l'antifootball. Un roi sans sujets. Une coupe du monde qui n'aura plus de monde.»</w:t>
       </w:r>
     </w:p>
     <w:p>
@@ -4860,7 +4860,7 @@
         <w:t>Deux poids, deux mesures à l'état pur.</w:t>
       </w:r>
       <w:r>
-        <w:t xml:space="preserve"> La FIFA avait exclu la Russie de toutes compétitions après 2022 et créé un fonds de solidarité de dix millions de dollars pour l'Ukraine — une organisation se revendiquant apolitique allant jusqu'à financer un belligérant. Depuis le 7 octobre 2023, Israël n'a subi aucune sanction comparable. Des joueurs qui ont affiché un drapeau palestinien ont été rappelés à l'ordre. Un gardien du PSG s'est vu interdire d'arborer le drapeau de son pays lors d'une finale de Ligue des Champions. « On nous a expliqué que les règles de la FIFA sont sacrées. Aujourd'hui est-ce que quelqu'un est capable de dire oui?» (Matingé, 14 juin 2026.)</w:t>
+        <w:t xml:space="preserve"> La FIFA avait exclu la Russie de toutes compétitions après 2022 et créé un fonds de solidarité de dix millions de dollars pour l'Ukraine — une organisation se revendiquant apolitique allant jusqu'à financer un belligérant. Depuis le 7 octobre 2023, Israël n'a subi aucune sanction comparable. Des joueurs qui ont affiché un drapeau palestinien ont été rappelés à l'ordre. Un gardien du PSG s'est vu interdire d'arborer le drapeau de son pays lors d'une finale de Ligue des Champions. « On nous a expliqué que les règles de la FIFA sont sacrées. Aujourd'hui est-ce que quelqu'un est capable de dire oui?» (Batenguène, 14 juin 2026.)</w:t>
       </w:r>
     </w:p>
     <w:p>
@@ -4893,7 +4893,7 @@
         <w:t>Le starcisme, ou la marchandise qui ne réfléchit pas.</w:t>
       </w:r>
       <w:r>
-        <w:t xml:space="preserve"> Ce contexte éclaire une observation récurrente: pourquoi les grandes stars africaines sont-elles muettes sur les questions politiques? Matingé apporte la réponse structurelle: « Les joueurs sont des marchandises. Un Coca-Cola peut valoir beaucoup d'argent, mais un Coca-Cola n'a pas vocation à réfléchir.» Les capitalistes qui tiennent le football imposent des brassards; ceux qui refusent — Benzema et d'autres — partent jouer en Arabie Saoudite où subsiste un espace. Le starcisme mobilise des millions d'Africains, mais ces millions sont captés par des êtres dont les maîtres contrôlent les déclarations. C'est ça, le soft power à l'état pur: l'Afrique paie des abonnements pour suivre ses propres champions en train de se taire.</w:t>
+        <w:t xml:space="preserve"> Ce contexte éclaire une observation récurrente: pourquoi les grandes stars africaines sont-elles muettes sur les questions politiques? Batenguène apporte la réponse structurelle: « Les joueurs sont des marchandises. Un Coca-Cola peut valoir beaucoup d'argent, mais un Coca-Cola n'a pas vocation à réfléchir.» Les capitalistes qui tiennent le football imposent des brassards; ceux qui refusent — Benzema et d'autres — partent jouer en Arabie Saoudite où subsiste un espace. Le starcisme mobilise des millions d'Africains, mais ces millions sont captés par des êtres dont les maîtres contrôlent les déclarations. C'est ça, le soft power à l'état pur: l'Afrique paie des abonnements pour suivre ses propres champions en train de se taire.</w:t>
       </w:r>
     </w:p>
     <w:p>
@@ -4904,7 +4904,7 @@
         <w:t>Le paradoxe Trump, ou le bâton offert.</w:t>
       </w:r>
       <w:r>
-        <w:t xml:space="preserve"> En violant les engagements américains de 2018 sans que la FIFA réagisse efficacement, Trump a prouvé que ses textes ne sont pas « intangibles, imprescriptibles, inviolables» — comme ils l'étaient quand c'était un État africain qui s'en écartait. La conclusion de Matingé est directe: « Chaque pays africain doit être prêt à prendre la FIFA et la CAF et leur dire: c'est aussi comme ça ici. Que le pays fixe les règles. On ne veut plus voir une star ouvrir son bec parce qu'il n'a pas dit la même chose aux États-Unis.» Ce que la FIFA accepte de la puissance américaine, elle devra l'accepter de la puissance africaine. Trump a donné le bâton; aux souverainistes sahéliens de frapper.</w:t>
+        <w:t xml:space="preserve"> En violant les engagements américains de 2018 sans que la FIFA réagisse efficacement, Trump a prouvé que ses textes ne sont pas « intangibles, imprescriptibles, inviolables» — comme ils l'étaient quand c'était un État africain qui s'en écartait. La conclusion de Batenguène est directe: « Chaque pays africain doit être prêt à prendre la FIFA et la CAF et leur dire: c'est aussi comme ça ici. Que le pays fixe les règles. On ne veut plus voir une star ouvrir son bec parce qu'il n'a pas dit la même chose aux États-Unis.» Ce que la FIFA accepte de la puissance américaine, elle devra l'accepter de la puissance africaine. Trump a donné le bâton; aux souverainistes sahéliens de frapper.</w:t>
       </w:r>
     </w:p>
     <w:p>

</xml_diff>

<commit_message>
build: régénération du DOCX KDP (212 Ko) avec les ajouts récents
Synchronise le DOCX avec LIVRE-FINAL.md : Gabon (ch.10), Touadéra (ch.28),
Banda Kani (intro), Bazié/ONU/OCRS (ch.13), Bazié intox (ch.14), Boganda (ch.22).

Co-Authored-By: Claude Opus 4.8 <noreply@anthropic.com>
Claude-Session: https://claude.ai/code/session_01NN7tYMhNvj5F1TjbPqxiMy
</commit_message>
<xml_diff>
--- a/manuscrit-edition/LIVRE-FINAL.docx
+++ b/manuscrit-edition/LIVRE-FINAL.docx
@@ -72,18 +72,16 @@
     </w:p>
     <w:p>
       <w:pPr>
-        <w:spacing w:before="160" w:after="160"/>
         <w:jc w:val="center"/>
       </w:pPr>
       <w:r>
         <w:rPr>
           <w:b w:val="0"/>
           <w:i w:val="0"/>
-          <w:color w:val="D4A017"/>
-          <w:sz w:val="22"/>
+          <w:color w:val="0A0A0A"/>
           <w:rFonts w:ascii="FreeSans" w:hAnsi="FreeSans" w:cs="FreeSans"/>
         </w:rPr>
-        <w:t>★  ★  ★</w:t>
+        <w:t>★★★</w:t>
       </w:r>
     </w:p>
     <w:p>
@@ -206,18 +204,16 @@
     </w:p>
     <w:p>
       <w:pPr>
-        <w:spacing w:before="160" w:after="160"/>
         <w:jc w:val="center"/>
       </w:pPr>
       <w:r>
         <w:rPr>
           <w:b w:val="0"/>
           <w:i w:val="0"/>
-          <w:color w:val="D4A017"/>
-          <w:sz w:val="22"/>
+          <w:color w:val="0A0A0A"/>
           <w:rFonts w:ascii="FreeSans" w:hAnsi="FreeSans" w:cs="FreeSans"/>
         </w:rPr>
-        <w:t>★  ★  ★</w:t>
+        <w:t>★★★</w:t>
       </w:r>
     </w:p>
     <w:p>
@@ -256,19 +252,8 @@
       </w:r>
     </w:p>
     <w:p>
-      <w:pPr>
-        <w:spacing w:before="160" w:after="160"/>
-        <w:jc w:val="center"/>
-      </w:pPr>
-      <w:r>
-        <w:rPr>
-          <w:b w:val="0"/>
-          <w:i w:val="0"/>
-          <w:color w:val="D4A017"/>
-          <w:sz w:val="22"/>
-          <w:rFonts w:ascii="FreeSans" w:hAnsi="FreeSans" w:cs="FreeSans"/>
-        </w:rPr>
-        <w:t>★  ★  ★</w:t>
+      <w:r>
+        <w:t>★★★</w:t>
       </w:r>
     </w:p>
     <w:p>
@@ -340,19 +325,8 @@
       </w:r>
     </w:p>
     <w:p>
-      <w:pPr>
-        <w:spacing w:before="160" w:after="160"/>
-        <w:jc w:val="center"/>
-      </w:pPr>
-      <w:r>
-        <w:rPr>
-          <w:b w:val="0"/>
-          <w:i w:val="0"/>
-          <w:color w:val="D4A017"/>
-          <w:sz w:val="22"/>
-          <w:rFonts w:ascii="FreeSans" w:hAnsi="FreeSans" w:cs="FreeSans"/>
-        </w:rPr>
-        <w:t>★  ★  ★</w:t>
+      <w:r>
+        <w:t>★★★</w:t>
       </w:r>
     </w:p>
     <w:p>
@@ -417,19 +391,8 @@
       </w:r>
     </w:p>
     <w:p>
-      <w:pPr>
-        <w:spacing w:before="160" w:after="160"/>
-        <w:jc w:val="center"/>
-      </w:pPr>
-      <w:r>
-        <w:rPr>
-          <w:b w:val="0"/>
-          <w:i w:val="0"/>
-          <w:color w:val="D4A017"/>
-          <w:sz w:val="22"/>
-          <w:rFonts w:ascii="FreeSans" w:hAnsi="FreeSans" w:cs="FreeSans"/>
-        </w:rPr>
-        <w:t>★  ★  ★</w:t>
+      <w:r>
+        <w:t>★★★</w:t>
       </w:r>
     </w:p>
     <w:p>
@@ -506,19 +469,8 @@
       </w:r>
     </w:p>
     <w:p>
-      <w:pPr>
-        <w:spacing w:before="160" w:after="160"/>
-        <w:jc w:val="center"/>
-      </w:pPr>
-      <w:r>
-        <w:rPr>
-          <w:b w:val="0"/>
-          <w:i w:val="0"/>
-          <w:color w:val="D4A017"/>
-          <w:sz w:val="22"/>
-          <w:rFonts w:ascii="FreeSans" w:hAnsi="FreeSans" w:cs="FreeSans"/>
-        </w:rPr>
-        <w:t>★  ★  ★</w:t>
+      <w:r>
+        <w:t>★★★</w:t>
       </w:r>
     </w:p>
     <w:p>
@@ -562,19 +514,8 @@
       </w:pPr>
     </w:p>
     <w:p>
-      <w:pPr>
-        <w:spacing w:before="160" w:after="160"/>
-        <w:jc w:val="center"/>
-      </w:pPr>
-      <w:r>
-        <w:rPr>
-          <w:b w:val="0"/>
-          <w:i w:val="0"/>
-          <w:color w:val="D4A017"/>
-          <w:sz w:val="22"/>
-          <w:rFonts w:ascii="FreeSans" w:hAnsi="FreeSans" w:cs="FreeSans"/>
-        </w:rPr>
-        <w:t>★  ★  ★</w:t>
+      <w:r>
+        <w:t>★★★</w:t>
       </w:r>
     </w:p>
     <w:p>
@@ -600,19 +541,8 @@
       </w:r>
     </w:p>
     <w:p>
-      <w:pPr>
-        <w:spacing w:before="160" w:after="160"/>
-        <w:jc w:val="center"/>
-      </w:pPr>
-      <w:r>
-        <w:rPr>
-          <w:b w:val="0"/>
-          <w:i w:val="0"/>
-          <w:color w:val="D4A017"/>
-          <w:sz w:val="22"/>
-          <w:rFonts w:ascii="FreeSans" w:hAnsi="FreeSans" w:cs="FreeSans"/>
-        </w:rPr>
-        <w:t>★  ★  ★</w:t>
+      <w:r>
+        <w:t>★★★</w:t>
       </w:r>
     </w:p>
     <w:p>
@@ -706,6 +636,11 @@
     <w:p>
       <w:r>
         <w:t>Plus à l'est, le sultanat du Bornou, héritier du Kanem, dure du IXe au XIXe siècle — un millénaire d'existence politique continue — et entretient des correspondances diplomatiques avec l'Égypte et l'Empire ottoman. En d'autres termes, les souverains sahéliens échangeaient des ambassades et des lettres officielles avec les grandes puissances de leur temps, en partenaires reconnus. Enfin, le califat de Sokoto (1804–1903), né de la révolution religieuse d'Ousmane dan Fodio, devient l'une des plus grandes entités politiques africaines de son siècle; il reste aujourd'hui un référent identitaire majeur pour les populations haoussa et peules.</w:t>
+      </w:r>
+    </w:p>
+    <w:p>
+      <w:r>
+        <w:t>---ENCADRE---</w:t>
       </w:r>
     </w:p>
     <w:tbl>
@@ -731,7 +666,7 @@
                 <w:color w:val="F5F0E8"/>
                 <w:sz w:val="18"/>
               </w:rPr>
-              <w:t>REPÈRES — LES GRANDS ÉTATS DU SAHEL PRÉCOLONIAL</w:t>
+              <w:t>LES GRANDS ÉTATS DU SAHEL PRÉCOLONIAL</w:t>
             </w:r>
           </w:p>
         </w:tc>
@@ -847,6 +782,11 @@
     </w:tbl>
     <w:p/>
     <w:p>
+      <w:r>
+        <w:t>---FIN---</w:t>
+      </w:r>
+    </w:p>
+    <w:p>
       <w:pPr>
         <w:pStyle w:val="Heading2"/>
       </w:pPr>
@@ -870,19 +810,8 @@
       </w:r>
     </w:p>
     <w:p>
-      <w:pPr>
-        <w:spacing w:before="160" w:after="160"/>
-        <w:jc w:val="center"/>
-      </w:pPr>
-      <w:r>
-        <w:rPr>
-          <w:b w:val="0"/>
-          <w:i w:val="0"/>
-          <w:color w:val="D4A017"/>
-          <w:sz w:val="22"/>
-          <w:rFonts w:ascii="FreeSans" w:hAnsi="FreeSans" w:cs="FreeSans"/>
-        </w:rPr>
-        <w:t>★  ★  ★</w:t>
+      <w:r>
+        <w:t>★★★</w:t>
       </w:r>
     </w:p>
     <w:p>
@@ -935,6 +864,11 @@
     <w:p>
       <w:r>
         <w:t>L'autre preuve est juridique. La Charte du Mandé — dite aussi Kouroukan Fouga, 1236 — est considérée comme l'une des premières déclarations de droits humains de l'histoire: elle proclame la sacralité de la vie humaine, l'égalité de tous, l'abolition de l'esclavage par réduction. Pour le dire simplement, ce texte interdit de réduire une personne libre en esclavage et affirme que toute vie en vaut une autre — plus de cinq siècles avant la Déclaration des droits de l'homme et du citoyen de 1789. Proclamée à l'avènement de Soundiata Keïta, transmise oralement par les griots de génération en génération, la Charte rappelle une évidence que l'idéologie coloniale a niée: la réflexion sur la dignité humaine n'a pas attendu l'Europe pour exister au Sahel.</w:t>
+      </w:r>
+    </w:p>
+    <w:p>
+      <w:r>
+        <w:t>---ENCADRE---</w:t>
       </w:r>
     </w:p>
     <w:tbl>
@@ -960,7 +894,7 @@
                 <w:color w:val="F5F0E8"/>
                 <w:sz w:val="18"/>
               </w:rPr>
-              <w:t>REPÈRES — CE QUE LE SAHEL A PRODUIT</w:t>
+              <w:t>CE QUE LE SAHEL A PRODUIT</w:t>
             </w:r>
           </w:p>
         </w:tc>
@@ -1040,6 +974,11 @@
     </w:tbl>
     <w:p/>
     <w:p>
+      <w:r>
+        <w:t>---FIN---</w:t>
+      </w:r>
+    </w:p>
+    <w:p>
       <w:pPr>
         <w:pStyle w:val="Heading2"/>
       </w:pPr>
@@ -1063,19 +1002,8 @@
       </w:r>
     </w:p>
     <w:p>
-      <w:pPr>
-        <w:spacing w:before="160" w:after="160"/>
-        <w:jc w:val="center"/>
-      </w:pPr>
-      <w:r>
-        <w:rPr>
-          <w:b w:val="0"/>
-          <w:i w:val="0"/>
-          <w:color w:val="D4A017"/>
-          <w:sz w:val="22"/>
-          <w:rFonts w:ascii="FreeSans" w:hAnsi="FreeSans" w:cs="FreeSans"/>
-        </w:rPr>
-        <w:t>★  ★  ★</w:t>
+      <w:r>
+        <w:t>★★★</w:t>
       </w:r>
     </w:p>
     <w:p>
@@ -1146,6 +1074,11 @@
     <w:p>
       <w:r>
         <w:t>Certains Africains ont vu le piège très tôt. Barthélémy Boganda, fondateur de la République centrafricaine — mort en 1959 dans un accident d'avion aux circonstances suspectées —, et Kwame Nkrumah, père de l'indépendance ghanéenne, mettaient en garde contre la même menace: des États micro-nationaux non viables, condamnés à la dépendance permanente, incapables de peser individuellement dans un système international construit contre eux. En d'autres termes, un État trop petit, enclavé, découpé sans logique économique, ne peut ni se défendre seul, ni négocier seul, ni se développer seul: il est structurellement condamné à chercher un protecteur — et le protecteur tout désigné sera l'ancien colonisateur. Berlin 1884-1885 avait fabriqué la condition de l'impossible souveraineté. Le destin des deux hommes ajoute à l'avertissement: Boganda meurt avant l'indépendance de son pays, dans des circonstances jamais pleinement élucidées, et Nkrumah, on le verra, sera renversé en 1966. Les fédérations qu'ils appelaient de leurs vœux ne verront pas le jour de leur vivant; il faudra attendre 2023 et la Charte du Liptako-Gourma pour qu'une réponse institutionnelle à ce morcellement émerge au Sahel — trois États nés du découpage de Berlin décidant, cent quarante ans plus tard, de mettre leurs souverainetés en commun.</w:t>
+      </w:r>
+    </w:p>
+    <w:p>
+      <w:r>
+        <w:t>---ENCADRE---</w:t>
       </w:r>
     </w:p>
     <w:tbl>
@@ -1171,7 +1104,7 @@
                 <w:color w:val="F5F0E8"/>
                 <w:sz w:val="18"/>
               </w:rPr>
-              <w:t>REPÈRES — BERLIN, 1884-1885</w:t>
+              <w:t>BERLIN, 1884-1885</w:t>
             </w:r>
           </w:p>
         </w:tc>
@@ -1251,6 +1184,11 @@
     </w:tbl>
     <w:p/>
     <w:p>
+      <w:r>
+        <w:t>---FIN---</w:t>
+      </w:r>
+    </w:p>
+    <w:p>
       <w:pPr>
         <w:pStyle w:val="Heading2"/>
       </w:pPr>
@@ -1274,19 +1212,8 @@
       </w:r>
     </w:p>
     <w:p>
-      <w:pPr>
-        <w:spacing w:before="160" w:after="160"/>
-        <w:jc w:val="center"/>
-      </w:pPr>
-      <w:r>
-        <w:rPr>
-          <w:b w:val="0"/>
-          <w:i w:val="0"/>
-          <w:color w:val="D4A017"/>
-          <w:sz w:val="22"/>
-          <w:rFonts w:ascii="FreeSans" w:hAnsi="FreeSans" w:cs="FreeSans"/>
-        </w:rPr>
-        <w:t>★  ★  ★</w:t>
+      <w:r>
+        <w:t>★★★</w:t>
       </w:r>
     </w:p>
     <w:p>
@@ -1344,6 +1271,11 @@
     <w:p>
       <w:r>
         <w:t>Babemba Traoré, roi du Kenédougou, dans l'actuel Mali, voit en 1898 les troupes françaises mettre le siège devant sa capitale, Sikasso, protégée par son célèbre tata — une muraille d'enceinte que l'artillerie finit par éventrer. Quand la chute devient inévitable, Babemba choisit de se donner la mort plutôt que de se rendre. Son geste restera, dans la mémoire malienne, comme la définition même du refus: on peut prendre la ville, pas le roi. Rabah Fadlallah conquiert le sultanat du Bornou et résiste à la pénétration française jusqu'en 1900, où il est vaincu et tué à la bataille de Kousseri, dans l'actuel Cameroun. Avant eux, El Hadj Omar Tall, fondateur de la théocratie toucouleur couvrant le Mali, la Guinée et le Sénégal actuels, avait mené au XIXe siècle la résistance islamique à la colonisation française, avant d'être acculé dans une grotte au nord du Mali, en 1864, où il disparaît.</w:t>
+      </w:r>
+    </w:p>
+    <w:p>
+      <w:r>
+        <w:t>---ENCADRE---</w:t>
       </w:r>
     </w:p>
     <w:tbl>
@@ -1369,7 +1301,7 @@
                 <w:color w:val="F5F0E8"/>
                 <w:sz w:val="18"/>
               </w:rPr>
-              <w:t>REPÈRES — LES FIGURES DE LA RÉSISTANCE SAHÉLIENNE</w:t>
+              <w:t>LES FIGURES DE LA RÉSISTANCE SAHÉLIENNE</w:t>
             </w:r>
           </w:p>
         </w:tc>
@@ -1467,6 +1399,11 @@
     </w:tbl>
     <w:p/>
     <w:p>
+      <w:r>
+        <w:t>---FIN---</w:t>
+      </w:r>
+    </w:p>
+    <w:p>
       <w:pPr>
         <w:pStyle w:val="Heading2"/>
       </w:pPr>
@@ -1508,19 +1445,8 @@
       </w:r>
     </w:p>
     <w:p>
-      <w:pPr>
-        <w:spacing w:before="160" w:after="160"/>
-        <w:jc w:val="center"/>
-      </w:pPr>
-      <w:r>
-        <w:rPr>
-          <w:b w:val="0"/>
-          <w:i w:val="0"/>
-          <w:color w:val="D4A017"/>
-          <w:sz w:val="22"/>
-          <w:rFonts w:ascii="FreeSans" w:hAnsi="FreeSans" w:cs="FreeSans"/>
-        </w:rPr>
-        <w:t>★  ★  ★</w:t>
+      <w:r>
+        <w:t>★★★</w:t>
       </w:r>
     </w:p>
     <w:p>
@@ -1564,19 +1490,8 @@
       </w:pPr>
     </w:p>
     <w:p>
-      <w:pPr>
-        <w:spacing w:before="160" w:after="160"/>
-        <w:jc w:val="center"/>
-      </w:pPr>
-      <w:r>
-        <w:rPr>
-          <w:b w:val="0"/>
-          <w:i w:val="0"/>
-          <w:color w:val="D4A017"/>
-          <w:sz w:val="22"/>
-          <w:rFonts w:ascii="FreeSans" w:hAnsi="FreeSans" w:cs="FreeSans"/>
-        </w:rPr>
-        <w:t>★  ★  ★</w:t>
+      <w:r>
+        <w:t>★★★</w:t>
       </w:r>
     </w:p>
     <w:p>
@@ -1600,19 +1515,8 @@
       </w:r>
     </w:p>
     <w:p>
-      <w:pPr>
-        <w:spacing w:before="160" w:after="160"/>
-        <w:jc w:val="center"/>
-      </w:pPr>
-      <w:r>
-        <w:rPr>
-          <w:b w:val="0"/>
-          <w:i w:val="0"/>
-          <w:color w:val="D4A017"/>
-          <w:sz w:val="22"/>
-          <w:rFonts w:ascii="FreeSans" w:hAnsi="FreeSans" w:cs="FreeSans"/>
-        </w:rPr>
-        <w:t>★  ★  ★</w:t>
+      <w:r>
+        <w:t>★★★</w:t>
       </w:r>
     </w:p>
     <w:p>
@@ -1752,6 +1656,11 @@
     <w:p>
       <w:r>
         <w:t>Quatre pionniers. Deux assassinés, deux renversés. Aucun n'a achevé son mandat. La leçon, elle, a été parfaitement reçue par les survivants.</w:t>
+      </w:r>
+    </w:p>
+    <w:p>
+      <w:r>
+        <w:t>---ENCADRE---</w:t>
       </w:r>
     </w:p>
     <w:tbl>
@@ -1777,7 +1686,7 @@
                 <w:color w:val="F5F0E8"/>
                 <w:sz w:val="18"/>
               </w:rPr>
-              <w:t>ENCADRÉ — LES INDÉPENDANCES ET LEUR BILAN, SOIXANTE ANS APRÈS</w:t>
+              <w:t>LES INDÉPENDANCES ET LEUR BILAN, SOIXANTE ANS APRÈS</w:t>
             </w:r>
           </w:p>
         </w:tc>
@@ -1839,6 +1748,11 @@
     </w:tbl>
     <w:p/>
     <w:p>
+      <w:r>
+        <w:t>---FIN---</w:t>
+      </w:r>
+    </w:p>
+    <w:p>
       <w:pPr>
         <w:pStyle w:val="Heading2"/>
       </w:pPr>
@@ -1858,23 +1772,26 @@
     </w:p>
     <w:p>
       <w:r>
+        <w:t>Le politologue camerounais Banda Kani — dont on retrouvera l'analyse au chapitre 14 — pousse la critique un cran plus loin: il conteste le mot même de « bilan». Dresser le bilan d'une présence, observe-t-il, suppose que cette présence ait pris fin — or « la première chose que révèle tout bilan honnête, c'est qu'il n'y a jamais eu de décolonisation». La France serait, à ses yeux, « le dernier empire colonial en plein XXIe siècle». Sa preuve tient dans un fait de langage que nul ne relève: la France est la seule ancienne puissance coloniale à revendiquer encore une « politique africaine». On n'entend ni la Belgique parler de sa « politique congolaise», ni l'Allemagne, le Portugal ou les Pays-Bas d'une « politique africaine» — ces puissances sont parties, et leur vocabulaire l'atteste. La persistance de l'expression, côté français, trahirait la persistance de la chose. De là sa thèse: toute analyse des rapports franco-africains qui escamote ce qu'il nomme « le contentieux de la décolonisation» — l'inachèvement délibéré de 1960 — cesse d'être une analyse pour devenir un prolongement du discours impérial (</w:t>
+      </w:r>
+      <w:r>
+        <w:rPr>
+          <w:i/>
+        </w:rPr>
+        <w:t>Parole panafricaniste</w:t>
+      </w:r>
+      <w:r>
+        <w:t>, Panafricanisme TV, 1ᵉʳ mars 2023).</w:t>
+      </w:r>
+    </w:p>
+    <w:p>
+      <w:r>
         <w:t>Reste à comprendre ce qui, exactement, a été verrouillé en 1960. Pour cela, il faut ouvrir les livres de comptes — car c'est dans les chiffres, bien plus que dans les discours, que le pacte colonial s'est camouflé.</w:t>
       </w:r>
     </w:p>
     <w:p>
-      <w:pPr>
-        <w:spacing w:before="160" w:after="160"/>
-        <w:jc w:val="center"/>
-      </w:pPr>
-      <w:r>
-        <w:rPr>
-          <w:b w:val="0"/>
-          <w:i w:val="0"/>
-          <w:color w:val="D4A017"/>
-          <w:sz w:val="22"/>
-          <w:rFonts w:ascii="FreeSans" w:hAnsi="FreeSans" w:cs="FreeSans"/>
-        </w:rPr>
-        <w:t>★  ★  ★</w:t>
+      <w:r>
+        <w:t>★★★</w:t>
       </w:r>
     </w:p>
     <w:p>
@@ -2009,6 +1926,11 @@
     <w:p>
       <w:r>
         <w:t>Et la machine se réalimente elle-même. Robert Bourgi, avocat franco-libanais et porteur de mallettes pour l'Élysée, raconte ses tournées chez Omar Bongo, Blaise Compaoré, Denis Sassou-Nguesso ou Mobutu, avec un message de Paris: contribuez à la campagne de « votre ami». « Jamais ça n'est descendu en dessous d'un million de dollars.» Pour la seule campagne de Jacques Chirac en 1995: au moins 100 millions de dollars. Laurent Gbagbo, à sa sortie de la CPI, admet avoir versé 3 millions d'euros à la demande de Chirac et de Villepin. Charles Pasqua, ancien ministre de l'Intérieur, reconnaît publiquement dans Le Parisien que Balladur voulait « couper les vivres aux socialistes» en remplaçant Le Floch-Prigent à la tête d'Elf. Le pétrole africain, acheté quatre dollars, finançait la démocratie française.</w:t>
+      </w:r>
+    </w:p>
+    <w:p>
+      <w:r>
+        <w:t>---ENCADRE---</w:t>
       </w:r>
     </w:p>
     <w:tbl>
@@ -2034,7 +1956,7 @@
                 <w:color w:val="F5F0E8"/>
                 <w:sz w:val="18"/>
               </w:rPr>
-              <w:t>ENCADRÉ — LE CIRCUIT DU PILLAGE, DE L'EXTRACTION AU FINANCEMENT POLITIQUE</w:t>
+              <w:t>LE CIRCUIT DU PILLAGE, DE L'EXTRACTION AU FINANCEMENT POLITIQUE</w:t>
             </w:r>
           </w:p>
         </w:tc>
@@ -2137,6 +2059,11 @@
       </w:r>
     </w:p>
     <w:p>
+      <w:r>
+        <w:t>---FIN---</w:t>
+      </w:r>
+    </w:p>
+    <w:p>
       <w:pPr>
         <w:pStyle w:val="Heading2"/>
       </w:pPr>
@@ -2160,19 +2087,8 @@
       </w:r>
     </w:p>
     <w:p>
-      <w:pPr>
-        <w:spacing w:before="160" w:after="160"/>
-        <w:jc w:val="center"/>
-      </w:pPr>
-      <w:r>
-        <w:rPr>
-          <w:b w:val="0"/>
-          <w:i w:val="0"/>
-          <w:color w:val="D4A017"/>
-          <w:sz w:val="22"/>
-          <w:rFonts w:ascii="FreeSans" w:hAnsi="FreeSans" w:cs="FreeSans"/>
-        </w:rPr>
-        <w:t>★  ★  ★</w:t>
+      <w:r>
+        <w:t>★★★</w:t>
       </w:r>
     </w:p>
     <w:p>
@@ -2251,6 +2167,11 @@
     <w:p>
       <w:r>
         <w:t>Concrètement, voici ce que cela signifie: quand le Niger vend son uranium ou le Mali son or à un acheteur étranger, les devises gagnées transitent par ce compte parisien. La France connaît ainsi, en temps réel, les flux d'exportation de chaque pays; elle peut bloquer des transactions; elle contrôle de fait la politique monétaire de nations théoriquement souveraines. Le taux de change est fixé par Paris. Les banques centrales africaines ont leur siège à Dakar ou à Yaoundé, mais leurs dirigeants sont systématiquement formés à Paris et orientés par Paris. Et l'ironie est complète, comme le relève le journaliste Albert Anatole Ayissi: « Même les migrants français en Afrique ne sont pas payés en franc CFA — ils le sont en euros.»</w:t>
+      </w:r>
+    </w:p>
+    <w:p>
+      <w:r>
+        <w:t>---ENCADRE---</w:t>
       </w:r>
     </w:p>
     <w:tbl>
@@ -2276,7 +2197,7 @@
                 <w:color w:val="F5F0E8"/>
                 <w:sz w:val="18"/>
               </w:rPr>
-              <w:t>ENCADRÉ — LE COMPTE D'OPÉRATIONS EN CLAIR</w:t>
+              <w:t>LE COMPTE D'OPÉRATIONS EN CLAIR</w:t>
             </w:r>
           </w:p>
         </w:tc>
@@ -2356,6 +2277,11 @@
     </w:tbl>
     <w:p/>
     <w:p>
+      <w:r>
+        <w:t>---FIN---</w:t>
+      </w:r>
+    </w:p>
+    <w:p>
       <w:pPr>
         <w:pStyle w:val="Heading2"/>
       </w:pPr>
@@ -2375,7 +2301,7 @@
     </w:p>
     <w:p>
       <w:r>
-        <w:t>Et quand on ne tue pas l'homme, on tue la monnaie. La Guinée de Sékou Touré, qui ose dire non en 1958, voit des avions déverser de la fausse monnaie sur son territoire pour torpiller sa devise naissante — une opération de déstabilisation attribuée aux services français de l'époque. Le franc malien, créé par Modibo Keïta en 1962, s'effondre en 1984 sous une spéculation systématique organisée depuis Paris, forçant Bamako à réintégrer la zone franc. Et en 1994, la dévaluation décidée à Paris ampute en une nuit le pouvoir d'achat de toute la zone — on a vu au chapitre précédent dans quelle séquence politique elle s'inscrivait. Le spectre de la déstabilisation monétaire n'est pas un fantasme: c'est une arme réelle, documentée, répétée.</w:t>
+        <w:t>Et quand on ne tue pas l'homme, on tue la monnaie. La Guinée de Sékou Touré offre le manuel de ces représailles. En votant «non» le 28 septembre 1958 et en prenant son indépendance dans la foulée — tout en souhaitant initialement rester dans la zone franc, refus que Paris oppose catégoriquement —, Conakry déclenche la machine secrète française. Le SDECE (futur DGSE) installe un quartier général à Dakar, avec des antennes à Tambacounda et à Abidjan; arme et entraîne des exilés guinéens; finance des insurrections; déploie un dispositif de propagande et deux complots planifiant l'élimination physique de Sékou Touré. La pièce maîtresse est monétaire: les presses du SDECE impriment des millions de faux francs guinéens pour inonder le pays et faire s'effondrer la jeune économie — méthode directement calquée sur l'opération nazie «Bernhard», qui avait visé l'Angleterre pendant la Seconde Guerre mondiale. L'opération porte le nom d'une lessive: «Persil». «Chaque fois qu'un président français déclare: "nous ne nous opposons pas à la fin du franc CFA — c'est aux Africains de décider", note Nathalie Yamb, je pense au général de Gaulle qui tenait exactement le même langage en 1958 avant d'orchestrer la destruction de la Guinée» (Yamb, 2021). Le franc malien, créé par Modibo Keïta en 1962, s'effondre en 1984 sous une spéculation systématique organisée depuis Paris, forçant Bamako à réintégrer la zone franc. Et en 1994, la dévaluation décidée à Paris ampute en une nuit le pouvoir d'achat de toute la zone — on a vu au chapitre précédent dans quelle séquence politique elle s'inscrivait. Le spectre de la déstabilisation monétaire n'est pas un fantasme: c'est une arme réelle, documentée, répétée.</w:t>
       </w:r>
     </w:p>
     <w:p>
@@ -2397,6 +2323,16 @@
       </w:r>
     </w:p>
     <w:p>
+      <w:r>
+        <w:t>La Guinée, souvent brandée comme l'argument décisif contre la souveraineté monétaire — «regardez où elle est, hors du CFA!» —, n'est pas l'exemple d'une monnaie souveraine qui aurait échoué seule. C'est l'exemple d'une économie sabotée méthodiquement dès sa naissance: faux billets du SDECE, exilés armés, insurrections financées, complots d'élimination du président, coffres de la BCEAO vidés le jour du référendum, francs CFA guinéens rendus non convertibles au Sénégal et au Mali. Comparer la Guinée à des économies souveraines non sabotées, c'est comparer une course libre à une course avec un coureur qui tire sur les chevilles du concurrent dès le coup de feu de départ.</w:t>
+      </w:r>
+    </w:p>
+    <w:p>
+      <w:r>
+        <w:t>Les chiffres de la Banque mondiale fournissent la preuve structurelle. Les dix plus grandes économies africaines en 2020 sont: Nigeria, Afrique du Sud, Égypte, Algérie, Maroc, Éthiopie, Kenya, Angola, Ghana, Tanzanie — pas un seul pays de la zone CFA. Les principaux partenaires commerciaux de la France en Afrique — Maroc, Algérie, Angola, Tunisie, Afrique du Sud, Nigeria, Kenya — n'y figurent pas davantage. La conclusion s'impose: avec ces pays, la France doit négocier d'égal à égal. Avec les pays de la zone CFA, elle se contente de prendre. «Nous sommes sa chose» (Yamb, ibid.).</w:t>
+      </w:r>
+    </w:p>
+    <w:p>
       <w:pPr>
         <w:pStyle w:val="Heading2"/>
       </w:pPr>
@@ -2415,19 +2351,8 @@
       </w:r>
     </w:p>
     <w:p>
-      <w:pPr>
-        <w:spacing w:before="160" w:after="160"/>
-        <w:jc w:val="center"/>
-      </w:pPr>
-      <w:r>
-        <w:rPr>
-          <w:b w:val="0"/>
-          <w:i w:val="0"/>
-          <w:color w:val="D4A017"/>
-          <w:sz w:val="22"/>
-          <w:rFonts w:ascii="FreeSans" w:hAnsi="FreeSans" w:cs="FreeSans"/>
-        </w:rPr>
-        <w:t>★  ★  ★</w:t>
+      <w:r>
+        <w:t>★★★</w:t>
       </w:r>
     </w:p>
     <w:p>
@@ -2511,6 +2436,11 @@
     <w:p>
       <w:r>
         <w:t>Et il y a le coût invisible. Quand l'ambassadeur Sylvain Itté ironisait sur les réseaux — « Arrêtez de boire l'eau à Niamey puisqu'elle est européenne» —, Franklin Nyamsi a décodé ce que la moquerie masquait: les nappes phréatiques d'Arlit sont polluées par les résidus des mines d'uranium, contamination documentée par Greenpeace dès 2010. Des Nigériens boivent une eau radioactive. Pendant ce temps, moins de 20 % de la population du pays a accès à l'électricité (Banque mondiale, 2022). La formule résume tout: le pays qui éclaire la France vit dans l'obscurité.</w:t>
+      </w:r>
+    </w:p>
+    <w:p>
+      <w:r>
+        <w:t>---ENCADRE---</w:t>
       </w:r>
     </w:p>
     <w:tbl>
@@ -2536,7 +2466,7 @@
                 <w:color w:val="F5F0E8"/>
                 <w:sz w:val="18"/>
               </w:rPr>
-              <w:t>ENCADRÉ — NIGER: L'INVENTAIRE D'UN PARADOXE</w:t>
+              <w:t>NIGER: L'INVENTAIRE D'UN PARADOXE</w:t>
             </w:r>
           </w:p>
         </w:tc>
@@ -2634,6 +2564,11 @@
     </w:tbl>
     <w:p/>
     <w:p>
+      <w:r>
+        <w:t>---FIN---</w:t>
+      </w:r>
+    </w:p>
+    <w:p>
       <w:pPr>
         <w:pStyle w:val="Heading2"/>
       </w:pPr>
@@ -2693,19 +2628,8 @@
       </w:r>
     </w:p>
     <w:p>
-      <w:pPr>
-        <w:spacing w:before="160" w:after="160"/>
-        <w:jc w:val="center"/>
-      </w:pPr>
-      <w:r>
-        <w:rPr>
-          <w:b w:val="0"/>
-          <w:i w:val="0"/>
-          <w:color w:val="D4A017"/>
-          <w:sz w:val="22"/>
-          <w:rFonts w:ascii="FreeSans" w:hAnsi="FreeSans" w:cs="FreeSans"/>
-        </w:rPr>
-        <w:t>★  ★  ★</w:t>
+      <w:r>
+        <w:t>★★★</w:t>
       </w:r>
     </w:p>
     <w:p>
@@ -2807,6 +2731,11 @@
     <w:p>
       <w:r>
         <w:t>La meilleure preuve que l'aide est un instrument politique? Sa courbe épouse exactement celle de l'obéissance.</w:t>
+      </w:r>
+    </w:p>
+    <w:p>
+      <w:r>
+        <w:t>---ENCADRE---</w:t>
       </w:r>
     </w:p>
     <w:tbl>
@@ -2832,7 +2761,7 @@
                 <w:color w:val="F5F0E8"/>
                 <w:sz w:val="18"/>
               </w:rPr>
-              <w:t>ENCADRÉ — AIDE FRANÇAISE AU MALI: CHRONOLOGIE D'UN CHANTAGE</w:t>
+              <w:t>AIDE FRANÇAISE AU MALI: CHRONOLOGIE D'UN CHANTAGE</w:t>
             </w:r>
           </w:p>
         </w:tc>
@@ -2949,6 +2878,11 @@
     <w:p/>
     <w:p>
       <w:r>
+        <w:t>---FIN---</w:t>
+      </w:r>
+    </w:p>
+    <w:p>
+      <w:r>
         <w:t>La Centrafrique illustre le mécanisme dans sa forme la plus crue. L'aide budgétaire internationale y représente, selon les années, 46 à 69 milliards de FCFA — jusqu'à 46 % du budget national (ministre des Finances Hervé Ndoba, 2022). Quand la France suspend son aide en 2021 pour forcer le départ de Wagner, elle pose explicitement trois conditions à la reprise: arrêt de la « désinformation», arrêt du « harcèlement des entreprises françaises», départ de Wagner (sources de l'ambassade de France à Bangui, Oubangui Médias, septembre 2021). Et la « désinformation», dans cette grammaire, se définit comme toute information défavorable aux intérêts français.</w:t>
       </w:r>
     </w:p>
@@ -3014,19 +2948,8 @@
       </w:r>
     </w:p>
     <w:p>
-      <w:pPr>
-        <w:spacing w:before="160" w:after="160"/>
-        <w:jc w:val="center"/>
-      </w:pPr>
-      <w:r>
-        <w:rPr>
-          <w:b w:val="0"/>
-          <w:i w:val="0"/>
-          <w:color w:val="D4A017"/>
-          <w:sz w:val="22"/>
-          <w:rFonts w:ascii="FreeSans" w:hAnsi="FreeSans" w:cs="FreeSans"/>
-        </w:rPr>
-        <w:t>★  ★  ★</w:t>
+      <w:r>
+        <w:t>★★★</w:t>
       </w:r>
     </w:p>
     <w:p>
@@ -3100,6 +3023,11 @@
     <w:p>
       <w:r>
         <w:t>Le Dr Yamb Ntimba a donné de ce système sa description la plus structurée: une pyramide de domination à cinq niveaux. Le niveau militaire garantit la cohérence de l'ensemble. Le niveau économique assure la captation. Le niveau informationnel fabrique le consentement. Le niveau culturel et médiatique structure les imaginaires. Et le niveau ontologique — le plus profond — installe la conviction de l'infériorité africaine dans les têtes africaines elles-mêmes. Concrètement, le niveau « ontologique» signifie ceci: quand un peuple a intégré qu'il est incapable de se gouverner, il n'a plus besoin d'être occupé — il s'occupe lui-même.</w:t>
+      </w:r>
+    </w:p>
+    <w:p>
+      <w:r>
+        <w:t>---ENCADRE---</w:t>
       </w:r>
     </w:p>
     <w:tbl>
@@ -3125,7 +3053,7 @@
                 <w:color w:val="F5F0E8"/>
                 <w:sz w:val="18"/>
               </w:rPr>
-              <w:t>ENCADRÉ — LA PYRAMIDE DE DOMINATION (DR YAMB NTIMBA)</w:t>
+              <w:t>LA PYRAMIDE DE DOMINATION (DR YAMB NTIMBA)</w:t>
             </w:r>
           </w:p>
         </w:tc>
@@ -3224,6 +3152,11 @@
     <w:p/>
     <w:p>
       <w:r>
+        <w:t>---FIN---</w:t>
+      </w:r>
+    </w:p>
+    <w:p>
+      <w:r>
         <w:t>Le point décisif de cette grille: le niveau militaire est le plus visible, mais le moins déterminant sur le long terme. C'est le sommet ontologique qui assure la résilience du système, même quand les armées sont expulsées. D'où l'importance des trois instruments qui suivent.</w:t>
       </w:r>
     </w:p>
@@ -3238,6 +3171,11 @@
     <w:p>
       <w:r>
         <w:t>Toute domination a besoin d'un vocabulaire, et celui de la Françafrique est sophistiqué: il nomme les choses à l'inverse de ce qu'elles sont. Cette inversion n'est pas un accident de langue. Elle est fonctionnelle: elle présente la domination comme de l'aide, l'exploitation comme du partenariat, la résistance comme de l'ingratitude.</w:t>
+      </w:r>
+    </w:p>
+    <w:p>
+      <w:r>
+        <w:t>---ENCADRE---</w:t>
       </w:r>
     </w:p>
     <w:tbl>
@@ -3263,7 +3201,7 @@
                 <w:color w:val="F5F0E8"/>
                 <w:sz w:val="18"/>
               </w:rPr>
-              <w:t>ENCADRÉ — DÉCONSTRUCTION DU LEXIQUE IMPÉRIAL</w:t>
+              <w:t>DÉCONSTRUCTION DU LEXIQUE IMPÉRIAL</w:t>
             </w:r>
           </w:p>
         </w:tc>
@@ -3380,6 +3318,11 @@
     <w:p/>
     <w:p>
       <w:r>
+        <w:t>---FIN---</w:t>
+      </w:r>
+    </w:p>
+    <w:p>
+      <w:r>
         <w:t>Le chercheur Mohamed Mahmoud Ould Mohamedou documente la même mécanique depuis le monde académique: les néologismes forgés pour qualifier le Sahel — « somalisation», « afghanisation», « Sahelistan», « Africanistan» — ne décrivent pas une réalité, ils la construisent. Ce lexique de l'échec structurel sert à installer l'idée qu'« une intervention est nécessaire» avant même que les faits ne la justifient (Mohamedou, La Découverte, 2013). Nathalie Yamb ajoute une observation d'archéologue du discours: l'Occident encourage les divisions en Afrique pendant qu'il sanctionne ceux qui veulent se séparer chez lui — Catalans, Bretons, Corses.</w:t>
       </w:r>
     </w:p>
@@ -3454,12 +3397,26 @@
     </w:p>
     <w:p>
       <w:r>
-        <w:t>Blaise Compaoré, ensuite: vingt-sept ans de pouvoir au Burkina Faso, l'assassinat de Sankara, un rôle de plaque tournante des groupes armés de la sous-région — avec le consentement de ses parrains, qui trouvaient dans cette instabilité calibrée la justification de leur présence militaire. Renversé par son peuple en 2014, exfiltré par la France vers Abidjan, condamné par contumace à la réclusion criminelle à perpétuité par le tribunal militaire de Ouagadougou pour l'assassinat de Sankara. Il vit toujours à Abidjan, protégé.</w:t>
-      </w:r>
-    </w:p>
-    <w:p>
-      <w:r>
-        <w:t>Alassane Ouattara, enfin — le cas le plus instructif, parce qu'il est en cours. Ancien directeur du département Afrique du FMI, il fut l'architecte institutionnel des plans d'ajustement structurel imposés au continent — ces programmes dont on a vu la mécanique au chapitre 9. Porté au pouvoir en 2011 grâce à la rébellion de Guillaume Soro et à l'intervention française, il condamne dix ans plus tard ce même Soro à vingt ans de prison pour les actes qu'il avait lui-même commandités. La France ne lève pas le petit doigt. Mabiala en tire la loi: « L'Empire n'a pas de mémoire pour ses valets. Il n'a que des intérêts.» L'Occident utilise, puis jette.</w:t>
+        <w:t>Blaise Compaoré, ensuite: vingt-sept ans de pouvoir au Burkina Faso, l'assassinat de Sankara, un rôle de plaque tournante des groupes armés de la sous-région — avec le consentement de ses parrains, qui trouvaient dans cette instabilité calibrée la justification de leur présence militaire. La séquence qui mène à la mort de Sankara est bien balisée: au sommet de l'UA à Addis-Abeba, le 29 juillet 1987, il avait mis en cause l'ordre colonial de la dette — «si nous ne payons pas, nos prêteurs ne mourront pas; si nous payons, c'est nous qui allons mourir» — et Mitterrand, qui ne lui pardonnait pas ce qu'il appelait son «impertinence» depuis sa visite à Ouagadougou en 1986, n'intervient pas pour le protéger. Trois mois après ce discours, Sankara était assassiné, Compaoré au pouvoir. Renversé par son peuple en 2014, exfiltré par la France vers Abidjan, condamné par contumace à la réclusion criminelle à perpétuité par le tribunal militaire de Ouagadougou pour l'assassinat de Sankara. Il vit toujours à Abidjan, protégé.</w:t>
+      </w:r>
+    </w:p>
+    <w:p>
+      <w:r>
+        <w:t>Alassane Ouattara, enfin — le cas le plus instructif, parce qu'il est en cours. Ancien directeur du département Afrique du FMI, il fut l'architecte institutionnel des plans d'ajustement structurel imposés au continent — ces programmes dont on a vu la mécanique au chapitre 9. Porté au pouvoir en 2011 grâce à la rébellion de Guillaume Soro et à l'intervention française, il condamne dix ans plus tard ce même Soro à vingt ans de prison pour les actes qu'il avait lui-même commandités. La France ne lève pas le petit doigt. Pour comprendre l'acharnement de Paris à installer Ouattara, il faut revenir à 2000: Mamadou Koulibaly, alors ministre des Finances de Côte d'Ivoire sous Gbagbo, était devenu le tout premier ministre en exercice de la zone CFA à annoncer publiquement une sortie du franc. Premier PIB de la zone — la Côte d'Ivoire en dehors du CFA était inacceptable pour Chirac. Koulibaly fut muté à l'Assemblée nationale, où il paraissait moins dangereux. Et selon l'analyse de Yamb, c'est pour définitivement écarter cette menace monétaire que la France soutint la rébellion de Guillaume Soro depuis au moins 2002, avant que le bombardement de Bouaké — 6 novembre 2004, neuf soldats français tués — lui fournisse le prétexte légal pour détruire toute la flotte aérienne ivoirienne qui venait de mettre en déroute cette rébellion. Le terrain fut ainsi préparé pour l'installation d'Ouattara et le maintien de la Côte d'Ivoire dans l'orbite du franc (Yamb, 2021). Mabiala en tire la loi: « L'Empire n'a pas de mémoire pour ses valets. Il n'a que des intérêts.» L'Occident utilise, puis jette.</w:t>
+      </w:r>
+    </w:p>
+    <w:p>
+      <w:r>
+        <w:t>Le cas gabonais illustre la capacité du système à se régénérer par lui-même, y compris à travers les coups d'État. Le général Brice Oligui Nguema a renversé Ali Bongo en août 2023 avec un discours de rupture; mais selon l'analyse de Jean-Paul Bec, professeur de sciences politiques, «le Gabon est actuellement un laboratoire pour la déstabilisation du point de vue stratégique — on fabrique un homme, on lui donne des idées qui ressemblent à celles des panafricanistes, on lui dit: "Tu vas dire ça mais ne fais pas ça"» (</w:t>
+      </w:r>
+      <w:r>
+        <w:rPr>
+          <w:i/>
+        </w:rPr>
+        <w:t>Festin Panafricain</w:t>
+      </w:r>
+      <w:r>
+        <w:t>, 2024). La preuve en actes: après l'annulation du contrat de pêche gabonais avec l'Union européenne — geste présenté comme un acte souverain —, le contrat a été réattribué à la France à cent pour cent, dans le même schéma que celui documenté au Sénégal (Faudé, ibid.). «Vous ne pouvez pas chasser la famille Bongo et maintenir le système», résume un intervenant de ce débat. Ce que cette séquence révèle n'est pas nouveau dans sa logique — c'est la loi de Mabiala appliquée aux transitions militaires: quand le valet tombe, l'Empire installe le suivant. Le critère de continuité n'est pas dynastique; il est systémique.</w:t>
       </w:r>
     </w:p>
     <w:p>
@@ -3472,47 +3429,47 @@
     </w:p>
     <w:p>
       <w:r>
-        <w:t>L'empire n'a pas de mémoire pour ses valets — mais ses valets ont des hôtels particuliers. Les «biens mal acquis» sont la face visible du contrat compradore: des biens acquis en France — immobilier, voitures de luxe, comptes bancaires — par des dirigeants africains et leur entourage, au moyen de fonds publics détournés dans leur pays d'origine et blanchis sur le territoire français.</w:t>
-      </w:r>
-    </w:p>
-    <w:p>
-      <w:r>
-        <w:t>En 2008, la justice française ouvre une information judiciaire sur les avoirs détenus en France par trois chefs d'État africains, pivots de l'influence française sur le continent: Omar Bongo (Gabon, au pouvoir depuis quarante ans), Denis Sassou-Nguesso (Congo-Brazzaville) et Teodorin Obiang (vice-président de Guinée équatoriale). La juge d'instruction donne suite à une plainte déposée par Transparency International France et l'association Sherpa — après que le parquet de Paris avait classé le dossier sans suite à deux reprises, illustrant à lui seul la perméabilité de l'institution judiciaire française aux pressions diplomatiques. Les biens documentés ne souffrent guère d'interprétation: pour Bongo, un hôtel particulier et quatre appartements dans le 16e arrondissement de Paris; pour Sassou-Nguesso, un hôtel particulier de 700 m² estimé à 10 millions d'euros dans les Yvelines et un appartement dans le 7e arrondissement. «Tout ça, il l'a payé avec son salaire de chef d'État africain?» («Face à Face», TV débat, v. 2008).</w:t>
-      </w:r>
-    </w:p>
-    <w:p>
-      <w:r>
-        <w:t>Les montants parlent d'eux-mêmes: pour la seule Guinée équatoriale, les avoirs saisis à l'issue des procédures contre Teodorin Obiang sont évalués à environ 150 millions d'euros — une somme qui aurait permis de vacciner trois fois la population du pays. En comptant les plus de vingt affaires actives en France, les ordres de grandeur dépassent les centaines de millions d'euros. Ce n'est pas de la corruption marginale: c'est un régime de captation systémique, où les élites compradores placent en France le produit de l'extraction africaine — reproduisant, à leur échelle, le mécanisme de sortie de capitaux documenté au chapitre 7 pour le franc CFA.</w:t>
-      </w:r>
-    </w:p>
-    <w:p>
-      <w:r>
-        <w:t>L'enquête qui aboutira à la première condamnation de cette série mérite d'être racontée depuis l'intérieur — car elle révèle autant sur les mécanismes du blanchiment que sur la difficulté de les démonter. Le commandant Jean-Philippe, de la Direction centrale de la police judiciaire (service anti-blanchiment), en est le directeur d'enquête depuis janvier 2011, après que la Cour de cassation — contre l'avis du parquet de Paris — a donné raison aux associations et imposé l'ouverture d'une information judiciaire. L'enquête remonte dix ans en arrière: train de vie «en totale inadéquation avec ses revenus officiels», Ferrari, Bentley, Bugatti Veyron, objets d'art acquis chez Christie's, mobilier acheté chez les antiquaires de la place de Paris. Ce qui frappe l'enquêteur, c'est le mécanisme de financement: «C'est pas forcément monsieur Obiang qui finance directement — c'était souvent par des sociétés qui apparaissaient, qui n'avaient aucune logique économique: des sociétés d'exploitation de bois, de BTP, qui payaient pour son compte» («Police, le podcast», 2024). Sociétés écrans sans activité réelle, domiciliées dans des paradis fiscaux — c'est la chaîne complète du blanchiment, du pétrole équato-guinéen aux antiquaires parisiens. Le 4 février 2012, une cinquantaine de policiers investissent le 42 avenue Foch: un hôtel particulier de 3 000 m² avec discothèque, salon de coiffure et salle de musculation. Quatre à cinq jours de perquisition, presque 1 000 objets saisis. «On se disait avec notre petite liste qu'on allait en saisir un peu. Et là, des objets partout — impossible à identifier. On a pris tout.» Au total, environ 200 millions d'euros de biens saisis: hôtel particulier, voitures et biens meubles. L'affaire a aussi une dimension internationale: aux États-Unis, propriété à Malibu et objets de Michael Jackson exportés illégalement (ce qui vaut l'intérêt direct du Department of Justice américain); au Brésil, propriétés à Rio et dépenses au carnaval. L'enquête policière s'achève vers 2015-2016; le jugement définitif intervient en 2019: deux ans avec sursis. «Anecdotique comme peine, dit Jean-Philippe, mais c'était surtout la confirmation de tout ce qu'on avait saisi. C'était la première. Si ça avait été négatif, les autres enquêtes auraient eu un peu dans l'aile.» Première enquête, premier jugement, premier précédent: posé.</w:t>
-      </w:r>
-    </w:p>
-    <w:p>
-      <w:r>
-        <w:t>La réponse équato-guinéenne ne passe pas que par les avocats. À Malabo, des militants pro-Obiang ont marché sous la pluie jusqu'aux grilles de l'ambassade de France, remettant à l'ambassadeur une lettre de protestation: «Il n'y a aucune institution équato-guinéenne qui a porté plainte contre ce monsieur — alors de quoi la justice française se permet-elle de juger un vice-président en fonction?» (reportage télévisé, Malabo). À Paris, dans la chambre des criées, les avocats de la défense ont tenté de suspendre la procédure: «On n'attaque pas un vice-président en fonction. La finalité de tout cela est la déstabilisation du régime.» L'argument de l'immunité ratione personae — qui protège en droit international les hauts responsables gouvernementaux en exercice — est le plus juridiquement sérieux et reste objet de débat. Mais l'argument le plus révélateur des logiques en présence est un autre: «Il ne faut pas rendre cet argent à la République tant que les dirigeants politiques sont en place.» Retraduit: les avocats de la défense s'opposent, au nom de leur client, à la restitution de l'argent au peuple équato-guinéen — parce que ce retour bénéficierait précisément à l'État dont leur client est vice-président. Les caisses de l'État sont vides parce que le vice-président les a vidées; restituer à l'État, c'est restituer à ceux qui ont volé. La contradiction est totale — et instructive. Le tribunal a refusé le renvoi: le procès a duré jusqu'au 6 juillet. Patrimoine documenté et confirmé à l'audience: plus de 100 millions d'euros.</w:t>
-      </w:r>
-    </w:p>
-    <w:p>
-      <w:r>
-        <w:t>Mais la véritable portée de ces affaires tient dans ce que la juriste Perdriel Vissière (Sherpa) nomme «dénoncer un système». Car le système a deux faces, et les plaignants le savent: «La corruption a un corrupteur ET un corruptible.» La France est nommée des deux côtés du guichet. La banque FIBA drainait, selon les enquêteurs, l'argent de Bongo et de Chirac; elle a disparu avec ses fonds peu après les premières dénonciations d'Eva Joly. Les diamants de Bokassa, acceptés par Giscard d'Estaing, n'ont jamais fait l'objet de poursuites françaises. Bongo aurait financé des campagnes électorales françaises — nommément, selon le journaliste Camara (UIJA). Areva est pointée comme corrupteur au Niger, en miroir des chefs d'État ciblés. Transparency International France épingle elle-même la France dans ses rapports annuels sur la corruption des entreprises.</w:t>
-      </w:r>
-    </w:p>
-    <w:p>
-      <w:r>
-        <w:t>Cette réciprocité n'invalide pas les procédures. Elle les élargit — et fait de la réponse de Paris un indicateur politique autant que judiciaire. Sarkozy avait proclamé la «rupture avec la Françafrique»; mais son gouvernement avait écarté Jean-Marie Bockel du moment où celui-ci avait demandé «l'acte de décès de la Françafrique». La juge d'instruction peut être indépendante; les parquets restent exposés à la pression diplomatique — dont tous les acteurs du débat reconnaissent l'existence. La leçon est structurelle: la Françafrique produit non seulement des compradore qui pillent leur peuple, mais aussi des circuits financiers franco-africains qui couvrent les deux partis, et une inertie judiciaire calibrée par les intérêts des États.</w:t>
-      </w:r>
-    </w:p>
-    <w:p>
-      <w:r>
-        <w:t>La leçon la plus durable des procédures «biens mal acquis» n'est donc pas judiciaire: c'est le principe, arraché après des années de plaidoyer, que les avoirs confisqués doivent revenir aux populations d'origine. Avant l'adoption du mécanisme légal — inscrit dans la loi «développement solidaire et lutte contre les inégalités mondiales», puis précisé par la circulaire du 22 novembre 2022 qui permet explicitement de restituer biens et recettes aux populations des États étrangers concernés —, ces biens tombaient dans le budget général de l'État français: de l'argent volé en Afrique, retenu en France. La restitution elle-même exige des garanties: là où la société civile du pays d'origine a été écartée du processus — Suisse, États-Unis, Royaume-Uni l'ont montré —, l'argent réapparaît dans les mains de ceux qui l'avaient détourné. Restituer sans démocratiser, c'est boucler la boucle.</w:t>
-      </w:r>
-    </w:p>
-    <w:p>
-      <w:r>
-        <w:t>Les militants anticorruption gabonais qui travaillaient avec Sherpa avaient été arrêtés illégalement en décembre 2008. L'empire protège ses valets — jusqu'à ce qu'ils ne servent plus. Omar Bongo lui-même était, selon l'analyste Camara, «victime de la mafia financière française — ET coupable». Les deux ne s'excluent pas: le comprador protège l'empire, l'empire protège le comprador, jusqu'au moment où la juge d'instruction trouve son chemin. Ce que Mobutu, Bongo et les autres n'avaient pas prévu, c'est que les tribunaux français pouvaient, un jour, leur survivre.</w:t>
+        <w:t>La décision de la Cour de cassation, en 2010, est surprenante — «aussi bien sur la question de principe que sur la question de forme», comme le note François Ndengwe, fondateur de l'African Advisory Board (Opinion, France 24, 2010). Surprenante d'abord parce qu'elle reconnaît à Transparency International France — une organisation qui n'est pas victime directe — la qualité à agir en justice contre des dirigeants qui «ont surtout des comptes à rendre à leurs citoyens et à leur continent». Surprenante ensuite parce que la Cour infirme deux refus successifs du parquet de Paris, illustrant la perméabilité de l'institution judiciaire française aux pressions diplomatiques. Ce que la Cour tranche, en définitive, c'est une question de compétence: les biens acquis en France relèvent du droit français — et c'est précisément là que se trouve le patrimoine.</w:t>
+      </w:r>
+    </w:p>
+    <w:p>
+      <w:r>
+        <w:t>Car le patrimoine existe. Les «biens mal acquis» sont la face visible du contrat compradore: immobilier, voitures de luxe, comptes bancaires détenus en France par des dirigeants africains et leurs proches, financés — selon les enquêteurs — par des fonds publics tirés directement sur les trésors de leurs pays. Omar Bongo (Gabon), Denis Sassou-Nguesso (Congo-Brazzaville) et Teodorin Obiang (Guinée équatoriale) en sont les figures emblématiques. Bongo: un hôtel particulier et quatre appartements dans le 16e arrondissement. Sassou-Nguesso: un hôtel particulier de 700 m² dans les Yvelines, estimé à 10 millions d'euros. Et Obiang — dont l'enquête aboutit à la première condamnation de la série — laisse derrière lui, avenue Foch, un hôtel particulier de 3 000 m² avec discothèque, salon de coiffure et salle de musculation: Ferrari, Bentley, Bugatti Veyron, objets d'art acquis chez Christie's, mobilier d'antiquaires parisiens. Patrimoine documenté et confirmé à l'audience: plus de 200 millions d'euros.</w:t>
+      </w:r>
+    </w:p>
+    <w:p>
+      <w:r>
+        <w:t>L'enquête conduite par le commandant Jean-Philippe, de la Direction centrale de la police judiciaire (service anti-blanchiment), révèle la mécanique du financement. Ce ne sont pas des virements depuis un compte personnel: «C'était souvent par des sociétés qui apparaissaient, qui n'avaient aucune logique économique — des sociétés d'exploitation de bois, de BTP — qui payaient pour son compte» («Police, le podcast», 2024). Sociétés-écrans sans activité réelle, domiciliées dans des paradis fiscaux: la chaîne complète du blanchiment, du pétrole équato-guinéen aux antiquaires de la place de Paris. Le 4 février 2012, une cinquantaine de policiers investissent l'avenue Foch. «On se disait avec notre petite liste qu'on allait en saisir un peu. Et là, des objets partout — impossible à identifier. On a pris tout.» Jugement définitif en 2019: deux ans avec sursis. «Anecdotique comme peine, dit Jean-Philippe, mais c'était surtout la confirmation de tout ce qu'on avait saisi. C'était la première. Si ça avait été négatif, les autres enquêtes auraient eu du plomb dans l'aile.» Première enquête, premier jugement, premier précédent: posé.</w:t>
+      </w:r>
+    </w:p>
+    <w:p>
+      <w:r>
+        <w:t>Mais la procédure ne doit pas masquer la disproportion. François Ndengwe la pose en termes arithmétiques: les trois patrimoines cumulés représentent environ 160 millions d'euros. Or les réserves de change des pays de la zone CFA — dont le Mali, le Niger, le Congo-Brazzaville et le Gabon — sont déposées au Trésor français. Non pas pour quelques dizaines de millions: pour des milliards, immobilisés là depuis l'indépendance. «Pour des biens mal acquis, il faudrait d'abord que Transparency enquête sur pourquoi des pays, 50 ans après leur indépendance, ont leurs réserves détenues par le Trésor français — ça, ce serait un sujet sérieux» (Ndengwe, ibid.). La même organisation qui épingle des dirigeants africains pour des centaines de millions s'abstient de produire une plainte pour les milliards que la mécanique du franc CFA extrait du continent chaque décennie (chapitre 7).</w:t>
+      </w:r>
+    </w:p>
+    <w:p>
+      <w:r>
+        <w:t>La disproportion est plus profonde encore. Global Financial Integrity estime que de 1970 à 2008, l'Afrique a perdu près de 1 800 milliards de dollars par des transferts illicites de capitaux — essentiellement des entreprises pétrolières et minières opérant depuis la France, les États-Unis et le Royaume-Uni, via des prix de transfert minorés et des montages d'optimisation fiscale. Au Niger, Areva est pointée comme corrupteur. En France même, jusqu'aux années 1990-2000, les versements de corruption à l'étranger étaient fiscalement déductibles: pendant trente ans, les entreprises françaises pouvaient légalement aller soudoyer, puis déclarer la dépense au fisc. «C'est comme ça qu'on a créé les conditions de la corruption en Afrique» (Ndengwe, ibid.). La corruption n'est pas une pathologie africaine importée en France: c'est un système exporté de France vers l'Afrique, puis réimporté sous forme de patrimoine parisien. La banque FIBA drainait, selon les enquêteurs, l'argent de Bongo et de Chirac; elle a disparu avec ses fonds peu après les premières dénonciations d'Eva Joly. Les diamants de Bokassa, acceptés par Giscard d'Estaing, n'ont jamais fait l'objet de poursuites françaises.</w:t>
+      </w:r>
+    </w:p>
+    <w:p>
+      <w:r>
+        <w:t>Catherine Pierce, administratrice de Transparency International France, n'esquive pas la critique — elle en change le périmètre: «Nous n'attaquons pas le comportement des chefs d'État africains dans leur pays; nous laissons cela à la justice de leur pays. Ce que nous ne voulons pas, c'est que la France soit le refuge de biens détournés» (Opinion, France 24, 2010). L'argument est précis: l'ensemble du patrimoine ciblé est en France, acquis en France. Les deux plaintes — contre les avoirs parisiens et contre l'extraction par les multinationales — ne sont pas exclusives; elles documentent deux facettes du même mécanisme. Ce que Transparency pointe, c'est le bout de la chaîne visible depuis Paris.</w:t>
+      </w:r>
+    </w:p>
+    <w:p>
+      <w:r>
+        <w:t>La défense des prévenus révèle une contradiction structurelle. À Malabo, des militants pro-Obiang ont marché jusqu'aux grilles de l'ambassade de France: «Il n'y a aucune institution équato-guinéenne qui a porté plainte contre ce monsieur — de quoi la justice française se permet-elle de juger un vice-président en fonction?» (reportage télévisé, Malabo). À Paris, les avocats de la défense invoquent l'immunité ratione personae — juridiquement sérieuse — et la déstabilisation politique. Mais l'argument le plus révélateur est celui-ci: «Il ne faut pas rendre cet argent à la République tant que les dirigeants politiques sont en place.» Retraduit: les avocats s'opposent, au nom de leur client, à la restitution au peuple équato-guinéen — parce que ce retour bénéficierait précisément à l'État dont leur client est vice-président. Les caisses sont vides parce que le vice-président les a vidées; restituer à l'État, c'est restituer à ceux qui ont volé. La contradiction est totale — et instructive.</w:t>
+      </w:r>
+    </w:p>
+    <w:p>
+      <w:r>
+        <w:t>La leçon la plus durable de ces procédures n'est pas judiciaire: c'est le principe, arraché après des années de plaidoyer, que les avoirs confisqués reviennent aux populations d'origine. Avant la loi «développement solidaire» et la circulaire du 22 novembre 2022 — qui permet explicitement de restituer biens et recettes aux populations des États étrangers concernés —, ces avoirs tombaient dans le budget général français: argent volé en Afrique, retenu en France. La restitution elle-même exige des garanties: là où la société civile locale a été écartée du processus — Suisse, États-Unis, Royaume-Uni l'ont montré —, l'argent réapparaît dans les mains de ceux qui l'avaient détourné. Restituer sans démocratiser, c'est boucler la boucle.</w:t>
+      </w:r>
+    </w:p>
+    <w:p>
+      <w:r>
+        <w:t>Ce que les procédures «biens mal acquis» éclairent, en définitive, c'est l'anatomie d'un système à double face. Les compradores pillent leur peuple; la France abrite le produit du pillage, fournit les banques, les avocats, les antiquaires et les notaires. Sarkozy avait proclamé la «rupture avec la Françafrique»; mais son gouvernement avait écarté Jean-Marie Bockel dès l'instant où celui-ci avait demandé «l'acte de décès de la Françafrique». La juge d'instruction peut être indépendante; les parquets restent exposés à la pression diplomatique — dont tous les acteurs du débat reconnaissent l'existence. Omar Bongo était, selon l'analyste Camara, «victime de la mafia financière française — ET coupable» (UIJA). Les deux ne s'excluent pas: l'empire protège ses valets jusqu'au moment où la juge d'instruction trouve son chemin. Ce que Bongo, Mobutu et les autres n'avaient pas prévu, c'est que les tribunaux français pouvaient, un jour, leur survivre.</w:t>
       </w:r>
     </w:p>
     <w:p>
@@ -3544,19 +3501,8 @@
       </w:r>
     </w:p>
     <w:p>
-      <w:pPr>
-        <w:spacing w:before="160" w:after="160"/>
-        <w:jc w:val="center"/>
-      </w:pPr>
-      <w:r>
-        <w:rPr>
-          <w:b w:val="0"/>
-          <w:i w:val="0"/>
-          <w:color w:val="D4A017"/>
-          <w:sz w:val="22"/>
-          <w:rFonts w:ascii="FreeSans" w:hAnsi="FreeSans" w:cs="FreeSans"/>
-        </w:rPr>
-        <w:t>★  ★  ★</w:t>
+      <w:r>
+        <w:t>★★★</w:t>
       </w:r>
     </w:p>
     <w:p>
@@ -3600,19 +3546,8 @@
       </w:pPr>
     </w:p>
     <w:p>
-      <w:pPr>
-        <w:spacing w:before="160" w:after="160"/>
-        <w:jc w:val="center"/>
-      </w:pPr>
-      <w:r>
-        <w:rPr>
-          <w:b w:val="0"/>
-          <w:i w:val="0"/>
-          <w:color w:val="D4A017"/>
-          <w:sz w:val="22"/>
-          <w:rFonts w:ascii="FreeSans" w:hAnsi="FreeSans" w:cs="FreeSans"/>
-        </w:rPr>
-        <w:t>★  ★  ★</w:t>
+      <w:r>
+        <w:t>★★★</w:t>
       </w:r>
     </w:p>
     <w:p>
@@ -3621,19 +3556,8 @@
       </w:r>
     </w:p>
     <w:p>
-      <w:pPr>
-        <w:spacing w:before="160" w:after="160"/>
-        <w:jc w:val="center"/>
-      </w:pPr>
-      <w:r>
-        <w:rPr>
-          <w:b w:val="0"/>
-          <w:i w:val="0"/>
-          <w:color w:val="D4A017"/>
-          <w:sz w:val="22"/>
-          <w:rFonts w:ascii="FreeSans" w:hAnsi="FreeSans" w:cs="FreeSans"/>
-        </w:rPr>
-        <w:t>★  ★  ★</w:t>
+      <w:r>
+        <w:t>★★★</w:t>
       </w:r>
     </w:p>
     <w:p>
@@ -3653,6 +3577,23 @@
       </w:r>
     </w:p>
     <w:p>
+      <w:pPr>
+        <w:spacing w:before="40" w:after="120"/>
+        <w:ind w:left="567"/>
+        <w:pBdr>
+          <w:left w:val="single" w:sz="18" w:space="8" w:color="D4A017"/>
+        </w:pBdr>
+      </w:pPr>
+      <w:r>
+        <w:rPr>
+          <w:i/>
+          <w:color w:val="8B1A1A"/>
+          <w:sz w:val="20"/>
+        </w:rPr>
+        <w:t>« Il est des cycles inévitables dans l'histoire sociale: c'est désormais au tour de la race noire de prévaloir dans le monde.» — Mouammar Kadhafi</w:t>
+      </w:r>
+    </w:p>
+    <w:p>
       <w:r>
         <w:t>Syrte, 20 octobre 2011. Un convoi de véhicules tente de fuir la ville assiégée. Des avions de l'OTAN le frappent. Dans la confusion qui suit, un homme de soixante-neuf ans est extrait d'une canalisation de drainage où il s'était réfugié, lynché, puis exécuté par des combattants qui filment la scène avec leurs téléphones. Les images font le tour du monde en quelques heures. Mouammar Kadhafi, qui avait dirigé la Libye pendant quarante-deux ans, meurt dans la poussière, sous l'objectif des caméras. Ce jour-là, peu d'observateurs comprennent que ce n'est pas seulement le guide qui disparaît. C'est un verrou qui saute. Et derrière ce verrou, il y a le Sahel.</w:t>
       </w:r>
@@ -3662,17 +3603,192 @@
         <w:pStyle w:val="Heading2"/>
       </w:pPr>
       <w:r>
-        <w:t>Un personnage double</w:t>
-      </w:r>
-    </w:p>
-    <w:p>
-      <w:r>
-        <w:t>Soyons honnêtes d'emblée: Kadhafi n'était pas un saint.</w:t>
-      </w:r>
-    </w:p>
-    <w:p>
-      <w:r>
-        <w:t>L'homme avait une autre face, que le récit occidental a soigneusement gommée: il était devenu, dans les années 2000, le principal financier et l'un des architectes du projet panafricain. C'est au sommet de Syrte, en septembre 1999, qu'est lancée la dynamique qui aboutira à la transformation de l'Organisation de l'unité africaine en Union africaine. C'est la Libye qui comblait une part substantielle du budget de l'organisation continentale, ainsi que les cotisations de plusieurs États membres trop pauvres pour les payer.</w:t>
+        <w:t>L'enfant du désert</w:t>
+      </w:r>
+    </w:p>
+    <w:p>
+      <w:r>
+        <w:t xml:space="preserve">Soyons honnêtes d'emblée: Kadhafi n'était pas un saint. Sur le plan intérieur, l'homme fut autoritaire, imprévisible, parfois brutal; il se méfiait des intellectuels et tolérait mal la contradiction. Mais réduire quarante-deux ans de pouvoir à cette seule face, c'est manquer ce qui fait de sa mort un tournant pour le continent. Pour saisir l'autre Kadhafi — celui que le récit occidental a soigneusement gommé —, le meilleur guide est sans doute le politologue camerounais Jean-Emmanuel Pondi, spécialiste des relations internationales, qui lui a consacré un essai au titre programmatique: </w:t>
+      </w:r>
+      <w:r>
+        <w:rPr>
+          <w:i/>
+        </w:rPr>
+        <w:t>Vie et mort de Mouammar Kadhafi: quelle leçon pour l'Afrique</w:t>
+      </w:r>
+      <w:r>
+        <w:t xml:space="preserve"> (Éditions Afrédit). On suivra ici son fil.</w:t>
+      </w:r>
+    </w:p>
+    <w:p>
+      <w:r>
+        <w:t>Kadhafi naît au début des années 1940, au moment où la Libye est bombardée par les puissances alliées — un monde en ébullition dont l'enfant retient surtout qu'on tire de partout. Il est le premier de sa famille de Bédouins à entrer dans une école occidentale. De ces origines nomades, Pondi tire un trait de caractère décisif: une liberté sans bornes et une aversion viscérale pour l'autorité — administrative d'abord, politique ensuite. Ce refus, Kadhafi en fera plus tard une doctrine: « L'éducation obligatoire est par nature coercitive et supprime la liberté; imposer un enseignement spécifique est une décision totalitaire.» Son héros d'enfance n'est pas un Libyen, mais l'Égyptien Gamal Abdel Nasser, dont la nationalisation du canal de Suez vient de faire un héros du monde arabe. À ce modèle s'ajoute une blessure: la Libye, méprisée jusque dans le monde arabe, n'est pas prise au sérieux. Kadhafi en souffre et veut en tirer revanche. C'est dans cette enfance, dit Pondi, qu'il faut chercher la matrice de tout le reste. Il entre à l'académie militaire de Benghazi avec une idée fixe que peu de cadets osent formuler: non pas devenir soldat, mais faire une révolution.</w:t>
+      </w:r>
+    </w:p>
+    <w:p>
+      <w:r>
+        <w:t>Il la fait le 1er septembre 1969, en renversant le roi qu'il juge à la solde des Occidentaux. Son premier acte est économique: nationaliser le pétrole et le gaz, dont l'exploitation était confiée à des consortiums occidentaux pour une part libyenne qu'il juge scandaleusement basse. Concrètement, la rente pétrolière cesse de partir sans contrepartie: la Libye, peu peuplée et riche en hydrocarbures, redistribue. Chaque ménage libyen reçoit un chèque annuel tiré des revenus du pétrole — une mesure quasi inédite ailleurs. C'est sur ce socle de richesse que Kadhafi va, plus tard, financer l'Afrique.</w:t>
+      </w:r>
+    </w:p>
+    <w:p>
+      <w:pPr>
+        <w:pStyle w:val="Heading2"/>
+      </w:pPr>
+      <w:r>
+        <w:t>L'argent du panafricanisme</w:t>
+      </w:r>
+    </w:p>
+    <w:p>
+      <w:r>
+        <w:t>Le panafricanisme de Kadhafi n'est pas une vocation première: c'est un report. Rejeté par les leaders du Maghreb — Bourguiba en tête — qui le trouvent trop jeune, trop bouillant, trop ambitieux, il se tourne vers l'Afrique subsaharienne. Le passage ne se fait pas sans heurt: la guerre de la bande d'Aozou contre le Tchad se solde par une défaite cuisante devant la Cour internationale de justice, qui tranche en faveur de N'Djamena. C'est après cette humiliation que Kadhafi revient vers l'Afrique, cette fois de manière pacifique — et l'Afrique l'adopte, jusqu'à lui décerner des titres de chef traditionnel.</w:t>
+      </w:r>
+    </w:p>
+    <w:p>
+      <w:r>
+        <w:t>Mais l'essentiel, pour Pondi, n'est pas dans les titres: il est dans la convergence entre le discours et les actes. Là où tant de chefs d'État se proclament anticolonialistes sans jamais le prouver, Kadhafi engage l'argent. Entre 2000 et 2010, il investit plus de 20 milliards de dollars sur le continent — davantage, souligne Pondi, que la Banque mondiale ou le FMI sur la même période. Ces investissements ont des noms et une portée stratégique: avec le satellite RASCOM, par exemple, un téléspectateur camerounais peut pour la première fois regarder une chaîne sénégalaise, sud-africaine ou nigériane, là où le continent était jusqu'alors condamné à louer les satellites occidentaux pour quelque 500 000 euros par an et par pays.</w:t>
+      </w:r>
+    </w:p>
+    <w:p>
+      <w:r>
+        <w:t>---ENCADRE---</w:t>
+      </w:r>
+    </w:p>
+    <w:tbl>
+      <w:tblPr>
+        <w:tblStyle w:val="TableGrid"/>
+        <w:tblW w:type="auto" w:w="0"/>
+        <w:tblLook w:firstColumn="1" w:firstRow="1" w:lastColumn="0" w:lastRow="0" w:noHBand="0" w:noVBand="1" w:val="04A0"/>
+      </w:tblPr>
+      <w:tblGrid>
+        <w:gridCol w:w="6624"/>
+      </w:tblGrid>
+      <w:tr>
+        <w:tc>
+          <w:tcPr>
+            <w:tcW w:type="dxa" w:w="6624"/>
+            <w:shd w:val="clear" w:fill="8B1A1A"/>
+          </w:tcPr>
+          <w:p>
+            <w:r>
+              <w:rPr>
+                <w:rFonts w:ascii="FreeSans" w:hAnsi="FreeSans"/>
+                <w:b/>
+                <w:color w:val="F5F0E8"/>
+                <w:sz w:val="18"/>
+              </w:rPr>
+              <w:t>L'EMPREINTE AFRICAINE DE KADHAFI (2000-2010)</w:t>
+            </w:r>
+          </w:p>
+        </w:tc>
+      </w:tr>
+      <w:tr>
+        <w:tc>
+          <w:tcPr>
+            <w:tcW w:type="dxa" w:w="6624"/>
+            <w:shd w:val="clear" w:fill="FFF0EE"/>
+          </w:tcPr>
+          <w:p>
+            <w:r>
+              <w:rPr>
+                <w:rFonts w:ascii="FreeSans" w:hAnsi="FreeSans"/>
+                <w:color w:val="0A0A0A"/>
+                <w:sz w:val="18"/>
+              </w:rPr>
+              <w:t>Malibya: environ 100 000 hectares de terres agricoles aménagées au Mali</w:t>
+            </w:r>
+          </w:p>
+        </w:tc>
+      </w:tr>
+      <w:tr>
+        <w:tc>
+          <w:tcPr>
+            <w:tcW w:type="dxa" w:w="6624"/>
+            <w:shd w:val="clear" w:fill="FFF0EE"/>
+          </w:tcPr>
+          <w:p>
+            <w:r>
+              <w:rPr>
+                <w:rFonts w:ascii="FreeSans" w:hAnsi="FreeSans"/>
+                <w:color w:val="0A0A0A"/>
+                <w:sz w:val="18"/>
+              </w:rPr>
+              <w:t>Oilibya: plus de 200 stations-service réparties à travers le continent</w:t>
+            </w:r>
+          </w:p>
+        </w:tc>
+      </w:tr>
+      <w:tr>
+        <w:tc>
+          <w:tcPr>
+            <w:tcW w:type="dxa" w:w="6624"/>
+            <w:shd w:val="clear" w:fill="FFF0EE"/>
+          </w:tcPr>
+          <w:p>
+            <w:r>
+              <w:rPr>
+                <w:rFonts w:ascii="FreeSans" w:hAnsi="FreeSans"/>
+                <w:color w:val="0A0A0A"/>
+                <w:sz w:val="18"/>
+              </w:rPr>
+              <w:t>Afriqiyah Airways: une compagnie « low cost» pour faire voyager les Africains à prix réduit</w:t>
+            </w:r>
+          </w:p>
+        </w:tc>
+      </w:tr>
+      <w:tr>
+        <w:tc>
+          <w:tcPr>
+            <w:tcW w:type="dxa" w:w="6624"/>
+            <w:shd w:val="clear" w:fill="FFF0EE"/>
+          </w:tcPr>
+          <w:p>
+            <w:r>
+              <w:rPr>
+                <w:rFonts w:ascii="FreeSans" w:hAnsi="FreeSans"/>
+                <w:color w:val="0A0A0A"/>
+                <w:sz w:val="18"/>
+              </w:rPr>
+              <w:t>RASCOM: un satellite de communication libérant l'Afrique de la location des satellites occidentaux</w:t>
+            </w:r>
+          </w:p>
+        </w:tc>
+      </w:tr>
+      <w:tr>
+        <w:tc>
+          <w:tcPr>
+            <w:tcW w:type="dxa" w:w="6624"/>
+            <w:shd w:val="clear" w:fill="FFF0EE"/>
+          </w:tcPr>
+          <w:p>
+            <w:r>
+              <w:rPr>
+                <w:rFonts w:ascii="FreeSans" w:hAnsi="FreeSans"/>
+                <w:color w:val="0A0A0A"/>
+                <w:sz w:val="18"/>
+              </w:rPr>
+              <w:t>Plus de 20 milliards de dollars investis sur la période — davantage que la Banque mondiale ou le FMI</w:t>
+            </w:r>
+          </w:p>
+        </w:tc>
+      </w:tr>
+    </w:tbl>
+    <w:p/>
+    <w:p>
+      <w:r>
+        <w:t>---FIN---</w:t>
+      </w:r>
+    </w:p>
+    <w:p>
+      <w:pPr>
+        <w:pStyle w:val="Heading2"/>
+      </w:pPr>
+      <w:r>
+        <w:t>L'architecte de l'Union africaine</w:t>
+      </w:r>
+    </w:p>
+    <w:p>
+      <w:r>
+        <w:t>C'est aussi Kadhafi qui finance la naissance de l'organisation continentale. Au sommet de Syrte, le 9 septembre 1999, la Libye convoque la réunion, éponge les arriérés de cotisation des États membres trop pauvres pour voter, et affrète ses avions — la compagnie Afriqiyah — pour transporter les délégations. Sans cet engagement, dit Pondi, la conférence de Syrte, premier jalon de l'Union africaine, n'aurait pas eu lieu. Le 11 juillet 2000, à Lomé, lorsqu'est présenté l'acte constitutif de l'UA, Kadhafi prend la parole pendant quarante-cinq minutes et met sur la table un milliard de dollars pour l'intégration africaine — « pour commencer», dit-il. Sa conviction, héritée de Nkrumah: l'indépendance politique ne vaut rien sans indépendance économique.</w:t>
       </w:r>
     </w:p>
     <w:p>
@@ -3685,11 +3801,39 @@
         <w:pStyle w:val="Heading2"/>
       </w:pPr>
       <w:r>
+        <w:t>Quatre leçons pour l'Afrique</w:t>
+      </w:r>
+    </w:p>
+    <w:p>
+      <w:r>
+        <w:t>De cette trajectoire, Pondi tire quatre leçons que ce livre fait siennes, parce qu'elles éclairent tout ce qui suit. La première: chaque fois qu'un dirigeant africain s'est donné les moyens de décider et d'appliquer ses décisions sans tutelle, il a souvent connu la déchéance. Le Fonds monétaire africain, dont le siège était prévu à Yaoundé, était en phase de finition — l'argent était déjà arrivé, le lancement imminent. La deuxième: l'Occident redoute moins ses ennemis que les insoumis. Sans dette envers la Banque mondiale ni le FMI, Kadhafi disait ce qu'il voulait, quand il le voulait; cet « électron libre» était d'autant plus inquiétant qu'il était incontrôlable. La troisième tient de la critique: faute de s'entourer des intellectuels dont il se méfiait, Kadhafi n'a pas su conceptualiser sa révolution ni la faire durer. Il aurait pu fonder des institutions pérennes — une école, une fondation, un prix panafricain; il a laissé une œuvre dispersée, plus facile à démanteler qu'un héritage codifié. La quatrième, enfin: la cause panafricaine est perçue, en bien des lieux, comme subversive et dangereuse. Ce n'est pas un pique-nique du dimanche. C'est un combat dont il faut savoir, à l'avance, qu'il a un prix.</w:t>
+      </w:r>
+    </w:p>
+    <w:p>
+      <w:r>
+        <w:t>Cette dernière leçon n'est pas abstraite. Sept mois de frappes l'ont écrite dans la chair d'un homme et dans le destin d'un pays. Il faut maintenant raconter comment.</w:t>
+      </w:r>
+    </w:p>
+    <w:p>
+      <w:pPr>
+        <w:pStyle w:val="Heading2"/>
+      </w:pPr>
+      <w:r>
         <w:t>Mars-octobre 2011: chronologie d'une destruction</w:t>
       </w:r>
     </w:p>
     <w:p>
       <w:r>
+        <w:t>Avant les frappes, il y eut l'étincelle. Le 15 février 2011, des manifestations éclatent à Benghazi; en quelques jours, la ville bascule et un « Conseil national de transition» s'autoproclame. Le mot n'est pas neutre: dans la grammaire des changements de régime, « transition» est le terme qui habille de légalité un basculement préparé. Sur la nature de ce soulèvement, les lectures s'opposent frontalement. Le récit occidental y voit une révolution populaire spontanée contre un tyran. Des observateurs engagés y voient une opération montée de l'extérieur autant que de l'intérieur du régime. Luc Michel, militant pro-Kadhafi qui dirigeait alors le réseau européen des comités révolutionnaires libyens et se trouvait sur place, décrit une aile « libérale» du régime, des transfuges et des éléments étrangers allumant puis exploitant la révolte. Le témoignage est de première main; il est aussi tout sauf neutre, et on le lira comme tel. Reste un fait que nul ne conteste: la vitesse à laquelle des manifestations sont devenues une guerre civile internationalisée.</w:t>
+      </w:r>
+    </w:p>
+    <w:p>
+      <w:r>
+        <w:t>Ce soulèvement, Michel l'inscrit dans un dessein plus vaste qu'il nomme, à la suite des stratèges américains, le « Grand Moyen-Orient»: un projet né avec la guerre d'Irak de 2003 et visant, l'un après l'autre, les régimes nationalistes arabes — l'Irak de Saddam, la Libye de Kadhafi, la Syrie des Assad. Détail qui ne s'invente pas: l'expression « printemps arabe» est elle-même le titre d'un livre de l'écrivain français Jacques Benoist-Méchin, paru en 1959 et consacré à la vague nationaliste de Nasser. Recyclée un demi-siècle plus tard, elle a paré d'un parfum d'émancipation une séquence d'une autre nature. Cette lecture est contestée et émane d'une source partisane. Mais elle converge avec celle qu'exposera, au chapitre suivant, le général Tiani — « une même matrice: l'Irak, la Syrie, la Libye, et aujourd'hui le Sahel». Quand un militant pro-Kadhafi et un chef d'État sahélien décrivent, à quinze ans de distance, la même mécanique, la convergence mérite d'être notée.</w:t>
+      </w:r>
+    </w:p>
+    <w:p>
+      <w:r>
         <w:t>Le 10 mars, la France de Nicolas Sarkozy — aiguillonnée par le philosophe Bernard-Henri Lévy, qui a organisé le contact entre l'Élysée et les insurgés — reconnaît le Conseil national de transition comme seul représentant légitime du peuple libyen. Une première mondiale: Paris reconnaît une rébellion avant même que quiconque sache qui la compose.</w:t>
       </w:r>
     </w:p>
@@ -3708,12 +3852,73 @@
         <w:pStyle w:val="Heading2"/>
       </w:pPr>
       <w:r>
+        <w:t>Les hommes de la chute</w:t>
+      </w:r>
+    </w:p>
+    <w:p>
+      <w:r>
+        <w:t>Une fois le mandat de protection mué en guerre de renversement, restait à savoir qui prendrait le pays. Trois hommes disent la nature réelle de la rébellion que la coalition a portée au pouvoir.</w:t>
+      </w:r>
+    </w:p>
+    <w:p>
+      <w:r>
+        <w:t>Abdel Fattah Younes, d'abord. Ministre de l'Intérieur de Kadhafi, compagnon de la révolution de 1969, il fait défection en février 2011 et devient le chef militaire des insurgés. Il est assassiné dès juillet 2011 par des éléments de sa propre coalition, vraisemblablement islamistes, avant même la prise de Tripoli. La rébellion se dévorait de l'intérieur.</w:t>
+      </w:r>
+    </w:p>
+    <w:p>
+      <w:r>
+        <w:t>Abdelhakim Belhadj, ensuite. Ancien émir du Groupe islamique combattant en Libye, passé par les réseaux d'Al-Qaïda, il est capturé puis « rendu» à Tripoli en 2004 dans le cadre d'une livraison à laquelle les services britanniques ont prêté la main — Londres présentera plus tard ses excuses et indemnisera sa famille. Libéré des geôles libyennes au début de 2011, il devient, après la chute de la capitale, gouverneur militaire de Tripoli: l'ancien détenu jihadiste administre la ville pour le compte des généraux de l'OTAN. Et le détail est lourd de suites: dès la fin 2011, Belhadj est signalé en contact avec les insurgés syriens, organisant l'acheminement d'hommes et d'armes de la Libye détruite vers la guerre qui s'allume en Syrie. Le fil libyen rejoint ici le fil syrien que ce livre suivra au chapitre suivant.</w:t>
+      </w:r>
+    </w:p>
+    <w:p>
+      <w:r>
+        <w:t>Khalifa Haftar, enfin. Officier de Kadhafi capturé au Tchad en 1987, passé à l'opposition, il vit une vingtaine d'années aux États-Unis, à portée des cercles du renseignement, avant de rentrer en 2011 pour rejoindre la rébellion. Devenu en 2014 l'homme fort de la Cyrénaïque à la tête d'une armée privée, il retournera ses canons contre les islamistes qu'il avait côtoyés. La même décennie l'aura vu l'allié puis l'ennemi des mêmes hommes: preuve, s'il en fallait, que la ligne de fracture libyenne n'a jamais été celle, binaire, qu'on a vendue à l'opinion. La boucle se referme en 2019-2020: la nouvelle guerre civile libyenne — Haftar lançant l'assaut contre Tripoli — attire à son tour des combattants syriens, acheminés par les puissances rivales engagées sur le terrain de part et d'autre. Le flux parti de Libye vers la Syrie en 2011 revient, inversé, huit ans plus tard: même vivier de mercenaires, sens de circulation opposé. C'est cette réserve d'hommes que ce livre retrouvera, recyclée vers le Sahel, au chapitre suivant.</w:t>
+      </w:r>
+    </w:p>
+    <w:p>
+      <w:r>
+        <w:t>Reste le grand perdant silencieux de 2011: la Russie. À l'ONU, Moscou — alors présidée par Dmitri Medvedev — n'oppose pas son veto à la résolution 1973: elle s'abstient, croyant n'autoriser qu'une zone d'exclusion aérienne. En quelques jours, elle voit l'aviation et l'infrastructure militaire libyennes pulvérisées par des frappes qui visaient le renversement. La leçon sera retenue. C'est cette abstention de 2011, vécue comme une duperie, qui explique le veto systématique opposé ensuite par Moscou à toute résolution comparable sur la Syrie. Le verrou qui saute en Libye en referme un autre, ailleurs.</w:t>
+      </w:r>
+    </w:p>
+    <w:p>
+      <w:pPr>
+        <w:pStyle w:val="Heading2"/>
+      </w:pPr>
+      <w:r>
+        <w:t>L'islamiste utile</w:t>
+      </w:r>
+    </w:p>
+    <w:p>
+      <w:r>
+        <w:t>Il faut nommer ce que furent, pour l'essentiel, les troupes au sol de 2011. Non pas des démocrates en armes, mais des combattants islamistes. C'est ici que l'analyse de Michel rejoint un fait que la décennie suivante rendra incontestable, et que ce livre retrouvera au Sahel. Il existe, dit-il, deux catégories d'islamistes dans la grammaire occidentale: l'islamiste utile, quand il combat les ennemis de l'Amérique, et le mauvais islamiste, quand il la combat elle. Or ce sont, le plus souvent, les mêmes hommes — instrumentalisés au gré des cycles. Le précédent fondateur remonte à l'Afghanistan des années 1980, lorsque Washington et Riyad arment les moudjahidines contre l'Armée rouge, faisant naître les réseaux dont sortira Al-Qaïda. L'arme se retourne toujours, un jour, contre la main qui l'a forgée; mais d'ici là, elle sert.</w:t>
+      </w:r>
+    </w:p>
+    <w:p>
+      <w:r>
+        <w:t>La preuve libyenne est limpide. Abdelhakim Belhadj, qu'on a vu sortir des geôles pour devenir gouverneur de Tripoli, en est l'archétype: jihadiste traqué hier, allié utile aujourd'hui, gouverneur demain, exportateur de combattants vers la Syrie après-demain. À la veille du soulèvement, des centaines de membres des groupes combattants islamistes sont libérés des prisons libyennes — y compris au titre d'un programme de « réconciliation» que pilotait Saïf al-Islam, le fils de Kadhafi. Quelques mois plus tard, ces mêmes hommes encadrent les katibas qui prennent Tripoli. L'islamiste emprisonné est devenu, en un printemps, l'islamiste utile.</w:t>
+      </w:r>
+    </w:p>
+    <w:p>
+      <w:r>
+        <w:t>Ce mécanisme ne s'arrête pas aux frontières libyennes. Les scénarios occidentaux, rappelle Michel, prévoyaient d'installer aux commandes des régimes « remodelés» — Tunisie, Égypte, Libye, Syrie — des Frères musulmans présentables, force dominante d'un parlementarisme de façade. Mais l'instrument échappe toujours, pour partie, à la main qui l'a forgé: les combattants armés pour Tripoli se retrouvent en Syrie, ceux de Syrie au Sahel. C'est une lecture partisane, et on la pèse comme telle. Mais elle a, depuis, reçu une confirmation qu'on n'attendait pas de ce bord-là: le 13 novembre 2025, le général Tiani décrit mot pour mot la même séquence de recyclage — le combattant qu'on prie d'adoucir ses méthodes, qu'on rebaptise « islamiste», puis « révolutionnaire» à mesure qu'on rend sa vitrine présentable (chapitre 20). Quand un militant pro-Kadhafi en 2011 et un chef d'État sahélien en 2025 décrivent le même engrenage, la thèse cesse d'être une simple opinion d'engagé. L'essentiel tient en une phrase: le jihadiste n'est pas seulement l'ennemi que l'Occident affirme combattre au Sahel; il a d'abord été, ailleurs, l'outil qu'il a forgé. Cette dualité — l'instrument devenu prétexte — hante toute la guerre sahélienne.</w:t>
+      </w:r>
+    </w:p>
+    <w:p>
+      <w:pPr>
+        <w:pStyle w:val="Heading2"/>
+      </w:pPr>
+      <w:r>
         <w:t>Les arsenaux se dispersent</w:t>
       </w:r>
     </w:p>
     <w:p>
       <w:r>
         <w:t>La Libye de Kadhafi était l'un des États les plus militarisés d'Afrique. Sa destruction pulvérise les chaînes de garde de ses dépôts: des dizaines de milliers de tonnes d'armes — missiles, lance-roquettes, armes automatiques, véhicules blindés — se dispersent dans toute la bande sahélo-saharienne. Les combattants touareg du nord du Mali, dont certains avaient servi dans l'armée libyenne, rentrent chez eux avec armes et bagages. Au sens propre.</w:t>
+      </w:r>
+    </w:p>
+    <w:p>
+      <w:r>
+        <w:t>---ENCADRE---</w:t>
       </w:r>
     </w:p>
     <w:tbl>
@@ -3820,6 +4025,11 @@
     <w:p/>
     <w:p>
       <w:r>
+        <w:t>---FIN---</w:t>
+      </w:r>
+    </w:p>
+    <w:p>
+      <w:r>
         <w:t>Le Fezzan, justement. Cette vaste région désertique du sud libyen, peu contrôlée par Tripoli, a toujours été tournée vers le Niger, le Tchad et le Soudan plutôt que vers la côte méditerranéenne. Elle abrite des tribus touareg, toubou et arabes dont les réseaux de solidarité s'étendent de part et d'autre de plusieurs frontières à la fois. Kadhafi tenait le Fezzan. Son élimination a libéré cet espace, qui devient en quelques années la principale base arrière logistique des groupes armés actifs au Sahel — non seulement un couloir de passage, mais une zone de repli, de recrutement et d'approvisionnement. Les arsenaux dispersés y ont transité. Les réseaux tribaux transfrontaliers y ont prospéré, sans État pour les contraindre.</w:t>
       </w:r>
     </w:p>
@@ -3834,19 +4044,8 @@
       </w:r>
     </w:p>
     <w:p>
-      <w:pPr>
-        <w:spacing w:before="160" w:after="160"/>
-        <w:jc w:val="center"/>
-      </w:pPr>
-      <w:r>
-        <w:rPr>
-          <w:b w:val="0"/>
-          <w:i w:val="0"/>
-          <w:color w:val="D4A017"/>
-          <w:sz w:val="22"/>
-          <w:rFonts w:ascii="FreeSans" w:hAnsi="FreeSans" w:cs="FreeSans"/>
-        </w:rPr>
-        <w:t>★  ★  ★</w:t>
+      <w:r>
+        <w:t>★★★</w:t>
       </w:r>
     </w:p>
     <w:p>
@@ -3925,6 +4124,11 @@
     </w:p>
     <w:p>
       <w:r>
+        <w:t>Cette filiation Libye-Sahel n'est pas une lecture militante. En 2024, l'hebdomadaire L'Express — modélisant avec une quarantaine de chercheurs, diplomates, généraux et anciens des services un « scénario noir» d'effondrement du Mali — fait lui aussi débuter toute la séquence à « la crise libyenne de 2011» et à la dispersion des combattants de la Légion islamique de Kadhafi rentrés au pays. Quand l'establishment français date l'incendie de la même année que les panafricanistes, la cause cesse d'être une opinion.</w:t>
+      </w:r>
+    </w:p>
+    <w:p>
+      <w:r>
         <w:t>Mais qu'est-ce que l'Azawad? André Bourgeot, chercheur au CNRS et spécialiste du Sahel, tranche: « Azawad est une fabrication politique.» Pas une réalité historique. Les Touareg existent, leurs revendications aussi; l'Azawad tel que le MNLA le définit est une construction, instrumentalisée et adossée à des soutiens extérieurs. La distinction est capitale: on peut reconnaître une question touareg sans valider un projet de partition du Mali.</w:t>
       </w:r>
     </w:p>
@@ -3967,6 +4171,11 @@
     <w:p>
       <w:r>
         <w:t>La fabrique du terrorisme n'est pas seulement idéologique et financière. Elle est géographique. Une cartographie diffusée en mai 2026 par le canal d'analyse militaire @RYBAR_AFRICA documente les sentiers nomades transsahariens empruntés par les groupes armés, et recoupe les données de terrain d'ACLED ainsi que les constats des autorités maliennes. Trois réalités s'en dégagent.</w:t>
+      </w:r>
+    </w:p>
+    <w:p>
+      <w:r>
+        <w:t>---ENCADRE---</w:t>
       </w:r>
     </w:p>
     <w:tbl>
@@ -4055,6 +4264,11 @@
     <w:p/>
     <w:p>
       <w:r>
+        <w:t>---FIN---</w:t>
+      </w:r>
+    </w:p>
+    <w:p>
+      <w:r>
         <w:t>Ces corridors offrent aux groupes armés trois avantages: des camps de repli sur des territoires échappant à toute souveraineté effective; une économie de guerre autofinancée par la contrebande d'armes et de stupéfiants — concrètement, la guerre paie la guerre, sans dépendre d'un sponsor unique; et un recrutement transfrontalier au sein de communautés que les frontières de Berlin ont coupées en deux. Les frontières divisent les familles; les réseaux de recrutement les traversent. L'asymétrie est structurelle — et millénaire. Au bout de ces pistes, le Fezzan libyen, déjà rencontré au chapitre précédent, sert de base arrière durable.</w:t>
       </w:r>
     </w:p>
@@ -4097,19 +4311,8 @@
       </w:r>
     </w:p>
     <w:p>
-      <w:pPr>
-        <w:spacing w:before="160" w:after="160"/>
-        <w:jc w:val="center"/>
-      </w:pPr>
-      <w:r>
-        <w:rPr>
-          <w:b w:val="0"/>
-          <w:i w:val="0"/>
-          <w:color w:val="D4A017"/>
-          <w:sz w:val="22"/>
-          <w:rFonts w:ascii="FreeSans" w:hAnsi="FreeSans" w:cs="FreeSans"/>
-        </w:rPr>
-        <w:t>★  ★  ★</w:t>
+      <w:r>
+        <w:t>★★★</w:t>
       </w:r>
     </w:p>
     <w:p>
@@ -4202,6 +4405,11 @@
     <w:p>
       <w:r>
         <w:t>En août 2014, Serval devient Barkhane. Le dispositif s'étend sur cinq pays.</w:t>
+      </w:r>
+    </w:p>
+    <w:p>
+      <w:r>
+        <w:t>---ENCADRE---</w:t>
       </w:r>
     </w:p>
     <w:tbl>
@@ -4308,6 +4516,11 @@
     <w:p/>
     <w:p>
       <w:r>
+        <w:t>---FIN---</w:t>
+      </w:r>
+    </w:p>
+    <w:p>
+      <w:r>
         <w:t>Cinq milliards d'euros. Neuf ans. La menace triple. Il n'y a que deux explications possibles: soit les armées françaises sont incompétentes — ce que la communication officielle dément avec véhémence —, soit la mission n'était pas celle qu'on annonçait. La seconde hypothèse a des preuves.</w:t>
       </w:r>
     </w:p>
@@ -4336,12 +4549,44 @@
         <w:pStyle w:val="Heading2"/>
       </w:pPr>
       <w:r>
+        <w:t>L'OCRS: la vraie raison, nommée à la tribune de l'ONU</w:t>
+      </w:r>
+    </w:p>
+    <w:p>
+      <w:r>
+        <w:t xml:space="preserve">Si la mission n'était pas celle qu'on annonçait, quelle était-elle? La réponse la plus documentée a été donnée par l'AES elle-même, au siège des Nations unies. Le 23 septembre 2023, Bassolma Bazié — alors ministre d'État du Burkina Faso, dépêché au nom du capitaine Traoré à la 78ᵉ session de l'Assemblée générale — y prononce une mise en accusation frontale. Sa pièce maîtresse n'est pas un slogan: c'est un texte de loi. Le 10 janvier 1957, rappelle-t-il, l'Assemblée nationale française vote la loi n° 57-27 créant l'Organisation commune des régions sahariennes (OCRS) — une entité qui découpe transversalement le sous-sol de portions du Mali, du Niger, du Burkina Faso, de la Mauritanie et de l'Algérie, à la veille même des indépendances. Le Sahara n'était pas un désert vide: </w:t>
+      </w:r>
+      <w:r>
+        <w:rPr>
+          <w:i/>
+        </w:rPr>
+        <w:t>Le Monde</w:t>
+      </w:r>
+      <w:r>
+        <w:t xml:space="preserve"> du 23 juin 1957 évoquait déjà un potentiel de six à sept millions de tonnes de pétrole par an, et l'on y connaissait l'uranium, l'or, le lithium, le cuivre. Trois ans avant les drapeaux et les hymnes, la France avait donc organisé juridiquement la mainmise sur ce qui comptait vraiment. L'OCRS fut formellement dissoute en 1962, après l'indépendance algérienne; la logique qu'elle institutionnalisait, elle, ne le fut jamais.</w:t>
+      </w:r>
+    </w:p>
+    <w:p>
+      <w:r>
+        <w:t>De là, l'argument arithmétique que Bazié déroule devant l'Assemblée: des dizaines de milliers de soldats étrangers, des moyens de surveillance « parmi les plus sophistiqués au monde» — et pourtant des colonnes de centaines de combattants traversent le Sahel sans être inquiétées, dans des pays qui ne fabriquent ni armes ni munitions. « Qui recrute ces terroristes, qui les entraîne en permanence, qui les nourrit, et avec quels moyens?» La question, posée à la tribune de l'ONU, prolonge la thèse de la fabrique du terrorisme (chapitre 12) en la retournant en réquisitoire diplomatique. Et à ceux qui agitaient le spectre de Wagner à Ouagadougou, Bazié oppose une formule devenue célèbre: « Oui, c'est nous, les Wagner du Burkina Faso» — les forces de défense et de sécurité, et les Volontaires pour la défense de la patrie. La même tribune lui sert à dénoncer deux faits concrets: les représentants du Niger légitime « pratiquement interdits d'accès» au siège de l'ONU, et le blocage, sous pression française, d'un contrat d'armement burkinabè mêlant le Brésil, la Belgique, les États-Unis et le Canada — pendant que les armes affluaient sans entrave vers d'autres théâtres. Deux poids, deux mesures, jusque dans la livraison des fusils (Bassolma Bazié, AG de l'ONU, 23 septembre 2023).</w:t>
+      </w:r>
+    </w:p>
+    <w:p>
+      <w:pPr>
+        <w:pStyle w:val="Heading2"/>
+      </w:pPr>
+      <w:r>
         <w:t>Le prix du sang, comptabilité véritable</w:t>
       </w:r>
     </w:p>
     <w:p>
       <w:r>
         <w:t>Reste l'argument ultime de Paris: le sacrifice. En 2025, le ministre des Armées Sébastien Lecornu déclare au Figaro qu'il est « profondément navrant» de voir le terrorisme resurgir au Sahel après tant d'efforts — sous-entendu, après le sang versé des 58 soldats français morts au Sahel. Ce chiffre mérite un examen mort par mort. Nathalie Yamb l'a fait, en s'appuyant exclusivement sur les données publiées par le ministère français des Armées lui-même.</w:t>
+      </w:r>
+    </w:p>
+    <w:p>
+      <w:r>
+        <w:t>---ENCADRE---</w:t>
       </w:r>
     </w:p>
     <w:tbl>
@@ -4448,6 +4693,11 @@
     <w:p/>
     <w:p>
       <w:r>
+        <w:t>---FIN---</w:t>
+      </w:r>
+    </w:p>
+    <w:p>
+      <w:r>
         <w:t>Quinze morts au combat. Pour la France — pas pour le Mali, pas pour le Niger, pas pour le Burkina. Et ce chiffre est inférieur au bilan d'une seule frappe française: le 3 janvier 2021, à Bounti, dans la région de Mopti, l'aviation française frappe un rassemblement. L'enquête de la MINUSMA conclut qu'il s'agissait d'un mariage et dénombre 22 morts, dont 19 civils. Le ministère des Armées maintient sa version et tente de discréditer le rapport onusien.</w:t>
       </w:r>
     </w:p>
@@ -4472,19 +4722,8 @@
       </w:r>
     </w:p>
     <w:p>
-      <w:pPr>
-        <w:spacing w:before="160" w:after="160"/>
-        <w:jc w:val="center"/>
-      </w:pPr>
-      <w:r>
-        <w:rPr>
-          <w:b w:val="0"/>
-          <w:i w:val="0"/>
-          <w:color w:val="D4A017"/>
-          <w:sz w:val="22"/>
-          <w:rFonts w:ascii="FreeSans" w:hAnsi="FreeSans" w:cs="FreeSans"/>
-        </w:rPr>
-        <w:t>★  ★  ★</w:t>
+      <w:r>
+        <w:t>★★★</w:t>
       </w:r>
     </w:p>
     <w:p>
@@ -4555,6 +4794,11 @@
     </w:p>
     <w:p>
       <w:r>
+        <w:t>Un cadre de l'AES a documenté de l'intérieur l'effet recherché par ces campagnes. Bassolma Bazié — ancien ministre burkinabè devenu responsable au sein de la Confédération — raconte une séquence de l'été 2026: « Pendant une dizaine de jours, sur les réseaux sociaux et dans certaines presses internationales, on nous a chanté minute après minute que Ouagadougou était tombée, que le général avait fui, que les jihadistes avaient pris le pouvoir.» La réponse ne fut pas un démenti écrit mais une mise en scène du réel: les chefs d'État du Burkina, du Mali et du Niger se sont montrés ensemble, en public, à une conférence régionale. À un récit, l'AES n'oppose pas un communiqué; elle oppose une présence — car le doute, fabriqué plus vite que la réalité ne peut le dissiper, ne se dément pas, il se prend de vitesse. Bazié prolonge l'argument sur le terrain des faits: à un ambassadeur occidental venu l'interroger sur « les terroristes», il rétorque par deux questions — qui fabrique les drones que ces groupes utilisent désormais, et qui leur a appris à les piloter, dans des pays dont l'État peine à faire homologuer un appareil civil? — avant de renvoyer à l'aveu du renseignement militaire ukrainien après Tinzawaten (chapitre 12). Pour l'AES, la « fabrique du terrorisme» n'est pas une thèse: c'est un dossier.</w:t>
+      </w:r>
+    </w:p>
+    <w:p>
+      <w:r>
         <w:t>La distinction analytique que pose Larbaoui entre les acteurs du Golfe est précieuse. L'Arabie Saoudite remplit une fonction financière — mobiliser des pétrodollars pour financer des déstabilisations commanditées par Washington. Les Émirats arabes unis exercent une fonction duale: paradis fiscal où transite l'or soustrait aux économies africaines, et depuis les Accords d'Abraham de 2020, «missionnés pour propager l'idée des Accords d'Abraham» vers les pays à majorité musulmane. Le Qatar est la puissance médiatique du dispositif: Al Jazeera, dont Larbaoui affirme qu'elle est «gérée non seulement par la CIA mais par le Mossad» — affirmation non prouvée individuellement, cohérente avec les ingérences documentées dans le financement des médias arabes du Golfe. Ces trois États ont une origine commune: tous ont été créés ou délimités entre 1920 et décembre 1971, dans ce que Larbaoui appelle le «Plan Rogers» — la série de décisions anglo-américaines qui ont découpé les royaumes du Golfe pour en faire des États séparés, dépendants et contrôlables. «Chaque État a été créé en toute pièce par les colonialistes», résume-t-elle; et chaque État a reçu un rôle: l'Arabie Saoudite finance, les Émirats recyclent, le Qatar informe. Que Nestor Podassé, coordinateur de la communication de l'AES, parvienne à la même architecture depuis Ouagadougou — «les pays du Golfe s'occupent du volet idéologique, l'islam politique pour radicaliser les éléments, et du volet militaire pour fournir des combattants» (Panafrican Média TV, juin 2026) — suggère que la convergence analytique entre le terrain sahélien et l'observation depuis la diaspora est plus solide qu'il n'y paraît.</w:t>
       </w:r>
     </w:p>
@@ -4605,19 +4849,7 @@
       </w:r>
     </w:p>
     <w:p>
-      <w:pPr>
-        <w:spacing w:before="40" w:after="120"/>
-        <w:ind w:left="567"/>
-        <w:pBdr>
-          <w:left w:val="single" w:sz="18" w:space="8" w:color="D4A017"/>
-        </w:pBdr>
-      </w:pPr>
-      <w:r>
-        <w:rPr>
-          <w:i/>
-          <w:color w:val="8B1A1A"/>
-          <w:sz w:val="20"/>
-        </w:rPr>
+      <w:r>
         <w:t>« L'aide publique au développement est une aide-intérêt dont la finalité est d'abord de servir de relais d'influence pour le pays donateur», écrit Raphaël Granvaud (De l'huile sur le feu, Lux Éditeur, 2024). Ce n'est pas un pamphlétaire panafricaniste: c'est l'association française Survie. Les chiffres lui donnent raison. En 2021, 19,6 millions de personnes avaient besoin d'assistance humanitaire au Sahel; la France couvrait moins de 1 % des besoins de financement, tandis que ses dépenses militaires, déjà supérieures, augmentaient plus vite que ses dépenses de développement. Et l'argent annoncé se volatilise en chemin: de 2012 à 2016, seuls 18 % des versements de la Banque mondiale apparaissent dans la comptabilité nationale du Tchad, 27 % de l'aide américaine, 37 % de l'aide européenne, 60 % de l'aide française; au Niger, 37 % des versements français ont disparu, 71 % des versements allemands. L'ancien diplomate français Laurent Bigot l'a dit sans précaution: dans le nord du Mali, « aucun projet financé par l'aide au développement ne subsisterait cinq ans après son achèvement». « L'échec de l'aide au développement au Sahel est total.» Le chercheur Jean-Pierre Olivier de Sardan en a décrit la cause: des programmes conçus, pilotés et financés de l'extérieur, des « modèles voyageurs» exportés d'un pays à l'autre, « contournés, détournés, démembrés» par tous ceux qui les vivent — ce qu'il appelle la « revanche des contextes». En d'autres termes: une aide pensée sans les gens finit toujours par être défaite par les gens.</w:t>
       </w:r>
     </w:p>
@@ -4629,6 +4861,11 @@
     <w:p>
       <w:r>
         <w:t>Le cas d'école est le rapport du 2 avril 2026: 342 pages visant Ibrahim Traoré comme « responsable potentiel de crimes de guerre». Son calendrier intrigue. L'AES a annoncé son retrait de la CPI le 22 septembre 2025; la Cour conserve une compétence résiduelle d'un an. Le rapport couvre 2023-2025 — précisément les années encore poursuivables — et la lettre demandant la réponse des autorités burkinabè n'a été envoyée que le 22 décembre 2025, après trois ans de travail à charge et quatre mois avant publication (Yamb, avril 2026). Plus troublant: parmi les contributeurs remerciés figure Wassim Nassar, en contact en temps réel avec les assaillants lors de l'attaque de Bamako du 17 septembre 2024, et poursuivi par la justice des trois pays de l'AES pour association de malfaiteurs en lien avec une entreprise terroriste.</w:t>
+      </w:r>
+    </w:p>
+    <w:p>
+      <w:r>
+        <w:t>---ENCADRE---</w:t>
       </w:r>
     </w:p>
     <w:tbl>
@@ -4789,6 +5026,11 @@
     <w:p/>
     <w:p>
       <w:r>
+        <w:t>---FIN---</w:t>
+      </w:r>
+    </w:p>
+    <w:p>
+      <w:r>
         <w:t>Pour le dire simplement, la mécanique de l'étranglement fonctionne en cascade: un rapport qualifie un État d'« autoritaire»; les agences de notation dégradent sa note; son coût d'emprunt augmente; le FMI et la Banque mondiale conditionnent ou suspendent leurs financements. L'étranglement économique avance déguisé en préoccupation humanitaire. La conclusion n'est pas qu'il faut abolir l'humanitaire. C'est qu'il faut mettre fin à son immunité analytique. Le Niger en a tiré une conséquence radicale en 2025 en expulsant le CICR, Tiani invoquant des réunions secrètes tenues à Abuja début 2025 entre représentants occidentaux et groupes armés, avec le CICR comme vecteur financier.</w:t>
       </w:r>
     </w:p>
@@ -4913,19 +5155,8 @@
       </w:r>
     </w:p>
     <w:p>
-      <w:pPr>
-        <w:spacing w:before="160" w:after="160"/>
-        <w:jc w:val="center"/>
-      </w:pPr>
-      <w:r>
-        <w:rPr>
-          <w:b w:val="0"/>
-          <w:i w:val="0"/>
-          <w:color w:val="D4A017"/>
-          <w:sz w:val="22"/>
-          <w:rFonts w:ascii="FreeSans" w:hAnsi="FreeSans" w:cs="FreeSans"/>
-        </w:rPr>
-        <w:t>★  ★  ★</w:t>
+      <w:r>
+        <w:t>★★★</w:t>
       </w:r>
     </w:p>
     <w:p>
@@ -5021,10 +5252,43 @@
       </w:r>
     </w:p>
     <w:p>
+      <w:r>
+        <w:t>À l'expertise institutionnelle s'ajoute la production académique indépendante. Marc-Antoine Pérouse de Montclos, chercheur français spécialiste des conflits sahéliens, a conclu que l'intervention militaire française n'a pas résolu la menace jihadiste: elle l'a fragmentée, déplacée, rendue plus difficile à cibler — avant de la retrouver partout. Sa conclusion est celle des données ACLED, déjà citées au chapitre 13: une présence de dix ans pour un triplement de la menace. Selon Luc Michel, plusieurs voix de la presse française mainstream auraient chacune, à des moments différents, acté cette faillite — parmi elles Michèle Cotta, Le Monde Afrique et Le Figaro. Ces citations, rapportées par une source engagée, ne peuvent être retenues au même rang que les rapports parlementaires ou les auditions à huis clos. Elles signalent cependant que le constat de l'échec ne reste plus confiné au camp panafricaniste: il circule désormais dans des tribunes qui ne lui sont ni proches ni complaisantes — et, comme on va le voir à l'instant, jusqu'au sommet même de l'institution militaire, où ce que Michel rapportait de seconde main se trouve dit en propre.</w:t>
+      </w:r>
+    </w:p>
+    <w:p>
       <w:pPr>
         <w:pStyle w:val="Heading2"/>
       </w:pPr>
       <w:r>
+        <w:t>L'aveu du stratège: « pour les intérêts de la France »</w:t>
+      </w:r>
+    </w:p>
+    <w:p>
+      <w:r>
+        <w:t>Reste l'aveu le plus nu, parce qu'il vient d'un homme qui a commandé la guerre. Le général François Lecointre fut chef d'état-major des armées françaises de 2017 à 2021 — les années Barkhane —, avant de devenir grand chancelier de la Légion d'honneur. Nul marginal, nul dissident: le sommet même de l'institution militaire. C'est ce stratège que le capitaine Traoré avait pris à partie dans son discours sur la « guerre de haute intensité». Dans un entretien public, Lecointre concède ce que dix ans de communication officielle avaient nié: « Le retrait du Sahel fut difficile à accepter… je suis le premier à avoir beaucoup de mal à avaler ça. C'est un échec.» L'ancien patron des armées, sous lequel Barkhane fut conduite, parle d'échec. Le mot, dans sa bouche, n'est pas une opinion de plus: c'est un constat dressé de l'intérieur.</w:t>
+      </w:r>
+    </w:p>
+    <w:p>
+      <w:r>
+        <w:t>Mais l'aveu s'accompagne aussitôt d'un alibi, et il faut le démonter. L'échec, précise Lecointre, fut « français, européen et africain» — la responsabilité se dilue, et les premières victimes de la guerre en reçoivent leur part. Surtout, il refuse d'y voir « l'échec d'une opération militaire»: l'armée n'aurait été « qu'une dimension»; ce qui a manqué, c'est « l'action globale» — la restauration de l'État, le retour des administrations, le retour du développement, menés « simultanément et de façon coordonnée». L'argument est exactement celui d'Emmanuel Macron à Nairobi (chapitre 30): relocaliser l'échec dans l'exécution pour ne pas l'avouer dans la nature. Or ce livre a établi le contraire (chapitres 13 et 15): l'« action globale» ne pouvait pas réussir parce qu'elle n'était pas le but. L'autonomie de l'État malien était la fin de la mission française, non son objectif; un « désordre géré» servait mieux l'accès aux ressources qu'un Sahel pacifié et souverain. On n'échoue pas à faire ce qu'on n'a jamais cherché à faire.</w:t>
+      </w:r>
+    </w:p>
+    <w:p>
+      <w:r>
+        <w:t>Lecointre lâche pourtant la phrase qui dissout tous les alibis. Selon les propos qui lui sont attribués — rapportés avec la prudence due à une source unique —, « on ne fait pas la guerre pour la démocratie mais pour les intérêts de la France». Si la formule est exacte, elle ruine la justification officielle de Serval, de Barkhane et du G5 Sahel: non pas protéger des populations ni défendre un ordre démocratique, mais servir des intérêts. C'est, presque mot pour mot, ce que les dirigeants de l'AES répètent depuis 2020 — et que Paris rangeait au rayon de la propagande. Quand l'accusé reprend la phrase de l'accusation, le procès est clos.</w:t>
+      </w:r>
+    </w:p>
+    <w:p>
+      <w:r>
+        <w:t>Le même stratège dessine enfin l'avenir, et il glace: « Je suis persuadé que dans quelques années — dix ans, moins, ou plus — nous aurons l'obligation de retourner aider ces pays africains.» L'Europe, soutient-il, ne pourra tolérer durablement « à ses portes» un continent qu'il décrit gagné par l'effondrement des États et une explosion démographique sans précédent; elle devra « défendre ses intérêts, y compris par l'engagement de ses armées». Le retrait, donc, n'est pas tenu pour définitif: ce que la recomposition (chapitre 30) habille de partenariats rénovés, ce stratège le nomme sans fard — une option militaire gardée en réserve. Il y ajoute un pronostic: « ce ne sont pas la Chine, la Russie et Wagner qui apporteront des solutions durables.» L'histoire récente lui oppose déjà un démenti: ce que Barkhane n'avait pas accompli en dix ans — reprendre Kidal —, les FAMa l'ont fait en 2023 avec l'appui russe (chapitre 16). La « solution durable» reste à prouver de tous les côtés; mais le verdict de terrain, pour l'heure, n'est pas celui qu'annonce le stratège. C'est très exactement ce qui fait de la consolidation de l'AES, examinée au chapitre suivant, une question de survie et non de confort.</w:t>
+      </w:r>
+    </w:p>
+    <w:p>
+      <w:pPr>
+        <w:pStyle w:val="Heading2"/>
+      </w:pPr>
+      <w:r>
         <w:t>Ils savaient</w:t>
       </w:r>
     </w:p>
@@ -5039,19 +5303,8 @@
       </w:r>
     </w:p>
     <w:p>
-      <w:pPr>
-        <w:spacing w:before="160" w:after="160"/>
-        <w:jc w:val="center"/>
-      </w:pPr>
-      <w:r>
-        <w:rPr>
-          <w:b w:val="0"/>
-          <w:i w:val="0"/>
-          <w:color w:val="D4A017"/>
-          <w:sz w:val="22"/>
-          <w:rFonts w:ascii="FreeSans" w:hAnsi="FreeSans" w:cs="FreeSans"/>
-        </w:rPr>
-        <w:t>★  ★  ★</w:t>
+      <w:r>
+        <w:t>★★★</w:t>
       </w:r>
     </w:p>
     <w:p>
@@ -5095,19 +5348,8 @@
       </w:pPr>
     </w:p>
     <w:p>
-      <w:pPr>
-        <w:spacing w:before="160" w:after="160"/>
-        <w:jc w:val="center"/>
-      </w:pPr>
-      <w:r>
-        <w:rPr>
-          <w:b w:val="0"/>
-          <w:i w:val="0"/>
-          <w:color w:val="D4A017"/>
-          <w:sz w:val="22"/>
-          <w:rFonts w:ascii="FreeSans" w:hAnsi="FreeSans" w:cs="FreeSans"/>
-        </w:rPr>
-        <w:t>★  ★  ★</w:t>
+      <w:r>
+        <w:t>★★★</w:t>
       </w:r>
     </w:p>
     <w:p>
@@ -5131,19 +5373,8 @@
       </w:r>
     </w:p>
     <w:p>
-      <w:pPr>
-        <w:spacing w:before="160" w:after="160"/>
-        <w:jc w:val="center"/>
-      </w:pPr>
-      <w:r>
-        <w:rPr>
-          <w:b w:val="0"/>
-          <w:i w:val="0"/>
-          <w:color w:val="D4A017"/>
-          <w:sz w:val="22"/>
-          <w:rFonts w:ascii="FreeSans" w:hAnsi="FreeSans" w:cs="FreeSans"/>
-        </w:rPr>
-        <w:t>★  ★  ★</w:t>
+      <w:r>
+        <w:t>★★★</w:t>
       </w:r>
     </w:p>
     <w:p>
@@ -5318,19 +5549,8 @@
       </w:r>
     </w:p>
     <w:p>
-      <w:pPr>
-        <w:spacing w:before="160" w:after="160"/>
-        <w:jc w:val="center"/>
-      </w:pPr>
-      <w:r>
-        <w:rPr>
-          <w:b w:val="0"/>
-          <w:i w:val="0"/>
-          <w:color w:val="D4A017"/>
-          <w:sz w:val="22"/>
-          <w:rFonts w:ascii="FreeSans" w:hAnsi="FreeSans" w:cs="FreeSans"/>
-        </w:rPr>
-        <w:t>★  ★  ★</w:t>
+      <w:r>
+        <w:t>★★★</w:t>
       </w:r>
     </w:p>
     <w:p>
@@ -5456,19 +5676,8 @@
       </w:r>
     </w:p>
     <w:p>
-      <w:pPr>
-        <w:spacing w:before="160" w:after="160"/>
-        <w:jc w:val="center"/>
-      </w:pPr>
-      <w:r>
-        <w:rPr>
-          <w:b w:val="0"/>
-          <w:i w:val="0"/>
-          <w:color w:val="D4A017"/>
-          <w:sz w:val="22"/>
-          <w:rFonts w:ascii="FreeSans" w:hAnsi="FreeSans" w:cs="FreeSans"/>
-        </w:rPr>
-        <w:t>★  ★  ★</w:t>
+      <w:r>
+        <w:t>★★★</w:t>
       </w:r>
     </w:p>
     <w:p>
@@ -5507,6 +5716,11 @@
     <w:p>
       <w:r>
         <w:t>Niamey, 26 juillet 2023. Au petit matin, la garde présidentielle nigérienne place le président Mohamed Bazoum en résidence surveillée, au cœur même du palais. Le général Abdourahamane Tiani, chef de cette garde, prend la tête du Conseil national pour la sauvegarde de la patrie. En quelques heures, la réaction internationale atteint une intensité jamais vue pour les transitions précédentes: menaces d'intervention militaire de la CEDEAO, sanctions immédiates, frontières fermées, électricité coupée. Pourquoi tant de fureur pour ce pays-ci? La réponse tient en un mot: le Niger est le dernier verrou.</w:t>
+      </w:r>
+    </w:p>
+    <w:p>
+      <w:r>
+        <w:t>---ENCADRE---</w:t>
       </w:r>
     </w:p>
     <w:tbl>
@@ -5631,6 +5845,11 @@
     <w:p/>
     <w:p>
       <w:r>
+        <w:t>---FIN---</w:t>
+      </w:r>
+    </w:p>
+    <w:p>
+      <w:r>
         <w:t>Perdre le Niger, c'était perdre d'un coup l'intégralité du dispositif sahélien occidental. C'est exactement ce qui va se produire — et sans qu'une seule goutte de sang soit versée.</w:t>
       </w:r>
     </w:p>
@@ -5727,19 +5946,8 @@
       </w:r>
     </w:p>
     <w:p>
-      <w:pPr>
-        <w:spacing w:before="160" w:after="160"/>
-        <w:jc w:val="center"/>
-      </w:pPr>
-      <w:r>
-        <w:rPr>
-          <w:b w:val="0"/>
-          <w:i w:val="0"/>
-          <w:color w:val="D4A017"/>
-          <w:sz w:val="22"/>
-          <w:rFonts w:ascii="FreeSans" w:hAnsi="FreeSans" w:cs="FreeSans"/>
-        </w:rPr>
-        <w:t>★  ★  ★</w:t>
+      <w:r>
+        <w:t>★★★</w:t>
       </w:r>
     </w:p>
     <w:p>
@@ -5783,6 +5991,11 @@
     <w:p>
       <w:r>
         <w:t>Le nom même est un manifeste. Le Liptako-Gourma, c'est la zone des trois frontières, territoire ancestral des Peuls, des Touareg, des Songhaï, des Mossi — un espace qui existait bien avant que la conférence de Berlin ne trace ses lignes droites sur la carte de l'Afrique, en 1884. En choisissant ce nom, l'AES ancre sa rupture dans une continuité qui déborde la colonisation: avant Berlin, ce territoire existait; après Paris, il se reconstruit.</w:t>
+      </w:r>
+    </w:p>
+    <w:p>
+      <w:r>
+        <w:t>---ENCADRE---</w:t>
       </w:r>
     </w:p>
     <w:tbl>
@@ -5907,6 +6120,11 @@
     <w:p/>
     <w:p>
       <w:r>
+        <w:t>---FIN---</w:t>
+      </w:r>
+    </w:p>
+    <w:p>
+      <w:r>
         <w:t>La clause centrale est la première: la défense collective. Concrètement, c'est le principe qui fonde l'OTAN — l'attaque d'un seul vaut attaque de tous —, transposé au Sahel: envahir le Niger, désormais, c'est entrer en guerre contre le Mali et le Burkina Faso en même temps. La menace d'intervention de la CEDEAO meurt ce jour-là, tuée par une signature.</w:t>
       </w:r>
     </w:p>
@@ -5970,19 +6188,8 @@
       </w:r>
     </w:p>
     <w:p>
-      <w:pPr>
-        <w:spacing w:before="160" w:after="160"/>
-        <w:jc w:val="center"/>
-      </w:pPr>
-      <w:r>
-        <w:rPr>
-          <w:b w:val="0"/>
-          <w:i w:val="0"/>
-          <w:color w:val="D4A017"/>
-          <w:sz w:val="22"/>
-          <w:rFonts w:ascii="FreeSans" w:hAnsi="FreeSans" w:cs="FreeSans"/>
-        </w:rPr>
-        <w:t>★  ★  ★</w:t>
+      <w:r>
+        <w:t>★★★</w:t>
       </w:r>
     </w:p>
     <w:p>
@@ -6043,7 +6250,12 @@
     </w:p>
     <w:p>
       <w:r>
-        <w:t>Deux affaires donnent un visage à cette armée fantôme. Rémy Juan Quignolot, d'abord: ancien sous-officier français reconverti dans la sécurité privée, installé en Centrafrique depuis 2013, arrêté à Bangui le 10 mai 2021. Les photos publiées par le média Ndjoni Sango montrent un arsenal militaire complet étalé au sol. Cinq chefs d'accusation: espionnage, détention illégale d'armes, association de malfaiteurs, atteinte à la sûreté de l'État, complot. Il est exfiltré via Libreville le 21 mai 2023 — et la cellule Afrique de l'Élysée, Franck Paris et Nadège Chouat, est impliquée dans les tractations (Le Parisien, 21 mai 2023). Yann Vésilier, ensuite: agent de la DGSE arrêté à Bamako, accusé de préparation d'un renversement, toujours détenu au Mali à l'heure où s'écrivent ces lignes. Le Quai d'Orsay a parlé d'« instrumentalisation manifeste» pour Quignolot; il n'a pas eu les mêmes mots pour Vésilier. Deux pays, deux agents, un même mode opératoire: déploiement clandestin, arrestation par des autorités souverainistes, exfiltration diplomatique ou détention prolongée.</w:t>
+        <w:t>La Centrafrique est, dans ce tableau, le précédent fondateur. En décembre 2020, à quelques jours de l'élection présidentielle, les forces de l'ex-président François Bozizé — accompagnées de mercenaires tchadiens et soudanais — tentent de renverser Faustin-Archange Touadéra. L'offensive est stoppée par les FACA, épaulées par l'aviation russe et des conseillers russes: c'est la première fois que ce modèle — armée nationale africaine appuyée par Moscou contre une offensive soutenue par des réseaux extérieurs — est éprouvé grandeur nature. La déstabilisation ne s'arrête pas avec l'échec militaire: elle continue par d'autres canaux — rapports d'ONG, procédures judiciaires internationales, campagnes visant la notation souveraine pour bloquer l'accès aux investissements. Luc Michel (source engagée déjà rencontrée aux chapitres précédents) désigne ce dispositif comme une guerre de quatrième génération. Sa lecture est partisane; le mécanisme qu'elle pointe — faire saisir les leviers de la crédibilité internationale pour asphyxier économiquement un État souverain — est, lui, documenté dans d'autres contextes géopolitiques. Ce que la Centrafrique a subi à partir de 2020, les États de l'AES en expérimenteront les variantes dès 2021.</w:t>
+      </w:r>
+    </w:p>
+    <w:p>
+      <w:r>
+        <w:t>Deux affaires donnent ensuite un visage à cette armée fantôme. Rémy Juan Quignolot, d'abord: ancien sous-officier français reconverti dans la sécurité privée, installé en Centrafrique depuis 2013, arrêté à Bangui le 10 mai 2021. Les photos publiées par le média Ndjoni Sango montrent un arsenal militaire complet étalé au sol. Cinq chefs d'accusation: espionnage, détention illégale d'armes, association de malfaiteurs, atteinte à la sûreté de l'État, complot. Il est exfiltré via Libreville le 21 mai 2023 — et la cellule Afrique de l'Élysée, Franck Paris et Nadège Chouat, est impliquée dans les tractations (Le Parisien, 21 mai 2023). Yann Vésilier, ensuite: agent de la DGSE arrêté à Bamako, accusé de préparation d'un renversement, toujours détenu au Mali à l'heure où s'écrivent ces lignes. Le Quai d'Orsay a parlé d'« instrumentalisation manifeste» pour Quignolot; il n'a pas eu les mêmes mots pour Vésilier. Deux pays, deux agents, un même mode opératoire: déploiement clandestin, arrestation par des autorités souverainistes, exfiltration diplomatique ou détention prolongée.</w:t>
       </w:r>
     </w:p>
     <w:p>
@@ -6131,6 +6343,11 @@
       </w:pPr>
       <w:r>
         <w:t>Le 25 avril, et l'homme qu'il fallait tuer</w:t>
+      </w:r>
+    </w:p>
+    <w:p>
+      <w:r>
+        <w:t>---ENCADRE---</w:t>
       </w:r>
     </w:p>
     <w:tbl>
@@ -6273,6 +6490,11 @@
     <w:p/>
     <w:p>
       <w:r>
+        <w:t>---FIN---</w:t>
+      </w:r>
+    </w:p>
+    <w:p>
+      <w:r>
         <w:t>La coordination entre jihadistes et séparatistes, longtemps niée, s'affiche cette fois publiquement: Iyad Ag Ghali, chef du JNIM, et Alghabass Ag Intala commentent ensemble les attaques en vidéo; et le porte-parole du FLA déclare, sans qu'on le lui demande: « Nous avons de bons contacts avec les Ukrainiens tout comme avec la France, avec les États-Unis, avec presque tout le monde.» Banda Kani va plus loin: il décrit un contingent d'environ 12 000 hommes mêlant recrues sahéliennes précarisées et encadrement étranger, et des chefs de groupes armés en contact direct avec des cercles stratégiques français. L'analyste Laith Marouf apporte un éclairage complémentaire sur la composition de cet encadrement: des combattants issus des milices liées à Ahmad al-Sharaa, constituées dans le creuset syrien, auraient été progressivement redéployés vers le Sahel à mesure que leur noyau résiduel en Syrie fragilisait son emprise territoriale. Greffe algérienne des années 1990, armes libyennes de 2011, miliciens syriens de l'après-2024 — l'internationalisation de la force combattante au Sahel suit la chronologie des effondrements régionaux que l'Occident a provoqués ou laissé prospérer.</w:t>
       </w:r>
     </w:p>
@@ -6304,6 +6526,24 @@
         <w:pStyle w:val="Heading2"/>
       </w:pPr>
       <w:r>
+        <w:t>Tiani l'avait annoncé</w:t>
+      </w:r>
+    </w:p>
+    <w:p>
+      <w:r>
+        <w:t>Cinq mois avant l'attentat, l'avertissement était public. Le 13 novembre 2025, dans une allocution filmée à l'intérieur du pays, le général Tiani décrit un plan dont les attaques du 25 avril 2026 donneront une première réalisation. Selon lui, « il y a trois ou quatre mois» — soit à l'été 2025 —, une réunion s'est tenue dans un espace du Sahel, où « les sponsors de ces mercenaires» auraient arrêté un projet de partition. La séquence prévue, telle qu'il la rapporte: frapper d'abord le Mali, puis le « balkaniser» en quatre émirats — l'Azawad du FLA, le Macina, Tombouctou, le Serma-Gourma —, le Burkina et le Niger devant pour leur part être placés « chacun sous l'autorité d'un émir». L'allégation repose sur une source unique — Tiani lui-même — et doit être maniée comme telle. Mais le calendrier lui a donné un relief que nul ne peut ignorer: cinq mois plus tard, le Mali était attaqué, le FLA reprenait brièvement Kidal, et la coordination jihadistes-séparatistes s'affichait au grand jour. Tiani y joignait son argument militaire récurrent: ces combattants à moto, à vélo, parfois à pied, bénéficient « plus que les FDS» d'une couverture aérienne qui les renseigne sur les positions et les mouvements de l'armée — un appui qu'aucun groupe livré à lui-même ne possède.</w:t>
+      </w:r>
+    </w:p>
+    <w:p>
+      <w:r>
+        <w:t>Le second volet de l'avertissement est plus troublant encore, car il décrit un mécanisme, pas un événement. Tiani annonce une requalification programmée des combattants: on leur demanderait d'abandonner le vocabulaire du « jihad global» et d'adoucir les méthodes les plus brutales — décapitations, amputations, lapidations —; alors ils seraient présentés comme des « islamistes», puis, plus tard, comme des « révolutionnaires». « Ils ont reflué sur la religion pour nous faire avaler la pilule», résume-t-il, avant de citer les précédents: Afghanistan, Irak, Syrie, et la Libye « à notre frontière». Or c'est très exactement la doctrine qu'un responsable français allait formuler cinq mois plus tard — sans savoir, ou sans se soucier, qu'il confirmait la prophétie nigérienne.</w:t>
+      </w:r>
+    </w:p>
+    <w:p>
+      <w:pPr>
+        <w:pStyle w:val="Heading2"/>
+      </w:pPr>
+      <w:r>
         <w:t>L'agenda révélé: le JNIM comme futur acteur politique</w:t>
       </w:r>
     </w:p>
@@ -6353,19 +6593,8 @@
       </w:r>
     </w:p>
     <w:p>
-      <w:pPr>
-        <w:spacing w:before="160" w:after="160"/>
-        <w:jc w:val="center"/>
-      </w:pPr>
-      <w:r>
-        <w:rPr>
-          <w:b w:val="0"/>
-          <w:i w:val="0"/>
-          <w:color w:val="D4A017"/>
-          <w:sz w:val="22"/>
-          <w:rFonts w:ascii="FreeSans" w:hAnsi="FreeSans" w:cs="FreeSans"/>
-        </w:rPr>
-        <w:t>★  ★  ★</w:t>
+      <w:r>
+        <w:t>★★★</w:t>
       </w:r>
     </w:p>
     <w:p>
@@ -6496,6 +6725,11 @@
     <w:p>
       <w:r>
         <w:t>Reste un acteur que peu de lecteurs attendraient dans ce tableau, et que la recherche institutionnelle européenne elle-même a fini par nommer. En mai 2026, le SWP — l'Institut allemand pour les affaires internationales et la sécurité, qui conseille le gouvernement fédéral — publie une note signée Gerrit Kurtz, Wolfram Lacher et Stephan Roll sur « le rôle déstabilisateur des Émirats arabes unis dans les conflits africains». Sa conclusion: « Les Émirats arabes unis sont devenus l'un des acteurs extérieurs les plus agressifs dans les conflits africains. Son rôle entrave les efforts de résolution des conflits et aggrave les crises humanitaires ainsi que l'instabilité régionale» (SWP Comment n° 19, mai 2026).</w:t>
+      </w:r>
+    </w:p>
+    <w:p>
+      <w:r>
+        <w:t>---ENCADRE---</w:t>
       </w:r>
     </w:p>
     <w:tbl>
@@ -6638,6 +6872,11 @@
     <w:p/>
     <w:p>
       <w:r>
+        <w:t>---FIN---</w:t>
+      </w:r>
+    </w:p>
+    <w:p>
+      <w:r>
         <w:t>La guerre du Soudan ainsi alimentée a produit la plus grande crise humanitaire du monde: 33,7 millions de personnes dépendantes de l'aide selon l'ONU. Pour le dire simplement, un embargo de l'ONU est une interdiction internationale de livrer des armes à une zone de conflit; 458 vols cargo militaires en quatorze mois donnent la mesure de ce que vaut cette interdiction quand le contrevenant est riche et bien introduit. Détail qui ramène au cœur de notre sujet: le système de défense Galix, de fabrication française, a été retrouvé sur des blindés émiratis au Soudan. Les armes françaises participent au conflit soudanais — via les Émirats comme intermédiaire. Et le silence européen n'est pas une distraction: il est organisé, comme le montre le sort des amendements bloqués au Parlement européen. Pour l'AES, la leçon est immédiate: la guerre proxy décrite au chapitre précédent n'est pas une exclusivité française; c'est une méthode, dont le Soudan voisin offre la version la plus aboutie — et le Tchad, frontalier du Niger, en est déjà un maillon.</w:t>
       </w:r>
     </w:p>
@@ -6718,19 +6957,8 @@
       </w:r>
     </w:p>
     <w:p>
-      <w:pPr>
-        <w:spacing w:before="160" w:after="160"/>
-        <w:jc w:val="center"/>
-      </w:pPr>
-      <w:r>
-        <w:rPr>
-          <w:b w:val="0"/>
-          <w:i w:val="0"/>
-          <w:color w:val="D4A017"/>
-          <w:sz w:val="22"/>
-          <w:rFonts w:ascii="FreeSans" w:hAnsi="FreeSans" w:cs="FreeSans"/>
-        </w:rPr>
-        <w:t>★  ★  ★</w:t>
+      <w:r>
+        <w:t>★★★</w:t>
       </w:r>
     </w:p>
     <w:p>
@@ -6774,19 +7002,8 @@
       </w:pPr>
     </w:p>
     <w:p>
-      <w:pPr>
-        <w:spacing w:before="160" w:after="160"/>
-        <w:jc w:val="center"/>
-      </w:pPr>
-      <w:r>
-        <w:rPr>
-          <w:b w:val="0"/>
-          <w:i w:val="0"/>
-          <w:color w:val="D4A017"/>
-          <w:sz w:val="22"/>
-          <w:rFonts w:ascii="FreeSans" w:hAnsi="FreeSans" w:cs="FreeSans"/>
-        </w:rPr>
-        <w:t>★  ★  ★</w:t>
+      <w:r>
+        <w:t>★★★</w:t>
       </w:r>
     </w:p>
     <w:p>
@@ -6795,19 +7012,8 @@
       </w:r>
     </w:p>
     <w:p>
-      <w:pPr>
-        <w:spacing w:before="160" w:after="160"/>
-        <w:jc w:val="center"/>
-      </w:pPr>
-      <w:r>
-        <w:rPr>
-          <w:b w:val="0"/>
-          <w:i w:val="0"/>
-          <w:color w:val="D4A017"/>
-          <w:sz w:val="22"/>
-          <w:rFonts w:ascii="FreeSans" w:hAnsi="FreeSans" w:cs="FreeSans"/>
-        </w:rPr>
-        <w:t>★  ★  ★</w:t>
+      <w:r>
+        <w:t>★★★</w:t>
       </w:r>
     </w:p>
     <w:p>
@@ -6864,6 +7070,24 @@
         <w:pStyle w:val="Heading2"/>
       </w:pPr>
       <w:r>
+        <w:t>Boganda: le nom comme programme fédéral</w:t>
+      </w:r>
+    </w:p>
+    <w:p>
+      <w:r>
+        <w:t>Il manque à cette galerie un visage d'Afrique centrale, et c'est un vétéran de la vie politique centrafricaine, Fidèle Gouandjika, qui en a rappelé la mémoire dans un long récit en sango sur la fondation de son pays. Ce visage est celui de Barthélemy Boganda. Prêtre catholique devenu tribun, fondateur du Mouvement pour l'évolution sociale de l'Afrique noire (MESAN) et premier président du Grand Conseil de l'Afrique-Équatoriale française, Boganda porte, à la fin des années 1950, le même rêve que Nkrumah à l'autre bout du continent: non pas des micro-États juxtaposés, mais une fédération. Sa formule à lui est « les États-Unis d'Afrique latine» — l'union des quatre territoires de l'AEF (Tchad, Oubangui-Chari, Moyen-Congo, Gabon), élargie à terme aux autres colonies latines du continent. Contre la balkanisation programmée à Paris, il oppose un seul ensemble assez vaste pour peser.</w:t>
+      </w:r>
+    </w:p>
+    <w:p>
+      <w:r>
+        <w:t>Cette ambition est inscrite jusque dans un nom. Quand Boganda proclame, le 1er décembre 1958, la « République centrafricaine», il ne rebaptise pas seulement l'Oubangui-Chari: il choisit délibérément un nom de fédération — « Centrafrique» devait désigner le noyau d'un futur ensemble régional, non les bornes d'un seul territoire. Le nom était un programme. Il ne fut jamais réalisé. Le 29 mars 1959, à quelques mois de l'indépendance, l'avion de Boganda se disloque en vol près de Boukpayanga, sur le chemin de Bangui. Des traces suspectes auraient été relevées dans les débris; l'enquête conduite sous autorité française n'a jamais tranché, et le soupçon d'un attentat n'a jamais été levé — c'est, en Centrafrique, une conviction largement partagée, que rien d'officiel n'a confirmé ni démenti. Ce qui est certain, c'est le résultat: sans Boganda, le projet fédéral équatorial s'éteint; en 1960, les quatre territoires accèdent séparément à l'indépendance, exactement comme Paris le souhaitait. La balkanisation que l'AES s'efforce aujourd'hui de défaire, un homme avait tenté de l'empêcher avant même qu'elle ne s'installe. Il n'en a pas eu le temps.</w:t>
+      </w:r>
+    </w:p>
+    <w:p>
+      <w:pPr>
+        <w:pStyle w:val="Heading2"/>
+      </w:pPr>
+      <w:r>
         <w:t>Le 17 janvier 1961</w:t>
       </w:r>
     </w:p>
@@ -6903,6 +7127,11 @@
     <w:p>
       <w:r>
         <w:t>Le 19 novembre 1968, de jeunes officiers menés par le lieutenant Moussa Traoré renversent Modibo Keïta. L'expérience monétaire est enterrée, le Mali rentre dans le rang. Le premier président du Mali indépendant meurt en détention à Bamako le 16 mai 1977, sans jugement.</w:t>
+      </w:r>
+    </w:p>
+    <w:p>
+      <w:r>
+        <w:t>---ENCADRE---</w:t>
       </w:r>
     </w:p>
     <w:tbl>
@@ -7098,6 +7327,11 @@
     </w:tbl>
     <w:p/>
     <w:p>
+      <w:r>
+        <w:t>---FIN---</w:t>
+      </w:r>
+    </w:p>
+    <w:p>
       <w:pPr>
         <w:pStyle w:val="Heading2"/>
       </w:pPr>
@@ -7121,19 +7355,8 @@
       </w:r>
     </w:p>
     <w:p>
-      <w:pPr>
-        <w:spacing w:before="160" w:after="160"/>
-        <w:jc w:val="center"/>
-      </w:pPr>
-      <w:r>
-        <w:rPr>
-          <w:b w:val="0"/>
-          <w:i w:val="0"/>
-          <w:color w:val="D4A017"/>
-          <w:sz w:val="22"/>
-          <w:rFonts w:ascii="FreeSans" w:hAnsi="FreeSans" w:cs="FreeSans"/>
-        </w:rPr>
-        <w:t>★  ★  ★</w:t>
+      <w:r>
+        <w:t>★★★</w:t>
       </w:r>
     </w:p>
     <w:p>
@@ -7190,6 +7413,11 @@
     <w:p>
       <w:r>
         <w:t>Pour comprendre pourquoi cette mort n'est pas un fait divers ouest-africain, il faut mesurer ce qui s'était passé entre le 4 août 1983 — la prise de pouvoir du Conseil national de la révolution — et ce discours d'Addis-Abeba. Quatre ans. Le capitaine Sankara rebaptise la Haute-Volta, nom de colonie, en Burkina Faso: le pays des hommes intègres. Et il gouverne comme personne n'avait gouverné sur le continent.</w:t>
+      </w:r>
+    </w:p>
+    <w:p>
+      <w:r>
+        <w:t>---ENCADRE---</w:t>
       </w:r>
     </w:p>
     <w:tbl>
@@ -7314,6 +7542,11 @@
     <w:p/>
     <w:p>
       <w:r>
+        <w:t>---FIN---</w:t>
+      </w:r>
+    </w:p>
+    <w:p>
+      <w:r>
         <w:t>C'est, à ce jour, le programme de souveraineté africaine le plus ambitieux jamais réalisé sur le continent. Pas proclamé: réalisé. Sankara refusait l'aide française conditionnée comme il refusait les voitures de fonction de luxe — par cohérence, pas par posture.</w:t>
       </w:r>
     </w:p>
@@ -7379,19 +7612,8 @@
       </w:r>
     </w:p>
     <w:p>
-      <w:pPr>
-        <w:spacing w:before="160" w:after="160"/>
-        <w:jc w:val="center"/>
-      </w:pPr>
-      <w:r>
-        <w:rPr>
-          <w:b w:val="0"/>
-          <w:i w:val="0"/>
-          <w:color w:val="D4A017"/>
-          <w:sz w:val="22"/>
-          <w:rFonts w:ascii="FreeSans" w:hAnsi="FreeSans" w:cs="FreeSans"/>
-        </w:rPr>
-        <w:t>★  ★  ★</w:t>
+      <w:r>
+        <w:t>★★★</w:t>
       </w:r>
     </w:p>
     <w:p>
@@ -7459,6 +7681,11 @@
     <w:p>
       <w:r>
         <w:t>Le second front est informationnel. Nathalie Yamb opère depuis l’Afrique et tient tête aux ambassadeurs français sur les réseaux. Franklin Nyamsi, philosophe franco-camerounais, retourne depuis Rouen les arguments des diplomates de l'Élysée. Jonathan Batenguène analyse depuis le Cameroun. Ces voix existent dans l'espace médiatique européen lui-même et y constituent un contre-récit crédible, en français, aux heures de grande écoute numérique. Que ce front soit pris au sérieux par l'adversaire, on en a vu la preuve au chapitre 14: l'école cyber du 43e BIMA et ses « e-patrouilleurs» chargés de cibler nommément les panafricanistes, puis l'appel d'offres de septembre 2025 pour recruter des influenceurs africains contre l'AES. On ne budgétise pas une contre-offensive contre un front qui n'existe pas.</w:t>
+      </w:r>
+    </w:p>
+    <w:p>
+      <w:r>
+        <w:t>---ENCADRE---</w:t>
       </w:r>
     </w:p>
     <w:tbl>
@@ -7546,6 +7773,11 @@
     </w:tbl>
     <w:p/>
     <w:p>
+      <w:r>
+        <w:t>---FIN---</w:t>
+      </w:r>
+    </w:p>
+    <w:p>
       <w:pPr>
         <w:pStyle w:val="Heading2"/>
       </w:pPr>
@@ -7569,19 +7801,8 @@
       </w:r>
     </w:p>
     <w:p>
-      <w:pPr>
-        <w:spacing w:before="160" w:after="160"/>
-        <w:jc w:val="center"/>
-      </w:pPr>
-      <w:r>
-        <w:rPr>
-          <w:b w:val="0"/>
-          <w:i w:val="0"/>
-          <w:color w:val="D4A017"/>
-          <w:sz w:val="22"/>
-          <w:rFonts w:ascii="FreeSans" w:hAnsi="FreeSans" w:cs="FreeSans"/>
-        </w:rPr>
-        <w:t>★  ★  ★</w:t>
+      <w:r>
+        <w:t>★★★</w:t>
       </w:r>
     </w:p>
     <w:p>
@@ -7711,6 +7932,11 @@
     <w:p>
       <w:r>
         <w:t>Sur ce point, la pièce la plus troublante du dossier ne vient ni de Bamako ni de Moscou. Elle vient de Mohamed Bazoum lui-même — président déposé du Niger, adversaire déclaré des transitions — dans sa grande interview à RFI et France 24. Fait remarquable: en défendant le système, il en a confirmé, point par point, le diagnostic. On les a appelés les cinq aveux involontaires; en voici la version condensée.</w:t>
+      </w:r>
+    </w:p>
+    <w:p>
+      <w:r>
+        <w:t>---ENCADRE---</w:t>
       </w:r>
     </w:p>
     <w:tbl>
@@ -7835,6 +8061,11 @@
     <w:p/>
     <w:p>
       <w:r>
+        <w:t>---FIN---</w:t>
+      </w:r>
+    </w:p>
+    <w:p>
+      <w:r>
         <w:t>Et l'aveu qui les couronne tous: « Les gens du village qui sont victimes du terrorisme ne savent pas qu'il y a des Français ici au Niger, ou des Américains, ou des Russes.» Un président élu décrivant un dispositif militaire étranger invisible à son propre peuple — c'est la définition même de la souveraineté confisquée. Bazoum n'était ni incompétent ni cynique: son dossier anticorruption était réel, ses internats pour filles aussi. Il a géré la dépendance avec sérieux. Mais aucun président élu au Niger ne pouvait expulser la France et reprendre Imouraren — non par manque de volonté: parce que le système ne le permettait pas. L'AES n'est pas une révolution contre la mauvaise gouvernance. C'est une révolution contre la limite structurelle que la meilleure gouvernance compradore ne pouvait pas franchir. Bazoum l'a prouvé en la subissant.</w:t>
       </w:r>
     </w:p>
@@ -7854,6 +8085,11 @@
     <w:p>
       <w:r>
         <w:t>Alors, à quoi juger l'AES? À trois questions — pas une de moins, pas une de plus.</w:t>
+      </w:r>
+    </w:p>
+    <w:p>
+      <w:r>
+        <w:t>---ENCADRE---</w:t>
       </w:r>
     </w:p>
     <w:tbl>
@@ -7942,6 +8178,11 @@
     <w:p/>
     <w:p>
       <w:r>
+        <w:t>---FIN---</w:t>
+      </w:r>
+    </w:p>
+    <w:p>
+      <w:r>
         <w:t>Cette troisième question est la plus lourde: on verra au chapitre 26 comment la précarisation des communautés peules fabrique des combattants, et Yamb rappelle que la « protection des minorités» sert aussi, depuis les guerres de Yougoslavie, de levier d'intervention et de fragmentation. Raison de plus, et non de moins, d'y répondre: pour désamorcer l'arme, l'AES doit traiter ses minorités avec plus de justice que ses adversaires ne la traitent elle-même — c'est tout le sens de la phrase de Sankara placée en tête de ce chapitre. À ces trois questions, les réponses ne sont pas définitives. L'AES est en construction; ses transitions sont des processus ouverts, non des aboutissements figés.</w:t>
       </w:r>
     </w:p>
@@ -7956,19 +8197,8 @@
       </w:r>
     </w:p>
     <w:p>
-      <w:pPr>
-        <w:spacing w:before="160" w:after="160"/>
-        <w:jc w:val="center"/>
-      </w:pPr>
-      <w:r>
-        <w:rPr>
-          <w:b w:val="0"/>
-          <w:i w:val="0"/>
-          <w:color w:val="D4A017"/>
-          <w:sz w:val="22"/>
-          <w:rFonts w:ascii="FreeSans" w:hAnsi="FreeSans" w:cs="FreeSans"/>
-        </w:rPr>
-        <w:t>★  ★  ★</w:t>
+      <w:r>
+        <w:t>★★★</w:t>
       </w:r>
     </w:p>
     <w:p>
@@ -8012,19 +8242,8 @@
       </w:pPr>
     </w:p>
     <w:p>
-      <w:pPr>
-        <w:spacing w:before="160" w:after="160"/>
-        <w:jc w:val="center"/>
-      </w:pPr>
-      <w:r>
-        <w:rPr>
-          <w:b w:val="0"/>
-          <w:i w:val="0"/>
-          <w:color w:val="D4A017"/>
-          <w:sz w:val="22"/>
-          <w:rFonts w:ascii="FreeSans" w:hAnsi="FreeSans" w:cs="FreeSans"/>
-        </w:rPr>
-        <w:t>★  ★  ★</w:t>
+      <w:r>
+        <w:t>★★★</w:t>
       </w:r>
     </w:p>
     <w:p>
@@ -8048,19 +8267,8 @@
       </w:r>
     </w:p>
     <w:p>
-      <w:pPr>
-        <w:spacing w:before="160" w:after="160"/>
-        <w:jc w:val="center"/>
-      </w:pPr>
-      <w:r>
-        <w:rPr>
-          <w:b w:val="0"/>
-          <w:i w:val="0"/>
-          <w:color w:val="D4A017"/>
-          <w:sz w:val="22"/>
-          <w:rFonts w:ascii="FreeSans" w:hAnsi="FreeSans" w:cs="FreeSans"/>
-        </w:rPr>
-        <w:t>★  ★  ★</w:t>
+      <w:r>
+        <w:t>★★★</w:t>
       </w:r>
     </w:p>
     <w:p>
@@ -8117,6 +8325,11 @@
     <w:p>
       <w:r>
         <w:t>Concrètement, un blocus de carburant est une arme qui ne vise pas l'armée mais la vie quotidienne: sans essence, plus de transport de marchandises, plus de groupes électrogènes, plus de pompes à eau — un pays entier qui ralentit jusqu'à l'arrêt. C'est une guerre économique, pas seulement militaire. Et son issue dit quelque chose d'essentiel sur le rapport de force.</w:t>
+      </w:r>
+    </w:p>
+    <w:p>
+      <w:r>
+        <w:t>---ENCADRE---</w:t>
       </w:r>
     </w:p>
     <w:tbl>
@@ -8241,6 +8454,11 @@
     <w:p/>
     <w:p>
       <w:r>
+        <w:t>---FIN---</w:t>
+      </w:r>
+    </w:p>
+    <w:p>
+      <w:r>
         <w:t>Le blocus a échoué — mais pas seulement à cause des convois militaires. Le JNIM a commis des erreurs que ses adversaires n'auraient pas su provoquer. L'assassinat public de Mariam Cissé, la jeune blogueuse de Tonka dont nous avons croisé la trajectoire au chapitre 24, a retourné l'opinion malienne contre le groupe plus efficacement que n'importe quelle communication gouvernementale. « Un terrorisme asymétrique ciblant les civils relève de la lâcheté stratégique, qui elle-même repose sur l'instrumentalisation venue d'ailleurs», résume Amaïzo (29 novembre 2025).</w:t>
       </w:r>
     </w:p>
@@ -8347,19 +8565,8 @@
       </w:r>
     </w:p>
     <w:p>
-      <w:pPr>
-        <w:spacing w:before="160" w:after="160"/>
-        <w:jc w:val="center"/>
-      </w:pPr>
-      <w:r>
-        <w:rPr>
-          <w:b w:val="0"/>
-          <w:i w:val="0"/>
-          <w:color w:val="D4A017"/>
-          <w:sz w:val="22"/>
-          <w:rFonts w:ascii="FreeSans" w:hAnsi="FreeSans" w:cs="FreeSans"/>
-        </w:rPr>
-        <w:t>★  ★  ★</w:t>
+      <w:r>
+        <w:t>★★★</w:t>
       </w:r>
     </w:p>
     <w:p>
@@ -8421,6 +8628,11 @@
     <w:p>
       <w:r>
         <w:t>Concrètement, une convention fiscale bilatérale permettait aux multinationales françaises de rapatrier leurs profits — dividendes, intérêts, redevances — en payant très peu d'impôts sur place. La dénoncer, c'est rétablir le droit commun: les profits réalisés au Sahel y sont désormais taxés comme partout ailleurs. Ce n'est pas une déclaration politique. C'est la suppression juridique des instruments de l'extraction.</w:t>
+      </w:r>
+    </w:p>
+    <w:p>
+      <w:r>
+        <w:t>---ENCADRE---</w:t>
       </w:r>
     </w:p>
     <w:tbl>
@@ -8544,6 +8756,11 @@
     </w:tbl>
     <w:p/>
     <w:p>
+      <w:r>
+        <w:t>---FIN---</w:t>
+      </w:r>
+    </w:p>
+    <w:p>
       <w:pPr>
         <w:pStyle w:val="Heading2"/>
       </w:pPr>
@@ -8615,19 +8832,8 @@
       </w:r>
     </w:p>
     <w:p>
-      <w:pPr>
-        <w:spacing w:before="160" w:after="160"/>
-        <w:jc w:val="center"/>
-      </w:pPr>
-      <w:r>
-        <w:rPr>
-          <w:b w:val="0"/>
-          <w:i w:val="0"/>
-          <w:color w:val="D4A017"/>
-          <w:sz w:val="22"/>
-          <w:rFonts w:ascii="FreeSans" w:hAnsi="FreeSans" w:cs="FreeSans"/>
-        </w:rPr>
-        <w:t>★  ★  ★</w:t>
+      <w:r>
+        <w:t>★★★</w:t>
       </w:r>
     </w:p>
     <w:p>
@@ -8683,6 +8889,20 @@
     </w:p>
     <w:p>
       <w:r>
+        <w:t>La contrainte concrète que Touadéra devait enjamber est aussi géographique. La République centrafricaine est un pays enclavé: l'intégralité de son commerce extérieur transite par les ports camerounais de Douala et de Kribi. Or le Cameroun est lui-même membre de la CEMAC et de la zone CFA. Ce verrou signifie qu'une monnaie nationale centrafricaine — aussi souveraine soit-elle en théorie — resterait, en pratique, soumise aux mécanismes de change du franc CFA à chaque importation ou exportation. Selon l'analyse de Jean-Paul Bec (</w:t>
+      </w:r>
+      <w:r>
+        <w:rPr>
+          <w:i/>
+        </w:rPr>
+        <w:t>Festin Panafricain</w:t>
+      </w:r>
+      <w:r>
+        <w:t>, 2024), c'est précisément pourquoi les Français ont «décidé de faire du centrafrique un laboratoire»: la géographie du pays le rendait presque impossible à affranchir, quelle que soit la volonté de son dirigeant. Touadéra répondait à ce double verrouillage par une double stratégie. Sur le plan sécuritaire d'abord: face au refus français de protéger son gouvernement des groupes armés, il se tourne vers la Russie — Africa Corps — geste qui lui vaut un isolement diplomatique franco-américain immédiat mais qui lui assure une présence militaire relevant de ses seules instructions. Sur le plan monétaire ensuite: enjamber le CFA par le haut, via un actif hors de portée de toute banque centrale — le bitcoin — permettant de régler des exportations de ressources sans passer par les circuits du franc.</w:t>
+      </w:r>
+    </w:p>
+    <w:p>
+      <w:r>
         <w:t>D'où la stratégie du contournement. Le 22 avril 2022, une loi fait du bitcoin le seul actif de référence légal en RCA. Le 27 juin, la présidence annonce le lancement du Sango pour le 3 juillet. Et il faut dissiper ici un malentendu: le Sango n'est pas une monnaie. C'est un écosystème numérique dont le cœur est la « tokenisation» des actifs naturels centrafricains. Concrètement, tokeniser, c'est transformer une part du sous-sol — uranium, coltan, diamants, pétrole — en titres numériques inscrits sur une blockchain, c'est-à-dire un registre que personne ne peut falsifier ni confisquer: ni un réseau bancaire, ni une banque centrale étrangère, ni un tribunal parisien.</w:t>
       </w:r>
     </w:p>
@@ -8776,6 +8996,11 @@
     <w:p>
       <w:r>
         <w:t>Une monnaie souveraine devra s'adosser à une économie réelle. Cette économie existe. Le Mali et le Burkina Faso sont les premiers producteurs africains de coton. Le Mali est le troisième producteur d'or du continent. Le Niger détient les troisièmes réserves mondiales d'uranium. L'ensemble AES produit environ 230 tonnes d'or par an. Coton, or, uranium, pétrole nigérien: la base objective est là — à condition que leur exploitation bénéficie d'abord aux budgets nationaux, et non aux actionnaires de Barrick, d'Endeavour Mining ou d'Orano.</w:t>
+      </w:r>
+    </w:p>
+    <w:p>
+      <w:r>
+        <w:t>---ENCADRE---</w:t>
       </w:r>
     </w:p>
     <w:tbl>
@@ -8900,6 +9125,11 @@
     <w:p/>
     <w:p>
       <w:r>
+        <w:t>---FIN---</w:t>
+      </w:r>
+    </w:p>
+    <w:p>
+      <w:r>
         <w:t>Les risques sont réels et doivent être nommés: une inflation de transition, des attaques spéculatives, et le précédent de tous ceux qui ont payé de leur vie d'avoir seulement évoqué la sortie du CFA — Olympio, Sankara, Kadhafi, dont le chapitre 7 a raconté le prix. Le contre-exemple existe pourtant: la Mauritanie, sortie de la zone franc dès 1973, vit avec sa propre monnaie. L'AES, elle, avance pas à pas, en sachant que sur ce terrain, une seule erreur peut coûter dix ans.</w:t>
       </w:r>
     </w:p>
@@ -8914,19 +9144,8 @@
       </w:r>
     </w:p>
     <w:p>
-      <w:pPr>
-        <w:spacing w:before="160" w:after="160"/>
-        <w:jc w:val="center"/>
-      </w:pPr>
-      <w:r>
-        <w:rPr>
-          <w:b w:val="0"/>
-          <w:i w:val="0"/>
-          <w:color w:val="D4A017"/>
-          <w:sz w:val="22"/>
-          <w:rFonts w:ascii="FreeSans" w:hAnsi="FreeSans" w:cs="FreeSans"/>
-        </w:rPr>
-        <w:t>★  ★  ★</w:t>
+      <w:r>
+        <w:t>★★★</w:t>
       </w:r>
     </w:p>
     <w:p>
@@ -8953,6 +9172,11 @@
     <w:p>
       <w:r>
         <w:t>Mais la question doit être posée, et posée frontalement: l'AES a remplacé des partenaires français par des partenaires russes, chinois et turcs. La souveraineté exige qu'on vérifie si ces nouveaux partenariats ne reproduisent pas les logiques de domination qu'ils étaient censés remplacer. Ce chapitre propose un critère pour en juger: la réversibilité. Un partenaire, on peut le congédier. Un maître, non.</w:t>
+      </w:r>
+    </w:p>
+    <w:p>
+      <w:r>
+        <w:t>---ENCADRE---</w:t>
       </w:r>
     </w:p>
     <w:tbl>
@@ -9058,6 +9282,11 @@
     </w:tbl>
     <w:p/>
     <w:p>
+      <w:r>
+        <w:t>---FIN---</w:t>
+      </w:r>
+    </w:p>
+    <w:p>
       <w:pPr>
         <w:pStyle w:val="Heading2"/>
       </w:pPr>
@@ -9076,6 +9305,11 @@
       </w:r>
     </w:p>
     <w:p>
+      <w:r>
+        <w:t>Luc Michel — la source engagée rencontrée au chapitre 11 — ajoute un détail opérationnel dont la vérification indépendante reste à faire: la Russie aurait fourni à l'armée malienne des images satellites à usage tactique. Si ce point est exact, il tranche avec ce que dix ans de présence française n'avaient pas accordé: non pas seulement de l'équipement, mais la capacité de voir et de cibler en autonomie. Le partenariat qui autonomise, contre la coopération qui maintient la dépendance.</w:t>
+      </w:r>
+    </w:p>
+    <w:p>
       <w:pPr>
         <w:pStyle w:val="Heading2"/>
       </w:pPr>
@@ -9122,6 +9356,16 @@
       </w:r>
     </w:p>
     <w:p>
+      <w:r>
+        <w:t>Une voix dissonante mérite cependant d'être versée au dossier, ne serait-ce que pour être pesée. Luc Michel — la source engagée rencontrée au chapitre 11 — récuse en bloc ce portrait: pour lui, la Turquie demeure « la deuxième puissance de l'OTAN», et son activisme africain prolongerait, sous le masque du partenariat, un projet néo-ottoman adossé au parapluie américain; il va jusqu'à présenter Ankara comme un « parrain» de réseaux jihadistes en Libye et en Syrie. La thèse est radicale et partisane, et elle se heurte à un fait têtu: ce sont les États de l'AES eux-mêmes — souverains, et précisément soucieux de ne pas troquer une tutelle contre une autre — qui ont choisi Ankara après l'avoir évaluée.</w:t>
+      </w:r>
+    </w:p>
+    <w:p>
+      <w:r>
+        <w:t>Dans le débat même où Michel l'expose, un autre analyste africain lui répond — et son argumentaire recoupe celui de ce livre. La Turquie, objecte-t-il, n'est pas réductible à un pion de l'Occident: elle achète des systèmes de défense russes S-400 au mépris des injonctions de l'OTAN; elle est elle-même la cible d'attaques monétaires occidentales qui ont divisé sa monnaie; et sur les chantiers africains, elle emploie une main-d'œuvre locale là où d'autres importent la leur. L'Algérie elle-même, longtemps méfiante, s'accommode de la présence turque en Libye — qui a contribué à contenir l'offensive du maréchal Haftar, lequel avait menacé Alger. Surtout, conclut-il, ces investissements « ne se font pas sur un rapport de maître à esclave». C'est exactement le critère de ce livre. Que la relation turque soit née d'un calcul d'Erdoğan ne la disqualifie pas: elle se juge à sa réversibilité et à ses actes — sur ce qu'Ankara livre réellement et à quelles conditions —, non aux généalogies impériales que lui prêtent ses adversaires.</w:t>
+      </w:r>
+    </w:p>
+    <w:p>
       <w:pPr>
         <w:pStyle w:val="Heading2"/>
       </w:pPr>
@@ -9163,19 +9407,8 @@
       </w:r>
     </w:p>
     <w:p>
-      <w:pPr>
-        <w:spacing w:before="160" w:after="160"/>
-        <w:jc w:val="center"/>
-      </w:pPr>
-      <w:r>
-        <w:rPr>
-          <w:b w:val="0"/>
-          <w:i w:val="0"/>
-          <w:color w:val="D4A017"/>
-          <w:sz w:val="22"/>
-          <w:rFonts w:ascii="FreeSans" w:hAnsi="FreeSans" w:cs="FreeSans"/>
-        </w:rPr>
-        <w:t>★  ★  ★</w:t>
+      <w:r>
+        <w:t>★★★</w:t>
       </w:r>
     </w:p>
     <w:p>
@@ -9315,6 +9548,39 @@
         <w:pStyle w:val="Heading2"/>
       </w:pPr>
       <w:r>
+        <w:t>Montpellier 2021: la société civile comme instrument</w:t>
+      </w:r>
+    </w:p>
+    <w:p>
+      <w:r>
+        <w:t>Le procédé n'était pas neuf. Le 8 octobre 2021, à Montpellier, Emmanuel Macron avait déjà tenu un « Nouveau Sommet Afrique-France» d'un genre inédit: aucun chef d'État africain invité, mais un parterre de jeunes « issus de la société civile», sélectionnés aux quatre coins du continent. Officiellement, il s'agissait de tourner la page des « dirigeants corrompus» et de réinventer un imaginaire. À l'hémicycle, un député français lui-même s'interrogeait: Macron est-il « devenu le président des Africains»? Au Mali, le Conseil national de la jeunesse adressa une lettre à l'ambassade de France pour désavouer ceux qui avaient prétendu représenter le pays. Le format — un président français parlant à une « jeunesse africaine» triée, sans les États — annonçait trait pour trait le sommet diaspora de l'Élysée quatre ans plus tard.</w:t>
+      </w:r>
+    </w:p>
+    <w:p>
+      <w:r>
+        <w:t>Tout n'y fut pas docile pour autant. Une jeune Burkinabè y lança au président ses « quatre vérités», filant un proverbe de la marmite: on ne change pas de plat tant que la marmite reste sale — et la marmite, c'était la Françafrique. Macron en rit sur l'estrade, sous les applaudissements. Le rire valait réponse: on écoute la contestation, on ne change pas de politique. Une autre intervenante recadra l'enjeu d'une formule qui disait tout du basculement des attentes — « vous n'êtes pas là pour nous aider à nous développer; nous sommes là pour co-développer». La seule relation que cette génération acceptât désormais tenait dans ce préfixe: d'égal à égal, ou rien.</w:t>
+      </w:r>
+    </w:p>
+    <w:p>
+      <w:r>
+        <w:t>Luc Michel, déjà rencontré au chapitre 11, en propose une lecture plus radicale, qu'on rapporte avec sa charge militante. Pour lui, Montpellier est la « version française» d'un dispositif américain rodé: la « société civile» comme levier. Il rappelle le précédent du sommet États-Unis-Afrique d'août 2014, à Washington, où Obama avait reçu les chefs d'État — et où s'était tenu, en marge, un contre-sommet de la « société civile» africaine. Le mécanisme, soutient-il, est celui des « révolutions de couleur» éprouvées depuis Belgrade en 2000: financer et promouvoir des groupes de jeunes présentés comme spontanés, pour fragiliser des pouvoirs jugés indociles et préparer leur remplacement. On n'est pas tenu de suivre Michel jusqu'au bout — sa thèse est partisane et verse, par endroits, dans la dénonciation tous azimuts. Mais son noyau rejoint, par un autre chemin, la thèse centrale de ce chapitre: faute de pouvoir envoyer des soldats ou de recevoir des présidents, on convoque une « société civile» choisie. L'instrument change; l'objectif — façonner l'interlocuteur plutôt que de le rencontrer — demeure.</w:t>
+      </w:r>
+    </w:p>
+    <w:p>
+      <w:r>
+        <w:t>Cette lecture, on n'est pas tenu de la croire sur parole — sauf qu'une source insoupçonnable la recoupe. Le « scénario noir» de L'Express évoqué au chapitre 12, élaboré avec une quarantaine de chercheurs, généraux et anciens des services, et dont l'hebdomadaire précise qu'il « recoupe ceux sur lesquels l'armée française travaille déjà», énumère les leviers que Paris garde en main pour l'après-rupture. L'un d'eux y est formulé sans détour: « les Français mènent aujourd'hui de vrais efforts souterrains pour maintenir un contact avec les sociétés civiles des pays en question, de manière, le moment venu, à redevenir l'interlocuteur préférentiel.» La phrase ne sort pas d'un pamphlet panafricaniste: elle vient d'un travail d'establishment, adossé à l'armée et au renseignement. Ce que Michel dénonce comme une manœuvre, l'expertise française l'assume comme une stratégie. « Efforts souterrains», « interlocuteur préférentiel»: le vocabulaire dit tout. La société civile n'est pas seulement écoutée — elle est cultivée, en sous-main, comme la voie de retour.</w:t>
+      </w:r>
+    </w:p>
+    <w:p>
+      <w:r>
+        <w:t>Reste à distinguer, car tout dépend ici de la ligne de partage. Toute société civile africaine n'est pas un faux-nez: les syndicalistes, les intellectuels critiques, les oppositions en exil que réclamait Tchicaya à l'Élysée en sont la part la plus vivante. Le soupçon de Michel ne vaut que pour les vitrines fabriquées — celles que l'on invite précisément parce qu'elles ne porteront pas la contradiction. La frontière n'est pas « société civile contre États»; elle passe entre les voix qui émanent des peuples et celles que l'on convoque pour en tenir lieu.</w:t>
+      </w:r>
+    </w:p>
+    <w:p>
+      <w:pPr>
+        <w:pStyle w:val="Heading2"/>
+      </w:pPr>
+      <w:r>
         <w:t>Le sommet diaspora, ou le recyclage des paradigmes</w:t>
       </w:r>
     </w:p>
@@ -9378,23 +9644,404 @@
     </w:p>
     <w:p>
       <w:r>
+        <w:t>Luc Michel — rencontré aux chapitres 11 et 29, avec sa charge partisane assumée — y lit le comportement d'une puissance qui n'a pas ajusté son attitude à son rang réel: superpuissance jusqu'à Waterloo, grande puissance jusqu'en 1940, puissance secondaire depuis lors — mais puissance secondaire refusant de se conduire comme telle. La formule est militante dans sa forme, mais elle rejoint un diagnostic plus sobre que la science politique a depuis longtemps entériné: depuis de Gaulle, la France compense par l'affirmation symbolique ce qu'elle ne peut plus soutenir par les moyens matériels. Et ce que Michel énonce à charge, le général Lecointre l'a depuis confirmé dans la langue de l'institution (chapitre 15): si l'Europe doit un jour « agir comme une entité politique» et défendre ses intérêts « par l'engagement de ses armées», c'est bien que la France, seule, ne le peut plus. La forme diffère; le constat est le même. En Afrique, ce décalage prend une forme particulière. Michel y voit simultanément cinq fronts de confrontation franco-russe — Mali, République centrafricaine, Liban, Biélorussie, et la guerre d'Ukraine comme arrière-fond —, dont le Sahel n'est qu'un des théâtres. Qu'il ait ou non raison sur tous les détails, ce cadre éclaire quelque chose que le mot «ingratitude» ne peut pas expliquer: une puissance sûre d'elle n'a pas besoin de ce mot. Elle l'emploie parce qu'elle a besoin de l'Afrique pour rester ce qu'elle n'est plus.</w:t>
+      </w:r>
+    </w:p>
+    <w:p>
+      <w:pPr>
+        <w:pStyle w:val="Heading2"/>
+      </w:pPr>
+      <w:r>
+        <w:t>La séquence de Nairobi, mai 2026, au crible des faits</w:t>
+      </w:r>
+    </w:p>
+    <w:p>
+      <w:r>
+        <w:t>Deux prises de parole à un jour d'intervalle condensent tout ce chapitre. Le 11 mai 2026, au sommet « Africa Forward» de Nairobi, puis le 12 mai en interview — trois semaines après l'attentat qui a coûté la vie à Sadio Camara —, Emmanuel Macron déploie la même offensive de communication: présenter une défaite de terrain comme une transformation choisie. On la pèse ici à l'aune des faits déjà établis dans ces pages. Commençons par l'interview, où il répond à une question simple: avec le recul, qu'auriez-vous fait différemment au Mali? Sa réponse illustre en acte le mécanisme central du livre.</w:t>
+      </w:r>
+    </w:p>
+    <w:p>
+      <w:r>
+        <w:t>Le premier glissement est chronologique. « La France est venue en 2013 à la demande du président Keïta», affirme Macron. Or Serval est déclenchée le 11 janvier 2013; Keïta n'est élu qu'en août. L'appel émane du président par intérim Dioncounda Traoré — et surtout, l'enquête de Raphaël Granvaud établit que le plan Sahel, volet militaire clandestin compris, était décidé dès 2008-2009 (chapitre 15). On ne « vient pas à la demande» à un dispositif préparé cinq ans à l'avance: la requête de janvier 2013 a fourni l'habillage juridique d'une présence déjà planifiée.</w:t>
+      </w:r>
+    </w:p>
+    <w:p>
+      <w:r>
+        <w:t>Le deuxième glissement escamote l'origine de l'incendie. Les groupes lourdement armés « venus par le nord» en 2012 sortaient des arsenaux libyens dispersés après l'intervention franco-otanienne de 2011 (chapitre 11). La France a contribué à allumer le feu qu'elle se présente ensuite comme venue éteindre.</w:t>
+      </w:r>
+    </w:p>
+    <w:p>
+      <w:r>
+        <w:t>Le troisième est le plus audacieux: invoquer la chute temporaire de Kidal en avril 2026 pour accabler la transition. C'est compter sur l'oubli de deux faits (chapitre 16). En mai 2013, c'est l'armée française elle-même qui interdit Kidal à l'armée malienne — le soldat refoulé ce jour-là s'appelait Assimi Goïta. Et le 14 novembre 2023, ce sont les FAMa « putschistes» méprisées par Macron qui reprennent Kidal en moins de vingt-quatre heures — ce que Barkhane n'avait pas fait en dix ans. La chute d'avril 2026 n'accuse pas la transition: elle accuse les soutiens d'un FLA qui revendique lui-même « de bons contacts avec les Ukrainiens, la France, les États-Unis» (chapitre 20).</w:t>
+      </w:r>
+    </w:p>
+    <w:p>
+      <w:r>
+        <w:t>Le quatrième renverse la charge sécuritaire: les transitions auraient « préféré des milices russes à la lutte antiterroriste». Mais c'est le chef d'état-major français Burkhard qui, à huis clos en septembre 2024, range les FAMa et Wagner dos à dos, admettant que la France « n'a pas de camp d'amis au Mali» (chapitre 15). Et c'est sous partenariat russe que Kidal fut reprise. Le critère est le résultat de terrain, pas le drapeau du partenaire.</w:t>
+      </w:r>
+    </w:p>
+    <w:p>
+      <w:r>
+        <w:t>Le cinquième est un aveu déguisé en grief: « l'ingratitude». On l'a posé plus haut: l'arrogance est le dernier refuge de qui a perdu le rapport de force. Gratitude pour quoi — l'uranium payé sous le marché soixante ans durant, les zones jihadistes triplées en sept ans de Barkhane (ACLED, chapitre 13)? Quant aux « fausses informations», sur le point décisif c'est l'adversaire qui tranche: le 9 mai 2026, une source sécuritaire française confirme sur RTL que « des ex-légionnaires francophones travaillent avec le GUR ukrainien». Macron s'emporte contre le journaliste; il ne dément pas le fond (chapitre 20).</w:t>
+      </w:r>
+    </w:p>
+    <w:p>
+      <w:r>
+        <w:t>Le sixième est une autocritique calibrée pour ne rien concéder d'essentiel: « on aurait dû être plus exigeant sur le développement» dès le G5 Sahel de 2017. Macron avoue une erreur de dosage pour taire l'erreur de nature. Dès 2017 il reconnaissait que sans gouvernance la guerre ne pouvait être gagnée — et l'a poursuivie sept ans. Le rapport Védrine (2013) classait le panafricanisme, non le jihadisme, parmi les menaces (chapitre 15). L'échec n'est pas un défaut d'exigence: il est dans l'objectif.</w:t>
+      </w:r>
+    </w:p>
+    <w:p>
+      <w:r>
+        <w:t>Le septième et dernier est la thèse même de ce chapitre, énoncée par l'accusé: « on a tout repensé — partenariat à parité, bases renommées avec des noms africains, cogestion». Renommer une base, la cogérer, passer du soldat au formateur: c'est la définition exacte de la recomposition. « À parité»: le mot est démenti par l'armée fantôme reconstituée au Bénin pendant que le discours proclame le retrait (chapitre 20). Et le test décisif reste la réversibilité (chapitre 29): les AES n'ont pas renégocié la présence française, ils l'ont expulsée — preuve qu'elle n'était pas réversible par le dialogue. La « parité» revendiquée en 2026 est celle qu'on accorde après avoir été chassé.</w:t>
+      </w:r>
+    </w:p>
+    <w:p>
+      <w:r>
+        <w:t>---ENCADRE---</w:t>
+      </w:r>
+    </w:p>
+    <w:tbl>
+      <w:tblPr>
+        <w:tblStyle w:val="TableGrid"/>
+        <w:tblW w:type="auto" w:w="0"/>
+        <w:tblLook w:firstColumn="1" w:firstRow="1" w:lastColumn="0" w:lastRow="0" w:noHBand="0" w:noVBand="1" w:val="04A0"/>
+      </w:tblPr>
+      <w:tblGrid>
+        <w:gridCol w:w="6624"/>
+      </w:tblGrid>
+      <w:tr>
+        <w:tc>
+          <w:tcPr>
+            <w:tcW w:type="dxa" w:w="6624"/>
+            <w:shd w:val="clear" w:fill="8B1A1A"/>
+          </w:tcPr>
+          <w:p>
+            <w:r>
+              <w:rPr>
+                <w:rFonts w:ascii="FreeSans" w:hAnsi="FreeSans"/>
+                <w:b/>
+                <w:color w:val="F5F0E8"/>
+                <w:sz w:val="18"/>
+              </w:rPr>
+              <w:t>L'INTERVIEW DU 12 MAI, AU CRIBLE DES FAITS</w:t>
+            </w:r>
+          </w:p>
+        </w:tc>
+      </w:tr>
+      <w:tr>
+        <w:tc>
+          <w:tcPr>
+            <w:tcW w:type="dxa" w:w="6624"/>
+            <w:shd w:val="clear" w:fill="FFF0EE"/>
+          </w:tcPr>
+          <w:p>
+            <w:r>
+              <w:rPr>
+                <w:rFonts w:ascii="FreeSans" w:hAnsi="FreeSans"/>
+                <w:color w:val="0A0A0A"/>
+                <w:sz w:val="18"/>
+              </w:rPr>
+              <w:t>« Venue à la demande de Keïta» en 2013: Serval démarre avant l'élection de Keïta; plan Sahel décidé dès 2008-2009 (ch. 15)</w:t>
+            </w:r>
+          </w:p>
+        </w:tc>
+      </w:tr>
+      <w:tr>
+        <w:tc>
+          <w:tcPr>
+            <w:tcW w:type="dxa" w:w="6624"/>
+            <w:shd w:val="clear" w:fill="FFF0EE"/>
+          </w:tcPr>
+          <w:p>
+            <w:r>
+              <w:rPr>
+                <w:rFonts w:ascii="FreeSans" w:hAnsi="FreeSans"/>
+                <w:color w:val="0A0A0A"/>
+                <w:sz w:val="18"/>
+              </w:rPr>
+              <w:t>« Terroristes venus du nord»: armes issues des arsenaux libyens de 2011, ouverts par l'intervention franco-otanienne (ch. 11)</w:t>
+            </w:r>
+          </w:p>
+        </w:tc>
+      </w:tr>
+      <w:tr>
+        <w:tc>
+          <w:tcPr>
+            <w:tcW w:type="dxa" w:w="6624"/>
+            <w:shd w:val="clear" w:fill="FFF0EE"/>
+          </w:tcPr>
+          <w:p>
+            <w:r>
+              <w:rPr>
+                <w:rFonts w:ascii="FreeSans" w:hAnsi="FreeSans"/>
+                <w:color w:val="0A0A0A"/>
+                <w:sz w:val="18"/>
+              </w:rPr>
+              <w:t>Kidal reprochée à la transition: interdite aux FAMa par l'armée française en 2013, reprise par les FAMa en 2023 (ch. 16)</w:t>
+            </w:r>
+          </w:p>
+        </w:tc>
+      </w:tr>
+      <w:tr>
+        <w:tc>
+          <w:tcPr>
+            <w:tcW w:type="dxa" w:w="6624"/>
+            <w:shd w:val="clear" w:fill="FFF0EE"/>
+          </w:tcPr>
+          <w:p>
+            <w:r>
+              <w:rPr>
+                <w:rFonts w:ascii="FreeSans" w:hAnsi="FreeSans"/>
+                <w:color w:val="0A0A0A"/>
+                <w:sz w:val="18"/>
+              </w:rPr>
+              <w:t>« Milices russes préférées à l'antiterrorisme»: c'est le général Burkhard qui range FAMa et Wagner dos à dos (ch. 15)</w:t>
+            </w:r>
+          </w:p>
+        </w:tc>
+      </w:tr>
+      <w:tr>
+        <w:tc>
+          <w:tcPr>
+            <w:tcW w:type="dxa" w:w="6624"/>
+            <w:shd w:val="clear" w:fill="FFF0EE"/>
+          </w:tcPr>
+          <w:p>
+            <w:r>
+              <w:rPr>
+                <w:rFonts w:ascii="FreeSans" w:hAnsi="FreeSans"/>
+                <w:color w:val="0A0A0A"/>
+                <w:sz w:val="18"/>
+              </w:rPr>
+              <w:t>« Ingratitude»: aveu d'un rapport de force perdu; zones jihadistes triplées en sept ans de Barkhane (ch. 13)</w:t>
+            </w:r>
+          </w:p>
+        </w:tc>
+      </w:tr>
+      <w:tr>
+        <w:tc>
+          <w:tcPr>
+            <w:tcW w:type="dxa" w:w="6624"/>
+            <w:shd w:val="clear" w:fill="FFF0EE"/>
+          </w:tcPr>
+          <w:p>
+            <w:r>
+              <w:rPr>
+                <w:rFonts w:ascii="FreeSans" w:hAnsi="FreeSans"/>
+                <w:color w:val="0A0A0A"/>
+                <w:sz w:val="18"/>
+              </w:rPr>
+              <w:t>« Fausses informations»: l'appui ex-légionnaires/GUR confirmé par une source sécuritaire française sur RTL, non démenti (ch. 20)</w:t>
+            </w:r>
+          </w:p>
+        </w:tc>
+      </w:tr>
+      <w:tr>
+        <w:tc>
+          <w:tcPr>
+            <w:tcW w:type="dxa" w:w="6624"/>
+            <w:shd w:val="clear" w:fill="FFF0EE"/>
+          </w:tcPr>
+          <w:p>
+            <w:r>
+              <w:rPr>
+                <w:rFonts w:ascii="FreeSans" w:hAnsi="FreeSans"/>
+                <w:color w:val="0A0A0A"/>
+                <w:sz w:val="18"/>
+              </w:rPr>
+              <w:t>« Partenariat à parité, bases renommées»: définition même de la recomposition; présence française expulsée, non renégociée (ch. 29)</w:t>
+            </w:r>
+          </w:p>
+        </w:tc>
+      </w:tr>
+    </w:tbl>
+    <w:p/>
+    <w:p>
+      <w:r>
+        <w:t>---FIN---</w:t>
+      </w:r>
+    </w:p>
+    <w:p>
+      <w:r>
+        <w:t>Reste le sommet lui-même, et son non-dit le plus éloquent. Pressé par un journaliste sur l'absence du Mali, du Burkina et du Niger, Macron rétorque que « l'Afrique de l'Ouest sera bien là» — Sénégal, Côte d'Ivoire — et que « trois pays seulement» manquent. L'arithmétique masque la sélection: on additionne les présents pour ne pas nommer ce que signifie le retrait des trois États qui ont précisément rompu. Mais l'absence la plus parlante est ailleurs. L'Afrique du Sud de Cyril Ramaphosa, d'abord officiellement invitée, ne vient pas. Selon des informations que Paris dément, Ramaphosa aurait été désinvité sous la pression de Washington — l'administration Trump —, le Kenya prenant sa place. La version est invérifiable à ce stade et doit être maniée comme telle. Mais l'hypothèse, vraie ou fausse, pointe une question que le démenti ne dissout pas: une puissance contrainte d'arbitrer la liste de ses propres invités africains en fonction des préférences américaines ne serait plus une puissance de premier rang. C'est très exactement le diagnostic de « puissance secondaire» évoqué plus haut — non plus comme thèse militante, mais comme hypothèse que la composition d'un sommet rend soudain plausible.</w:t>
+      </w:r>
+    </w:p>
+    <w:p>
+      <w:r>
+        <w:t>Vient ensuite la dénégation centrale: « Je n'ai jamais pris l'Afrique francophone comme un pré carré», répète Macron, datant sa conversion du discours de Ouagadougou de 2017. La phrase se réfute par le sommet qui l'héberge: chercher des « États pivots» anglophones — Kenya, Nigeria — pour compenser le pré carré francophone perdu, c'est avouer qu'il y avait un pré carré, et qu'on lui cherche un successeur. Le déni se contredit dans le souffle même de la stratégie qu'il sert. Macron va plus loin: « Nous sommes les vrais panafricanistes.» Or on ne se proclame le détenteur légitime d'un mot que lorsqu'on l'a perdu — c'est la défaite sémantique annoncée par Banda Kani, déjà à l'œuvre quand Macron faisait de la francophonie « la langue du panafricanisme» à Djerba en 2022. Et la réalité matérielle persiste sous le vocabulaire rénové: 2 400 filiales françaises en Afrique subsaharienne, environ 41 milliards d'euros de chiffre d'affaires annuel (2019-2021), des profits massivement rapatriés vers la métropole. Le pré carré qu'on jure n'avoir jamais possédé a un bilan comptable.</w:t>
+      </w:r>
+    </w:p>
+    <w:p>
+      <w:r>
+        <w:t>Reste l'affirmation la plus aisément vérifiable, donc la plus risquée: « La France ne fait ni ne défait plus les gouvernements — c'est fini depuis 2017.» Le chapitre 20 l'a documentée jusqu'à l'os: Rémy Quignolot arrêté à Bangui en 2021, Yann Vésilier détenu à Bamako, les 5 milliards de francs CFA offerts à des soldats burkinabè pour un renversement en 2024, l'armée fantôme reconstituée au Bénin, le canal France-Ukraine-Sahel jusqu'aux drones proposés aux opposants maliens en 2025. Cette affirmation n'est pas fausse parce que des panafricanistes la contestent; elle est fausse parce que des juges maliens, centrafricains et burkinabè tiennent les agents, les valises et les dossiers. Entre le « c'est fini depuis 2017» et les faits, il y a la distance d'un mensonge mesurable.</w:t>
+      </w:r>
+    </w:p>
+    <w:p>
+      <w:r>
+        <w:t>Deux dernières pièces, enfin: l'une répète un procédé déjà nommé, l'autre oblige à la nuance. La première: interrogé sur l'absence des régimes de l'AES, Macron répond qu'on peut être « en désaccord avec les régimes — Traoré, Goïta» sans l'être « avec les peuples», et annonce qu'il s'adressera à « la société civile, y compris celle des pays du Sahel». C'est, mot pour mot, l'instrument disséqué plus haut à propos de Montpellier 2021: contourner les États qu'on ne peut plus convoquer en s'adressant à une « société civile» triée, présentée comme la voix des peuples. Nairobi n'invente rien; le procédé est reconduit à l'échelle continentale. La seconde pièce, en revanche, est un acte réel: la veille du sommet, une loi de restitution des biens culturels au continent africain a été promulguée. Il faut le reconnaître sans réserve — c'est un geste concret, longtemps promis et longtemps différé. Mais il faut aussi le situer: la restitution relève du levier culturel, le moins coûteux des instruments de la recomposition. Rendre des œuvres pillées n'engage ni le franc CFA, ni les contrats miniers, ni la guerre par procuration du chapitre 20. On peut restituer des masques et conserver la rente. Le geste est juste; il ne solde pas le compte.</w:t>
+      </w:r>
+    </w:p>
+    <w:p>
+      <w:r>
+        <w:t>---ENCADRE---</w:t>
+      </w:r>
+    </w:p>
+    <w:tbl>
+      <w:tblPr>
+        <w:tblStyle w:val="TableGrid"/>
+        <w:tblW w:type="auto" w:w="0"/>
+        <w:tblLook w:firstColumn="1" w:firstRow="1" w:lastColumn="0" w:lastRow="0" w:noHBand="0" w:noVBand="1" w:val="04A0"/>
+      </w:tblPr>
+      <w:tblGrid>
+        <w:gridCol w:w="6624"/>
+      </w:tblGrid>
+      <w:tr>
+        <w:tc>
+          <w:tcPr>
+            <w:tcW w:type="dxa" w:w="6624"/>
+            <w:shd w:val="clear" w:fill="8B1A1A"/>
+          </w:tcPr>
+          <w:p>
+            <w:r>
+              <w:rPr>
+                <w:rFonts w:ascii="FreeSans" w:hAnsi="FreeSans"/>
+                <w:b/>
+                <w:color w:val="F5F0E8"/>
+                <w:sz w:val="18"/>
+              </w:rPr>
+              <w:t>LE SOMMET D'AFRICA FORWARD, AU CRIBLE DES FAITS</w:t>
+            </w:r>
+          </w:p>
+        </w:tc>
+      </w:tr>
+      <w:tr>
+        <w:tc>
+          <w:tcPr>
+            <w:tcW w:type="dxa" w:w="6624"/>
+            <w:shd w:val="clear" w:fill="FFF0EE"/>
+          </w:tcPr>
+          <w:p>
+            <w:r>
+              <w:rPr>
+                <w:rFonts w:ascii="FreeSans" w:hAnsi="FreeSans"/>
+                <w:color w:val="0A0A0A"/>
+                <w:sz w:val="18"/>
+              </w:rPr>
+              <w:t>Afrique du Sud absente: Ramaphosa désinvité au profit du Kenya, sous pression américaine selon des sources que Paris dément — une puissance qui n'arbitre plus seule</w:t>
+            </w:r>
+          </w:p>
+        </w:tc>
+      </w:tr>
+      <w:tr>
+        <w:tc>
+          <w:tcPr>
+            <w:tcW w:type="dxa" w:w="6624"/>
+            <w:shd w:val="clear" w:fill="FFF0EE"/>
+          </w:tcPr>
+          <w:p>
+            <w:r>
+              <w:rPr>
+                <w:rFonts w:ascii="FreeSans" w:hAnsi="FreeSans"/>
+                <w:color w:val="0A0A0A"/>
+                <w:sz w:val="18"/>
+              </w:rPr>
+              <w:t>« Jamais un pré carré»: la quête d'« États pivots» anglophones avoue le pré carré perdu qu'elle cherche à remplacer</w:t>
+            </w:r>
+          </w:p>
+        </w:tc>
+      </w:tr>
+      <w:tr>
+        <w:tc>
+          <w:tcPr>
+            <w:tcW w:type="dxa" w:w="6624"/>
+            <w:shd w:val="clear" w:fill="FFF0EE"/>
+          </w:tcPr>
+          <w:p>
+            <w:r>
+              <w:rPr>
+                <w:rFonts w:ascii="FreeSans" w:hAnsi="FreeSans"/>
+                <w:color w:val="0A0A0A"/>
+                <w:sz w:val="18"/>
+              </w:rPr>
+              <w:t>« Nous sommes les vrais panafricanistes»: on revendique le mot quand on l'a perdu (Banda Kani; Djerba, 2022)</w:t>
+            </w:r>
+          </w:p>
+        </w:tc>
+      </w:tr>
+      <w:tr>
+        <w:tc>
+          <w:tcPr>
+            <w:tcW w:type="dxa" w:w="6624"/>
+            <w:shd w:val="clear" w:fill="FFF0EE"/>
+          </w:tcPr>
+          <w:p>
+            <w:r>
+              <w:rPr>
+                <w:rFonts w:ascii="FreeSans" w:hAnsi="FreeSans"/>
+                <w:color w:val="0A0A0A"/>
+                <w:sz w:val="18"/>
+              </w:rPr>
+              <w:t>« Ni faire ni défaire les gouvernements depuis 2017»: démenti par Quignolot, Vésilier, les 5 milliards burkinabè, l'armée fantôme (ch. 20)</w:t>
+            </w:r>
+          </w:p>
+        </w:tc>
+      </w:tr>
+      <w:tr>
+        <w:tc>
+          <w:tcPr>
+            <w:tcW w:type="dxa" w:w="6624"/>
+            <w:shd w:val="clear" w:fill="FFF0EE"/>
+          </w:tcPr>
+          <w:p>
+            <w:r>
+              <w:rPr>
+                <w:rFonts w:ascii="FreeSans" w:hAnsi="FreeSans"/>
+                <w:color w:val="0A0A0A"/>
+                <w:sz w:val="18"/>
+              </w:rPr>
+              <w:t>« On aime les peuples, pas les régimes»: le procédé « société civile» de Montpellier 2021, reconduit à l'échelle continentale</w:t>
+            </w:r>
+          </w:p>
+        </w:tc>
+      </w:tr>
+      <w:tr>
+        <w:tc>
+          <w:tcPr>
+            <w:tcW w:type="dxa" w:w="6624"/>
+            <w:shd w:val="clear" w:fill="FFF0EE"/>
+          </w:tcPr>
+          <w:p>
+            <w:r>
+              <w:rPr>
+                <w:rFonts w:ascii="FreeSans" w:hAnsi="FreeSans"/>
+                <w:color w:val="0A0A0A"/>
+                <w:sz w:val="18"/>
+              </w:rPr>
+              <w:t>Loi de restitution des biens culturels: acte réel, mais levier le moins coûteux — n'engage ni le CFA, ni les contrats, ni la guerre proxy</w:t>
+            </w:r>
+          </w:p>
+        </w:tc>
+      </w:tr>
+    </w:tbl>
+    <w:p/>
+    <w:p>
+      <w:r>
+        <w:t>---FIN---</w:t>
+      </w:r>
+    </w:p>
+    <w:p>
+      <w:r>
+        <w:t>Reste un point que Macron formule sans en mesurer la portée: « c'est le peuple malien qui souffre». C'est vrai — et c'est précisément ce que le livre documente depuis le début. Mais la souffrance d'un peuple sous les coups de groupes armés équipés, renseignés et recyclés par des réseaux extérieurs (chapitre 20) n'est pas un argument contre sa souveraineté: c'en est la justification la plus tragique. La séquence de Nairobi n'est pas une analyse de l'échec. C'est l'échec qui se raconte une dernière histoire.</w:t>
+      </w:r>
+    </w:p>
+    <w:p>
+      <w:r>
         <w:t>Derrière ce mépris de façade, pourtant, il y a autre chose — une peur, profonde et documentée; et c'est en l'anatomisant qu'on découvre ce que l'AES doit réussir pour survivre.</w:t>
       </w:r>
     </w:p>
     <w:p>
-      <w:pPr>
-        <w:spacing w:before="160" w:after="160"/>
-        <w:jc w:val="center"/>
-      </w:pPr>
-      <w:r>
-        <w:rPr>
-          <w:b w:val="0"/>
-          <w:i w:val="0"/>
-          <w:color w:val="D4A017"/>
-          <w:sz w:val="22"/>
-          <w:rFonts w:ascii="FreeSans" w:hAnsi="FreeSans" w:cs="FreeSans"/>
-        </w:rPr>
-        <w:t>★  ★  ★</w:t>
+      <w:r>
+        <w:t>★★★</w:t>
       </w:r>
     </w:p>
     <w:p>
@@ -9462,6 +10109,11 @@
     <w:p>
       <w:r>
         <w:t>D'où le double tableau qui suit — sans doute le plus important de ce livre, parce qu'il ne juge pas l'AES sur ses intentions, mais sur des critères vérifiables.</w:t>
+      </w:r>
+    </w:p>
+    <w:p>
+      <w:r>
+        <w:t>---ENCADRE---</w:t>
       </w:r>
     </w:p>
     <w:tbl>
@@ -9602,6 +10254,16 @@
       </w:tr>
     </w:tbl>
     <w:p/>
+    <w:p>
+      <w:r>
+        <w:t>---FIN---</w:t>
+      </w:r>
+    </w:p>
+    <w:p>
+      <w:r>
+        <w:t>---ENCADRE---</w:t>
+      </w:r>
+    </w:p>
     <w:tbl>
       <w:tblPr>
         <w:tblStyle w:val="TableGrid"/>
@@ -9769,7 +10431,7 @@
                 <w:color w:val="0A0A0A"/>
                 <w:sz w:val="18"/>
               </w:rPr>
-              <w:t>Dialogue permanent: maintenir les canaux de négociation même en temps de guerre — la leçon malienne est que fermeté militaire et diplomatie ne s'excluent pas; « La guerre n'empêche pas le dialogue » (Patient Parfait Ndoum, For You Media Africa, 8 juin 2026)</w:t>
+              <w:t>Dialogue permanent: maintenir les canaux de négociation même en temps de guerre; « La guerre n'empêche pas le dialogue » (Patient Parfait Ndoum, For You Media Africa, 8 juin 2026)</w:t>
             </w:r>
           </w:p>
         </w:tc>
@@ -9778,6 +10440,11 @@
     <w:p/>
     <w:p>
       <w:r>
+        <w:t>---FIN---</w:t>
+      </w:r>
+    </w:p>
+    <w:p>
+      <w:r>
         <w:t>Trois variables transversales déterminent l'issue de tous les scénarios. La gouvernance économique réelle: les ressources profitent-elles aux populations, ou nourrissent-elles une rente d'élite en uniforme? La liberté d'expression: les sociétés civiles peuvent-elles critiquer sans être réprimées? Le retour progressif au constitutionnalisme: les transitions produisent-elles des institutions ou des règnes? Ces trois questions n'émanent pas des puissances extérieures. Elles émanent des peuples sahéliens eux-mêmes. C'est là leur force — et leur exigence la plus difficile à tenir.</w:t>
       </w:r>
     </w:p>
@@ -9786,6 +10453,68 @@
         <w:pStyle w:val="Heading2"/>
       </w:pPr>
       <w:r>
+        <w:t>Les quatre leviers de la transformation</w:t>
+      </w:r>
+    </w:p>
+    <w:p>
+      <w:r>
+        <w:t>L'Hiver Noir dont parle Ibrahim Traoré n'est pas une métaphore — c'est un programme. Pour le traverser, l'AES doit actionner simultanément quatre leviers que la logique de dépendance avait, depuis soixante ans, verrouillés l'un après l'autre.</w:t>
+      </w:r>
+    </w:p>
+    <w:p>
+      <w:r>
+        <w:rPr>
+          <w:b/>
+        </w:rPr>
+        <w:t>Économie : contrôler le sous-sol.</w:t>
+      </w:r>
+      <w:r>
+        <w:t xml:space="preserve"> Le premier levier est le plus visible, parce que le plus ancien. Les contrats miniers signés sous la tutelle françafricaine accordaient à l'État une part historiquement limitée à 10 % ou moins, contre 90 % aux multinationales. Renégocier ces contrats — or, uranium, pétrole — pour inverser la proportion: voilà le socle. S'y ajoute la rupture avec le Franc CFA, perçu non comme une monnaie mais comme un instrument de captivité économique, au profit d'une monnaie souveraine ou commune. La Banque d'investissement et de développement de la Confédération, dont le capital dépasse les 300 milliards de FCFA, devra être capitalisée par les trois États eux-mêmes, sous peine de retomber dans la logique des conditionnalités. Et derrière tout cela, l'autosuffisance alimentaire: mobiliser les masses laborieuses — agriculteurs, éleveurs — en acteurs d'une défense nationale qui commence dans les champs.</w:t>
+      </w:r>
+    </w:p>
+    <w:p>
+      <w:r>
+        <w:rPr>
+          <w:b/>
+        </w:rPr>
+        <w:t>Militaire : de l'armée de métier au peuple en armes.</w:t>
+      </w:r>
+      <w:r>
+        <w:t xml:space="preserve"> L'armée de métier classique, héritée des structures coloniales, ne suffit plus face à un adversaire qui joue sur tous les tableaux — diplomatique, informationnel, économique, proxy. La réponse des transitions est le concept d'armée populaire: impliquer l'ensemble des citoyens aptes dans la défense du territoire, pas comme supplétifs, mais comme acteurs conscients. La Force unifiée de l'AES, engagée dans des opérations conjointes, doit briser l'encerclement planifié. Et la souveraineté des moyens — assurer la défense par des capacités propres plutôt que par des partenaires dont les intérêts géostratégiques divergent — est la condition sine qua non de cette doctrine.</w:t>
+      </w:r>
+    </w:p>
+    <w:p>
+      <w:r>
+        <w:rPr>
+          <w:b/>
+        </w:rPr>
+        <w:t>Culturel et cognitif : décoloniser les mentalités.</w:t>
+      </w:r>
+      <w:r>
+        <w:t xml:space="preserve"> C'est là, dit Traoré, « la partie la plus difficile de la lutte ». L'ennemi qui reste dans les esprits après que les bases militaires sont fermées est plus difficile à expulser que les soldats. Briser le mimétisme culturel et intellectuel — revenir aux sources et aux identités propres comme instruments de résistance — n'est pas un programme sentimental: c'est une stratégie. Elle passe par une éducation populaire dans toutes les couches de la société, pour rendre les citoyens imperméables aux fake news et aux opérations de subversion informationnelle. L'AES doit aussi développer ses propres vecteurs d'information, pour ne plus laisser le champ libre aux narratifs hostiles diffusés par des médias dont les sièges sociaux sont à Paris ou à Washington.</w:t>
+      </w:r>
+    </w:p>
+    <w:p>
+      <w:r>
+        <w:rPr>
+          <w:b/>
+        </w:rPr>
+        <w:t>Politique et diplomatique : la cohésion comme arme.</w:t>
+      </w:r>
+      <w:r>
+        <w:t xml:space="preserve"> Toute division entre Bamako, Ouagadougou et Niamey serait un suicide, et la diplomatie concertée une nécessité absolue. Mais la cohésion interne ne suffit pas: il faut diversifier les partenariats vers un monde multipolaire — BRICS, Russie, Chine, Turquie — qui propose des échanges fondés sur le profit mutuel sans conditions d'ingérence. Et pour que l'adhésion populaire soit durable, certaines voix sahéliennes appellent à rééquilibrer les dépenses publiques vers les secteurs sociaux — santé, éducation — et à concevoir le souverainisme de façon inclusive, pour éviter que les fractures internes donnent prise aux manœuvres extérieures.</w:t>
+      </w:r>
+    </w:p>
+    <w:p>
+      <w:r>
+        <w:t>Ces quatre leviers ne sont pas actionnables séquentiellement. Ils forment un système: contrôler le sous-sol finance l'armée populaire; l'armée populaire sécurise les champs qui nourrissent les villes; les villes, éduquées et informées, résistent aux narratifs de déstabilisation; la diplomatie, enfin, négocie depuis une position renforcée. L'AES ne peut en choisir qu'un ou deux. Il faut les quatre, simultanément, ou aucun.</w:t>
+      </w:r>
+    </w:p>
+    <w:p>
+      <w:pPr>
+        <w:pStyle w:val="Heading2"/>
+      </w:pPr>
+      <w:r>
         <w:t>Le point de départ, pas le point d'arrivée</w:t>
       </w:r>
     </w:p>
@@ -9815,19 +10544,8 @@
       </w:r>
     </w:p>
     <w:p>
-      <w:pPr>
-        <w:spacing w:before="160" w:after="160"/>
-        <w:jc w:val="center"/>
-      </w:pPr>
-      <w:r>
-        <w:rPr>
-          <w:b w:val="0"/>
-          <w:i w:val="0"/>
-          <w:color w:val="D4A017"/>
-          <w:sz w:val="22"/>
-          <w:rFonts w:ascii="FreeSans" w:hAnsi="FreeSans" w:cs="FreeSans"/>
-        </w:rPr>
-        <w:t>★  ★  ★</w:t>
+      <w:r>
+        <w:t>★★★</w:t>
       </w:r>
     </w:p>
     <w:p>
@@ -9882,19 +10600,8 @@
       </w:r>
     </w:p>
     <w:p>
-      <w:pPr>
-        <w:spacing w:before="160" w:after="160"/>
-        <w:jc w:val="center"/>
-      </w:pPr>
-      <w:r>
-        <w:rPr>
-          <w:b w:val="0"/>
-          <w:i w:val="0"/>
-          <w:color w:val="D4A017"/>
-          <w:sz w:val="22"/>
-          <w:rFonts w:ascii="FreeSans" w:hAnsi="FreeSans" w:cs="FreeSans"/>
-        </w:rPr>
-        <w:t>★  ★  ★</w:t>
+      <w:r>
+        <w:t>★★★</w:t>
       </w:r>
     </w:p>
     <w:p>
@@ -9948,19 +10655,8 @@
       </w:r>
     </w:p>
     <w:p>
-      <w:pPr>
-        <w:spacing w:before="160" w:after="160"/>
-        <w:jc w:val="center"/>
-      </w:pPr>
-      <w:r>
-        <w:rPr>
-          <w:b w:val="0"/>
-          <w:i w:val="0"/>
-          <w:color w:val="D4A017"/>
-          <w:sz w:val="22"/>
-          <w:rFonts w:ascii="FreeSans" w:hAnsi="FreeSans" w:cs="FreeSans"/>
-        </w:rPr>
-        <w:t>★  ★  ★</w:t>
+      <w:r>
+        <w:t>★★★</w:t>
       </w:r>
     </w:p>
     <w:p>
@@ -9998,19 +10694,8 @@
       </w:r>
     </w:p>
     <w:p>
-      <w:pPr>
-        <w:spacing w:before="160" w:after="160"/>
-        <w:jc w:val="center"/>
-      </w:pPr>
-      <w:r>
-        <w:rPr>
-          <w:b w:val="0"/>
-          <w:i w:val="0"/>
-          <w:color w:val="D4A017"/>
-          <w:sz w:val="22"/>
-          <w:rFonts w:ascii="FreeSans" w:hAnsi="FreeSans" w:cs="FreeSans"/>
-        </w:rPr>
-        <w:t>★  ★  ★</w:t>
+      <w:r>
+        <w:t>★★★</w:t>
       </w:r>
     </w:p>
     <w:p>
@@ -10046,7 +10731,7 @@
     </w:p>
     <w:p>
       <w:r>
-        <w:t>1957 — Le Ghana de Kwame Nkrumah devient le premier pays d'Afrique subsaharienne colonisée à accéder à l'indépendance.</w:t>
+        <w:t>1957 — Le Ghana de Kwame Nkrumah devient le premier pays d'Afrique subsaharienne colonisée à accéder à l'indépendance. La même année (loi du 10 janvier), la France crée l'Organisation commune des régions sahariennes (OCRS) pour organiser le sous-sol du Sahara à la veille des indépendances.</w:t>
       </w:r>
     </w:p>
     <w:p>
@@ -10190,19 +10875,8 @@
       </w:r>
     </w:p>
     <w:p>
-      <w:pPr>
-        <w:spacing w:before="160" w:after="160"/>
-        <w:jc w:val="center"/>
-      </w:pPr>
-      <w:r>
-        <w:rPr>
-          <w:b w:val="0"/>
-          <w:i w:val="0"/>
-          <w:color w:val="D4A017"/>
-          <w:sz w:val="22"/>
-          <w:rFonts w:ascii="FreeSans" w:hAnsi="FreeSans" w:cs="FreeSans"/>
-        </w:rPr>
-        <w:t>★  ★  ★</w:t>
+      <w:r>
+        <w:t>★★★</w:t>
       </w:r>
     </w:p>
     <w:p>
@@ -10490,6 +11164,14 @@
         <w:pStyle w:val="ListBullet"/>
       </w:pPr>
       <w:r>
+        <w:t>OCRS — Organisation commune des régions sahariennes (loi française du 10 janvier 1957)</w:t>
+      </w:r>
+    </w:p>
+    <w:p>
+      <w:pPr>
+        <w:pStyle w:val="ListBullet"/>
+      </w:pPr>
+      <w:r>
         <w:t>OIF — Organisation internationale de la Francophonie</w:t>
       </w:r>
     </w:p>
@@ -10542,19 +11224,8 @@
       </w:r>
     </w:p>
     <w:p>
-      <w:pPr>
-        <w:spacing w:before="160" w:after="160"/>
-        <w:jc w:val="center"/>
-      </w:pPr>
-      <w:r>
-        <w:rPr>
-          <w:b w:val="0"/>
-          <w:i w:val="0"/>
-          <w:color w:val="D4A017"/>
-          <w:sz w:val="22"/>
-          <w:rFonts w:ascii="FreeSans" w:hAnsi="FreeSans" w:cs="FreeSans"/>
-        </w:rPr>
-        <w:t>★  ★  ★</w:t>
+      <w:r>
+        <w:t>★★★</w:t>
       </w:r>
     </w:p>
     <w:p>
@@ -10615,6 +11286,39 @@
         <w:pStyle w:val="ListBullet"/>
       </w:pPr>
       <w:r>
+        <w:t>Belhadj, Abdelhakim — chef jihadiste libyen, gouverneur militaire de Tripoli après 2011. ch. 11.</w:t>
+      </w:r>
+    </w:p>
+    <w:p>
+      <w:pPr>
+        <w:pStyle w:val="ListBullet"/>
+      </w:pPr>
+      <w:r>
+        <w:t>Benoist-Méchin, Jacques — écrivain français, auteur d'</w:t>
+      </w:r>
+      <w:r>
+        <w:rPr>
+          <w:i/>
+        </w:rPr>
+        <w:t>Un printemps arabe</w:t>
+      </w:r>
+      <w:r>
+        <w:t xml:space="preserve"> (1959). ch. 11.</w:t>
+      </w:r>
+    </w:p>
+    <w:p>
+      <w:pPr>
+        <w:pStyle w:val="ListBullet"/>
+      </w:pPr>
+      <w:r>
+        <w:t>Boganda, Barthélemy — fondateur de la Centrafrique, théoricien des « États-Unis d'Afrique latine», mort en 1959. ch. 22.</w:t>
+      </w:r>
+    </w:p>
+    <w:p>
+      <w:pPr>
+        <w:pStyle w:val="ListBullet"/>
+      </w:pPr>
+      <w:r>
         <w:t>Bokassa, Jean-Bedel — ancien chef d'État centrafricain installé par la France. ch. 8, ch. 15.</w:t>
       </w:r>
     </w:p>
@@ -10791,6 +11495,14 @@
         <w:pStyle w:val="ListBullet"/>
       </w:pPr>
       <w:r>
+        <w:t>Haftar, Khalifa — officier libyen passé à l'opposition, homme fort de la Cyrénaïque après 2014. ch. 11.</w:t>
+      </w:r>
+    </w:p>
+    <w:p>
+      <w:pPr>
+        <w:pStyle w:val="ListBullet"/>
+      </w:pPr>
+      <w:r>
         <w:t>Hollande, François — président français (2012-2017), initiateur de Serval. ch. 13, ch. 15.</w:t>
       </w:r>
     </w:p>
@@ -10847,6 +11559,14 @@
         <w:pStyle w:val="ListBullet"/>
       </w:pPr>
       <w:r>
+        <w:t>Lecointre, François — chef d'état-major des armées françaises (2017-2021), grand chancelier de la Légion d'honneur. ch. 15.</w:t>
+      </w:r>
+    </w:p>
+    <w:p>
+      <w:pPr>
+        <w:pStyle w:val="ListBullet"/>
+      </w:pPr>
+      <w:r>
         <w:t>Le Floch-Prigent, Loïk — ancien PDG d'Elf. ch. 6.</w:t>
       </w:r>
     </w:p>
@@ -10895,7 +11615,7 @@
         <w:pStyle w:val="ListBullet"/>
       </w:pPr>
       <w:r>
-        <w:t>Medvedev, Dmitri — responsable russe, dénonciateur du franc CFA à l'UNESCO. ch. 29.</w:t>
+        <w:t>Medvedev, Dmitri — responsable russe, dénonciateur du franc CFA à l'UNESCO. ch. 11, ch. 29.</w:t>
       </w:r>
     </w:p>
     <w:p>
@@ -10903,6 +11623,14 @@
         <w:pStyle w:val="ListBullet"/>
       </w:pPr>
       <w:r>
+        <w:t>Michel, Luc — militant pro-Kadhafi, animateur du réseau européen des comités révolutionnaires libyens (source engagée). ch. 11, ch. 15, ch. 29, ch. 30.</w:t>
+      </w:r>
+    </w:p>
+    <w:p>
+      <w:pPr>
+        <w:pStyle w:val="ListBullet"/>
+      </w:pPr>
+      <w:r>
         <w:t>Mobutu Sese Seko — dictateur du Zaïre (1965-1997). ch. 6, ch. 10.</w:t>
       </w:r>
     </w:p>
@@ -10959,6 +11687,39 @@
         <w:pStyle w:val="ListBullet"/>
       </w:pPr>
       <w:r>
+        <w:t>Pérouse de Montclos, Marc-Antoine — chercheur français, spécialiste des conflits sahéliens. ch. 15.</w:t>
+      </w:r>
+    </w:p>
+    <w:p>
+      <w:pPr>
+        <w:pStyle w:val="ListBullet"/>
+      </w:pPr>
+      <w:r>
+        <w:t xml:space="preserve">Pondi, Jean-Emmanuel — politologue camerounais, auteur de </w:t>
+      </w:r>
+      <w:r>
+        <w:rPr>
+          <w:i/>
+        </w:rPr>
+        <w:t>Vie et mort de Mouammar Kadhafi</w:t>
+      </w:r>
+      <w:r>
+        <w:t>. ch. 11.</w:t>
+      </w:r>
+    </w:p>
+    <w:p>
+      <w:pPr>
+        <w:pStyle w:val="ListBullet"/>
+      </w:pPr>
+      <w:r>
+        <w:t>Saïf al-Islam Kadhafi — fils de Mouammar Kadhafi, chef de l'aile « libérale» du régime en 2011. ch. 11.</w:t>
+      </w:r>
+    </w:p>
+    <w:p>
+      <w:pPr>
+        <w:pStyle w:val="ListBullet"/>
+      </w:pPr>
+      <w:r>
         <w:t>Samory Touré — fondateur de l'empire Wassoulou, résistant à la colonisation. ch. 4, Conclusion.</w:t>
       </w:r>
     </w:p>
@@ -11047,23 +11808,20 @@
         <w:pStyle w:val="ListBullet"/>
       </w:pPr>
       <w:r>
+        <w:t>Younes, Abdel Fattah — ministre de Kadhafi rallié aux insurgés, assassiné en juillet 2011. ch. 11.</w:t>
+      </w:r>
+    </w:p>
+    <w:p>
+      <w:pPr>
+        <w:pStyle w:val="ListBullet"/>
+      </w:pPr>
+      <w:r>
         <w:t>Yusov, Andriy — porte-parole du renseignement militaire ukrainien. ch. 20.</w:t>
       </w:r>
     </w:p>
     <w:p>
-      <w:pPr>
-        <w:spacing w:before="160" w:after="160"/>
-        <w:jc w:val="center"/>
-      </w:pPr>
-      <w:r>
-        <w:rPr>
-          <w:b w:val="0"/>
-          <w:i w:val="0"/>
-          <w:color w:val="D4A017"/>
-          <w:sz w:val="22"/>
-          <w:rFonts w:ascii="FreeSans" w:hAnsi="FreeSans" w:cs="FreeSans"/>
-        </w:rPr>
-        <w:t>★  ★  ★</w:t>
+      <w:r>
+        <w:t>★★★</w:t>
       </w:r>
     </w:p>
     <w:p>
@@ -11133,19 +11891,7 @@
       </w:r>
     </w:p>
     <w:p>
-      <w:pPr>
-        <w:spacing w:before="40" w:after="120"/>
-        <w:ind w:left="567"/>
-        <w:pBdr>
-          <w:left w:val="single" w:sz="18" w:space="8" w:color="D4A017"/>
-        </w:pBdr>
-      </w:pPr>
-      <w:r>
-        <w:rPr>
-          <w:i/>
-          <w:color w:val="8B1A1A"/>
-          <w:sz w:val="20"/>
-        </w:rPr>
+      <w:r>
         <w:t>« transition militaire», « autorités de transition», « prise de pouvoir». Ce choix</w:t>
       </w:r>
     </w:p>
@@ -11336,6 +12082,14 @@
         <w:pStyle w:val="ListBullet"/>
       </w:pPr>
       <w:r>
+        <w:t>L'Express (2024) — « scénario noir» d'effondrement du Mali élaboré avec une quarantaine d'experts; filiation Libye-Sahel, doctrine des « efforts souterrains» vers les sociétés civiles.</w:t>
+      </w:r>
+    </w:p>
+    <w:p>
+      <w:pPr>
+        <w:pStyle w:val="ListBullet"/>
+      </w:pPr>
+      <w:r>
         <w:t>André Bourgeot (CNRS) — « Azawad est une fabrication politique».</w:t>
       </w:r>
     </w:p>
@@ -11392,6 +12146,24 @@
     <w:p>
       <w:r>
         <w:t>de l'influence française.</w:t>
+      </w:r>
+    </w:p>
+    <w:p>
+      <w:pPr>
+        <w:pStyle w:val="ListBullet"/>
+      </w:pPr>
+      <w:r>
+        <w:t>Général François Lecointre, ancien chef d'état-major des armées (2017-2021) — « l'échec</w:t>
+      </w:r>
+    </w:p>
+    <w:p>
+      <w:r>
+        <w:t>de nos engagements au Sahel»; « on ne fait pas la guerre pour la démocratie mais pour les</w:t>
+      </w:r>
+    </w:p>
+    <w:p>
+      <w:r>
+        <w:t>intérêts de la France» (propos rapportés via une source unique, à confirmer).</w:t>
       </w:r>
     </w:p>
     <w:p>

</xml_diff>

<commit_message>
fix(docx): supprime les marqueurs bruts ---ENCADRE---/---FIN---/★★★ du corps
Le DOCX contenait bien les 31 chapitres mais imprimait 125 marqueurs structurels
en texte brut, donnant l'impression d'un document cassé/incomplet. Le parseur
saute désormais les lignes ---ENCADRE---/---FIN--- et les filets ---, et
reconnaît les séparateurs ★★★ (sans espaces) comme ornements.

Résultat : 0 artefact, 34 encadrés en tableaux, 31 chapitres, texte complet.

Co-Authored-By: Claude Opus 4.8 <noreply@anthropic.com>
Claude-Session: https://claude.ai/code/session_01NN7tYMhNvj5F1TjbPqxiMy
</commit_message>
<xml_diff>
--- a/manuscrit-edition/LIVRE-FINAL.docx
+++ b/manuscrit-edition/LIVRE-FINAL.docx
@@ -72,16 +72,18 @@
     </w:p>
     <w:p>
       <w:pPr>
+        <w:spacing w:before="160" w:after="160"/>
         <w:jc w:val="center"/>
       </w:pPr>
       <w:r>
         <w:rPr>
           <w:b w:val="0"/>
           <w:i w:val="0"/>
-          <w:color w:val="0A0A0A"/>
+          <w:color w:val="D4A017"/>
+          <w:sz w:val="22"/>
           <w:rFonts w:ascii="FreeSans" w:hAnsi="FreeSans" w:cs="FreeSans"/>
         </w:rPr>
-        <w:t>★★★</w:t>
+        <w:t>★  ★  ★</w:t>
       </w:r>
     </w:p>
     <w:p>
@@ -204,16 +206,18 @@
     </w:p>
     <w:p>
       <w:pPr>
+        <w:spacing w:before="160" w:after="160"/>
         <w:jc w:val="center"/>
       </w:pPr>
       <w:r>
         <w:rPr>
           <w:b w:val="0"/>
           <w:i w:val="0"/>
-          <w:color w:val="0A0A0A"/>
+          <w:color w:val="D4A017"/>
+          <w:sz w:val="22"/>
           <w:rFonts w:ascii="FreeSans" w:hAnsi="FreeSans" w:cs="FreeSans"/>
         </w:rPr>
-        <w:t>★★★</w:t>
+        <w:t>★  ★  ★</w:t>
       </w:r>
     </w:p>
     <w:p>
@@ -252,8 +256,19 @@
       </w:r>
     </w:p>
     <w:p>
-      <w:r>
-        <w:t>★★★</w:t>
+      <w:pPr>
+        <w:spacing w:before="160" w:after="160"/>
+        <w:jc w:val="center"/>
+      </w:pPr>
+      <w:r>
+        <w:rPr>
+          <w:b w:val="0"/>
+          <w:i w:val="0"/>
+          <w:color w:val="D4A017"/>
+          <w:sz w:val="22"/>
+          <w:rFonts w:ascii="FreeSans" w:hAnsi="FreeSans" w:cs="FreeSans"/>
+        </w:rPr>
+        <w:t>★  ★  ★</w:t>
       </w:r>
     </w:p>
     <w:p>
@@ -325,8 +340,19 @@
       </w:r>
     </w:p>
     <w:p>
-      <w:r>
-        <w:t>★★★</w:t>
+      <w:pPr>
+        <w:spacing w:before="160" w:after="160"/>
+        <w:jc w:val="center"/>
+      </w:pPr>
+      <w:r>
+        <w:rPr>
+          <w:b w:val="0"/>
+          <w:i w:val="0"/>
+          <w:color w:val="D4A017"/>
+          <w:sz w:val="22"/>
+          <w:rFonts w:ascii="FreeSans" w:hAnsi="FreeSans" w:cs="FreeSans"/>
+        </w:rPr>
+        <w:t>★  ★  ★</w:t>
       </w:r>
     </w:p>
     <w:p>
@@ -391,8 +417,19 @@
       </w:r>
     </w:p>
     <w:p>
-      <w:r>
-        <w:t>★★★</w:t>
+      <w:pPr>
+        <w:spacing w:before="160" w:after="160"/>
+        <w:jc w:val="center"/>
+      </w:pPr>
+      <w:r>
+        <w:rPr>
+          <w:b w:val="0"/>
+          <w:i w:val="0"/>
+          <w:color w:val="D4A017"/>
+          <w:sz w:val="22"/>
+          <w:rFonts w:ascii="FreeSans" w:hAnsi="FreeSans" w:cs="FreeSans"/>
+        </w:rPr>
+        <w:t>★  ★  ★</w:t>
       </w:r>
     </w:p>
     <w:p>
@@ -469,8 +506,19 @@
       </w:r>
     </w:p>
     <w:p>
-      <w:r>
-        <w:t>★★★</w:t>
+      <w:pPr>
+        <w:spacing w:before="160" w:after="160"/>
+        <w:jc w:val="center"/>
+      </w:pPr>
+      <w:r>
+        <w:rPr>
+          <w:b w:val="0"/>
+          <w:i w:val="0"/>
+          <w:color w:val="D4A017"/>
+          <w:sz w:val="22"/>
+          <w:rFonts w:ascii="FreeSans" w:hAnsi="FreeSans" w:cs="FreeSans"/>
+        </w:rPr>
+        <w:t>★  ★  ★</w:t>
       </w:r>
     </w:p>
     <w:p>
@@ -514,8 +562,19 @@
       </w:pPr>
     </w:p>
     <w:p>
-      <w:r>
-        <w:t>★★★</w:t>
+      <w:pPr>
+        <w:spacing w:before="160" w:after="160"/>
+        <w:jc w:val="center"/>
+      </w:pPr>
+      <w:r>
+        <w:rPr>
+          <w:b w:val="0"/>
+          <w:i w:val="0"/>
+          <w:color w:val="D4A017"/>
+          <w:sz w:val="22"/>
+          <w:rFonts w:ascii="FreeSans" w:hAnsi="FreeSans" w:cs="FreeSans"/>
+        </w:rPr>
+        <w:t>★  ★  ★</w:t>
       </w:r>
     </w:p>
     <w:p>
@@ -541,8 +600,19 @@
       </w:r>
     </w:p>
     <w:p>
-      <w:r>
-        <w:t>★★★</w:t>
+      <w:pPr>
+        <w:spacing w:before="160" w:after="160"/>
+        <w:jc w:val="center"/>
+      </w:pPr>
+      <w:r>
+        <w:rPr>
+          <w:b w:val="0"/>
+          <w:i w:val="0"/>
+          <w:color w:val="D4A017"/>
+          <w:sz w:val="22"/>
+          <w:rFonts w:ascii="FreeSans" w:hAnsi="FreeSans" w:cs="FreeSans"/>
+        </w:rPr>
+        <w:t>★  ★  ★</w:t>
       </w:r>
     </w:p>
     <w:p>
@@ -636,11 +706,6 @@
     <w:p>
       <w:r>
         <w:t>Plus à l'est, le sultanat du Bornou, héritier du Kanem, dure du IXe au XIXe siècle — un millénaire d'existence politique continue — et entretient des correspondances diplomatiques avec l'Égypte et l'Empire ottoman. En d'autres termes, les souverains sahéliens échangeaient des ambassades et des lettres officielles avec les grandes puissances de leur temps, en partenaires reconnus. Enfin, le califat de Sokoto (1804–1903), né de la révolution religieuse d'Ousmane dan Fodio, devient l'une des plus grandes entités politiques africaines de son siècle; il reste aujourd'hui un référent identitaire majeur pour les populations haoussa et peules.</w:t>
-      </w:r>
-    </w:p>
-    <w:p>
-      <w:r>
-        <w:t>---ENCADRE---</w:t>
       </w:r>
     </w:p>
     <w:tbl>
@@ -782,11 +847,6 @@
     </w:tbl>
     <w:p/>
     <w:p>
-      <w:r>
-        <w:t>---FIN---</w:t>
-      </w:r>
-    </w:p>
-    <w:p>
       <w:pPr>
         <w:pStyle w:val="Heading2"/>
       </w:pPr>
@@ -810,8 +870,19 @@
       </w:r>
     </w:p>
     <w:p>
-      <w:r>
-        <w:t>★★★</w:t>
+      <w:pPr>
+        <w:spacing w:before="160" w:after="160"/>
+        <w:jc w:val="center"/>
+      </w:pPr>
+      <w:r>
+        <w:rPr>
+          <w:b w:val="0"/>
+          <w:i w:val="0"/>
+          <w:color w:val="D4A017"/>
+          <w:sz w:val="22"/>
+          <w:rFonts w:ascii="FreeSans" w:hAnsi="FreeSans" w:cs="FreeSans"/>
+        </w:rPr>
+        <w:t>★  ★  ★</w:t>
       </w:r>
     </w:p>
     <w:p>
@@ -864,11 +935,6 @@
     <w:p>
       <w:r>
         <w:t>L'autre preuve est juridique. La Charte du Mandé — dite aussi Kouroukan Fouga, 1236 — est considérée comme l'une des premières déclarations de droits humains de l'histoire: elle proclame la sacralité de la vie humaine, l'égalité de tous, l'abolition de l'esclavage par réduction. Pour le dire simplement, ce texte interdit de réduire une personne libre en esclavage et affirme que toute vie en vaut une autre — plus de cinq siècles avant la Déclaration des droits de l'homme et du citoyen de 1789. Proclamée à l'avènement de Soundiata Keïta, transmise oralement par les griots de génération en génération, la Charte rappelle une évidence que l'idéologie coloniale a niée: la réflexion sur la dignité humaine n'a pas attendu l'Europe pour exister au Sahel.</w:t>
-      </w:r>
-    </w:p>
-    <w:p>
-      <w:r>
-        <w:t>---ENCADRE---</w:t>
       </w:r>
     </w:p>
     <w:tbl>
@@ -974,11 +1040,6 @@
     </w:tbl>
     <w:p/>
     <w:p>
-      <w:r>
-        <w:t>---FIN---</w:t>
-      </w:r>
-    </w:p>
-    <w:p>
       <w:pPr>
         <w:pStyle w:val="Heading2"/>
       </w:pPr>
@@ -1002,8 +1063,19 @@
       </w:r>
     </w:p>
     <w:p>
-      <w:r>
-        <w:t>★★★</w:t>
+      <w:pPr>
+        <w:spacing w:before="160" w:after="160"/>
+        <w:jc w:val="center"/>
+      </w:pPr>
+      <w:r>
+        <w:rPr>
+          <w:b w:val="0"/>
+          <w:i w:val="0"/>
+          <w:color w:val="D4A017"/>
+          <w:sz w:val="22"/>
+          <w:rFonts w:ascii="FreeSans" w:hAnsi="FreeSans" w:cs="FreeSans"/>
+        </w:rPr>
+        <w:t>★  ★  ★</w:t>
       </w:r>
     </w:p>
     <w:p>
@@ -1074,11 +1146,6 @@
     <w:p>
       <w:r>
         <w:t>Certains Africains ont vu le piège très tôt. Barthélémy Boganda, fondateur de la République centrafricaine — mort en 1959 dans un accident d'avion aux circonstances suspectées —, et Kwame Nkrumah, père de l'indépendance ghanéenne, mettaient en garde contre la même menace: des États micro-nationaux non viables, condamnés à la dépendance permanente, incapables de peser individuellement dans un système international construit contre eux. En d'autres termes, un État trop petit, enclavé, découpé sans logique économique, ne peut ni se défendre seul, ni négocier seul, ni se développer seul: il est structurellement condamné à chercher un protecteur — et le protecteur tout désigné sera l'ancien colonisateur. Berlin 1884-1885 avait fabriqué la condition de l'impossible souveraineté. Le destin des deux hommes ajoute à l'avertissement: Boganda meurt avant l'indépendance de son pays, dans des circonstances jamais pleinement élucidées, et Nkrumah, on le verra, sera renversé en 1966. Les fédérations qu'ils appelaient de leurs vœux ne verront pas le jour de leur vivant; il faudra attendre 2023 et la Charte du Liptako-Gourma pour qu'une réponse institutionnelle à ce morcellement émerge au Sahel — trois États nés du découpage de Berlin décidant, cent quarante ans plus tard, de mettre leurs souverainetés en commun.</w:t>
-      </w:r>
-    </w:p>
-    <w:p>
-      <w:r>
-        <w:t>---ENCADRE---</w:t>
       </w:r>
     </w:p>
     <w:tbl>
@@ -1184,11 +1251,6 @@
     </w:tbl>
     <w:p/>
     <w:p>
-      <w:r>
-        <w:t>---FIN---</w:t>
-      </w:r>
-    </w:p>
-    <w:p>
       <w:pPr>
         <w:pStyle w:val="Heading2"/>
       </w:pPr>
@@ -1212,8 +1274,19 @@
       </w:r>
     </w:p>
     <w:p>
-      <w:r>
-        <w:t>★★★</w:t>
+      <w:pPr>
+        <w:spacing w:before="160" w:after="160"/>
+        <w:jc w:val="center"/>
+      </w:pPr>
+      <w:r>
+        <w:rPr>
+          <w:b w:val="0"/>
+          <w:i w:val="0"/>
+          <w:color w:val="D4A017"/>
+          <w:sz w:val="22"/>
+          <w:rFonts w:ascii="FreeSans" w:hAnsi="FreeSans" w:cs="FreeSans"/>
+        </w:rPr>
+        <w:t>★  ★  ★</w:t>
       </w:r>
     </w:p>
     <w:p>
@@ -1271,11 +1344,6 @@
     <w:p>
       <w:r>
         <w:t>Babemba Traoré, roi du Kenédougou, dans l'actuel Mali, voit en 1898 les troupes françaises mettre le siège devant sa capitale, Sikasso, protégée par son célèbre tata — une muraille d'enceinte que l'artillerie finit par éventrer. Quand la chute devient inévitable, Babemba choisit de se donner la mort plutôt que de se rendre. Son geste restera, dans la mémoire malienne, comme la définition même du refus: on peut prendre la ville, pas le roi. Rabah Fadlallah conquiert le sultanat du Bornou et résiste à la pénétration française jusqu'en 1900, où il est vaincu et tué à la bataille de Kousseri, dans l'actuel Cameroun. Avant eux, El Hadj Omar Tall, fondateur de la théocratie toucouleur couvrant le Mali, la Guinée et le Sénégal actuels, avait mené au XIXe siècle la résistance islamique à la colonisation française, avant d'être acculé dans une grotte au nord du Mali, en 1864, où il disparaît.</w:t>
-      </w:r>
-    </w:p>
-    <w:p>
-      <w:r>
-        <w:t>---ENCADRE---</w:t>
       </w:r>
     </w:p>
     <w:tbl>
@@ -1399,11 +1467,6 @@
     </w:tbl>
     <w:p/>
     <w:p>
-      <w:r>
-        <w:t>---FIN---</w:t>
-      </w:r>
-    </w:p>
-    <w:p>
       <w:pPr>
         <w:pStyle w:val="Heading2"/>
       </w:pPr>
@@ -1445,8 +1508,19 @@
       </w:r>
     </w:p>
     <w:p>
-      <w:r>
-        <w:t>★★★</w:t>
+      <w:pPr>
+        <w:spacing w:before="160" w:after="160"/>
+        <w:jc w:val="center"/>
+      </w:pPr>
+      <w:r>
+        <w:rPr>
+          <w:b w:val="0"/>
+          <w:i w:val="0"/>
+          <w:color w:val="D4A017"/>
+          <w:sz w:val="22"/>
+          <w:rFonts w:ascii="FreeSans" w:hAnsi="FreeSans" w:cs="FreeSans"/>
+        </w:rPr>
+        <w:t>★  ★  ★</w:t>
       </w:r>
     </w:p>
     <w:p>
@@ -1490,8 +1564,19 @@
       </w:pPr>
     </w:p>
     <w:p>
-      <w:r>
-        <w:t>★★★</w:t>
+      <w:pPr>
+        <w:spacing w:before="160" w:after="160"/>
+        <w:jc w:val="center"/>
+      </w:pPr>
+      <w:r>
+        <w:rPr>
+          <w:b w:val="0"/>
+          <w:i w:val="0"/>
+          <w:color w:val="D4A017"/>
+          <w:sz w:val="22"/>
+          <w:rFonts w:ascii="FreeSans" w:hAnsi="FreeSans" w:cs="FreeSans"/>
+        </w:rPr>
+        <w:t>★  ★  ★</w:t>
       </w:r>
     </w:p>
     <w:p>
@@ -1515,8 +1600,19 @@
       </w:r>
     </w:p>
     <w:p>
-      <w:r>
-        <w:t>★★★</w:t>
+      <w:pPr>
+        <w:spacing w:before="160" w:after="160"/>
+        <w:jc w:val="center"/>
+      </w:pPr>
+      <w:r>
+        <w:rPr>
+          <w:b w:val="0"/>
+          <w:i w:val="0"/>
+          <w:color w:val="D4A017"/>
+          <w:sz w:val="22"/>
+          <w:rFonts w:ascii="FreeSans" w:hAnsi="FreeSans" w:cs="FreeSans"/>
+        </w:rPr>
+        <w:t>★  ★  ★</w:t>
       </w:r>
     </w:p>
     <w:p>
@@ -1656,11 +1752,6 @@
     <w:p>
       <w:r>
         <w:t>Quatre pionniers. Deux assassinés, deux renversés. Aucun n'a achevé son mandat. La leçon, elle, a été parfaitement reçue par les survivants.</w:t>
-      </w:r>
-    </w:p>
-    <w:p>
-      <w:r>
-        <w:t>---ENCADRE---</w:t>
       </w:r>
     </w:p>
     <w:tbl>
@@ -1748,11 +1839,6 @@
     </w:tbl>
     <w:p/>
     <w:p>
-      <w:r>
-        <w:t>---FIN---</w:t>
-      </w:r>
-    </w:p>
-    <w:p>
       <w:pPr>
         <w:pStyle w:val="Heading2"/>
       </w:pPr>
@@ -1790,8 +1876,19 @@
       </w:r>
     </w:p>
     <w:p>
-      <w:r>
-        <w:t>★★★</w:t>
+      <w:pPr>
+        <w:spacing w:before="160" w:after="160"/>
+        <w:jc w:val="center"/>
+      </w:pPr>
+      <w:r>
+        <w:rPr>
+          <w:b w:val="0"/>
+          <w:i w:val="0"/>
+          <w:color w:val="D4A017"/>
+          <w:sz w:val="22"/>
+          <w:rFonts w:ascii="FreeSans" w:hAnsi="FreeSans" w:cs="FreeSans"/>
+        </w:rPr>
+        <w:t>★  ★  ★</w:t>
       </w:r>
     </w:p>
     <w:p>
@@ -1926,11 +2023,6 @@
     <w:p>
       <w:r>
         <w:t>Et la machine se réalimente elle-même. Robert Bourgi, avocat franco-libanais et porteur de mallettes pour l'Élysée, raconte ses tournées chez Omar Bongo, Blaise Compaoré, Denis Sassou-Nguesso ou Mobutu, avec un message de Paris: contribuez à la campagne de « votre ami». « Jamais ça n'est descendu en dessous d'un million de dollars.» Pour la seule campagne de Jacques Chirac en 1995: au moins 100 millions de dollars. Laurent Gbagbo, à sa sortie de la CPI, admet avoir versé 3 millions d'euros à la demande de Chirac et de Villepin. Charles Pasqua, ancien ministre de l'Intérieur, reconnaît publiquement dans Le Parisien que Balladur voulait « couper les vivres aux socialistes» en remplaçant Le Floch-Prigent à la tête d'Elf. Le pétrole africain, acheté quatre dollars, finançait la démocratie française.</w:t>
-      </w:r>
-    </w:p>
-    <w:p>
-      <w:r>
-        <w:t>---ENCADRE---</w:t>
       </w:r>
     </w:p>
     <w:tbl>
@@ -2059,11 +2151,6 @@
       </w:r>
     </w:p>
     <w:p>
-      <w:r>
-        <w:t>---FIN---</w:t>
-      </w:r>
-    </w:p>
-    <w:p>
       <w:pPr>
         <w:pStyle w:val="Heading2"/>
       </w:pPr>
@@ -2087,8 +2174,19 @@
       </w:r>
     </w:p>
     <w:p>
-      <w:r>
-        <w:t>★★★</w:t>
+      <w:pPr>
+        <w:spacing w:before="160" w:after="160"/>
+        <w:jc w:val="center"/>
+      </w:pPr>
+      <w:r>
+        <w:rPr>
+          <w:b w:val="0"/>
+          <w:i w:val="0"/>
+          <w:color w:val="D4A017"/>
+          <w:sz w:val="22"/>
+          <w:rFonts w:ascii="FreeSans" w:hAnsi="FreeSans" w:cs="FreeSans"/>
+        </w:rPr>
+        <w:t>★  ★  ★</w:t>
       </w:r>
     </w:p>
     <w:p>
@@ -2167,11 +2265,6 @@
     <w:p>
       <w:r>
         <w:t>Concrètement, voici ce que cela signifie: quand le Niger vend son uranium ou le Mali son or à un acheteur étranger, les devises gagnées transitent par ce compte parisien. La France connaît ainsi, en temps réel, les flux d'exportation de chaque pays; elle peut bloquer des transactions; elle contrôle de fait la politique monétaire de nations théoriquement souveraines. Le taux de change est fixé par Paris. Les banques centrales africaines ont leur siège à Dakar ou à Yaoundé, mais leurs dirigeants sont systématiquement formés à Paris et orientés par Paris. Et l'ironie est complète, comme le relève le journaliste Albert Anatole Ayissi: « Même les migrants français en Afrique ne sont pas payés en franc CFA — ils le sont en euros.»</w:t>
-      </w:r>
-    </w:p>
-    <w:p>
-      <w:r>
-        <w:t>---ENCADRE---</w:t>
       </w:r>
     </w:p>
     <w:tbl>
@@ -2277,11 +2370,6 @@
     </w:tbl>
     <w:p/>
     <w:p>
-      <w:r>
-        <w:t>---FIN---</w:t>
-      </w:r>
-    </w:p>
-    <w:p>
       <w:pPr>
         <w:pStyle w:val="Heading2"/>
       </w:pPr>
@@ -2351,8 +2439,19 @@
       </w:r>
     </w:p>
     <w:p>
-      <w:r>
-        <w:t>★★★</w:t>
+      <w:pPr>
+        <w:spacing w:before="160" w:after="160"/>
+        <w:jc w:val="center"/>
+      </w:pPr>
+      <w:r>
+        <w:rPr>
+          <w:b w:val="0"/>
+          <w:i w:val="0"/>
+          <w:color w:val="D4A017"/>
+          <w:sz w:val="22"/>
+          <w:rFonts w:ascii="FreeSans" w:hAnsi="FreeSans" w:cs="FreeSans"/>
+        </w:rPr>
+        <w:t>★  ★  ★</w:t>
       </w:r>
     </w:p>
     <w:p>
@@ -2436,11 +2535,6 @@
     <w:p>
       <w:r>
         <w:t>Et il y a le coût invisible. Quand l'ambassadeur Sylvain Itté ironisait sur les réseaux — « Arrêtez de boire l'eau à Niamey puisqu'elle est européenne» —, Franklin Nyamsi a décodé ce que la moquerie masquait: les nappes phréatiques d'Arlit sont polluées par les résidus des mines d'uranium, contamination documentée par Greenpeace dès 2010. Des Nigériens boivent une eau radioactive. Pendant ce temps, moins de 20 % de la population du pays a accès à l'électricité (Banque mondiale, 2022). La formule résume tout: le pays qui éclaire la France vit dans l'obscurité.</w:t>
-      </w:r>
-    </w:p>
-    <w:p>
-      <w:r>
-        <w:t>---ENCADRE---</w:t>
       </w:r>
     </w:p>
     <w:tbl>
@@ -2564,11 +2658,6 @@
     </w:tbl>
     <w:p/>
     <w:p>
-      <w:r>
-        <w:t>---FIN---</w:t>
-      </w:r>
-    </w:p>
-    <w:p>
       <w:pPr>
         <w:pStyle w:val="Heading2"/>
       </w:pPr>
@@ -2628,8 +2717,19 @@
       </w:r>
     </w:p>
     <w:p>
-      <w:r>
-        <w:t>★★★</w:t>
+      <w:pPr>
+        <w:spacing w:before="160" w:after="160"/>
+        <w:jc w:val="center"/>
+      </w:pPr>
+      <w:r>
+        <w:rPr>
+          <w:b w:val="0"/>
+          <w:i w:val="0"/>
+          <w:color w:val="D4A017"/>
+          <w:sz w:val="22"/>
+          <w:rFonts w:ascii="FreeSans" w:hAnsi="FreeSans" w:cs="FreeSans"/>
+        </w:rPr>
+        <w:t>★  ★  ★</w:t>
       </w:r>
     </w:p>
     <w:p>
@@ -2731,11 +2831,6 @@
     <w:p>
       <w:r>
         <w:t>La meilleure preuve que l'aide est un instrument politique? Sa courbe épouse exactement celle de l'obéissance.</w:t>
-      </w:r>
-    </w:p>
-    <w:p>
-      <w:r>
-        <w:t>---ENCADRE---</w:t>
       </w:r>
     </w:p>
     <w:tbl>
@@ -2878,11 +2973,6 @@
     <w:p/>
     <w:p>
       <w:r>
-        <w:t>---FIN---</w:t>
-      </w:r>
-    </w:p>
-    <w:p>
-      <w:r>
         <w:t>La Centrafrique illustre le mécanisme dans sa forme la plus crue. L'aide budgétaire internationale y représente, selon les années, 46 à 69 milliards de FCFA — jusqu'à 46 % du budget national (ministre des Finances Hervé Ndoba, 2022). Quand la France suspend son aide en 2021 pour forcer le départ de Wagner, elle pose explicitement trois conditions à la reprise: arrêt de la « désinformation», arrêt du « harcèlement des entreprises françaises», départ de Wagner (sources de l'ambassade de France à Bangui, Oubangui Médias, septembre 2021). Et la « désinformation», dans cette grammaire, se définit comme toute information défavorable aux intérêts français.</w:t>
       </w:r>
     </w:p>
@@ -2948,8 +3038,19 @@
       </w:r>
     </w:p>
     <w:p>
-      <w:r>
-        <w:t>★★★</w:t>
+      <w:pPr>
+        <w:spacing w:before="160" w:after="160"/>
+        <w:jc w:val="center"/>
+      </w:pPr>
+      <w:r>
+        <w:rPr>
+          <w:b w:val="0"/>
+          <w:i w:val="0"/>
+          <w:color w:val="D4A017"/>
+          <w:sz w:val="22"/>
+          <w:rFonts w:ascii="FreeSans" w:hAnsi="FreeSans" w:cs="FreeSans"/>
+        </w:rPr>
+        <w:t>★  ★  ★</w:t>
       </w:r>
     </w:p>
     <w:p>
@@ -3023,11 +3124,6 @@
     <w:p>
       <w:r>
         <w:t>Le Dr Yamb Ntimba a donné de ce système sa description la plus structurée: une pyramide de domination à cinq niveaux. Le niveau militaire garantit la cohérence de l'ensemble. Le niveau économique assure la captation. Le niveau informationnel fabrique le consentement. Le niveau culturel et médiatique structure les imaginaires. Et le niveau ontologique — le plus profond — installe la conviction de l'infériorité africaine dans les têtes africaines elles-mêmes. Concrètement, le niveau « ontologique» signifie ceci: quand un peuple a intégré qu'il est incapable de se gouverner, il n'a plus besoin d'être occupé — il s'occupe lui-même.</w:t>
-      </w:r>
-    </w:p>
-    <w:p>
-      <w:r>
-        <w:t>---ENCADRE---</w:t>
       </w:r>
     </w:p>
     <w:tbl>
@@ -3152,11 +3248,6 @@
     <w:p/>
     <w:p>
       <w:r>
-        <w:t>---FIN---</w:t>
-      </w:r>
-    </w:p>
-    <w:p>
-      <w:r>
         <w:t>Le point décisif de cette grille: le niveau militaire est le plus visible, mais le moins déterminant sur le long terme. C'est le sommet ontologique qui assure la résilience du système, même quand les armées sont expulsées. D'où l'importance des trois instruments qui suivent.</w:t>
       </w:r>
     </w:p>
@@ -3171,11 +3262,6 @@
     <w:p>
       <w:r>
         <w:t>Toute domination a besoin d'un vocabulaire, et celui de la Françafrique est sophistiqué: il nomme les choses à l'inverse de ce qu'elles sont. Cette inversion n'est pas un accident de langue. Elle est fonctionnelle: elle présente la domination comme de l'aide, l'exploitation comme du partenariat, la résistance comme de l'ingratitude.</w:t>
-      </w:r>
-    </w:p>
-    <w:p>
-      <w:r>
-        <w:t>---ENCADRE---</w:t>
       </w:r>
     </w:p>
     <w:tbl>
@@ -3318,11 +3404,6 @@
     <w:p/>
     <w:p>
       <w:r>
-        <w:t>---FIN---</w:t>
-      </w:r>
-    </w:p>
-    <w:p>
-      <w:r>
         <w:t>Le chercheur Mohamed Mahmoud Ould Mohamedou documente la même mécanique depuis le monde académique: les néologismes forgés pour qualifier le Sahel — « somalisation», « afghanisation», « Sahelistan», « Africanistan» — ne décrivent pas une réalité, ils la construisent. Ce lexique de l'échec structurel sert à installer l'idée qu'« une intervention est nécessaire» avant même que les faits ne la justifient (Mohamedou, La Découverte, 2013). Nathalie Yamb ajoute une observation d'archéologue du discours: l'Occident encourage les divisions en Afrique pendant qu'il sanctionne ceux qui veulent se séparer chez lui — Catalans, Bretons, Corses.</w:t>
       </w:r>
     </w:p>
@@ -3501,8 +3582,19 @@
       </w:r>
     </w:p>
     <w:p>
-      <w:r>
-        <w:t>★★★</w:t>
+      <w:pPr>
+        <w:spacing w:before="160" w:after="160"/>
+        <w:jc w:val="center"/>
+      </w:pPr>
+      <w:r>
+        <w:rPr>
+          <w:b w:val="0"/>
+          <w:i w:val="0"/>
+          <w:color w:val="D4A017"/>
+          <w:sz w:val="22"/>
+          <w:rFonts w:ascii="FreeSans" w:hAnsi="FreeSans" w:cs="FreeSans"/>
+        </w:rPr>
+        <w:t>★  ★  ★</w:t>
       </w:r>
     </w:p>
     <w:p>
@@ -3546,8 +3638,19 @@
       </w:pPr>
     </w:p>
     <w:p>
-      <w:r>
-        <w:t>★★★</w:t>
+      <w:pPr>
+        <w:spacing w:before="160" w:after="160"/>
+        <w:jc w:val="center"/>
+      </w:pPr>
+      <w:r>
+        <w:rPr>
+          <w:b w:val="0"/>
+          <w:i w:val="0"/>
+          <w:color w:val="D4A017"/>
+          <w:sz w:val="22"/>
+          <w:rFonts w:ascii="FreeSans" w:hAnsi="FreeSans" w:cs="FreeSans"/>
+        </w:rPr>
+        <w:t>★  ★  ★</w:t>
       </w:r>
     </w:p>
     <w:p>
@@ -3556,8 +3659,19 @@
       </w:r>
     </w:p>
     <w:p>
-      <w:r>
-        <w:t>★★★</w:t>
+      <w:pPr>
+        <w:spacing w:before="160" w:after="160"/>
+        <w:jc w:val="center"/>
+      </w:pPr>
+      <w:r>
+        <w:rPr>
+          <w:b w:val="0"/>
+          <w:i w:val="0"/>
+          <w:color w:val="D4A017"/>
+          <w:sz w:val="22"/>
+          <w:rFonts w:ascii="FreeSans" w:hAnsi="FreeSans" w:cs="FreeSans"/>
+        </w:rPr>
+        <w:t>★  ★  ★</w:t>
       </w:r>
     </w:p>
     <w:p>
@@ -3646,11 +3760,6 @@
     <w:p>
       <w:r>
         <w:t>Mais l'essentiel, pour Pondi, n'est pas dans les titres: il est dans la convergence entre le discours et les actes. Là où tant de chefs d'État se proclament anticolonialistes sans jamais le prouver, Kadhafi engage l'argent. Entre 2000 et 2010, il investit plus de 20 milliards de dollars sur le continent — davantage, souligne Pondi, que la Banque mondiale ou le FMI sur la même période. Ces investissements ont des noms et une portée stratégique: avec le satellite RASCOM, par exemple, un téléspectateur camerounais peut pour la première fois regarder une chaîne sénégalaise, sud-africaine ou nigériane, là où le continent était jusqu'alors condamné à louer les satellites occidentaux pour quelque 500 000 euros par an et par pays.</w:t>
-      </w:r>
-    </w:p>
-    <w:p>
-      <w:r>
-        <w:t>---ENCADRE---</w:t>
       </w:r>
     </w:p>
     <w:tbl>
@@ -3774,11 +3883,6 @@
     </w:tbl>
     <w:p/>
     <w:p>
-      <w:r>
-        <w:t>---FIN---</w:t>
-      </w:r>
-    </w:p>
-    <w:p>
       <w:pPr>
         <w:pStyle w:val="Heading2"/>
       </w:pPr>
@@ -3914,11 +4018,6 @@
     <w:p>
       <w:r>
         <w:t>La Libye de Kadhafi était l'un des États les plus militarisés d'Afrique. Sa destruction pulvérise les chaînes de garde de ses dépôts: des dizaines de milliers de tonnes d'armes — missiles, lance-roquettes, armes automatiques, véhicules blindés — se dispersent dans toute la bande sahélo-saharienne. Les combattants touareg du nord du Mali, dont certains avaient servi dans l'armée libyenne, rentrent chez eux avec armes et bagages. Au sens propre.</w:t>
-      </w:r>
-    </w:p>
-    <w:p>
-      <w:r>
-        <w:t>---ENCADRE---</w:t>
       </w:r>
     </w:p>
     <w:tbl>
@@ -4025,11 +4124,6 @@
     <w:p/>
     <w:p>
       <w:r>
-        <w:t>---FIN---</w:t>
-      </w:r>
-    </w:p>
-    <w:p>
-      <w:r>
         <w:t>Le Fezzan, justement. Cette vaste région désertique du sud libyen, peu contrôlée par Tripoli, a toujours été tournée vers le Niger, le Tchad et le Soudan plutôt que vers la côte méditerranéenne. Elle abrite des tribus touareg, toubou et arabes dont les réseaux de solidarité s'étendent de part et d'autre de plusieurs frontières à la fois. Kadhafi tenait le Fezzan. Son élimination a libéré cet espace, qui devient en quelques années la principale base arrière logistique des groupes armés actifs au Sahel — non seulement un couloir de passage, mais une zone de repli, de recrutement et d'approvisionnement. Les arsenaux dispersés y ont transité. Les réseaux tribaux transfrontaliers y ont prospéré, sans État pour les contraindre.</w:t>
       </w:r>
     </w:p>
@@ -4044,8 +4138,19 @@
       </w:r>
     </w:p>
     <w:p>
-      <w:r>
-        <w:t>★★★</w:t>
+      <w:pPr>
+        <w:spacing w:before="160" w:after="160"/>
+        <w:jc w:val="center"/>
+      </w:pPr>
+      <w:r>
+        <w:rPr>
+          <w:b w:val="0"/>
+          <w:i w:val="0"/>
+          <w:color w:val="D4A017"/>
+          <w:sz w:val="22"/>
+          <w:rFonts w:ascii="FreeSans" w:hAnsi="FreeSans" w:cs="FreeSans"/>
+        </w:rPr>
+        <w:t>★  ★  ★</w:t>
       </w:r>
     </w:p>
     <w:p>
@@ -4171,11 +4276,6 @@
     <w:p>
       <w:r>
         <w:t>La fabrique du terrorisme n'est pas seulement idéologique et financière. Elle est géographique. Une cartographie diffusée en mai 2026 par le canal d'analyse militaire @RYBAR_AFRICA documente les sentiers nomades transsahariens empruntés par les groupes armés, et recoupe les données de terrain d'ACLED ainsi que les constats des autorités maliennes. Trois réalités s'en dégagent.</w:t>
-      </w:r>
-    </w:p>
-    <w:p>
-      <w:r>
-        <w:t>---ENCADRE---</w:t>
       </w:r>
     </w:p>
     <w:tbl>
@@ -4264,11 +4364,6 @@
     <w:p/>
     <w:p>
       <w:r>
-        <w:t>---FIN---</w:t>
-      </w:r>
-    </w:p>
-    <w:p>
-      <w:r>
         <w:t>Ces corridors offrent aux groupes armés trois avantages: des camps de repli sur des territoires échappant à toute souveraineté effective; une économie de guerre autofinancée par la contrebande d'armes et de stupéfiants — concrètement, la guerre paie la guerre, sans dépendre d'un sponsor unique; et un recrutement transfrontalier au sein de communautés que les frontières de Berlin ont coupées en deux. Les frontières divisent les familles; les réseaux de recrutement les traversent. L'asymétrie est structurelle — et millénaire. Au bout de ces pistes, le Fezzan libyen, déjà rencontré au chapitre précédent, sert de base arrière durable.</w:t>
       </w:r>
     </w:p>
@@ -4311,8 +4406,19 @@
       </w:r>
     </w:p>
     <w:p>
-      <w:r>
-        <w:t>★★★</w:t>
+      <w:pPr>
+        <w:spacing w:before="160" w:after="160"/>
+        <w:jc w:val="center"/>
+      </w:pPr>
+      <w:r>
+        <w:rPr>
+          <w:b w:val="0"/>
+          <w:i w:val="0"/>
+          <w:color w:val="D4A017"/>
+          <w:sz w:val="22"/>
+          <w:rFonts w:ascii="FreeSans" w:hAnsi="FreeSans" w:cs="FreeSans"/>
+        </w:rPr>
+        <w:t>★  ★  ★</w:t>
       </w:r>
     </w:p>
     <w:p>
@@ -4405,11 +4511,6 @@
     <w:p>
       <w:r>
         <w:t>En août 2014, Serval devient Barkhane. Le dispositif s'étend sur cinq pays.</w:t>
-      </w:r>
-    </w:p>
-    <w:p>
-      <w:r>
-        <w:t>---ENCADRE---</w:t>
       </w:r>
     </w:p>
     <w:tbl>
@@ -4516,11 +4617,6 @@
     <w:p/>
     <w:p>
       <w:r>
-        <w:t>---FIN---</w:t>
-      </w:r>
-    </w:p>
-    <w:p>
-      <w:r>
         <w:t>Cinq milliards d'euros. Neuf ans. La menace triple. Il n'y a que deux explications possibles: soit les armées françaises sont incompétentes — ce que la communication officielle dément avec véhémence —, soit la mission n'était pas celle qu'on annonçait. La seconde hypothèse a des preuves.</w:t>
       </w:r>
     </w:p>
@@ -4582,11 +4678,6 @@
     <w:p>
       <w:r>
         <w:t>Reste l'argument ultime de Paris: le sacrifice. En 2025, le ministre des Armées Sébastien Lecornu déclare au Figaro qu'il est « profondément navrant» de voir le terrorisme resurgir au Sahel après tant d'efforts — sous-entendu, après le sang versé des 58 soldats français morts au Sahel. Ce chiffre mérite un examen mort par mort. Nathalie Yamb l'a fait, en s'appuyant exclusivement sur les données publiées par le ministère français des Armées lui-même.</w:t>
-      </w:r>
-    </w:p>
-    <w:p>
-      <w:r>
-        <w:t>---ENCADRE---</w:t>
       </w:r>
     </w:p>
     <w:tbl>
@@ -4693,11 +4784,6 @@
     <w:p/>
     <w:p>
       <w:r>
-        <w:t>---FIN---</w:t>
-      </w:r>
-    </w:p>
-    <w:p>
-      <w:r>
         <w:t>Quinze morts au combat. Pour la France — pas pour le Mali, pas pour le Niger, pas pour le Burkina. Et ce chiffre est inférieur au bilan d'une seule frappe française: le 3 janvier 2021, à Bounti, dans la région de Mopti, l'aviation française frappe un rassemblement. L'enquête de la MINUSMA conclut qu'il s'agissait d'un mariage et dénombre 22 morts, dont 19 civils. Le ministère des Armées maintient sa version et tente de discréditer le rapport onusien.</w:t>
       </w:r>
     </w:p>
@@ -4722,8 +4808,19 @@
       </w:r>
     </w:p>
     <w:p>
-      <w:r>
-        <w:t>★★★</w:t>
+      <w:pPr>
+        <w:spacing w:before="160" w:after="160"/>
+        <w:jc w:val="center"/>
+      </w:pPr>
+      <w:r>
+        <w:rPr>
+          <w:b w:val="0"/>
+          <w:i w:val="0"/>
+          <w:color w:val="D4A017"/>
+          <w:sz w:val="22"/>
+          <w:rFonts w:ascii="FreeSans" w:hAnsi="FreeSans" w:cs="FreeSans"/>
+        </w:rPr>
+        <w:t>★  ★  ★</w:t>
       </w:r>
     </w:p>
     <w:p>
@@ -4861,11 +4958,6 @@
     <w:p>
       <w:r>
         <w:t>Le cas d'école est le rapport du 2 avril 2026: 342 pages visant Ibrahim Traoré comme « responsable potentiel de crimes de guerre». Son calendrier intrigue. L'AES a annoncé son retrait de la CPI le 22 septembre 2025; la Cour conserve une compétence résiduelle d'un an. Le rapport couvre 2023-2025 — précisément les années encore poursuivables — et la lettre demandant la réponse des autorités burkinabè n'a été envoyée que le 22 décembre 2025, après trois ans de travail à charge et quatre mois avant publication (Yamb, avril 2026). Plus troublant: parmi les contributeurs remerciés figure Wassim Nassar, en contact en temps réel avec les assaillants lors de l'attaque de Bamako du 17 septembre 2024, et poursuivi par la justice des trois pays de l'AES pour association de malfaiteurs en lien avec une entreprise terroriste.</w:t>
-      </w:r>
-    </w:p>
-    <w:p>
-      <w:r>
-        <w:t>---ENCADRE---</w:t>
       </w:r>
     </w:p>
     <w:tbl>
@@ -5026,11 +5118,6 @@
     <w:p/>
     <w:p>
       <w:r>
-        <w:t>---FIN---</w:t>
-      </w:r>
-    </w:p>
-    <w:p>
-      <w:r>
         <w:t>Pour le dire simplement, la mécanique de l'étranglement fonctionne en cascade: un rapport qualifie un État d'« autoritaire»; les agences de notation dégradent sa note; son coût d'emprunt augmente; le FMI et la Banque mondiale conditionnent ou suspendent leurs financements. L'étranglement économique avance déguisé en préoccupation humanitaire. La conclusion n'est pas qu'il faut abolir l'humanitaire. C'est qu'il faut mettre fin à son immunité analytique. Le Niger en a tiré une conséquence radicale en 2025 en expulsant le CICR, Tiani invoquant des réunions secrètes tenues à Abuja début 2025 entre représentants occidentaux et groupes armés, avec le CICR comme vecteur financier.</w:t>
       </w:r>
     </w:p>
@@ -5155,8 +5242,19 @@
       </w:r>
     </w:p>
     <w:p>
-      <w:r>
-        <w:t>★★★</w:t>
+      <w:pPr>
+        <w:spacing w:before="160" w:after="160"/>
+        <w:jc w:val="center"/>
+      </w:pPr>
+      <w:r>
+        <w:rPr>
+          <w:b w:val="0"/>
+          <w:i w:val="0"/>
+          <w:color w:val="D4A017"/>
+          <w:sz w:val="22"/>
+          <w:rFonts w:ascii="FreeSans" w:hAnsi="FreeSans" w:cs="FreeSans"/>
+        </w:rPr>
+        <w:t>★  ★  ★</w:t>
       </w:r>
     </w:p>
     <w:p>
@@ -5303,8 +5401,19 @@
       </w:r>
     </w:p>
     <w:p>
-      <w:r>
-        <w:t>★★★</w:t>
+      <w:pPr>
+        <w:spacing w:before="160" w:after="160"/>
+        <w:jc w:val="center"/>
+      </w:pPr>
+      <w:r>
+        <w:rPr>
+          <w:b w:val="0"/>
+          <w:i w:val="0"/>
+          <w:color w:val="D4A017"/>
+          <w:sz w:val="22"/>
+          <w:rFonts w:ascii="FreeSans" w:hAnsi="FreeSans" w:cs="FreeSans"/>
+        </w:rPr>
+        <w:t>★  ★  ★</w:t>
       </w:r>
     </w:p>
     <w:p>
@@ -5348,8 +5457,19 @@
       </w:pPr>
     </w:p>
     <w:p>
-      <w:r>
-        <w:t>★★★</w:t>
+      <w:pPr>
+        <w:spacing w:before="160" w:after="160"/>
+        <w:jc w:val="center"/>
+      </w:pPr>
+      <w:r>
+        <w:rPr>
+          <w:b w:val="0"/>
+          <w:i w:val="0"/>
+          <w:color w:val="D4A017"/>
+          <w:sz w:val="22"/>
+          <w:rFonts w:ascii="FreeSans" w:hAnsi="FreeSans" w:cs="FreeSans"/>
+        </w:rPr>
+        <w:t>★  ★  ★</w:t>
       </w:r>
     </w:p>
     <w:p>
@@ -5373,8 +5493,19 @@
       </w:r>
     </w:p>
     <w:p>
-      <w:r>
-        <w:t>★★★</w:t>
+      <w:pPr>
+        <w:spacing w:before="160" w:after="160"/>
+        <w:jc w:val="center"/>
+      </w:pPr>
+      <w:r>
+        <w:rPr>
+          <w:b w:val="0"/>
+          <w:i w:val="0"/>
+          <w:color w:val="D4A017"/>
+          <w:sz w:val="22"/>
+          <w:rFonts w:ascii="FreeSans" w:hAnsi="FreeSans" w:cs="FreeSans"/>
+        </w:rPr>
+        <w:t>★  ★  ★</w:t>
       </w:r>
     </w:p>
     <w:p>
@@ -5549,8 +5680,19 @@
       </w:r>
     </w:p>
     <w:p>
-      <w:r>
-        <w:t>★★★</w:t>
+      <w:pPr>
+        <w:spacing w:before="160" w:after="160"/>
+        <w:jc w:val="center"/>
+      </w:pPr>
+      <w:r>
+        <w:rPr>
+          <w:b w:val="0"/>
+          <w:i w:val="0"/>
+          <w:color w:val="D4A017"/>
+          <w:sz w:val="22"/>
+          <w:rFonts w:ascii="FreeSans" w:hAnsi="FreeSans" w:cs="FreeSans"/>
+        </w:rPr>
+        <w:t>★  ★  ★</w:t>
       </w:r>
     </w:p>
     <w:p>
@@ -5676,8 +5818,19 @@
       </w:r>
     </w:p>
     <w:p>
-      <w:r>
-        <w:t>★★★</w:t>
+      <w:pPr>
+        <w:spacing w:before="160" w:after="160"/>
+        <w:jc w:val="center"/>
+      </w:pPr>
+      <w:r>
+        <w:rPr>
+          <w:b w:val="0"/>
+          <w:i w:val="0"/>
+          <w:color w:val="D4A017"/>
+          <w:sz w:val="22"/>
+          <w:rFonts w:ascii="FreeSans" w:hAnsi="FreeSans" w:cs="FreeSans"/>
+        </w:rPr>
+        <w:t>★  ★  ★</w:t>
       </w:r>
     </w:p>
     <w:p>
@@ -5716,11 +5869,6 @@
     <w:p>
       <w:r>
         <w:t>Niamey, 26 juillet 2023. Au petit matin, la garde présidentielle nigérienne place le président Mohamed Bazoum en résidence surveillée, au cœur même du palais. Le général Abdourahamane Tiani, chef de cette garde, prend la tête du Conseil national pour la sauvegarde de la patrie. En quelques heures, la réaction internationale atteint une intensité jamais vue pour les transitions précédentes: menaces d'intervention militaire de la CEDEAO, sanctions immédiates, frontières fermées, électricité coupée. Pourquoi tant de fureur pour ce pays-ci? La réponse tient en un mot: le Niger est le dernier verrou.</w:t>
-      </w:r>
-    </w:p>
-    <w:p>
-      <w:r>
-        <w:t>---ENCADRE---</w:t>
       </w:r>
     </w:p>
     <w:tbl>
@@ -5845,11 +5993,6 @@
     <w:p/>
     <w:p>
       <w:r>
-        <w:t>---FIN---</w:t>
-      </w:r>
-    </w:p>
-    <w:p>
-      <w:r>
         <w:t>Perdre le Niger, c'était perdre d'un coup l'intégralité du dispositif sahélien occidental. C'est exactement ce qui va se produire — et sans qu'une seule goutte de sang soit versée.</w:t>
       </w:r>
     </w:p>
@@ -5946,8 +6089,19 @@
       </w:r>
     </w:p>
     <w:p>
-      <w:r>
-        <w:t>★★★</w:t>
+      <w:pPr>
+        <w:spacing w:before="160" w:after="160"/>
+        <w:jc w:val="center"/>
+      </w:pPr>
+      <w:r>
+        <w:rPr>
+          <w:b w:val="0"/>
+          <w:i w:val="0"/>
+          <w:color w:val="D4A017"/>
+          <w:sz w:val="22"/>
+          <w:rFonts w:ascii="FreeSans" w:hAnsi="FreeSans" w:cs="FreeSans"/>
+        </w:rPr>
+        <w:t>★  ★  ★</w:t>
       </w:r>
     </w:p>
     <w:p>
@@ -5991,11 +6145,6 @@
     <w:p>
       <w:r>
         <w:t>Le nom même est un manifeste. Le Liptako-Gourma, c'est la zone des trois frontières, territoire ancestral des Peuls, des Touareg, des Songhaï, des Mossi — un espace qui existait bien avant que la conférence de Berlin ne trace ses lignes droites sur la carte de l'Afrique, en 1884. En choisissant ce nom, l'AES ancre sa rupture dans une continuité qui déborde la colonisation: avant Berlin, ce territoire existait; après Paris, il se reconstruit.</w:t>
-      </w:r>
-    </w:p>
-    <w:p>
-      <w:r>
-        <w:t>---ENCADRE---</w:t>
       </w:r>
     </w:p>
     <w:tbl>
@@ -6120,11 +6269,6 @@
     <w:p/>
     <w:p>
       <w:r>
-        <w:t>---FIN---</w:t>
-      </w:r>
-    </w:p>
-    <w:p>
-      <w:r>
         <w:t>La clause centrale est la première: la défense collective. Concrètement, c'est le principe qui fonde l'OTAN — l'attaque d'un seul vaut attaque de tous —, transposé au Sahel: envahir le Niger, désormais, c'est entrer en guerre contre le Mali et le Burkina Faso en même temps. La menace d'intervention de la CEDEAO meurt ce jour-là, tuée par une signature.</w:t>
       </w:r>
     </w:p>
@@ -6188,8 +6332,19 @@
       </w:r>
     </w:p>
     <w:p>
-      <w:r>
-        <w:t>★★★</w:t>
+      <w:pPr>
+        <w:spacing w:before="160" w:after="160"/>
+        <w:jc w:val="center"/>
+      </w:pPr>
+      <w:r>
+        <w:rPr>
+          <w:b w:val="0"/>
+          <w:i w:val="0"/>
+          <w:color w:val="D4A017"/>
+          <w:sz w:val="22"/>
+          <w:rFonts w:ascii="FreeSans" w:hAnsi="FreeSans" w:cs="FreeSans"/>
+        </w:rPr>
+        <w:t>★  ★  ★</w:t>
       </w:r>
     </w:p>
     <w:p>
@@ -6343,11 +6498,6 @@
       </w:pPr>
       <w:r>
         <w:t>Le 25 avril, et l'homme qu'il fallait tuer</w:t>
-      </w:r>
-    </w:p>
-    <w:p>
-      <w:r>
-        <w:t>---ENCADRE---</w:t>
       </w:r>
     </w:p>
     <w:tbl>
@@ -6490,11 +6640,6 @@
     <w:p/>
     <w:p>
       <w:r>
-        <w:t>---FIN---</w:t>
-      </w:r>
-    </w:p>
-    <w:p>
-      <w:r>
         <w:t>La coordination entre jihadistes et séparatistes, longtemps niée, s'affiche cette fois publiquement: Iyad Ag Ghali, chef du JNIM, et Alghabass Ag Intala commentent ensemble les attaques en vidéo; et le porte-parole du FLA déclare, sans qu'on le lui demande: « Nous avons de bons contacts avec les Ukrainiens tout comme avec la France, avec les États-Unis, avec presque tout le monde.» Banda Kani va plus loin: il décrit un contingent d'environ 12 000 hommes mêlant recrues sahéliennes précarisées et encadrement étranger, et des chefs de groupes armés en contact direct avec des cercles stratégiques français. L'analyste Laith Marouf apporte un éclairage complémentaire sur la composition de cet encadrement: des combattants issus des milices liées à Ahmad al-Sharaa, constituées dans le creuset syrien, auraient été progressivement redéployés vers le Sahel à mesure que leur noyau résiduel en Syrie fragilisait son emprise territoriale. Greffe algérienne des années 1990, armes libyennes de 2011, miliciens syriens de l'après-2024 — l'internationalisation de la force combattante au Sahel suit la chronologie des effondrements régionaux que l'Occident a provoqués ou laissé prospérer.</w:t>
       </w:r>
     </w:p>
@@ -6593,8 +6738,19 @@
       </w:r>
     </w:p>
     <w:p>
-      <w:r>
-        <w:t>★★★</w:t>
+      <w:pPr>
+        <w:spacing w:before="160" w:after="160"/>
+        <w:jc w:val="center"/>
+      </w:pPr>
+      <w:r>
+        <w:rPr>
+          <w:b w:val="0"/>
+          <w:i w:val="0"/>
+          <w:color w:val="D4A017"/>
+          <w:sz w:val="22"/>
+          <w:rFonts w:ascii="FreeSans" w:hAnsi="FreeSans" w:cs="FreeSans"/>
+        </w:rPr>
+        <w:t>★  ★  ★</w:t>
       </w:r>
     </w:p>
     <w:p>
@@ -6725,11 +6881,6 @@
     <w:p>
       <w:r>
         <w:t>Reste un acteur que peu de lecteurs attendraient dans ce tableau, et que la recherche institutionnelle européenne elle-même a fini par nommer. En mai 2026, le SWP — l'Institut allemand pour les affaires internationales et la sécurité, qui conseille le gouvernement fédéral — publie une note signée Gerrit Kurtz, Wolfram Lacher et Stephan Roll sur « le rôle déstabilisateur des Émirats arabes unis dans les conflits africains». Sa conclusion: « Les Émirats arabes unis sont devenus l'un des acteurs extérieurs les plus agressifs dans les conflits africains. Son rôle entrave les efforts de résolution des conflits et aggrave les crises humanitaires ainsi que l'instabilité régionale» (SWP Comment n° 19, mai 2026).</w:t>
-      </w:r>
-    </w:p>
-    <w:p>
-      <w:r>
-        <w:t>---ENCADRE---</w:t>
       </w:r>
     </w:p>
     <w:tbl>
@@ -6872,11 +7023,6 @@
     <w:p/>
     <w:p>
       <w:r>
-        <w:t>---FIN---</w:t>
-      </w:r>
-    </w:p>
-    <w:p>
-      <w:r>
         <w:t>La guerre du Soudan ainsi alimentée a produit la plus grande crise humanitaire du monde: 33,7 millions de personnes dépendantes de l'aide selon l'ONU. Pour le dire simplement, un embargo de l'ONU est une interdiction internationale de livrer des armes à une zone de conflit; 458 vols cargo militaires en quatorze mois donnent la mesure de ce que vaut cette interdiction quand le contrevenant est riche et bien introduit. Détail qui ramène au cœur de notre sujet: le système de défense Galix, de fabrication française, a été retrouvé sur des blindés émiratis au Soudan. Les armes françaises participent au conflit soudanais — via les Émirats comme intermédiaire. Et le silence européen n'est pas une distraction: il est organisé, comme le montre le sort des amendements bloqués au Parlement européen. Pour l'AES, la leçon est immédiate: la guerre proxy décrite au chapitre précédent n'est pas une exclusivité française; c'est une méthode, dont le Soudan voisin offre la version la plus aboutie — et le Tchad, frontalier du Niger, en est déjà un maillon.</w:t>
       </w:r>
     </w:p>
@@ -6957,8 +7103,19 @@
       </w:r>
     </w:p>
     <w:p>
-      <w:r>
-        <w:t>★★★</w:t>
+      <w:pPr>
+        <w:spacing w:before="160" w:after="160"/>
+        <w:jc w:val="center"/>
+      </w:pPr>
+      <w:r>
+        <w:rPr>
+          <w:b w:val="0"/>
+          <w:i w:val="0"/>
+          <w:color w:val="D4A017"/>
+          <w:sz w:val="22"/>
+          <w:rFonts w:ascii="FreeSans" w:hAnsi="FreeSans" w:cs="FreeSans"/>
+        </w:rPr>
+        <w:t>★  ★  ★</w:t>
       </w:r>
     </w:p>
     <w:p>
@@ -7002,8 +7159,19 @@
       </w:pPr>
     </w:p>
     <w:p>
-      <w:r>
-        <w:t>★★★</w:t>
+      <w:pPr>
+        <w:spacing w:before="160" w:after="160"/>
+        <w:jc w:val="center"/>
+      </w:pPr>
+      <w:r>
+        <w:rPr>
+          <w:b w:val="0"/>
+          <w:i w:val="0"/>
+          <w:color w:val="D4A017"/>
+          <w:sz w:val="22"/>
+          <w:rFonts w:ascii="FreeSans" w:hAnsi="FreeSans" w:cs="FreeSans"/>
+        </w:rPr>
+        <w:t>★  ★  ★</w:t>
       </w:r>
     </w:p>
     <w:p>
@@ -7012,8 +7180,19 @@
       </w:r>
     </w:p>
     <w:p>
-      <w:r>
-        <w:t>★★★</w:t>
+      <w:pPr>
+        <w:spacing w:before="160" w:after="160"/>
+        <w:jc w:val="center"/>
+      </w:pPr>
+      <w:r>
+        <w:rPr>
+          <w:b w:val="0"/>
+          <w:i w:val="0"/>
+          <w:color w:val="D4A017"/>
+          <w:sz w:val="22"/>
+          <w:rFonts w:ascii="FreeSans" w:hAnsi="FreeSans" w:cs="FreeSans"/>
+        </w:rPr>
+        <w:t>★  ★  ★</w:t>
       </w:r>
     </w:p>
     <w:p>
@@ -7127,11 +7306,6 @@
     <w:p>
       <w:r>
         <w:t>Le 19 novembre 1968, de jeunes officiers menés par le lieutenant Moussa Traoré renversent Modibo Keïta. L'expérience monétaire est enterrée, le Mali rentre dans le rang. Le premier président du Mali indépendant meurt en détention à Bamako le 16 mai 1977, sans jugement.</w:t>
-      </w:r>
-    </w:p>
-    <w:p>
-      <w:r>
-        <w:t>---ENCADRE---</w:t>
       </w:r>
     </w:p>
     <w:tbl>
@@ -7327,11 +7501,6 @@
     </w:tbl>
     <w:p/>
     <w:p>
-      <w:r>
-        <w:t>---FIN---</w:t>
-      </w:r>
-    </w:p>
-    <w:p>
       <w:pPr>
         <w:pStyle w:val="Heading2"/>
       </w:pPr>
@@ -7355,8 +7524,19 @@
       </w:r>
     </w:p>
     <w:p>
-      <w:r>
-        <w:t>★★★</w:t>
+      <w:pPr>
+        <w:spacing w:before="160" w:after="160"/>
+        <w:jc w:val="center"/>
+      </w:pPr>
+      <w:r>
+        <w:rPr>
+          <w:b w:val="0"/>
+          <w:i w:val="0"/>
+          <w:color w:val="D4A017"/>
+          <w:sz w:val="22"/>
+          <w:rFonts w:ascii="FreeSans" w:hAnsi="FreeSans" w:cs="FreeSans"/>
+        </w:rPr>
+        <w:t>★  ★  ★</w:t>
       </w:r>
     </w:p>
     <w:p>
@@ -7413,11 +7593,6 @@
     <w:p>
       <w:r>
         <w:t>Pour comprendre pourquoi cette mort n'est pas un fait divers ouest-africain, il faut mesurer ce qui s'était passé entre le 4 août 1983 — la prise de pouvoir du Conseil national de la révolution — et ce discours d'Addis-Abeba. Quatre ans. Le capitaine Sankara rebaptise la Haute-Volta, nom de colonie, en Burkina Faso: le pays des hommes intègres. Et il gouverne comme personne n'avait gouverné sur le continent.</w:t>
-      </w:r>
-    </w:p>
-    <w:p>
-      <w:r>
-        <w:t>---ENCADRE---</w:t>
       </w:r>
     </w:p>
     <w:tbl>
@@ -7542,11 +7717,6 @@
     <w:p/>
     <w:p>
       <w:r>
-        <w:t>---FIN---</w:t>
-      </w:r>
-    </w:p>
-    <w:p>
-      <w:r>
         <w:t>C'est, à ce jour, le programme de souveraineté africaine le plus ambitieux jamais réalisé sur le continent. Pas proclamé: réalisé. Sankara refusait l'aide française conditionnée comme il refusait les voitures de fonction de luxe — par cohérence, pas par posture.</w:t>
       </w:r>
     </w:p>
@@ -7612,8 +7782,19 @@
       </w:r>
     </w:p>
     <w:p>
-      <w:r>
-        <w:t>★★★</w:t>
+      <w:pPr>
+        <w:spacing w:before="160" w:after="160"/>
+        <w:jc w:val="center"/>
+      </w:pPr>
+      <w:r>
+        <w:rPr>
+          <w:b w:val="0"/>
+          <w:i w:val="0"/>
+          <w:color w:val="D4A017"/>
+          <w:sz w:val="22"/>
+          <w:rFonts w:ascii="FreeSans" w:hAnsi="FreeSans" w:cs="FreeSans"/>
+        </w:rPr>
+        <w:t>★  ★  ★</w:t>
       </w:r>
     </w:p>
     <w:p>
@@ -7681,11 +7862,6 @@
     <w:p>
       <w:r>
         <w:t>Le second front est informationnel. Nathalie Yamb opère depuis l’Afrique et tient tête aux ambassadeurs français sur les réseaux. Franklin Nyamsi, philosophe franco-camerounais, retourne depuis Rouen les arguments des diplomates de l'Élysée. Jonathan Batenguène analyse depuis le Cameroun. Ces voix existent dans l'espace médiatique européen lui-même et y constituent un contre-récit crédible, en français, aux heures de grande écoute numérique. Que ce front soit pris au sérieux par l'adversaire, on en a vu la preuve au chapitre 14: l'école cyber du 43e BIMA et ses « e-patrouilleurs» chargés de cibler nommément les panafricanistes, puis l'appel d'offres de septembre 2025 pour recruter des influenceurs africains contre l'AES. On ne budgétise pas une contre-offensive contre un front qui n'existe pas.</w:t>
-      </w:r>
-    </w:p>
-    <w:p>
-      <w:r>
-        <w:t>---ENCADRE---</w:t>
       </w:r>
     </w:p>
     <w:tbl>
@@ -7773,11 +7949,6 @@
     </w:tbl>
     <w:p/>
     <w:p>
-      <w:r>
-        <w:t>---FIN---</w:t>
-      </w:r>
-    </w:p>
-    <w:p>
       <w:pPr>
         <w:pStyle w:val="Heading2"/>
       </w:pPr>
@@ -7801,8 +7972,19 @@
       </w:r>
     </w:p>
     <w:p>
-      <w:r>
-        <w:t>★★★</w:t>
+      <w:pPr>
+        <w:spacing w:before="160" w:after="160"/>
+        <w:jc w:val="center"/>
+      </w:pPr>
+      <w:r>
+        <w:rPr>
+          <w:b w:val="0"/>
+          <w:i w:val="0"/>
+          <w:color w:val="D4A017"/>
+          <w:sz w:val="22"/>
+          <w:rFonts w:ascii="FreeSans" w:hAnsi="FreeSans" w:cs="FreeSans"/>
+        </w:rPr>
+        <w:t>★  ★  ★</w:t>
       </w:r>
     </w:p>
     <w:p>
@@ -7932,11 +8114,6 @@
     <w:p>
       <w:r>
         <w:t>Sur ce point, la pièce la plus troublante du dossier ne vient ni de Bamako ni de Moscou. Elle vient de Mohamed Bazoum lui-même — président déposé du Niger, adversaire déclaré des transitions — dans sa grande interview à RFI et France 24. Fait remarquable: en défendant le système, il en a confirmé, point par point, le diagnostic. On les a appelés les cinq aveux involontaires; en voici la version condensée.</w:t>
-      </w:r>
-    </w:p>
-    <w:p>
-      <w:r>
-        <w:t>---ENCADRE---</w:t>
       </w:r>
     </w:p>
     <w:tbl>
@@ -8061,11 +8238,6 @@
     <w:p/>
     <w:p>
       <w:r>
-        <w:t>---FIN---</w:t>
-      </w:r>
-    </w:p>
-    <w:p>
-      <w:r>
         <w:t>Et l'aveu qui les couronne tous: « Les gens du village qui sont victimes du terrorisme ne savent pas qu'il y a des Français ici au Niger, ou des Américains, ou des Russes.» Un président élu décrivant un dispositif militaire étranger invisible à son propre peuple — c'est la définition même de la souveraineté confisquée. Bazoum n'était ni incompétent ni cynique: son dossier anticorruption était réel, ses internats pour filles aussi. Il a géré la dépendance avec sérieux. Mais aucun président élu au Niger ne pouvait expulser la France et reprendre Imouraren — non par manque de volonté: parce que le système ne le permettait pas. L'AES n'est pas une révolution contre la mauvaise gouvernance. C'est une révolution contre la limite structurelle que la meilleure gouvernance compradore ne pouvait pas franchir. Bazoum l'a prouvé en la subissant.</w:t>
       </w:r>
     </w:p>
@@ -8085,11 +8257,6 @@
     <w:p>
       <w:r>
         <w:t>Alors, à quoi juger l'AES? À trois questions — pas une de moins, pas une de plus.</w:t>
-      </w:r>
-    </w:p>
-    <w:p>
-      <w:r>
-        <w:t>---ENCADRE---</w:t>
       </w:r>
     </w:p>
     <w:tbl>
@@ -8178,11 +8345,6 @@
     <w:p/>
     <w:p>
       <w:r>
-        <w:t>---FIN---</w:t>
-      </w:r>
-    </w:p>
-    <w:p>
-      <w:r>
         <w:t>Cette troisième question est la plus lourde: on verra au chapitre 26 comment la précarisation des communautés peules fabrique des combattants, et Yamb rappelle que la « protection des minorités» sert aussi, depuis les guerres de Yougoslavie, de levier d'intervention et de fragmentation. Raison de plus, et non de moins, d'y répondre: pour désamorcer l'arme, l'AES doit traiter ses minorités avec plus de justice que ses adversaires ne la traitent elle-même — c'est tout le sens de la phrase de Sankara placée en tête de ce chapitre. À ces trois questions, les réponses ne sont pas définitives. L'AES est en construction; ses transitions sont des processus ouverts, non des aboutissements figés.</w:t>
       </w:r>
     </w:p>
@@ -8197,8 +8359,19 @@
       </w:r>
     </w:p>
     <w:p>
-      <w:r>
-        <w:t>★★★</w:t>
+      <w:pPr>
+        <w:spacing w:before="160" w:after="160"/>
+        <w:jc w:val="center"/>
+      </w:pPr>
+      <w:r>
+        <w:rPr>
+          <w:b w:val="0"/>
+          <w:i w:val="0"/>
+          <w:color w:val="D4A017"/>
+          <w:sz w:val="22"/>
+          <w:rFonts w:ascii="FreeSans" w:hAnsi="FreeSans" w:cs="FreeSans"/>
+        </w:rPr>
+        <w:t>★  ★  ★</w:t>
       </w:r>
     </w:p>
     <w:p>
@@ -8242,8 +8415,19 @@
       </w:pPr>
     </w:p>
     <w:p>
-      <w:r>
-        <w:t>★★★</w:t>
+      <w:pPr>
+        <w:spacing w:before="160" w:after="160"/>
+        <w:jc w:val="center"/>
+      </w:pPr>
+      <w:r>
+        <w:rPr>
+          <w:b w:val="0"/>
+          <w:i w:val="0"/>
+          <w:color w:val="D4A017"/>
+          <w:sz w:val="22"/>
+          <w:rFonts w:ascii="FreeSans" w:hAnsi="FreeSans" w:cs="FreeSans"/>
+        </w:rPr>
+        <w:t>★  ★  ★</w:t>
       </w:r>
     </w:p>
     <w:p>
@@ -8267,8 +8451,19 @@
       </w:r>
     </w:p>
     <w:p>
-      <w:r>
-        <w:t>★★★</w:t>
+      <w:pPr>
+        <w:spacing w:before="160" w:after="160"/>
+        <w:jc w:val="center"/>
+      </w:pPr>
+      <w:r>
+        <w:rPr>
+          <w:b w:val="0"/>
+          <w:i w:val="0"/>
+          <w:color w:val="D4A017"/>
+          <w:sz w:val="22"/>
+          <w:rFonts w:ascii="FreeSans" w:hAnsi="FreeSans" w:cs="FreeSans"/>
+        </w:rPr>
+        <w:t>★  ★  ★</w:t>
       </w:r>
     </w:p>
     <w:p>
@@ -8325,11 +8520,6 @@
     <w:p>
       <w:r>
         <w:t>Concrètement, un blocus de carburant est une arme qui ne vise pas l'armée mais la vie quotidienne: sans essence, plus de transport de marchandises, plus de groupes électrogènes, plus de pompes à eau — un pays entier qui ralentit jusqu'à l'arrêt. C'est une guerre économique, pas seulement militaire. Et son issue dit quelque chose d'essentiel sur le rapport de force.</w:t>
-      </w:r>
-    </w:p>
-    <w:p>
-      <w:r>
-        <w:t>---ENCADRE---</w:t>
       </w:r>
     </w:p>
     <w:tbl>
@@ -8454,11 +8644,6 @@
     <w:p/>
     <w:p>
       <w:r>
-        <w:t>---FIN---</w:t>
-      </w:r>
-    </w:p>
-    <w:p>
-      <w:r>
         <w:t>Le blocus a échoué — mais pas seulement à cause des convois militaires. Le JNIM a commis des erreurs que ses adversaires n'auraient pas su provoquer. L'assassinat public de Mariam Cissé, la jeune blogueuse de Tonka dont nous avons croisé la trajectoire au chapitre 24, a retourné l'opinion malienne contre le groupe plus efficacement que n'importe quelle communication gouvernementale. « Un terrorisme asymétrique ciblant les civils relève de la lâcheté stratégique, qui elle-même repose sur l'instrumentalisation venue d'ailleurs», résume Amaïzo (29 novembre 2025).</w:t>
       </w:r>
     </w:p>
@@ -8565,8 +8750,19 @@
       </w:r>
     </w:p>
     <w:p>
-      <w:r>
-        <w:t>★★★</w:t>
+      <w:pPr>
+        <w:spacing w:before="160" w:after="160"/>
+        <w:jc w:val="center"/>
+      </w:pPr>
+      <w:r>
+        <w:rPr>
+          <w:b w:val="0"/>
+          <w:i w:val="0"/>
+          <w:color w:val="D4A017"/>
+          <w:sz w:val="22"/>
+          <w:rFonts w:ascii="FreeSans" w:hAnsi="FreeSans" w:cs="FreeSans"/>
+        </w:rPr>
+        <w:t>★  ★  ★</w:t>
       </w:r>
     </w:p>
     <w:p>
@@ -8628,11 +8824,6 @@
     <w:p>
       <w:r>
         <w:t>Concrètement, une convention fiscale bilatérale permettait aux multinationales françaises de rapatrier leurs profits — dividendes, intérêts, redevances — en payant très peu d'impôts sur place. La dénoncer, c'est rétablir le droit commun: les profits réalisés au Sahel y sont désormais taxés comme partout ailleurs. Ce n'est pas une déclaration politique. C'est la suppression juridique des instruments de l'extraction.</w:t>
-      </w:r>
-    </w:p>
-    <w:p>
-      <w:r>
-        <w:t>---ENCADRE---</w:t>
       </w:r>
     </w:p>
     <w:tbl>
@@ -8756,11 +8947,6 @@
     </w:tbl>
     <w:p/>
     <w:p>
-      <w:r>
-        <w:t>---FIN---</w:t>
-      </w:r>
-    </w:p>
-    <w:p>
       <w:pPr>
         <w:pStyle w:val="Heading2"/>
       </w:pPr>
@@ -8832,8 +9018,19 @@
       </w:r>
     </w:p>
     <w:p>
-      <w:r>
-        <w:t>★★★</w:t>
+      <w:pPr>
+        <w:spacing w:before="160" w:after="160"/>
+        <w:jc w:val="center"/>
+      </w:pPr>
+      <w:r>
+        <w:rPr>
+          <w:b w:val="0"/>
+          <w:i w:val="0"/>
+          <w:color w:val="D4A017"/>
+          <w:sz w:val="22"/>
+          <w:rFonts w:ascii="FreeSans" w:hAnsi="FreeSans" w:cs="FreeSans"/>
+        </w:rPr>
+        <w:t>★  ★  ★</w:t>
       </w:r>
     </w:p>
     <w:p>
@@ -8996,11 +9193,6 @@
     <w:p>
       <w:r>
         <w:t>Une monnaie souveraine devra s'adosser à une économie réelle. Cette économie existe. Le Mali et le Burkina Faso sont les premiers producteurs africains de coton. Le Mali est le troisième producteur d'or du continent. Le Niger détient les troisièmes réserves mondiales d'uranium. L'ensemble AES produit environ 230 tonnes d'or par an. Coton, or, uranium, pétrole nigérien: la base objective est là — à condition que leur exploitation bénéficie d'abord aux budgets nationaux, et non aux actionnaires de Barrick, d'Endeavour Mining ou d'Orano.</w:t>
-      </w:r>
-    </w:p>
-    <w:p>
-      <w:r>
-        <w:t>---ENCADRE---</w:t>
       </w:r>
     </w:p>
     <w:tbl>
@@ -9125,11 +9317,6 @@
     <w:p/>
     <w:p>
       <w:r>
-        <w:t>---FIN---</w:t>
-      </w:r>
-    </w:p>
-    <w:p>
-      <w:r>
         <w:t>Les risques sont réels et doivent être nommés: une inflation de transition, des attaques spéculatives, et le précédent de tous ceux qui ont payé de leur vie d'avoir seulement évoqué la sortie du CFA — Olympio, Sankara, Kadhafi, dont le chapitre 7 a raconté le prix. Le contre-exemple existe pourtant: la Mauritanie, sortie de la zone franc dès 1973, vit avec sa propre monnaie. L'AES, elle, avance pas à pas, en sachant que sur ce terrain, une seule erreur peut coûter dix ans.</w:t>
       </w:r>
     </w:p>
@@ -9144,8 +9331,19 @@
       </w:r>
     </w:p>
     <w:p>
-      <w:r>
-        <w:t>★★★</w:t>
+      <w:pPr>
+        <w:spacing w:before="160" w:after="160"/>
+        <w:jc w:val="center"/>
+      </w:pPr>
+      <w:r>
+        <w:rPr>
+          <w:b w:val="0"/>
+          <w:i w:val="0"/>
+          <w:color w:val="D4A017"/>
+          <w:sz w:val="22"/>
+          <w:rFonts w:ascii="FreeSans" w:hAnsi="FreeSans" w:cs="FreeSans"/>
+        </w:rPr>
+        <w:t>★  ★  ★</w:t>
       </w:r>
     </w:p>
     <w:p>
@@ -9172,11 +9370,6 @@
     <w:p>
       <w:r>
         <w:t>Mais la question doit être posée, et posée frontalement: l'AES a remplacé des partenaires français par des partenaires russes, chinois et turcs. La souveraineté exige qu'on vérifie si ces nouveaux partenariats ne reproduisent pas les logiques de domination qu'ils étaient censés remplacer. Ce chapitre propose un critère pour en juger: la réversibilité. Un partenaire, on peut le congédier. Un maître, non.</w:t>
-      </w:r>
-    </w:p>
-    <w:p>
-      <w:r>
-        <w:t>---ENCADRE---</w:t>
       </w:r>
     </w:p>
     <w:tbl>
@@ -9282,11 +9475,6 @@
     </w:tbl>
     <w:p/>
     <w:p>
-      <w:r>
-        <w:t>---FIN---</w:t>
-      </w:r>
-    </w:p>
-    <w:p>
       <w:pPr>
         <w:pStyle w:val="Heading2"/>
       </w:pPr>
@@ -9407,8 +9595,19 @@
       </w:r>
     </w:p>
     <w:p>
-      <w:r>
-        <w:t>★★★</w:t>
+      <w:pPr>
+        <w:spacing w:before="160" w:after="160"/>
+        <w:jc w:val="center"/>
+      </w:pPr>
+      <w:r>
+        <w:rPr>
+          <w:b w:val="0"/>
+          <w:i w:val="0"/>
+          <w:color w:val="D4A017"/>
+          <w:sz w:val="22"/>
+          <w:rFonts w:ascii="FreeSans" w:hAnsi="FreeSans" w:cs="FreeSans"/>
+        </w:rPr>
+        <w:t>★  ★  ★</w:t>
       </w:r>
     </w:p>
     <w:p>
@@ -9693,11 +9892,6 @@
     <w:p>
       <w:r>
         <w:t>Le septième et dernier est la thèse même de ce chapitre, énoncée par l'accusé: « on a tout repensé — partenariat à parité, bases renommées avec des noms africains, cogestion». Renommer une base, la cogérer, passer du soldat au formateur: c'est la définition exacte de la recomposition. « À parité»: le mot est démenti par l'armée fantôme reconstituée au Bénin pendant que le discours proclame le retrait (chapitre 20). Et le test décisif reste la réversibilité (chapitre 29): les AES n'ont pas renégocié la présence française, ils l'ont expulsée — preuve qu'elle n'était pas réversible par le dialogue. La « parité» revendiquée en 2026 est celle qu'on accorde après avoir été chassé.</w:t>
-      </w:r>
-    </w:p>
-    <w:p>
-      <w:r>
-        <w:t>---ENCADRE---</w:t>
       </w:r>
     </w:p>
     <w:tbl>
@@ -9858,11 +10052,6 @@
     <w:p/>
     <w:p>
       <w:r>
-        <w:t>---FIN---</w:t>
-      </w:r>
-    </w:p>
-    <w:p>
-      <w:r>
         <w:t>Reste le sommet lui-même, et son non-dit le plus éloquent. Pressé par un journaliste sur l'absence du Mali, du Burkina et du Niger, Macron rétorque que « l'Afrique de l'Ouest sera bien là» — Sénégal, Côte d'Ivoire — et que « trois pays seulement» manquent. L'arithmétique masque la sélection: on additionne les présents pour ne pas nommer ce que signifie le retrait des trois États qui ont précisément rompu. Mais l'absence la plus parlante est ailleurs. L'Afrique du Sud de Cyril Ramaphosa, d'abord officiellement invitée, ne vient pas. Selon des informations que Paris dément, Ramaphosa aurait été désinvité sous la pression de Washington — l'administration Trump —, le Kenya prenant sa place. La version est invérifiable à ce stade et doit être maniée comme telle. Mais l'hypothèse, vraie ou fausse, pointe une question que le démenti ne dissout pas: une puissance contrainte d'arbitrer la liste de ses propres invités africains en fonction des préférences américaines ne serait plus une puissance de premier rang. C'est très exactement le diagnostic de « puissance secondaire» évoqué plus haut — non plus comme thèse militante, mais comme hypothèse que la composition d'un sommet rend soudain plausible.</w:t>
       </w:r>
     </w:p>
@@ -9879,11 +10068,6 @@
     <w:p>
       <w:r>
         <w:t>Deux dernières pièces, enfin: l'une répète un procédé déjà nommé, l'autre oblige à la nuance. La première: interrogé sur l'absence des régimes de l'AES, Macron répond qu'on peut être « en désaccord avec les régimes — Traoré, Goïta» sans l'être « avec les peuples», et annonce qu'il s'adressera à « la société civile, y compris celle des pays du Sahel». C'est, mot pour mot, l'instrument disséqué plus haut à propos de Montpellier 2021: contourner les États qu'on ne peut plus convoquer en s'adressant à une « société civile» triée, présentée comme la voix des peuples. Nairobi n'invente rien; le procédé est reconduit à l'échelle continentale. La seconde pièce, en revanche, est un acte réel: la veille du sommet, une loi de restitution des biens culturels au continent africain a été promulguée. Il faut le reconnaître sans réserve — c'est un geste concret, longtemps promis et longtemps différé. Mais il faut aussi le situer: la restitution relève du levier culturel, le moins coûteux des instruments de la recomposition. Rendre des œuvres pillées n'engage ni le franc CFA, ni les contrats miniers, ni la guerre par procuration du chapitre 20. On peut restituer des masques et conserver la rente. Le geste est juste; il ne solde pas le compte.</w:t>
-      </w:r>
-    </w:p>
-    <w:p>
-      <w:r>
-        <w:t>---ENCADRE---</w:t>
       </w:r>
     </w:p>
     <w:tbl>
@@ -10026,11 +10210,6 @@
     <w:p/>
     <w:p>
       <w:r>
-        <w:t>---FIN---</w:t>
-      </w:r>
-    </w:p>
-    <w:p>
-      <w:r>
         <w:t>Reste un point que Macron formule sans en mesurer la portée: « c'est le peuple malien qui souffre». C'est vrai — et c'est précisément ce que le livre documente depuis le début. Mais la souffrance d'un peuple sous les coups de groupes armés équipés, renseignés et recyclés par des réseaux extérieurs (chapitre 20) n'est pas un argument contre sa souveraineté: c'en est la justification la plus tragique. La séquence de Nairobi n'est pas une analyse de l'échec. C'est l'échec qui se raconte une dernière histoire.</w:t>
       </w:r>
     </w:p>
@@ -10040,8 +10219,19 @@
       </w:r>
     </w:p>
     <w:p>
-      <w:r>
-        <w:t>★★★</w:t>
+      <w:pPr>
+        <w:spacing w:before="160" w:after="160"/>
+        <w:jc w:val="center"/>
+      </w:pPr>
+      <w:r>
+        <w:rPr>
+          <w:b w:val="0"/>
+          <w:i w:val="0"/>
+          <w:color w:val="D4A017"/>
+          <w:sz w:val="22"/>
+          <w:rFonts w:ascii="FreeSans" w:hAnsi="FreeSans" w:cs="FreeSans"/>
+        </w:rPr>
+        <w:t>★  ★  ★</w:t>
       </w:r>
     </w:p>
     <w:p>
@@ -10109,11 +10299,6 @@
     <w:p>
       <w:r>
         <w:t>D'où le double tableau qui suit — sans doute le plus important de ce livre, parce qu'il ne juge pas l'AES sur ses intentions, mais sur des critères vérifiables.</w:t>
-      </w:r>
-    </w:p>
-    <w:p>
-      <w:r>
-        <w:t>---ENCADRE---</w:t>
       </w:r>
     </w:p>
     <w:tbl>
@@ -10254,16 +10439,6 @@
       </w:tr>
     </w:tbl>
     <w:p/>
-    <w:p>
-      <w:r>
-        <w:t>---FIN---</w:t>
-      </w:r>
-    </w:p>
-    <w:p>
-      <w:r>
-        <w:t>---ENCADRE---</w:t>
-      </w:r>
-    </w:p>
     <w:tbl>
       <w:tblPr>
         <w:tblStyle w:val="TableGrid"/>
@@ -10440,11 +10615,6 @@
     <w:p/>
     <w:p>
       <w:r>
-        <w:t>---FIN---</w:t>
-      </w:r>
-    </w:p>
-    <w:p>
-      <w:r>
         <w:t>Trois variables transversales déterminent l'issue de tous les scénarios. La gouvernance économique réelle: les ressources profitent-elles aux populations, ou nourrissent-elles une rente d'élite en uniforme? La liberté d'expression: les sociétés civiles peuvent-elles critiquer sans être réprimées? Le retour progressif au constitutionnalisme: les transitions produisent-elles des institutions ou des règnes? Ces trois questions n'émanent pas des puissances extérieures. Elles émanent des peuples sahéliens eux-mêmes. C'est là leur force — et leur exigence la plus difficile à tenir.</w:t>
       </w:r>
     </w:p>
@@ -10544,8 +10714,19 @@
       </w:r>
     </w:p>
     <w:p>
-      <w:r>
-        <w:t>★★★</w:t>
+      <w:pPr>
+        <w:spacing w:before="160" w:after="160"/>
+        <w:jc w:val="center"/>
+      </w:pPr>
+      <w:r>
+        <w:rPr>
+          <w:b w:val="0"/>
+          <w:i w:val="0"/>
+          <w:color w:val="D4A017"/>
+          <w:sz w:val="22"/>
+          <w:rFonts w:ascii="FreeSans" w:hAnsi="FreeSans" w:cs="FreeSans"/>
+        </w:rPr>
+        <w:t>★  ★  ★</w:t>
       </w:r>
     </w:p>
     <w:p>
@@ -10600,8 +10781,19 @@
       </w:r>
     </w:p>
     <w:p>
-      <w:r>
-        <w:t>★★★</w:t>
+      <w:pPr>
+        <w:spacing w:before="160" w:after="160"/>
+        <w:jc w:val="center"/>
+      </w:pPr>
+      <w:r>
+        <w:rPr>
+          <w:b w:val="0"/>
+          <w:i w:val="0"/>
+          <w:color w:val="D4A017"/>
+          <w:sz w:val="22"/>
+          <w:rFonts w:ascii="FreeSans" w:hAnsi="FreeSans" w:cs="FreeSans"/>
+        </w:rPr>
+        <w:t>★  ★  ★</w:t>
       </w:r>
     </w:p>
     <w:p>
@@ -10655,8 +10847,19 @@
       </w:r>
     </w:p>
     <w:p>
-      <w:r>
-        <w:t>★★★</w:t>
+      <w:pPr>
+        <w:spacing w:before="160" w:after="160"/>
+        <w:jc w:val="center"/>
+      </w:pPr>
+      <w:r>
+        <w:rPr>
+          <w:b w:val="0"/>
+          <w:i w:val="0"/>
+          <w:color w:val="D4A017"/>
+          <w:sz w:val="22"/>
+          <w:rFonts w:ascii="FreeSans" w:hAnsi="FreeSans" w:cs="FreeSans"/>
+        </w:rPr>
+        <w:t>★  ★  ★</w:t>
       </w:r>
     </w:p>
     <w:p>
@@ -10694,8 +10897,19 @@
       </w:r>
     </w:p>
     <w:p>
-      <w:r>
-        <w:t>★★★</w:t>
+      <w:pPr>
+        <w:spacing w:before="160" w:after="160"/>
+        <w:jc w:val="center"/>
+      </w:pPr>
+      <w:r>
+        <w:rPr>
+          <w:b w:val="0"/>
+          <w:i w:val="0"/>
+          <w:color w:val="D4A017"/>
+          <w:sz w:val="22"/>
+          <w:rFonts w:ascii="FreeSans" w:hAnsi="FreeSans" w:cs="FreeSans"/>
+        </w:rPr>
+        <w:t>★  ★  ★</w:t>
       </w:r>
     </w:p>
     <w:p>
@@ -10875,8 +11089,19 @@
       </w:r>
     </w:p>
     <w:p>
-      <w:r>
-        <w:t>★★★</w:t>
+      <w:pPr>
+        <w:spacing w:before="160" w:after="160"/>
+        <w:jc w:val="center"/>
+      </w:pPr>
+      <w:r>
+        <w:rPr>
+          <w:b w:val="0"/>
+          <w:i w:val="0"/>
+          <w:color w:val="D4A017"/>
+          <w:sz w:val="22"/>
+          <w:rFonts w:ascii="FreeSans" w:hAnsi="FreeSans" w:cs="FreeSans"/>
+        </w:rPr>
+        <w:t>★  ★  ★</w:t>
       </w:r>
     </w:p>
     <w:p>
@@ -11224,8 +11449,19 @@
       </w:r>
     </w:p>
     <w:p>
-      <w:r>
-        <w:t>★★★</w:t>
+      <w:pPr>
+        <w:spacing w:before="160" w:after="160"/>
+        <w:jc w:val="center"/>
+      </w:pPr>
+      <w:r>
+        <w:rPr>
+          <w:b w:val="0"/>
+          <w:i w:val="0"/>
+          <w:color w:val="D4A017"/>
+          <w:sz w:val="22"/>
+          <w:rFonts w:ascii="FreeSans" w:hAnsi="FreeSans" w:cs="FreeSans"/>
+        </w:rPr>
+        <w:t>★  ★  ★</w:t>
       </w:r>
     </w:p>
     <w:p>
@@ -11820,8 +12056,19 @@
       </w:r>
     </w:p>
     <w:p>
-      <w:r>
-        <w:t>★★★</w:t>
+      <w:pPr>
+        <w:spacing w:before="160" w:after="160"/>
+        <w:jc w:val="center"/>
+      </w:pPr>
+      <w:r>
+        <w:rPr>
+          <w:b w:val="0"/>
+          <w:i w:val="0"/>
+          <w:color w:val="D4A017"/>
+          <w:sz w:val="22"/>
+          <w:rFonts w:ascii="FreeSans" w:hAnsi="FreeSans" w:cs="FreeSans"/>
+        </w:rPr>
+        <w:t>★  ★  ★</w:t>
       </w:r>
     </w:p>
     <w:p>
@@ -11981,11 +12228,6 @@
       </w:r>
     </w:p>
     <w:p>
-      <w:r>
-        <w:t>---</w:t>
-      </w:r>
-    </w:p>
-    <w:p>
       <w:pPr>
         <w:pStyle w:val="Heading2"/>
       </w:pPr>
@@ -12425,11 +12667,6 @@
     <w:p>
       <w:r>
         <w:t>(RTN, 16 mars 2024); Sylvie Baipo Témon, ministre des Affaires étrangères de la RCA (octobre 2021).</w:t>
-      </w:r>
-    </w:p>
-    <w:p>
-      <w:r>
-        <w:t>---</w:t>
       </w:r>
     </w:p>
     <w:p>

</xml_diff>

<commit_message>
feat(docx): sommaire complet auto-généré (parties + chapitres + annexes)
Le DOCX ne reprenait que les 3 puces du '# Sommaire' minimal du manuscrit.
Il génère désormais, comme le PDF, un sommaire complet depuis tous les titres
H1 : pièces liminaires, 6 parties (rouge, gras), 31 chapitres indentés, et
annexes (Conclusion, Chronologie, Glossaire, Index, Notes).

Contrôle qualité : 0 artefact, 31 chapitres, 34 encadrés, sommaire présent,
445 150 caractères de texte.

Co-Authored-By: Claude Opus 4.8 <noreply@anthropic.com>
Claude-Session: https://claude.ai/code/session_01NN7tYMhNvj5F1TjbPqxiMy
</commit_message>
<xml_diff>
--- a/manuscrit-edition/LIVRE-FINAL.docx
+++ b/manuscrit-edition/LIVRE-FINAL.docx
@@ -233,26 +233,767 @@
     </w:p>
     <w:p>
       <w:pPr>
-        <w:pStyle w:val="ListBullet"/>
-      </w:pPr>
-      <w:r>
+        <w:spacing w:before="100" w:after="40" w:line="288" w:lineRule="auto"/>
+        <w:ind w:left="0"/>
+        <w:jc w:val="left"/>
+      </w:pPr>
+      <w:r>
+        <w:rPr>
+          <w:b/>
+          <w:i w:val="0"/>
+          <w:color w:val="5A1010"/>
+          <w:sz w:val="21"/>
+          <w:rFonts w:ascii="FreeSans" w:hAnsi="FreeSans" w:cs="FreeSans"/>
+        </w:rPr>
         <w:t>Avant-propos — Méthode, sources et limites</w:t>
       </w:r>
     </w:p>
     <w:p>
       <w:pPr>
-        <w:pStyle w:val="ListBullet"/>
-      </w:pPr>
-      <w:r>
+        <w:spacing w:before="100" w:after="40" w:line="288" w:lineRule="auto"/>
+        <w:ind w:left="0"/>
+        <w:jc w:val="left"/>
+      </w:pPr>
+      <w:r>
+        <w:rPr>
+          <w:b/>
+          <w:i w:val="0"/>
+          <w:color w:val="5A1010"/>
+          <w:sz w:val="21"/>
+          <w:rFonts w:ascii="FreeSans" w:hAnsi="FreeSans" w:cs="FreeSans"/>
+        </w:rPr>
         <w:t>Prologue — La villa de Niamey</w:t>
       </w:r>
     </w:p>
     <w:p>
       <w:pPr>
-        <w:pStyle w:val="ListBullet"/>
-      </w:pPr>
-      <w:r>
+        <w:spacing w:before="100" w:after="40" w:line="288" w:lineRule="auto"/>
+        <w:ind w:left="0"/>
+        <w:jc w:val="left"/>
+      </w:pPr>
+      <w:r>
+        <w:rPr>
+          <w:b/>
+          <w:i w:val="0"/>
+          <w:color w:val="5A1010"/>
+          <w:sz w:val="21"/>
+          <w:rFonts w:ascii="FreeSans" w:hAnsi="FreeSans" w:cs="FreeSans"/>
+        </w:rPr>
         <w:t>Introduction — Pourquoi l'AES change tout</w:t>
+      </w:r>
+    </w:p>
+    <w:p>
+      <w:pPr>
+        <w:spacing w:before="220" w:after="60" w:line="288" w:lineRule="auto"/>
+        <w:ind w:left="0"/>
+        <w:jc w:val="left"/>
+      </w:pPr>
+      <w:r>
+        <w:rPr>
+          <w:b/>
+          <w:i w:val="0"/>
+          <w:color w:val="8B1A1A"/>
+          <w:sz w:val="22"/>
+          <w:rFonts w:ascii="FreeSans" w:hAnsi="FreeSans" w:cs="FreeSans"/>
+        </w:rPr>
+        <w:t>PARTIE I — L'AFRIQUE AVANT LA DOMINATION</w:t>
+      </w:r>
+    </w:p>
+    <w:p>
+      <w:pPr>
+        <w:spacing w:before="0" w:after="20" w:line="288" w:lineRule="auto"/>
+        <w:ind w:left="432"/>
+        <w:jc w:val="left"/>
+      </w:pPr>
+      <w:r>
+        <w:rPr>
+          <w:b w:val="0"/>
+          <w:i w:val="0"/>
+          <w:color w:val="0A0A0A"/>
+          <w:sz w:val="20"/>
+          <w:rFonts w:ascii="FreeSans" w:hAnsi="FreeSans" w:cs="FreeSans"/>
+        </w:rPr>
+        <w:t>Chapitre 1 — Les grands empires</w:t>
+      </w:r>
+    </w:p>
+    <w:p>
+      <w:pPr>
+        <w:spacing w:before="0" w:after="20" w:line="288" w:lineRule="auto"/>
+        <w:ind w:left="432"/>
+        <w:jc w:val="left"/>
+      </w:pPr>
+      <w:r>
+        <w:rPr>
+          <w:b w:val="0"/>
+          <w:i w:val="0"/>
+          <w:color w:val="0A0A0A"/>
+          <w:sz w:val="20"/>
+          <w:rFonts w:ascii="FreeSans" w:hAnsi="FreeSans" w:cs="FreeSans"/>
+        </w:rPr>
+        <w:t>Chapitre 2 — Les civilisations du Sahel</w:t>
+      </w:r>
+    </w:p>
+    <w:p>
+      <w:pPr>
+        <w:spacing w:before="0" w:after="20" w:line="288" w:lineRule="auto"/>
+        <w:ind w:left="432"/>
+        <w:jc w:val="left"/>
+      </w:pPr>
+      <w:r>
+        <w:rPr>
+          <w:b w:val="0"/>
+          <w:i w:val="0"/>
+          <w:color w:val="0A0A0A"/>
+          <w:sz w:val="20"/>
+          <w:rFonts w:ascii="FreeSans" w:hAnsi="FreeSans" w:cs="FreeSans"/>
+        </w:rPr>
+        <w:t>Chapitre 3 — La conquête coloniale</w:t>
+      </w:r>
+    </w:p>
+    <w:p>
+      <w:pPr>
+        <w:spacing w:before="0" w:after="20" w:line="288" w:lineRule="auto"/>
+        <w:ind w:left="432"/>
+        <w:jc w:val="left"/>
+      </w:pPr>
+      <w:r>
+        <w:rPr>
+          <w:b w:val="0"/>
+          <w:i w:val="0"/>
+          <w:color w:val="0A0A0A"/>
+          <w:sz w:val="20"/>
+          <w:rFonts w:ascii="FreeSans" w:hAnsi="FreeSans" w:cs="FreeSans"/>
+        </w:rPr>
+        <w:t>Chapitre 4 — Les résistances oubliées</w:t>
+      </w:r>
+    </w:p>
+    <w:p>
+      <w:pPr>
+        <w:spacing w:before="220" w:after="60" w:line="288" w:lineRule="auto"/>
+        <w:ind w:left="0"/>
+        <w:jc w:val="left"/>
+      </w:pPr>
+      <w:r>
+        <w:rPr>
+          <w:b/>
+          <w:i w:val="0"/>
+          <w:color w:val="8B1A1A"/>
+          <w:sz w:val="22"/>
+          <w:rFonts w:ascii="FreeSans" w:hAnsi="FreeSans" w:cs="FreeSans"/>
+        </w:rPr>
+        <w:t>PARTIE II — COMMENT LA DÉPENDANCE A ÉTÉ ORGANISÉE</w:t>
+      </w:r>
+    </w:p>
+    <w:p>
+      <w:pPr>
+        <w:spacing w:before="0" w:after="20" w:line="288" w:lineRule="auto"/>
+        <w:ind w:left="432"/>
+        <w:jc w:val="left"/>
+      </w:pPr>
+      <w:r>
+        <w:rPr>
+          <w:b w:val="0"/>
+          <w:i w:val="0"/>
+          <w:color w:val="0A0A0A"/>
+          <w:sz w:val="20"/>
+          <w:rFonts w:ascii="FreeSans" w:hAnsi="FreeSans" w:cs="FreeSans"/>
+        </w:rPr>
+        <w:t>Chapitre 5 — 1960: les indépendances inachevées</w:t>
+      </w:r>
+    </w:p>
+    <w:p>
+      <w:pPr>
+        <w:spacing w:before="0" w:after="20" w:line="288" w:lineRule="auto"/>
+        <w:ind w:left="432"/>
+        <w:jc w:val="left"/>
+      </w:pPr>
+      <w:r>
+        <w:rPr>
+          <w:b w:val="0"/>
+          <w:i w:val="0"/>
+          <w:color w:val="0A0A0A"/>
+          <w:sz w:val="20"/>
+          <w:rFonts w:ascii="FreeSans" w:hAnsi="FreeSans" w:cs="FreeSans"/>
+        </w:rPr>
+        <w:t>Chapitre 6 — Le pacte néocolonial</w:t>
+      </w:r>
+    </w:p>
+    <w:p>
+      <w:pPr>
+        <w:spacing w:before="0" w:after="20" w:line="288" w:lineRule="auto"/>
+        <w:ind w:left="432"/>
+        <w:jc w:val="left"/>
+      </w:pPr>
+      <w:r>
+        <w:rPr>
+          <w:b w:val="0"/>
+          <w:i w:val="0"/>
+          <w:color w:val="0A0A0A"/>
+          <w:sz w:val="20"/>
+          <w:rFonts w:ascii="FreeSans" w:hAnsi="FreeSans" w:cs="FreeSans"/>
+        </w:rPr>
+        <w:t>Chapitre 7 — Le franc CFA</w:t>
+      </w:r>
+    </w:p>
+    <w:p>
+      <w:pPr>
+        <w:spacing w:before="0" w:after="20" w:line="288" w:lineRule="auto"/>
+        <w:ind w:left="432"/>
+        <w:jc w:val="left"/>
+      </w:pPr>
+      <w:r>
+        <w:rPr>
+          <w:b w:val="0"/>
+          <w:i w:val="0"/>
+          <w:color w:val="0A0A0A"/>
+          <w:sz w:val="20"/>
+          <w:rFonts w:ascii="FreeSans" w:hAnsi="FreeSans" w:cs="FreeSans"/>
+        </w:rPr>
+        <w:t>Chapitre 8 — Les ressources stratégiques</w:t>
+      </w:r>
+    </w:p>
+    <w:p>
+      <w:pPr>
+        <w:spacing w:before="0" w:after="20" w:line="288" w:lineRule="auto"/>
+        <w:ind w:left="432"/>
+        <w:jc w:val="left"/>
+      </w:pPr>
+      <w:r>
+        <w:rPr>
+          <w:b w:val="0"/>
+          <w:i w:val="0"/>
+          <w:color w:val="0A0A0A"/>
+          <w:sz w:val="20"/>
+          <w:rFonts w:ascii="FreeSans" w:hAnsi="FreeSans" w:cs="FreeSans"/>
+        </w:rPr>
+        <w:t>Chapitre 9 — L'aide, la dette, les assassins financiers</w:t>
+      </w:r>
+    </w:p>
+    <w:p>
+      <w:pPr>
+        <w:spacing w:before="0" w:after="20" w:line="288" w:lineRule="auto"/>
+        <w:ind w:left="432"/>
+        <w:jc w:val="left"/>
+      </w:pPr>
+      <w:r>
+        <w:rPr>
+          <w:b w:val="0"/>
+          <w:i w:val="0"/>
+          <w:color w:val="0A0A0A"/>
+          <w:sz w:val="20"/>
+          <w:rFonts w:ascii="FreeSans" w:hAnsi="FreeSans" w:cs="FreeSans"/>
+        </w:rPr>
+        <w:t>Chapitre 10 — Les réseaux d'influence</w:t>
+      </w:r>
+    </w:p>
+    <w:p>
+      <w:pPr>
+        <w:spacing w:before="220" w:after="60" w:line="288" w:lineRule="auto"/>
+        <w:ind w:left="0"/>
+        <w:jc w:val="left"/>
+      </w:pPr>
+      <w:r>
+        <w:rPr>
+          <w:b/>
+          <w:i w:val="0"/>
+          <w:color w:val="8B1A1A"/>
+          <w:sz w:val="22"/>
+          <w:rFonts w:ascii="FreeSans" w:hAnsi="FreeSans" w:cs="FreeSans"/>
+        </w:rPr>
+        <w:t>PARTIE III — LA GUERRE DU SAHEL</w:t>
+      </w:r>
+    </w:p>
+    <w:p>
+      <w:pPr>
+        <w:spacing w:before="0" w:after="20" w:line="288" w:lineRule="auto"/>
+        <w:ind w:left="432"/>
+        <w:jc w:val="left"/>
+      </w:pPr>
+      <w:r>
+        <w:rPr>
+          <w:b w:val="0"/>
+          <w:i w:val="0"/>
+          <w:color w:val="0A0A0A"/>
+          <w:sz w:val="20"/>
+          <w:rFonts w:ascii="FreeSans" w:hAnsi="FreeSans" w:cs="FreeSans"/>
+        </w:rPr>
+        <w:t>Chapitre 11 — La crise libyenne</w:t>
+      </w:r>
+    </w:p>
+    <w:p>
+      <w:pPr>
+        <w:spacing w:before="0" w:after="20" w:line="288" w:lineRule="auto"/>
+        <w:ind w:left="432"/>
+        <w:jc w:val="left"/>
+      </w:pPr>
+      <w:r>
+        <w:rPr>
+          <w:b w:val="0"/>
+          <w:i w:val="0"/>
+          <w:color w:val="0A0A0A"/>
+          <w:sz w:val="20"/>
+          <w:rFonts w:ascii="FreeSans" w:hAnsi="FreeSans" w:cs="FreeSans"/>
+        </w:rPr>
+        <w:t>Chapitre 12 — L'explosion du terrorisme</w:t>
+      </w:r>
+    </w:p>
+    <w:p>
+      <w:pPr>
+        <w:spacing w:before="0" w:after="20" w:line="288" w:lineRule="auto"/>
+        <w:ind w:left="432"/>
+        <w:jc w:val="left"/>
+      </w:pPr>
+      <w:r>
+        <w:rPr>
+          <w:b w:val="0"/>
+          <w:i w:val="0"/>
+          <w:color w:val="0A0A0A"/>
+          <w:sz w:val="20"/>
+          <w:rFonts w:ascii="FreeSans" w:hAnsi="FreeSans" w:cs="FreeSans"/>
+        </w:rPr>
+        <w:t>Chapitre 13 — Serval, Barkhane et leurs limites</w:t>
+      </w:r>
+    </w:p>
+    <w:p>
+      <w:pPr>
+        <w:spacing w:before="0" w:after="20" w:line="288" w:lineRule="auto"/>
+        <w:ind w:left="432"/>
+        <w:jc w:val="left"/>
+      </w:pPr>
+      <w:r>
+        <w:rPr>
+          <w:b w:val="0"/>
+          <w:i w:val="0"/>
+          <w:color w:val="0A0A0A"/>
+          <w:sz w:val="20"/>
+          <w:rFonts w:ascii="FreeSans" w:hAnsi="FreeSans" w:cs="FreeSans"/>
+        </w:rPr>
+        <w:t>Chapitre 14 — La bataille de l'information</w:t>
+      </w:r>
+    </w:p>
+    <w:p>
+      <w:pPr>
+        <w:spacing w:before="0" w:after="20" w:line="288" w:lineRule="auto"/>
+        <w:ind w:left="432"/>
+        <w:jc w:val="left"/>
+      </w:pPr>
+      <w:r>
+        <w:rPr>
+          <w:b w:val="0"/>
+          <w:i w:val="0"/>
+          <w:color w:val="0A0A0A"/>
+          <w:sz w:val="20"/>
+          <w:rFonts w:ascii="FreeSans" w:hAnsi="FreeSans" w:cs="FreeSans"/>
+        </w:rPr>
+        <w:t>Chapitre 15 — Ce que la France admet en privé</w:t>
+      </w:r>
+    </w:p>
+    <w:p>
+      <w:pPr>
+        <w:spacing w:before="220" w:after="60" w:line="288" w:lineRule="auto"/>
+        <w:ind w:left="0"/>
+        <w:jc w:val="left"/>
+      </w:pPr>
+      <w:r>
+        <w:rPr>
+          <w:b/>
+          <w:i w:val="0"/>
+          <w:color w:val="8B1A1A"/>
+          <w:sz w:val="22"/>
+          <w:rFonts w:ascii="FreeSans" w:hAnsi="FreeSans" w:cs="FreeSans"/>
+        </w:rPr>
+        <w:t>PARTIE IV — LA RÉVOLUTION DE LA SOUVERAINETÉ</w:t>
+      </w:r>
+    </w:p>
+    <w:p>
+      <w:pPr>
+        <w:spacing w:before="0" w:after="20" w:line="288" w:lineRule="auto"/>
+        <w:ind w:left="432"/>
+        <w:jc w:val="left"/>
+      </w:pPr>
+      <w:r>
+        <w:rPr>
+          <w:b w:val="0"/>
+          <w:i w:val="0"/>
+          <w:color w:val="0A0A0A"/>
+          <w:sz w:val="20"/>
+          <w:rFonts w:ascii="FreeSans" w:hAnsi="FreeSans" w:cs="FreeSans"/>
+        </w:rPr>
+        <w:t>Chapitre 16 — Mali: la première rupture</w:t>
+      </w:r>
+    </w:p>
+    <w:p>
+      <w:pPr>
+        <w:spacing w:before="0" w:after="20" w:line="288" w:lineRule="auto"/>
+        <w:ind w:left="432"/>
+        <w:jc w:val="left"/>
+      </w:pPr>
+      <w:r>
+        <w:rPr>
+          <w:b w:val="0"/>
+          <w:i w:val="0"/>
+          <w:color w:val="0A0A0A"/>
+          <w:sz w:val="20"/>
+          <w:rFonts w:ascii="FreeSans" w:hAnsi="FreeSans" w:cs="FreeSans"/>
+        </w:rPr>
+        <w:t>Chapitre 17 — Burkina Faso: la doctrine Traoré</w:t>
+      </w:r>
+    </w:p>
+    <w:p>
+      <w:pPr>
+        <w:spacing w:before="0" w:after="20" w:line="288" w:lineRule="auto"/>
+        <w:ind w:left="432"/>
+        <w:jc w:val="left"/>
+      </w:pPr>
+      <w:r>
+        <w:rPr>
+          <w:b w:val="0"/>
+          <w:i w:val="0"/>
+          <w:color w:val="0A0A0A"/>
+          <w:sz w:val="20"/>
+          <w:rFonts w:ascii="FreeSans" w:hAnsi="FreeSans" w:cs="FreeSans"/>
+        </w:rPr>
+        <w:t>Chapitre 18 — Niger: le verrou final</w:t>
+      </w:r>
+    </w:p>
+    <w:p>
+      <w:pPr>
+        <w:spacing w:before="0" w:after="20" w:line="288" w:lineRule="auto"/>
+        <w:ind w:left="432"/>
+        <w:jc w:val="left"/>
+      </w:pPr>
+      <w:r>
+        <w:rPr>
+          <w:b w:val="0"/>
+          <w:i w:val="0"/>
+          <w:color w:val="0A0A0A"/>
+          <w:sz w:val="20"/>
+          <w:rFonts w:ascii="FreeSans" w:hAnsi="FreeSans" w:cs="FreeSans"/>
+        </w:rPr>
+        <w:t>Chapitre 19 — La naissance de l'AES</w:t>
+      </w:r>
+    </w:p>
+    <w:p>
+      <w:pPr>
+        <w:spacing w:before="0" w:after="20" w:line="288" w:lineRule="auto"/>
+        <w:ind w:left="432"/>
+        <w:jc w:val="left"/>
+      </w:pPr>
+      <w:r>
+        <w:rPr>
+          <w:b w:val="0"/>
+          <w:i w:val="0"/>
+          <w:color w:val="0A0A0A"/>
+          <w:sz w:val="20"/>
+          <w:rFonts w:ascii="FreeSans" w:hAnsi="FreeSans" w:cs="FreeSans"/>
+        </w:rPr>
+        <w:t>Chapitre 20 — La guerre proxy</w:t>
+      </w:r>
+    </w:p>
+    <w:p>
+      <w:pPr>
+        <w:spacing w:before="0" w:after="20" w:line="288" w:lineRule="auto"/>
+        <w:ind w:left="432"/>
+        <w:jc w:val="left"/>
+      </w:pPr>
+      <w:r>
+        <w:rPr>
+          <w:b w:val="0"/>
+          <w:i w:val="0"/>
+          <w:color w:val="0A0A0A"/>
+          <w:sz w:val="20"/>
+          <w:rFonts w:ascii="FreeSans" w:hAnsi="FreeSans" w:cs="FreeSans"/>
+        </w:rPr>
+        <w:t>Chapitre 21 — L'environnement régional</w:t>
+      </w:r>
+    </w:p>
+    <w:p>
+      <w:pPr>
+        <w:spacing w:before="220" w:after="60" w:line="288" w:lineRule="auto"/>
+        <w:ind w:left="0"/>
+        <w:jc w:val="left"/>
+      </w:pPr>
+      <w:r>
+        <w:rPr>
+          <w:b/>
+          <w:i w:val="0"/>
+          <w:color w:val="8B1A1A"/>
+          <w:sz w:val="22"/>
+          <w:rFonts w:ascii="FreeSans" w:hAnsi="FreeSans" w:cs="FreeSans"/>
+        </w:rPr>
+        <w:t>PARTIE V — LE RÉVEIL PANAFRICAIN</w:t>
+      </w:r>
+    </w:p>
+    <w:p>
+      <w:pPr>
+        <w:spacing w:before="0" w:after="20" w:line="288" w:lineRule="auto"/>
+        <w:ind w:left="432"/>
+        <w:jc w:val="left"/>
+      </w:pPr>
+      <w:r>
+        <w:rPr>
+          <w:b w:val="0"/>
+          <w:i w:val="0"/>
+          <w:color w:val="0A0A0A"/>
+          <w:sz w:val="20"/>
+          <w:rFonts w:ascii="FreeSans" w:hAnsi="FreeSans" w:cs="FreeSans"/>
+        </w:rPr>
+        <w:t>Chapitre 22 — Nkrumah, Lumumba, Keïta: la première vague</w:t>
+      </w:r>
+    </w:p>
+    <w:p>
+      <w:pPr>
+        <w:spacing w:before="0" w:after="20" w:line="288" w:lineRule="auto"/>
+        <w:ind w:left="432"/>
+        <w:jc w:val="left"/>
+      </w:pPr>
+      <w:r>
+        <w:rPr>
+          <w:b w:val="0"/>
+          <w:i w:val="0"/>
+          <w:color w:val="0A0A0A"/>
+          <w:sz w:val="20"/>
+          <w:rFonts w:ascii="FreeSans" w:hAnsi="FreeSans" w:cs="FreeSans"/>
+        </w:rPr>
+        <w:t>Chapitre 23 — Sankara avait raison</w:t>
+      </w:r>
+    </w:p>
+    <w:p>
+      <w:pPr>
+        <w:spacing w:before="0" w:after="20" w:line="288" w:lineRule="auto"/>
+        <w:ind w:left="432"/>
+        <w:jc w:val="left"/>
+      </w:pPr>
+      <w:r>
+        <w:rPr>
+          <w:b w:val="0"/>
+          <w:i w:val="0"/>
+          <w:color w:val="0A0A0A"/>
+          <w:sz w:val="20"/>
+          <w:rFonts w:ascii="FreeSans" w:hAnsi="FreeSans" w:cs="FreeSans"/>
+        </w:rPr>
+        <w:t>Chapitre 24 — La jeunesse connectée, la diaspora en première ligne</w:t>
+      </w:r>
+    </w:p>
+    <w:p>
+      <w:pPr>
+        <w:spacing w:before="0" w:after="20" w:line="288" w:lineRule="auto"/>
+        <w:ind w:left="432"/>
+        <w:jc w:val="left"/>
+      </w:pPr>
+      <w:r>
+        <w:rPr>
+          <w:b w:val="0"/>
+          <w:i w:val="0"/>
+          <w:color w:val="0A0A0A"/>
+          <w:sz w:val="20"/>
+          <w:rFonts w:ascii="FreeSans" w:hAnsi="FreeSans" w:cs="FreeSans"/>
+        </w:rPr>
+        <w:t>Chapitre 25 — L'AES, laboratoire panafricain</w:t>
+      </w:r>
+    </w:p>
+    <w:p>
+      <w:pPr>
+        <w:spacing w:before="220" w:after="60" w:line="288" w:lineRule="auto"/>
+        <w:ind w:left="0"/>
+        <w:jc w:val="left"/>
+      </w:pPr>
+      <w:r>
+        <w:rPr>
+          <w:b/>
+          <w:i w:val="0"/>
+          <w:color w:val="8B1A1A"/>
+          <w:sz w:val="22"/>
+          <w:rFonts w:ascii="FreeSans" w:hAnsi="FreeSans" w:cs="FreeSans"/>
+        </w:rPr>
+        <w:t>PARTIE VI — LES DÉFIS DE DEMAIN</w:t>
+      </w:r>
+    </w:p>
+    <w:p>
+      <w:pPr>
+        <w:spacing w:before="0" w:after="20" w:line="288" w:lineRule="auto"/>
+        <w:ind w:left="432"/>
+        <w:jc w:val="left"/>
+      </w:pPr>
+      <w:r>
+        <w:rPr>
+          <w:b w:val="0"/>
+          <w:i w:val="0"/>
+          <w:color w:val="0A0A0A"/>
+          <w:sz w:val="20"/>
+          <w:rFonts w:ascii="FreeSans" w:hAnsi="FreeSans" w:cs="FreeSans"/>
+        </w:rPr>
+        <w:t>Chapitre 26 — Sécurité : vaincre sans trahir</w:t>
+      </w:r>
+    </w:p>
+    <w:p>
+      <w:pPr>
+        <w:spacing w:before="0" w:after="20" w:line="288" w:lineRule="auto"/>
+        <w:ind w:left="432"/>
+        <w:jc w:val="left"/>
+      </w:pPr>
+      <w:r>
+        <w:rPr>
+          <w:b w:val="0"/>
+          <w:i w:val="0"/>
+          <w:color w:val="0A0A0A"/>
+          <w:sz w:val="20"/>
+          <w:rFonts w:ascii="FreeSans" w:hAnsi="FreeSans" w:cs="FreeSans"/>
+        </w:rPr>
+        <w:t>Chapitre 27 — Industrialisation et éducation: l'économie de guerre et l'arme des cerveaux</w:t>
+      </w:r>
+    </w:p>
+    <w:p>
+      <w:pPr>
+        <w:spacing w:before="0" w:after="20" w:line="288" w:lineRule="auto"/>
+        <w:ind w:left="432"/>
+        <w:jc w:val="left"/>
+      </w:pPr>
+      <w:r>
+        <w:rPr>
+          <w:b w:val="0"/>
+          <w:i w:val="0"/>
+          <w:color w:val="0A0A0A"/>
+          <w:sz w:val="20"/>
+          <w:rFonts w:ascii="FreeSans" w:hAnsi="FreeSans" w:cs="FreeSans"/>
+        </w:rPr>
+        <w:t>Chapitre 28 — La monnaie: briser la chaîne du CFA</w:t>
+      </w:r>
+    </w:p>
+    <w:p>
+      <w:pPr>
+        <w:spacing w:before="0" w:after="20" w:line="288" w:lineRule="auto"/>
+        <w:ind w:left="432"/>
+        <w:jc w:val="left"/>
+      </w:pPr>
+      <w:r>
+        <w:rPr>
+          <w:b w:val="0"/>
+          <w:i w:val="0"/>
+          <w:color w:val="0A0A0A"/>
+          <w:sz w:val="20"/>
+          <w:rFonts w:ascii="FreeSans" w:hAnsi="FreeSans" w:cs="FreeSans"/>
+        </w:rPr>
+        <w:t>Chapitre 29 — Le monde multipolaire: partenaires ou nouveaux maîtres?</w:t>
+      </w:r>
+    </w:p>
+    <w:p>
+      <w:pPr>
+        <w:spacing w:before="0" w:after="20" w:line="288" w:lineRule="auto"/>
+        <w:ind w:left="432"/>
+        <w:jc w:val="left"/>
+      </w:pPr>
+      <w:r>
+        <w:rPr>
+          <w:b w:val="0"/>
+          <w:i w:val="0"/>
+          <w:color w:val="0A0A0A"/>
+          <w:sz w:val="20"/>
+          <w:rFonts w:ascii="FreeSans" w:hAnsi="FreeSans" w:cs="FreeSans"/>
+        </w:rPr>
+        <w:t>Chapitre 30 — France-Afrique 2.0: la recomposition de la domination</w:t>
+      </w:r>
+    </w:p>
+    <w:p>
+      <w:pPr>
+        <w:spacing w:before="0" w:after="20" w:line="288" w:lineRule="auto"/>
+        <w:ind w:left="432"/>
+        <w:jc w:val="left"/>
+      </w:pPr>
+      <w:r>
+        <w:rPr>
+          <w:b w:val="0"/>
+          <w:i w:val="0"/>
+          <w:color w:val="0A0A0A"/>
+          <w:sz w:val="20"/>
+          <w:rFonts w:ascii="FreeSans" w:hAnsi="FreeSans" w:cs="FreeSans"/>
+        </w:rPr>
+        <w:t>Chapitre 31 — Ce que l'AES doit réussir pour survivre</w:t>
+      </w:r>
+    </w:p>
+    <w:p>
+      <w:pPr>
+        <w:spacing w:before="100" w:after="40" w:line="288" w:lineRule="auto"/>
+        <w:ind w:left="0"/>
+        <w:jc w:val="left"/>
+      </w:pPr>
+      <w:r>
+        <w:rPr>
+          <w:b/>
+          <w:i w:val="0"/>
+          <w:color w:val="5A1010"/>
+          <w:sz w:val="21"/>
+          <w:rFonts w:ascii="FreeSans" w:hAnsi="FreeSans" w:cs="FreeSans"/>
+        </w:rPr>
+        <w:t>Conclusion — Retour à la villa de Niamey</w:t>
+      </w:r>
+    </w:p>
+    <w:p>
+      <w:pPr>
+        <w:spacing w:before="100" w:after="40" w:line="288" w:lineRule="auto"/>
+        <w:ind w:left="0"/>
+        <w:jc w:val="left"/>
+      </w:pPr>
+      <w:r>
+        <w:rPr>
+          <w:b/>
+          <w:i w:val="0"/>
+          <w:color w:val="5A1010"/>
+          <w:sz w:val="21"/>
+          <w:rFonts w:ascii="FreeSans" w:hAnsi="FreeSans" w:cs="FreeSans"/>
+        </w:rPr>
+        <w:t>Chronologie — du partage de l'Afrique à l'Alliance des États du Sahel</w:t>
+      </w:r>
+    </w:p>
+    <w:p>
+      <w:pPr>
+        <w:spacing w:before="100" w:after="40" w:line="288" w:lineRule="auto"/>
+        <w:ind w:left="0"/>
+        <w:jc w:val="left"/>
+      </w:pPr>
+      <w:r>
+        <w:rPr>
+          <w:b/>
+          <w:i w:val="0"/>
+          <w:color w:val="5A1010"/>
+          <w:sz w:val="21"/>
+          <w:rFonts w:ascii="FreeSans" w:hAnsi="FreeSans" w:cs="FreeSans"/>
+        </w:rPr>
+        <w:t>Glossaire des sigles</w:t>
+      </w:r>
+    </w:p>
+    <w:p>
+      <w:pPr>
+        <w:spacing w:before="100" w:after="40" w:line="288" w:lineRule="auto"/>
+        <w:ind w:left="0"/>
+        <w:jc w:val="left"/>
+      </w:pPr>
+      <w:r>
+        <w:rPr>
+          <w:b/>
+          <w:i w:val="0"/>
+          <w:color w:val="5A1010"/>
+          <w:sz w:val="21"/>
+          <w:rFonts w:ascii="FreeSans" w:hAnsi="FreeSans" w:cs="FreeSans"/>
+        </w:rPr>
+        <w:t>Index des personnages</w:t>
+      </w:r>
+    </w:p>
+    <w:p>
+      <w:pPr>
+        <w:spacing w:before="100" w:after="40" w:line="288" w:lineRule="auto"/>
+        <w:ind w:left="0"/>
+        <w:jc w:val="left"/>
+      </w:pPr>
+      <w:r>
+        <w:rPr>
+          <w:b/>
+          <w:i w:val="0"/>
+          <w:color w:val="5A1010"/>
+          <w:sz w:val="21"/>
+          <w:rFonts w:ascii="FreeSans" w:hAnsi="FreeSans" w:cs="FreeSans"/>
+        </w:rPr>
+        <w:t>Notes méthodologiques &amp; corpus de sources</w:t>
       </w:r>
     </w:p>
     <w:p>

</xml_diff>

<commit_message>
fix(docx): étoiles « ★★★ » sans espace, citations 0,5 pt, auteurs noirs, pagination
Quatre corrections demandées :
- Étoiles : ornement « ★★★ » sans espace entre les caractères (charte habillage),
  au lieu de « ★  ★  ★ » — 55 séparateurs corrigés.
- Bordure gauche des citations : 0,5 pt (sz=4) au lieu de 2,25 pt (sz=18).
- Couleur du nom de l'auteur de citation : noir (#0A0A0A) au lieu du gris chaud
  GRISRG (#6A5A44).
- Numérotation : pied de page centré au format « — N — » via champ PAGE Word.

Co-Authored-By: Claude Opus 4.7 <noreply@anthropic.com>
Claude-Session: https://claude.ai/code/session_01NN7tYMhNvj5F1TjbPqxiMy
</commit_message>
<xml_diff>
--- a/manuscrit-edition/LIVRE-FINAL.docx
+++ b/manuscrit-edition/LIVRE-FINAL.docx
@@ -83,7 +83,7 @@
           <w:sz w:val="22"/>
           <w:rFonts w:ascii="FreeSerif" w:hAnsi="FreeSerif" w:cs="FreeSerif"/>
         </w:rPr>
-        <w:t>★  ★  ★</w:t>
+        <w:t>★★★</w:t>
       </w:r>
     </w:p>
     <w:p>
@@ -107,7 +107,7 @@
         <w:spacing w:before="40" w:after="120"/>
         <w:ind w:left="567"/>
         <w:pBdr>
-          <w:left w:val="single" w:sz="18" w:space="8" w:color="A07820"/>
+          <w:left w:val="single" w:sz="4" w:space="8" w:color="A07820"/>
         </w:pBdr>
       </w:pPr>
       <w:r>
@@ -124,13 +124,13 @@
         <w:spacing w:before="40" w:after="120"/>
         <w:ind w:left="567"/>
         <w:pBdr>
-          <w:left w:val="single" w:sz="18" w:space="8" w:color="A07820"/>
+          <w:left w:val="single" w:sz="4" w:space="8" w:color="A07820"/>
         </w:pBdr>
       </w:pPr>
       <w:r>
         <w:rPr>
           <w:i/>
-          <w:color w:val="6A5A44"/>
+          <w:color w:val="0A0A0A"/>
           <w:sz w:val="18"/>
         </w:rPr>
         <w:t>— Marcus Garvey</w:t>
@@ -141,7 +141,7 @@
         <w:spacing w:before="40" w:after="120"/>
         <w:ind w:left="567"/>
         <w:pBdr>
-          <w:left w:val="single" w:sz="18" w:space="8" w:color="A07820"/>
+          <w:left w:val="single" w:sz="4" w:space="8" w:color="A07820"/>
         </w:pBdr>
       </w:pPr>
       <w:r>
@@ -158,13 +158,13 @@
         <w:spacing w:before="40" w:after="120"/>
         <w:ind w:left="567"/>
         <w:pBdr>
-          <w:left w:val="single" w:sz="18" w:space="8" w:color="A07820"/>
+          <w:left w:val="single" w:sz="4" w:space="8" w:color="A07820"/>
         </w:pBdr>
       </w:pPr>
       <w:r>
         <w:rPr>
           <w:i/>
-          <w:color w:val="6A5A44"/>
+          <w:color w:val="0A0A0A"/>
           <w:sz w:val="18"/>
         </w:rPr>
         <w:t>— Frantz Fanon, *Les Damnés de la Terre*, 1961</w:t>
@@ -175,7 +175,7 @@
         <w:spacing w:before="40" w:after="120"/>
         <w:ind w:left="567"/>
         <w:pBdr>
-          <w:left w:val="single" w:sz="18" w:space="8" w:color="A07820"/>
+          <w:left w:val="single" w:sz="4" w:space="8" w:color="A07820"/>
         </w:pBdr>
       </w:pPr>
       <w:r>
@@ -192,13 +192,13 @@
         <w:spacing w:before="40" w:after="120"/>
         <w:ind w:left="567"/>
         <w:pBdr>
-          <w:left w:val="single" w:sz="18" w:space="8" w:color="A07820"/>
+          <w:left w:val="single" w:sz="4" w:space="8" w:color="A07820"/>
         </w:pBdr>
       </w:pPr>
       <w:r>
         <w:rPr>
           <w:i/>
-          <w:color w:val="6A5A44"/>
+          <w:color w:val="0A0A0A"/>
           <w:sz w:val="18"/>
         </w:rPr>
         <w:t>— Thomas Sankara, discours à l'ONU, 4 octobre 1984</w:t>
@@ -217,7 +217,7 @@
           <w:sz w:val="22"/>
           <w:rFonts w:ascii="FreeSerif" w:hAnsi="FreeSerif" w:cs="FreeSerif"/>
         </w:rPr>
-        <w:t>★  ★  ★</w:t>
+        <w:t>★★★</w:t>
       </w:r>
     </w:p>
     <w:p>
@@ -1017,7 +1017,7 @@
           <w:sz w:val="22"/>
           <w:rFonts w:ascii="FreeSerif" w:hAnsi="FreeSerif" w:cs="FreeSerif"/>
         </w:rPr>
-        <w:t>★  ★  ★</w:t>
+        <w:t>★★★</w:t>
       </w:r>
     </w:p>
     <w:p>
@@ -1050,7 +1050,7 @@
         <w:spacing w:before="40" w:after="120"/>
         <w:ind w:left="567"/>
         <w:pBdr>
-          <w:left w:val="single" w:sz="18" w:space="8" w:color="A07820"/>
+          <w:left w:val="single" w:sz="4" w:space="8" w:color="A07820"/>
         </w:pBdr>
       </w:pPr>
       <w:r>
@@ -1110,7 +1110,7 @@
           <w:sz w:val="22"/>
           <w:rFonts w:ascii="FreeSerif" w:hAnsi="FreeSerif" w:cs="FreeSerif"/>
         </w:rPr>
-        <w:t>★  ★  ★</w:t>
+        <w:t>★★★</w:t>
       </w:r>
     </w:p>
     <w:p>
@@ -1196,7 +1196,7 @@
           <w:sz w:val="22"/>
           <w:rFonts w:ascii="FreeSerif" w:hAnsi="FreeSerif" w:cs="FreeSerif"/>
         </w:rPr>
-        <w:t>★  ★  ★</w:t>
+        <w:t>★★★</w:t>
       </w:r>
     </w:p>
     <w:p>
@@ -1229,7 +1229,7 @@
         <w:spacing w:before="40" w:after="120"/>
         <w:ind w:left="567"/>
         <w:pBdr>
-          <w:left w:val="single" w:sz="18" w:space="8" w:color="A07820"/>
+          <w:left w:val="single" w:sz="4" w:space="8" w:color="A07820"/>
         </w:pBdr>
       </w:pPr>
       <w:r>
@@ -1294,7 +1294,7 @@
           <w:sz w:val="22"/>
           <w:rFonts w:ascii="FreeSerif" w:hAnsi="FreeSerif" w:cs="FreeSerif"/>
         </w:rPr>
-        <w:t>★  ★  ★</w:t>
+        <w:t>★★★</w:t>
       </w:r>
     </w:p>
     <w:p>
@@ -1350,7 +1350,7 @@
           <w:sz w:val="22"/>
           <w:rFonts w:ascii="FreeSerif" w:hAnsi="FreeSerif" w:cs="FreeSerif"/>
         </w:rPr>
-        <w:t>★  ★  ★</w:t>
+        <w:t>★★★</w:t>
       </w:r>
     </w:p>
     <w:p>
@@ -1358,7 +1358,7 @@
         <w:spacing w:before="40" w:after="120"/>
         <w:ind w:left="567"/>
         <w:pBdr>
-          <w:left w:val="single" w:sz="18" w:space="8" w:color="A07820"/>
+          <w:left w:val="single" w:sz="4" w:space="8" w:color="A07820"/>
         </w:pBdr>
       </w:pPr>
       <w:r>
@@ -1388,7 +1388,7 @@
           <w:sz w:val="22"/>
           <w:rFonts w:ascii="FreeSerif" w:hAnsi="FreeSerif" w:cs="FreeSerif"/>
         </w:rPr>
-        <w:t>★  ★  ★</w:t>
+        <w:t>★★★</w:t>
       </w:r>
     </w:p>
     <w:p>
@@ -1690,7 +1690,7 @@
           <w:sz w:val="22"/>
           <w:rFonts w:ascii="FreeSerif" w:hAnsi="FreeSerif" w:cs="FreeSerif"/>
         </w:rPr>
-        <w:t>★  ★  ★</w:t>
+        <w:t>★★★</w:t>
       </w:r>
     </w:p>
     <w:p>
@@ -1909,7 +1909,7 @@
           <w:sz w:val="22"/>
           <w:rFonts w:ascii="FreeSerif" w:hAnsi="FreeSerif" w:cs="FreeSerif"/>
         </w:rPr>
-        <w:t>★  ★  ★</w:t>
+        <w:t>★★★</w:t>
       </w:r>
     </w:p>
     <w:p>
@@ -2149,7 +2149,7 @@
           <w:sz w:val="22"/>
           <w:rFonts w:ascii="FreeSerif" w:hAnsi="FreeSerif" w:cs="FreeSerif"/>
         </w:rPr>
-        <w:t>★  ★  ★</w:t>
+        <w:t>★★★</w:t>
       </w:r>
     </w:p>
     <w:p>
@@ -2412,7 +2412,7 @@
           <w:sz w:val="22"/>
           <w:rFonts w:ascii="FreeSerif" w:hAnsi="FreeSerif" w:cs="FreeSerif"/>
         </w:rPr>
-        <w:t>★  ★  ★</w:t>
+        <w:t>★★★</w:t>
       </w:r>
     </w:p>
     <w:p>
@@ -2468,7 +2468,7 @@
           <w:sz w:val="22"/>
           <w:rFonts w:ascii="FreeSerif" w:hAnsi="FreeSerif" w:cs="FreeSerif"/>
         </w:rPr>
-        <w:t>★  ★  ★</w:t>
+        <w:t>★★★</w:t>
       </w:r>
     </w:p>
     <w:p>
@@ -2504,7 +2504,7 @@
           <w:sz w:val="22"/>
           <w:rFonts w:ascii="FreeSerif" w:hAnsi="FreeSerif" w:cs="FreeSerif"/>
         </w:rPr>
-        <w:t>★  ★  ★</w:t>
+        <w:t>★★★</w:t>
       </w:r>
     </w:p>
     <w:p>
@@ -2537,7 +2537,7 @@
         <w:spacing w:before="40" w:after="120"/>
         <w:ind w:left="567"/>
         <w:pBdr>
-          <w:left w:val="single" w:sz="18" w:space="8" w:color="A07820"/>
+          <w:left w:val="single" w:sz="4" w:space="8" w:color="A07820"/>
         </w:pBdr>
       </w:pPr>
       <w:r>
@@ -2554,13 +2554,13 @@
         <w:spacing w:before="40" w:after="120"/>
         <w:ind w:left="567"/>
         <w:pBdr>
-          <w:left w:val="single" w:sz="18" w:space="8" w:color="A07820"/>
+          <w:left w:val="single" w:sz="4" w:space="8" w:color="A07820"/>
         </w:pBdr>
       </w:pPr>
       <w:r>
         <w:rPr>
           <w:i/>
-          <w:color w:val="6A5A44"/>
+          <w:color w:val="0A0A0A"/>
           <w:sz w:val="18"/>
         </w:rPr>
         <w:t>— Ahmed Sékou Touré, devant le général de Gaulle, Conakry, 25 août 1958</w:t>
@@ -2809,7 +2809,7 @@
           <w:sz w:val="22"/>
           <w:rFonts w:ascii="FreeSerif" w:hAnsi="FreeSerif" w:cs="FreeSerif"/>
         </w:rPr>
-        <w:t>★  ★  ★</w:t>
+        <w:t>★★★</w:t>
       </w:r>
     </w:p>
     <w:p>
@@ -2842,7 +2842,7 @@
         <w:spacing w:before="40" w:after="120"/>
         <w:ind w:left="567"/>
         <w:pBdr>
-          <w:left w:val="single" w:sz="18" w:space="8" w:color="A07820"/>
+          <w:left w:val="single" w:sz="4" w:space="8" w:color="A07820"/>
         </w:pBdr>
       </w:pPr>
       <w:r>
@@ -2859,13 +2859,13 @@
         <w:spacing w:before="40" w:after="120"/>
         <w:ind w:left="567"/>
         <w:pBdr>
-          <w:left w:val="single" w:sz="18" w:space="8" w:color="A07820"/>
+          <w:left w:val="single" w:sz="4" w:space="8" w:color="A07820"/>
         </w:pBdr>
       </w:pPr>
       <w:r>
         <w:rPr>
           <w:i/>
-          <w:color w:val="6A5A44"/>
+          <w:color w:val="0A0A0A"/>
           <w:sz w:val="18"/>
         </w:rPr>
         <w:t>— Jacques Chirac, ancien président de la République française</w:t>
@@ -3136,7 +3136,7 @@
           <w:sz w:val="22"/>
           <w:rFonts w:ascii="FreeSerif" w:hAnsi="FreeSerif" w:cs="FreeSerif"/>
         </w:rPr>
-        <w:t>★  ★  ★</w:t>
+        <w:t>★★★</w:t>
       </w:r>
     </w:p>
     <w:p>
@@ -3169,7 +3169,7 @@
         <w:spacing w:before="40" w:after="120"/>
         <w:ind w:left="567"/>
         <w:pBdr>
-          <w:left w:val="single" w:sz="18" w:space="8" w:color="A07820"/>
+          <w:left w:val="single" w:sz="4" w:space="8" w:color="A07820"/>
         </w:pBdr>
       </w:pPr>
       <w:r>
@@ -3186,13 +3186,13 @@
         <w:spacing w:before="40" w:after="120"/>
         <w:ind w:left="567"/>
         <w:pBdr>
-          <w:left w:val="single" w:sz="18" w:space="8" w:color="A07820"/>
+          <w:left w:val="single" w:sz="4" w:space="8" w:color="A07820"/>
         </w:pBdr>
       </w:pPr>
       <w:r>
         <w:rPr>
           <w:i/>
-          <w:color w:val="6A5A44"/>
+          <w:color w:val="0A0A0A"/>
           <w:sz w:val="18"/>
         </w:rPr>
         <w:t>— Dr Douma Jean-René, Panafrican Média TV, 10 mai 2026</w:t>
@@ -3430,7 +3430,7 @@
           <w:sz w:val="22"/>
           <w:rFonts w:ascii="FreeSerif" w:hAnsi="FreeSerif" w:cs="FreeSerif"/>
         </w:rPr>
-        <w:t>★  ★  ★</w:t>
+        <w:t>★★★</w:t>
       </w:r>
     </w:p>
     <w:p>
@@ -3463,7 +3463,7 @@
         <w:spacing w:before="40" w:after="120"/>
         <w:ind w:left="567"/>
         <w:pBdr>
-          <w:left w:val="single" w:sz="18" w:space="8" w:color="A07820"/>
+          <w:left w:val="single" w:sz="4" w:space="8" w:color="A07820"/>
         </w:pBdr>
       </w:pPr>
       <w:r>
@@ -3480,13 +3480,13 @@
         <w:spacing w:before="40" w:after="120"/>
         <w:ind w:left="567"/>
         <w:pBdr>
-          <w:left w:val="single" w:sz="18" w:space="8" w:color="A07820"/>
+          <w:left w:val="single" w:sz="4" w:space="8" w:color="A07820"/>
         </w:pBdr>
       </w:pPr>
       <w:r>
         <w:rPr>
           <w:i/>
-          <w:color w:val="6A5A44"/>
+          <w:color w:val="0A0A0A"/>
           <w:sz w:val="18"/>
         </w:rPr>
         <w:t>— André Chassaigne, député, Assemblée nationale française, décembre 2013</w:t>
@@ -3737,7 +3737,7 @@
           <w:sz w:val="22"/>
           <w:rFonts w:ascii="FreeSerif" w:hAnsi="FreeSerif" w:cs="FreeSerif"/>
         </w:rPr>
-        <w:t>★  ★  ★</w:t>
+        <w:t>★★★</w:t>
       </w:r>
     </w:p>
     <w:p>
@@ -3770,7 +3770,7 @@
         <w:spacing w:before="40" w:after="120"/>
         <w:ind w:left="567"/>
         <w:pBdr>
-          <w:left w:val="single" w:sz="18" w:space="8" w:color="A07820"/>
+          <w:left w:val="single" w:sz="4" w:space="8" w:color="A07820"/>
         </w:pBdr>
       </w:pPr>
       <w:r>
@@ -3787,13 +3787,13 @@
         <w:spacing w:before="40" w:after="120"/>
         <w:ind w:left="567"/>
         <w:pBdr>
-          <w:left w:val="single" w:sz="18" w:space="8" w:color="A07820"/>
+          <w:left w:val="single" w:sz="4" w:space="8" w:color="A07820"/>
         </w:pBdr>
       </w:pPr>
       <w:r>
         <w:rPr>
           <w:i/>
-          <w:color w:val="6A5A44"/>
+          <w:color w:val="0A0A0A"/>
           <w:sz w:val="18"/>
         </w:rPr>
         <w:t>— Nathalie Yamb, chronique Afrique Résurrection, novembre 2022</w:t>
@@ -4087,7 +4087,7 @@
           <w:sz w:val="22"/>
           <w:rFonts w:ascii="FreeSerif" w:hAnsi="FreeSerif" w:cs="FreeSerif"/>
         </w:rPr>
-        <w:t>★  ★  ★</w:t>
+        <w:t>★★★</w:t>
       </w:r>
     </w:p>
     <w:p>
@@ -4120,7 +4120,7 @@
         <w:spacing w:before="40" w:after="120"/>
         <w:ind w:left="567"/>
         <w:pBdr>
-          <w:left w:val="single" w:sz="18" w:space="8" w:color="A07820"/>
+          <w:left w:val="single" w:sz="4" w:space="8" w:color="A07820"/>
         </w:pBdr>
       </w:pPr>
       <w:r>
@@ -4137,13 +4137,13 @@
         <w:spacing w:before="40" w:after="120"/>
         <w:ind w:left="567"/>
         <w:pBdr>
-          <w:left w:val="single" w:sz="18" w:space="8" w:color="A07820"/>
+          <w:left w:val="single" w:sz="4" w:space="8" w:color="A07820"/>
         </w:pBdr>
       </w:pPr>
       <w:r>
         <w:rPr>
           <w:i/>
-          <w:color w:val="6A5A44"/>
+          <w:color w:val="0A0A0A"/>
           <w:sz w:val="18"/>
         </w:rPr>
         <w:t>— Nathalie Yamb, janvier 2022</w:t>
@@ -4677,7 +4677,7 @@
           <w:sz w:val="22"/>
           <w:rFonts w:ascii="FreeSerif" w:hAnsi="FreeSerif" w:cs="FreeSerif"/>
         </w:rPr>
-        <w:t>★  ★  ★</w:t>
+        <w:t>★★★</w:t>
       </w:r>
     </w:p>
     <w:p>
@@ -4733,7 +4733,7 @@
           <w:sz w:val="22"/>
           <w:rFonts w:ascii="FreeSerif" w:hAnsi="FreeSerif" w:cs="FreeSerif"/>
         </w:rPr>
-        <w:t>★  ★  ★</w:t>
+        <w:t>★★★</w:t>
       </w:r>
     </w:p>
     <w:p>
@@ -4754,7 +4754,7 @@
           <w:sz w:val="22"/>
           <w:rFonts w:ascii="FreeSerif" w:hAnsi="FreeSerif" w:cs="FreeSerif"/>
         </w:rPr>
-        <w:t>★  ★  ★</w:t>
+        <w:t>★★★</w:t>
       </w:r>
     </w:p>
     <w:p>
@@ -4787,7 +4787,7 @@
         <w:spacing w:before="40" w:after="120"/>
         <w:ind w:left="567"/>
         <w:pBdr>
-          <w:left w:val="single" w:sz="18" w:space="8" w:color="A07820"/>
+          <w:left w:val="single" w:sz="4" w:space="8" w:color="A07820"/>
         </w:pBdr>
       </w:pPr>
       <w:r>
@@ -5282,7 +5282,7 @@
           <w:sz w:val="22"/>
           <w:rFonts w:ascii="FreeSerif" w:hAnsi="FreeSerif" w:cs="FreeSerif"/>
         </w:rPr>
-        <w:t>★  ★  ★</w:t>
+        <w:t>★★★</w:t>
       </w:r>
     </w:p>
     <w:p>
@@ -5315,7 +5315,7 @@
         <w:spacing w:before="40" w:after="120"/>
         <w:ind w:left="567"/>
         <w:pBdr>
-          <w:left w:val="single" w:sz="18" w:space="8" w:color="A07820"/>
+          <w:left w:val="single" w:sz="4" w:space="8" w:color="A07820"/>
         </w:pBdr>
       </w:pPr>
       <w:r>
@@ -5582,7 +5582,7 @@
           <w:sz w:val="22"/>
           <w:rFonts w:ascii="FreeSerif" w:hAnsi="FreeSerif" w:cs="FreeSerif"/>
         </w:rPr>
-        <w:t>★  ★  ★</w:t>
+        <w:t>★★★</w:t>
       </w:r>
     </w:p>
     <w:p>
@@ -5615,7 +5615,7 @@
         <w:spacing w:before="40" w:after="120"/>
         <w:ind w:left="567"/>
         <w:pBdr>
-          <w:left w:val="single" w:sz="18" w:space="8" w:color="A07820"/>
+          <w:left w:val="single" w:sz="4" w:space="8" w:color="A07820"/>
         </w:pBdr>
       </w:pPr>
       <w:r>
@@ -6024,7 +6024,7 @@
           <w:sz w:val="22"/>
           <w:rFonts w:ascii="FreeSerif" w:hAnsi="FreeSerif" w:cs="FreeSerif"/>
         </w:rPr>
-        <w:t>★  ★  ★</w:t>
+        <w:t>★★★</w:t>
       </w:r>
     </w:p>
     <w:p>
@@ -6057,7 +6057,7 @@
         <w:spacing w:before="40" w:after="120"/>
         <w:ind w:left="567"/>
         <w:pBdr>
-          <w:left w:val="single" w:sz="18" w:space="8" w:color="A07820"/>
+          <w:left w:val="single" w:sz="4" w:space="8" w:color="A07820"/>
         </w:pBdr>
       </w:pPr>
       <w:r>
@@ -6493,7 +6493,7 @@
           <w:sz w:val="22"/>
           <w:rFonts w:ascii="FreeSerif" w:hAnsi="FreeSerif" w:cs="FreeSerif"/>
         </w:rPr>
-        <w:t>★  ★  ★</w:t>
+        <w:t>★★★</w:t>
       </w:r>
     </w:p>
     <w:p>
@@ -6526,7 +6526,7 @@
         <w:spacing w:before="40" w:after="120"/>
         <w:ind w:left="567"/>
         <w:pBdr>
-          <w:left w:val="single" w:sz="18" w:space="8" w:color="A07820"/>
+          <w:left w:val="single" w:sz="4" w:space="8" w:color="A07820"/>
         </w:pBdr>
       </w:pPr>
       <w:r>
@@ -6676,7 +6676,7 @@
           <w:sz w:val="22"/>
           <w:rFonts w:ascii="FreeSerif" w:hAnsi="FreeSerif" w:cs="FreeSerif"/>
         </w:rPr>
-        <w:t>★  ★  ★</w:t>
+        <w:t>★★★</w:t>
       </w:r>
     </w:p>
     <w:p>
@@ -6732,7 +6732,7 @@
           <w:sz w:val="22"/>
           <w:rFonts w:ascii="FreeSerif" w:hAnsi="FreeSerif" w:cs="FreeSerif"/>
         </w:rPr>
-        <w:t>★  ★  ★</w:t>
+        <w:t>★★★</w:t>
       </w:r>
     </w:p>
     <w:p>
@@ -6768,7 +6768,7 @@
           <w:sz w:val="22"/>
           <w:rFonts w:ascii="FreeSerif" w:hAnsi="FreeSerif" w:cs="FreeSerif"/>
         </w:rPr>
-        <w:t>★  ★  ★</w:t>
+        <w:t>★★★</w:t>
       </w:r>
     </w:p>
     <w:p>
@@ -6801,7 +6801,7 @@
         <w:spacing w:before="40" w:after="120"/>
         <w:ind w:left="567"/>
         <w:pBdr>
-          <w:left w:val="single" w:sz="18" w:space="8" w:color="A07820"/>
+          <w:left w:val="single" w:sz="4" w:space="8" w:color="A07820"/>
         </w:pBdr>
       </w:pPr>
       <w:r>
@@ -6982,7 +6982,7 @@
           <w:sz w:val="22"/>
           <w:rFonts w:ascii="FreeSerif" w:hAnsi="FreeSerif" w:cs="FreeSerif"/>
         </w:rPr>
-        <w:t>★  ★  ★</w:t>
+        <w:t>★★★</w:t>
       </w:r>
     </w:p>
     <w:p>
@@ -7015,7 +7015,7 @@
         <w:spacing w:before="40" w:after="120"/>
         <w:ind w:left="567"/>
         <w:pBdr>
-          <w:left w:val="single" w:sz="18" w:space="8" w:color="A07820"/>
+          <w:left w:val="single" w:sz="4" w:space="8" w:color="A07820"/>
         </w:pBdr>
       </w:pPr>
       <w:r>
@@ -7138,7 +7138,7 @@
           <w:sz w:val="22"/>
           <w:rFonts w:ascii="FreeSerif" w:hAnsi="FreeSerif" w:cs="FreeSerif"/>
         </w:rPr>
-        <w:t>★  ★  ★</w:t>
+        <w:t>★★★</w:t>
       </w:r>
     </w:p>
     <w:p>
@@ -7171,7 +7171,7 @@
         <w:spacing w:before="40" w:after="120"/>
         <w:ind w:left="567"/>
         <w:pBdr>
-          <w:left w:val="single" w:sz="18" w:space="8" w:color="A07820"/>
+          <w:left w:val="single" w:sz="4" w:space="8" w:color="A07820"/>
         </w:pBdr>
       </w:pPr>
       <w:r>
@@ -7438,7 +7438,7 @@
           <w:sz w:val="22"/>
           <w:rFonts w:ascii="FreeSerif" w:hAnsi="FreeSerif" w:cs="FreeSerif"/>
         </w:rPr>
-        <w:t>★  ★  ★</w:t>
+        <w:t>★★★</w:t>
       </w:r>
     </w:p>
     <w:p>
@@ -7471,7 +7471,7 @@
         <w:spacing w:before="40" w:after="120"/>
         <w:ind w:left="567"/>
         <w:pBdr>
-          <w:left w:val="single" w:sz="18" w:space="8" w:color="A07820"/>
+          <w:left w:val="single" w:sz="4" w:space="8" w:color="A07820"/>
         </w:pBdr>
       </w:pPr>
       <w:r>
@@ -7707,7 +7707,7 @@
           <w:sz w:val="22"/>
           <w:rFonts w:ascii="FreeSerif" w:hAnsi="FreeSerif" w:cs="FreeSerif"/>
         </w:rPr>
-        <w:t>★  ★  ★</w:t>
+        <w:t>★★★</w:t>
       </w:r>
     </w:p>
     <w:p>
@@ -7740,7 +7740,7 @@
         <w:spacing w:before="40" w:after="120"/>
         <w:ind w:left="567"/>
         <w:pBdr>
-          <w:left w:val="single" w:sz="18" w:space="8" w:color="A07820"/>
+          <w:left w:val="single" w:sz="4" w:space="8" w:color="A07820"/>
         </w:pBdr>
       </w:pPr>
       <w:r>
@@ -8154,7 +8154,7 @@
           <w:sz w:val="22"/>
           <w:rFonts w:ascii="FreeSerif" w:hAnsi="FreeSerif" w:cs="FreeSerif"/>
         </w:rPr>
-        <w:t>★  ★  ★</w:t>
+        <w:t>★★★</w:t>
       </w:r>
     </w:p>
     <w:p>
@@ -8187,7 +8187,7 @@
         <w:spacing w:before="40" w:after="120"/>
         <w:ind w:left="567"/>
         <w:pBdr>
-          <w:left w:val="single" w:sz="18" w:space="8" w:color="A07820"/>
+          <w:left w:val="single" w:sz="4" w:space="8" w:color="A07820"/>
         </w:pBdr>
       </w:pPr>
       <w:r>
@@ -8554,7 +8554,7 @@
           <w:sz w:val="22"/>
           <w:rFonts w:ascii="FreeSerif" w:hAnsi="FreeSerif" w:cs="FreeSerif"/>
         </w:rPr>
-        <w:t>★  ★  ★</w:t>
+        <w:t>★★★</w:t>
       </w:r>
     </w:p>
     <w:p>
@@ -8610,7 +8610,7 @@
           <w:sz w:val="22"/>
           <w:rFonts w:ascii="FreeSerif" w:hAnsi="FreeSerif" w:cs="FreeSerif"/>
         </w:rPr>
-        <w:t>★  ★  ★</w:t>
+        <w:t>★★★</w:t>
       </w:r>
     </w:p>
     <w:p>
@@ -8631,7 +8631,7 @@
           <w:sz w:val="22"/>
           <w:rFonts w:ascii="FreeSerif" w:hAnsi="FreeSerif" w:cs="FreeSerif"/>
         </w:rPr>
-        <w:t>★  ★  ★</w:t>
+        <w:t>★★★</w:t>
       </w:r>
     </w:p>
     <w:p>
@@ -9007,7 +9007,7 @@
           <w:sz w:val="22"/>
           <w:rFonts w:ascii="FreeSerif" w:hAnsi="FreeSerif" w:cs="FreeSerif"/>
         </w:rPr>
-        <w:t>★  ★  ★</w:t>
+        <w:t>★★★</w:t>
       </w:r>
     </w:p>
     <w:p>
@@ -9040,7 +9040,7 @@
         <w:spacing w:before="40" w:after="120"/>
         <w:ind w:left="567"/>
         <w:pBdr>
-          <w:left w:val="single" w:sz="18" w:space="8" w:color="A07820"/>
+          <w:left w:val="single" w:sz="4" w:space="8" w:color="A07820"/>
         </w:pBdr>
       </w:pPr>
       <w:r>
@@ -9291,7 +9291,7 @@
           <w:sz w:val="22"/>
           <w:rFonts w:ascii="FreeSerif" w:hAnsi="FreeSerif" w:cs="FreeSerif"/>
         </w:rPr>
-        <w:t>★  ★  ★</w:t>
+        <w:t>★★★</w:t>
       </w:r>
     </w:p>
     <w:p>
@@ -9507,7 +9507,7 @@
           <w:sz w:val="22"/>
           <w:rFonts w:ascii="FreeSerif" w:hAnsi="FreeSerif" w:cs="FreeSerif"/>
         </w:rPr>
-        <w:t>★  ★  ★</w:t>
+        <w:t>★★★</w:t>
       </w:r>
     </w:p>
     <w:p>
@@ -9540,7 +9540,7 @@
         <w:spacing w:before="40" w:after="120"/>
         <w:ind w:left="567"/>
         <w:pBdr>
-          <w:left w:val="single" w:sz="18" w:space="8" w:color="A07820"/>
+          <w:left w:val="single" w:sz="4" w:space="8" w:color="A07820"/>
         </w:pBdr>
       </w:pPr>
       <w:r>
@@ -9583,7 +9583,7 @@
         <w:spacing w:before="40" w:after="120"/>
         <w:ind w:left="567"/>
         <w:pBdr>
-          <w:left w:val="single" w:sz="18" w:space="8" w:color="A07820"/>
+          <w:left w:val="single" w:sz="4" w:space="8" w:color="A07820"/>
         </w:pBdr>
       </w:pPr>
       <w:r>
@@ -9931,7 +9931,7 @@
           <w:sz w:val="22"/>
           <w:rFonts w:ascii="FreeSerif" w:hAnsi="FreeSerif" w:cs="FreeSerif"/>
         </w:rPr>
-        <w:t>★  ★  ★</w:t>
+        <w:t>★★★</w:t>
       </w:r>
     </w:p>
     <w:p>
@@ -9987,7 +9987,7 @@
           <w:sz w:val="22"/>
           <w:rFonts w:ascii="FreeSerif" w:hAnsi="FreeSerif" w:cs="FreeSerif"/>
         </w:rPr>
-        <w:t>★  ★  ★</w:t>
+        <w:t>★★★</w:t>
       </w:r>
     </w:p>
     <w:p>
@@ -10023,7 +10023,7 @@
           <w:sz w:val="22"/>
           <w:rFonts w:ascii="FreeSerif" w:hAnsi="FreeSerif" w:cs="FreeSerif"/>
         </w:rPr>
-        <w:t>★  ★  ★</w:t>
+        <w:t>★★★</w:t>
       </w:r>
     </w:p>
     <w:p>
@@ -10056,7 +10056,7 @@
         <w:spacing w:before="40" w:after="120"/>
         <w:ind w:left="567"/>
         <w:pBdr>
-          <w:left w:val="single" w:sz="18" w:space="8" w:color="A07820"/>
+          <w:left w:val="single" w:sz="4" w:space="8" w:color="A07820"/>
         </w:pBdr>
       </w:pPr>
       <w:r>
@@ -10354,7 +10354,7 @@
           <w:sz w:val="22"/>
           <w:rFonts w:ascii="FreeSerif" w:hAnsi="FreeSerif" w:cs="FreeSerif"/>
         </w:rPr>
-        <w:t>★  ★  ★</w:t>
+        <w:t>★★★</w:t>
       </w:r>
     </w:p>
     <w:p>
@@ -10387,7 +10387,7 @@
         <w:spacing w:before="40" w:after="120"/>
         <w:ind w:left="567"/>
         <w:pBdr>
-          <w:left w:val="single" w:sz="18" w:space="8" w:color="A07820"/>
+          <w:left w:val="single" w:sz="4" w:space="8" w:color="A07820"/>
         </w:pBdr>
       </w:pPr>
       <w:r>
@@ -10648,7 +10648,7 @@
           <w:sz w:val="22"/>
           <w:rFonts w:ascii="FreeSerif" w:hAnsi="FreeSerif" w:cs="FreeSerif"/>
         </w:rPr>
-        <w:t>★  ★  ★</w:t>
+        <w:t>★★★</w:t>
       </w:r>
     </w:p>
     <w:p>
@@ -10681,7 +10681,7 @@
         <w:spacing w:before="40" w:after="120"/>
         <w:ind w:left="567"/>
         <w:pBdr>
-          <w:left w:val="single" w:sz="18" w:space="8" w:color="A07820"/>
+          <w:left w:val="single" w:sz="4" w:space="8" w:color="A07820"/>
         </w:pBdr>
       </w:pPr>
       <w:r>
@@ -10993,7 +10993,7 @@
           <w:sz w:val="22"/>
           <w:rFonts w:ascii="FreeSerif" w:hAnsi="FreeSerif" w:cs="FreeSerif"/>
         </w:rPr>
-        <w:t>★  ★  ★</w:t>
+        <w:t>★★★</w:t>
       </w:r>
     </w:p>
     <w:p>
@@ -11289,7 +11289,7 @@
           <w:sz w:val="22"/>
           <w:rFonts w:ascii="FreeSerif" w:hAnsi="FreeSerif" w:cs="FreeSerif"/>
         </w:rPr>
-        <w:t>★  ★  ★</w:t>
+        <w:t>★★★</w:t>
       </w:r>
     </w:p>
     <w:p>
@@ -11322,7 +11322,7 @@
         <w:spacing w:before="40" w:after="120"/>
         <w:ind w:left="567"/>
         <w:pBdr>
-          <w:left w:val="single" w:sz="18" w:space="8" w:color="A07820"/>
+          <w:left w:val="single" w:sz="4" w:space="8" w:color="A07820"/>
         </w:pBdr>
       </w:pPr>
       <w:r>
@@ -11959,7 +11959,7 @@
           <w:sz w:val="22"/>
           <w:rFonts w:ascii="FreeSerif" w:hAnsi="FreeSerif" w:cs="FreeSerif"/>
         </w:rPr>
-        <w:t>★  ★  ★</w:t>
+        <w:t>★★★</w:t>
       </w:r>
     </w:p>
     <w:p>
@@ -12491,7 +12491,7 @@
           <w:sz w:val="22"/>
           <w:rFonts w:ascii="FreeSerif" w:hAnsi="FreeSerif" w:cs="FreeSerif"/>
         </w:rPr>
-        <w:t>★  ★  ★</w:t>
+        <w:t>★★★</w:t>
       </w:r>
     </w:p>
     <w:p>
@@ -12567,7 +12567,7 @@
           <w:sz w:val="22"/>
           <w:rFonts w:ascii="FreeSerif" w:hAnsi="FreeSerif" w:cs="FreeSerif"/>
         </w:rPr>
-        <w:t>★  ★  ★</w:t>
+        <w:t>★★★</w:t>
       </w:r>
     </w:p>
     <w:p>
@@ -12633,7 +12633,7 @@
           <w:sz w:val="22"/>
           <w:rFonts w:ascii="FreeSerif" w:hAnsi="FreeSerif" w:cs="FreeSerif"/>
         </w:rPr>
-        <w:t>★  ★  ★</w:t>
+        <w:t>★★★</w:t>
       </w:r>
     </w:p>
     <w:p>
@@ -12641,7 +12641,7 @@
         <w:spacing w:before="40" w:after="120"/>
         <w:ind w:left="567"/>
         <w:pBdr>
-          <w:left w:val="single" w:sz="18" w:space="8" w:color="A07820"/>
+          <w:left w:val="single" w:sz="4" w:space="8" w:color="A07820"/>
         </w:pBdr>
       </w:pPr>
       <w:r>
@@ -12658,13 +12658,13 @@
         <w:spacing w:before="40" w:after="120"/>
         <w:ind w:left="567"/>
         <w:pBdr>
-          <w:left w:val="single" w:sz="18" w:space="8" w:color="A07820"/>
+          <w:left w:val="single" w:sz="4" w:space="8" w:color="A07820"/>
         </w:pBdr>
       </w:pPr>
       <w:r>
         <w:rPr>
           <w:i/>
-          <w:color w:val="6A5A44"/>
+          <w:color w:val="0A0A0A"/>
           <w:sz w:val="18"/>
         </w:rPr>
         <w:t>— Général Tiani, 13 novembre 2025</w:t>
@@ -12683,7 +12683,7 @@
           <w:sz w:val="22"/>
           <w:rFonts w:ascii="FreeSerif" w:hAnsi="FreeSerif" w:cs="FreeSerif"/>
         </w:rPr>
-        <w:t>★  ★  ★</w:t>
+        <w:t>★★★</w:t>
       </w:r>
     </w:p>
     <w:p>
@@ -12884,7 +12884,7 @@
           <w:sz w:val="22"/>
           <w:rFonts w:ascii="FreeSerif" w:hAnsi="FreeSerif" w:cs="FreeSerif"/>
         </w:rPr>
-        <w:t>★  ★  ★</w:t>
+        <w:t>★★★</w:t>
       </w:r>
     </w:p>
     <w:p>
@@ -13253,7 +13253,7 @@
           <w:sz w:val="22"/>
           <w:rFonts w:ascii="FreeSerif" w:hAnsi="FreeSerif" w:cs="FreeSerif"/>
         </w:rPr>
-        <w:t>★  ★  ★</w:t>
+        <w:t>★★★</w:t>
       </w:r>
     </w:p>
     <w:p>
@@ -13869,7 +13869,7 @@
           <w:sz w:val="22"/>
           <w:rFonts w:ascii="FreeSerif" w:hAnsi="FreeSerif" w:cs="FreeSerif"/>
         </w:rPr>
-        <w:t>★  ★  ★</w:t>
+        <w:t>★★★</w:t>
       </w:r>
     </w:p>
     <w:p>
@@ -14499,7 +14499,7 @@
         <w:spacing w:before="40" w:after="120"/>
         <w:ind w:left="567"/>
         <w:pBdr>
-          <w:left w:val="single" w:sz="18" w:space="8" w:color="A07820"/>
+          <w:left w:val="single" w:sz="4" w:space="8" w:color="A07820"/>
         </w:pBdr>
       </w:pPr>
       <w:r>
@@ -14512,6 +14512,7 @@
       </w:r>
     </w:p>
     <w:sectPr>
+      <w:footerReference w:type="default" r:id="rId9"/>
       <w:pgSz w:w="8640" w:h="12960"/>
       <w:pgMar w:top="1080" w:right="864" w:bottom="1008" w:left="1152" w:header="720" w:footer="720" w:gutter="0"/>
       <w:cols w:space="720"/>
@@ -14519,6 +14520,43 @@
     </w:sectPr>
   </w:body>
 </w:document>
+</file>
+
+<file path=word/footer1.xml><?xml version="1.0" encoding="utf-8"?>
+<w:ftr xmlns:m="http://schemas.openxmlformats.org/officeDocument/2006/math" xmlns:mc="http://schemas.openxmlformats.org/markup-compatibility/2006" xmlns:mo="http://schemas.microsoft.com/office/mac/office/2008/main" xmlns:mv="urn:schemas-microsoft-com:mac:vml" xmlns:o="urn:schemas-microsoft-com:office:office" xmlns:r="http://schemas.openxmlformats.org/officeDocument/2006/relationships" xmlns:v="urn:schemas-microsoft-com:vml" xmlns:w10="urn:schemas-microsoft-com:office:word" xmlns:w14="http://schemas.microsoft.com/office/word/2010/wordml" xmlns:w="http://schemas.openxmlformats.org/wordprocessingml/2006/main" xmlns:wne="http://schemas.microsoft.com/office/word/2006/wordml" xmlns:wp14="http://schemas.microsoft.com/office/word/2010/wordprocessingDrawing" xmlns:wp="http://schemas.openxmlformats.org/drawingml/2006/wordprocessingDrawing" xmlns:wpc="http://schemas.microsoft.com/office/word/2010/wordprocessingCanvas" xmlns:wpg="http://schemas.microsoft.com/office/word/2010/wordprocessingGroup" xmlns:wpi="http://schemas.microsoft.com/office/word/2010/wordprocessingInk" xmlns:wps="http://schemas.microsoft.com/office/word/2010/wordprocessingShape" mc:Ignorable="w14 wp14">
+  <w:p>
+    <w:pPr>
+      <w:pStyle w:val="Footer"/>
+      <w:jc w:val="center"/>
+    </w:pPr>
+    <w:r>
+      <w:rPr>
+        <w:rFonts w:ascii="FreeSerif" w:hAnsi="FreeSerif" w:cs="FreeSerif"/>
+        <w:color w:val="A8A8A0"/>
+        <w:sz w:val="18"/>
+      </w:rPr>
+      <w:t xml:space="preserve">— </w:t>
+    </w:r>
+    <w:r>
+      <w:rPr>
+        <w:rFonts w:ascii="FreeSerif" w:hAnsi="FreeSerif" w:cs="FreeSerif"/>
+        <w:color w:val="A8A8A0"/>
+        <w:sz w:val="18"/>
+      </w:rPr>
+      <w:fldChar w:fldCharType="begin"/>
+      <w:instrText xml:space="preserve">PAGE</w:instrText>
+      <w:fldChar w:fldCharType="end"/>
+    </w:r>
+    <w:r>
+      <w:rPr>
+        <w:rFonts w:ascii="FreeSerif" w:hAnsi="FreeSerif" w:cs="FreeSerif"/>
+        <w:color w:val="A8A8A0"/>
+        <w:sz w:val="18"/>
+      </w:rPr>
+      <w:t xml:space="preserve"> —</w:t>
+    </w:r>
+  </w:p>
+</w:ftr>
 </file>
 
 <file path=word/numbering.xml><?xml version="1.0" encoding="utf-8"?>

</xml_diff>